<commit_message>
Docs v1.1: add admin portal and changes since v1.0
- Functional Specification: new Chapter 13 (admin portal, statement, bulk ops, run-accrual, partition fix, sandbox URLs)
- Technical Design Document: new Chapter 15 (lending-admin-service design, API, security, deployment, V9, scripts, URLs)
- Architecture deck: 3 new slides (admin portal, screens/login, sandbox URLs and changes)
- Root README.md and CHANGELOG.md; CLOUD_DEPLOYMENT.md section 13 (Render sandbox)

Co-Authored-By: Claude Sonnet 5.5 <noreply@anthropic.com>
Claude-Session: https://claude.ai/code/session_011Ly3TH5YUMArmTYksVUGUE
</commit_message>
<xml_diff>
--- a/docs/Lending_Platform_Functional_Specification.docx
+++ b/docs/Lending_Platform_Functional_Specification.docx
@@ -51,7 +51,7 @@
           <w:sz w:val="22"/>
           <w:szCs w:val="22"/>
         </w:rPr>
-        <w:t xml:space="preserve">Business rules, API contracts, and the batch job catalog for lending-service &amp; lending-batch-service</w:t>
+        <w:t xml:space="preserve">Business rules, API contracts, batch job catalog and admin portal for lending-service, lending-batch-service &amp; lending-admin-service</w:t>
       </w:r>
     </w:p>
     <w:p>
@@ -79,7 +79,7 @@
           <w:sz w:val="20"/>
           <w:szCs w:val="20"/>
         </w:rPr>
-        <w:t xml:space="preserve">Document version 1.0 — generated from source, 2 September 2026</w:t>
+        <w:t xml:space="preserve">Document version 1.1 — updated 10 October 2026 (adds Admin Portal and changes since v1.0)</w:t>
       </w:r>
     </w:p>
     <w:p>
@@ -202,6 +202,27 @@
           <w:szCs w:val="21"/>
         </w:rPr>
         <w:t xml:space="preserve">This document specifies the functional behavior of the Lending Platform: what each API endpoint does from a business perspective, the rules and validations that govern loan servicing, and the intended purpose of every one of the 36 batch jobs that make up the platform's daily, monthly, and periodic processing calendar. It is the functional companion to the Technical Design Document, which covers architecture and implementation.</w:t>
+      </w:r>
+    </w:p>
+    <w:p>
+      <w:pPr>
+        <w:spacing w:after="140" w:line="276"/>
+      </w:pPr>
+      <w:r>
+        <w:rPr>
+          <w:b/>
+          <w:bCs/>
+          <w:sz w:val="21"/>
+          <w:szCs w:val="21"/>
+        </w:rPr>
+        <w:t xml:space="preserve">Version 1.1 (10 October 2026):</w:t>
+      </w:r>
+      <w:r>
+        <w:rPr>
+          <w:sz w:val="21"/>
+          <w:szCs w:val="21"/>
+        </w:rPr>
+        <w:t xml:space="preserve"> adds the read-only Admin Portal and the functions delivered since v1.0 — customer PDF statement, bulk create and disburse, run-accrual-for-all, and the partition fix. They are collected in Chapter 13, which also lists the sandbox and Swagger URLs.</w:t>
       </w:r>
     </w:p>
     <w:p>
@@ -18050,6 +18071,2938 @@
           <w:szCs w:val="21"/>
         </w:rPr>
         <w:t xml:space="preserve">The entire batch execution framework: job registry, partitioning, Quartz scheduling, admin API, metrics, audit logging, and dead-lettering (§9) — ready to host real business logic as soon as each job's TODO is implemented.</w:t>
+      </w:r>
+    </w:p>
+    <w:p>
+      <w:pPr>
+        <w:pStyle w:val="Heading1"/>
+        <w:pBdr>
+          <w:bottom w:val="single" w:color="1F3864" w:sz="8" w:space="4"/>
+        </w:pBdr>
+        <w:spacing w:after="160" w:before="360"/>
+      </w:pPr>
+      <w:r>
+        <w:rPr>
+          <w:b/>
+          <w:bCs/>
+          <w:color w:val="1F3864"/>
+          <w:sz w:val="30"/>
+          <w:szCs w:val="30"/>
+        </w:rPr>
+        <w:t xml:space="preserve">13. Addendum — Admin Portal &amp; Changes Since v1.0</w:t>
+      </w:r>
+    </w:p>
+    <w:p>
+      <w:pPr>
+        <w:spacing w:after="140" w:line="276"/>
+      </w:pPr>
+      <w:r>
+        <w:rPr>
+          <w:sz w:val="21"/>
+          <w:szCs w:val="21"/>
+        </w:rPr>
+        <w:t xml:space="preserve">This chapter adds the functions delivered after version 1.0 (2 September 2026): the read-only </w:t>
+      </w:r>
+      <w:r>
+        <w:rPr>
+          <w:b/>
+          <w:bCs/>
+          <w:sz w:val="21"/>
+          <w:szCs w:val="21"/>
+        </w:rPr>
+        <w:t xml:space="preserve">Admin Portal</w:t>
+      </w:r>
+      <w:r>
+        <w:rPr>
+          <w:sz w:val="21"/>
+          <w:szCs w:val="21"/>
+        </w:rPr>
+        <w:t xml:space="preserve">, the customer PDF statement, bulk account create and disburse, the run-accrual-for-all procedure, and the fix for postings that failed when a month had no partition. Chapters 1-12 are unchanged except as noted in §13.8.</w:t>
+      </w:r>
+    </w:p>
+    <w:p>
+      <w:pPr>
+        <w:pStyle w:val="Heading2"/>
+        <w:spacing w:after="120" w:before="280"/>
+      </w:pPr>
+      <w:r>
+        <w:rPr>
+          <w:b/>
+          <w:bCs/>
+          <w:color w:val="2E5AA8"/>
+          <w:sz w:val="25"/>
+          <w:szCs w:val="25"/>
+        </w:rPr>
+        <w:t xml:space="preserve">13.1 What Is New</w:t>
+      </w:r>
+    </w:p>
+    <w:tbl>
+      <w:tblPr>
+        <w:tblW w:type="dxa" w:w="9500"/>
+        <w:tblBorders>
+          <w:top w:val="single" w:color="auto" w:sz="4"/>
+          <w:left w:val="single" w:color="auto" w:sz="4"/>
+          <w:bottom w:val="single" w:color="auto" w:sz="4"/>
+          <w:right w:val="single" w:color="auto" w:sz="4"/>
+          <w:insideH w:val="single" w:color="auto" w:sz="4"/>
+          <w:insideV w:val="single" w:color="auto" w:sz="4"/>
+        </w:tblBorders>
+      </w:tblPr>
+      <w:tblGrid>
+        <w:gridCol w:w="2600"/>
+        <w:gridCol w:w="6900"/>
+      </w:tblGrid>
+      <w:tr>
+        <w:trPr>
+          <w:tblHeader/>
+        </w:trPr>
+        <w:tc>
+          <w:tcPr>
+            <w:tcW w:type="dxa" w:w="2600"/>
+            <w:shd w:fill="1F3864" w:val="clear"/>
+            <w:tcMar>
+              <w:top w:type="dxa" w:w="60"/>
+              <w:left w:type="dxa" w:w="100"/>
+              <w:bottom w:type="dxa" w:w="60"/>
+              <w:right w:type="dxa" w:w="100"/>
+            </w:tcMar>
+            <w:vAlign w:val="center"/>
+          </w:tcPr>
+          <w:p>
+            <w:pPr>
+              <w:jc w:val="left"/>
+            </w:pPr>
+            <w:r>
+              <w:rPr>
+                <w:b/>
+                <w:bCs/>
+                <w:color w:val="FFFFFF"/>
+                <w:sz w:val="19"/>
+                <w:szCs w:val="19"/>
+              </w:rPr>
+              <w:t xml:space="preserve">Capability</w:t>
+            </w:r>
+          </w:p>
+        </w:tc>
+        <w:tc>
+          <w:tcPr>
+            <w:tcW w:type="dxa" w:w="6900"/>
+            <w:shd w:fill="1F3864" w:val="clear"/>
+            <w:tcMar>
+              <w:top w:type="dxa" w:w="60"/>
+              <w:left w:type="dxa" w:w="100"/>
+              <w:bottom w:type="dxa" w:w="60"/>
+              <w:right w:type="dxa" w:w="100"/>
+            </w:tcMar>
+            <w:vAlign w:val="center"/>
+          </w:tcPr>
+          <w:p>
+            <w:pPr>
+              <w:jc w:val="left"/>
+            </w:pPr>
+            <w:r>
+              <w:rPr>
+                <w:b/>
+                <w:bCs/>
+                <w:color w:val="FFFFFF"/>
+                <w:sz w:val="19"/>
+                <w:szCs w:val="19"/>
+              </w:rPr>
+              <w:t xml:space="preserve">In one line</w:t>
+            </w:r>
+          </w:p>
+        </w:tc>
+      </w:tr>
+      <w:tr>
+        <w:trPr>
+          <w:cantSplit/>
+        </w:trPr>
+        <w:tc>
+          <w:tcPr>
+            <w:tcW w:type="dxa" w:w="2600"/>
+            <w:tcMar>
+              <w:top w:type="dxa" w:w="60"/>
+              <w:left w:type="dxa" w:w="100"/>
+              <w:bottom w:type="dxa" w:w="60"/>
+              <w:right w:type="dxa" w:w="100"/>
+            </w:tcMar>
+            <w:vAlign w:val="center"/>
+          </w:tcPr>
+          <w:p>
+            <w:pPr>
+              <w:jc w:val="left"/>
+            </w:pPr>
+            <w:r>
+              <w:rPr>
+                <w:sz w:val="19"/>
+                <w:szCs w:val="19"/>
+              </w:rPr>
+              <w:t xml:space="preserve">Admin Portal</w:t>
+            </w:r>
+          </w:p>
+        </w:tc>
+        <w:tc>
+          <w:tcPr>
+            <w:tcW w:type="dxa" w:w="6900"/>
+            <w:tcMar>
+              <w:top w:type="dxa" w:w="60"/>
+              <w:left w:type="dxa" w:w="100"/>
+              <w:bottom w:type="dxa" w:w="60"/>
+              <w:right w:type="dxa" w:w="100"/>
+            </w:tcMar>
+            <w:vAlign w:val="center"/>
+          </w:tcPr>
+          <w:p>
+            <w:pPr>
+              <w:jc w:val="left"/>
+            </w:pPr>
+            <w:r>
+              <w:rPr>
+                <w:sz w:val="19"/>
+                <w:szCs w:val="19"/>
+              </w:rPr>
+              <w:t xml:space="preserve">Web console for operations staff to search accounts and inquire on amortization, accruals, payments, upcoming and overdue instalments, mortgage, ledger outbox and batch jobs — view only.</w:t>
+            </w:r>
+          </w:p>
+        </w:tc>
+      </w:tr>
+      <w:tr>
+        <w:trPr>
+          <w:cantSplit/>
+        </w:trPr>
+        <w:tc>
+          <w:tcPr>
+            <w:tcW w:type="dxa" w:w="2600"/>
+            <w:shd w:fill="F5F8FC" w:val="clear"/>
+            <w:tcMar>
+              <w:top w:type="dxa" w:w="60"/>
+              <w:left w:type="dxa" w:w="100"/>
+              <w:bottom w:type="dxa" w:w="60"/>
+              <w:right w:type="dxa" w:w="100"/>
+            </w:tcMar>
+            <w:vAlign w:val="center"/>
+          </w:tcPr>
+          <w:p>
+            <w:pPr>
+              <w:jc w:val="left"/>
+            </w:pPr>
+            <w:r>
+              <w:rPr>
+                <w:sz w:val="19"/>
+                <w:szCs w:val="19"/>
+              </w:rPr>
+              <w:t xml:space="preserve">Customer statement</w:t>
+            </w:r>
+          </w:p>
+        </w:tc>
+        <w:tc>
+          <w:tcPr>
+            <w:tcW w:type="dxa" w:w="6900"/>
+            <w:shd w:fill="F5F8FC" w:val="clear"/>
+            <w:tcMar>
+              <w:top w:type="dxa" w:w="60"/>
+              <w:left w:type="dxa" w:w="100"/>
+              <w:bottom w:type="dxa" w:w="60"/>
+              <w:right w:type="dxa" w:w="100"/>
+            </w:tcMar>
+            <w:vAlign w:val="center"/>
+          </w:tcPr>
+          <w:p>
+            <w:pPr>
+              <w:jc w:val="left"/>
+            </w:pPr>
+            <w:r>
+              <w:rPr>
+                <w:sz w:val="19"/>
+                <w:szCs w:val="19"/>
+              </w:rPr>
+              <w:t xml:space="preserve">Downloadable PDF loan statement per account, from the API or from the Admin Portal.</w:t>
+            </w:r>
+          </w:p>
+        </w:tc>
+      </w:tr>
+      <w:tr>
+        <w:trPr>
+          <w:cantSplit/>
+        </w:trPr>
+        <w:tc>
+          <w:tcPr>
+            <w:tcW w:type="dxa" w:w="2600"/>
+            <w:tcMar>
+              <w:top w:type="dxa" w:w="60"/>
+              <w:left w:type="dxa" w:w="100"/>
+              <w:bottom w:type="dxa" w:w="60"/>
+              <w:right w:type="dxa" w:w="100"/>
+            </w:tcMar>
+            <w:vAlign w:val="center"/>
+          </w:tcPr>
+          <w:p>
+            <w:pPr>
+              <w:jc w:val="left"/>
+            </w:pPr>
+            <w:r>
+              <w:rPr>
+                <w:sz w:val="19"/>
+                <w:szCs w:val="19"/>
+              </w:rPr>
+              <w:t xml:space="preserve">Bulk create / disburse</w:t>
+            </w:r>
+          </w:p>
+        </w:tc>
+        <w:tc>
+          <w:tcPr>
+            <w:tcW w:type="dxa" w:w="6900"/>
+            <w:tcMar>
+              <w:top w:type="dxa" w:w="60"/>
+              <w:left w:type="dxa" w:w="100"/>
+              <w:bottom w:type="dxa" w:w="60"/>
+              <w:right w:type="dxa" w:w="100"/>
+            </w:tcMar>
+            <w:vAlign w:val="center"/>
+          </w:tcPr>
+          <w:p>
+            <w:pPr>
+              <w:jc w:val="left"/>
+            </w:pPr>
+            <w:r>
+              <w:rPr>
+                <w:sz w:val="19"/>
+                <w:szCs w:val="19"/>
+              </w:rPr>
+              <w:t xml:space="preserve">Create or disburse up to 200 accounts in one call with a result for each item.</w:t>
+            </w:r>
+          </w:p>
+        </w:tc>
+      </w:tr>
+      <w:tr>
+        <w:trPr>
+          <w:cantSplit/>
+        </w:trPr>
+        <w:tc>
+          <w:tcPr>
+            <w:tcW w:type="dxa" w:w="2600"/>
+            <w:shd w:fill="F5F8FC" w:val="clear"/>
+            <w:tcMar>
+              <w:top w:type="dxa" w:w="60"/>
+              <w:left w:type="dxa" w:w="100"/>
+              <w:bottom w:type="dxa" w:w="60"/>
+              <w:right w:type="dxa" w:w="100"/>
+            </w:tcMar>
+            <w:vAlign w:val="center"/>
+          </w:tcPr>
+          <w:p>
+            <w:pPr>
+              <w:jc w:val="left"/>
+            </w:pPr>
+            <w:r>
+              <w:rPr>
+                <w:sz w:val="19"/>
+                <w:szCs w:val="19"/>
+              </w:rPr>
+              <w:t xml:space="preserve">Run accrual for all</w:t>
+            </w:r>
+          </w:p>
+        </w:tc>
+        <w:tc>
+          <w:tcPr>
+            <w:tcW w:type="dxa" w:w="6900"/>
+            <w:shd w:fill="F5F8FC" w:val="clear"/>
+            <w:tcMar>
+              <w:top w:type="dxa" w:w="60"/>
+              <w:left w:type="dxa" w:w="100"/>
+              <w:bottom w:type="dxa" w:w="60"/>
+              <w:right w:type="dxa" w:w="100"/>
+            </w:tcMar>
+            <w:vAlign w:val="center"/>
+          </w:tcPr>
+          <w:p>
+            <w:pPr>
+              <w:jc w:val="left"/>
+            </w:pPr>
+            <w:r>
+              <w:rPr>
+                <w:sz w:val="19"/>
+                <w:szCs w:val="19"/>
+              </w:rPr>
+              <w:t xml:space="preserve">One call (or script) accrues interest for every active account for a business date.</w:t>
+            </w:r>
+          </w:p>
+        </w:tc>
+      </w:tr>
+      <w:tr>
+        <w:trPr>
+          <w:cantSplit/>
+        </w:trPr>
+        <w:tc>
+          <w:tcPr>
+            <w:tcW w:type="dxa" w:w="2600"/>
+            <w:tcMar>
+              <w:top w:type="dxa" w:w="60"/>
+              <w:left w:type="dxa" w:w="100"/>
+              <w:bottom w:type="dxa" w:w="60"/>
+              <w:right w:type="dxa" w:w="100"/>
+            </w:tcMar>
+            <w:vAlign w:val="center"/>
+          </w:tcPr>
+          <w:p>
+            <w:pPr>
+              <w:jc w:val="left"/>
+            </w:pPr>
+            <w:r>
+              <w:rPr>
+                <w:sz w:val="19"/>
+                <w:szCs w:val="19"/>
+              </w:rPr>
+              <w:t xml:space="preserve">Partition fix</w:t>
+            </w:r>
+          </w:p>
+        </w:tc>
+        <w:tc>
+          <w:tcPr>
+            <w:tcW w:type="dxa" w:w="6900"/>
+            <w:tcMar>
+              <w:top w:type="dxa" w:w="60"/>
+              <w:left w:type="dxa" w:w="100"/>
+              <w:bottom w:type="dxa" w:w="60"/>
+              <w:right w:type="dxa" w:w="100"/>
+            </w:tcMar>
+            <w:vAlign w:val="center"/>
+          </w:tcPr>
+          <w:p>
+            <w:pPr>
+              <w:jc w:val="left"/>
+            </w:pPr>
+            <w:r>
+              <w:rPr>
+                <w:sz w:val="19"/>
+                <w:szCs w:val="19"/>
+              </w:rPr>
+              <w:t xml:space="preserve">Accrual and EMI posting no longer fail with 409 when the month's storage partition was missing.</w:t>
+            </w:r>
+          </w:p>
+        </w:tc>
+      </w:tr>
+      <w:tr>
+        <w:trPr>
+          <w:cantSplit/>
+        </w:trPr>
+        <w:tc>
+          <w:tcPr>
+            <w:tcW w:type="dxa" w:w="2600"/>
+            <w:shd w:fill="F5F8FC" w:val="clear"/>
+            <w:tcMar>
+              <w:top w:type="dxa" w:w="60"/>
+              <w:left w:type="dxa" w:w="100"/>
+              <w:bottom w:type="dxa" w:w="60"/>
+              <w:right w:type="dxa" w:w="100"/>
+            </w:tcMar>
+            <w:vAlign w:val="center"/>
+          </w:tcPr>
+          <w:p>
+            <w:pPr>
+              <w:jc w:val="left"/>
+            </w:pPr>
+            <w:r>
+              <w:rPr>
+                <w:sz w:val="19"/>
+                <w:szCs w:val="19"/>
+              </w:rPr>
+              <w:t xml:space="preserve">Friendlier errors</w:t>
+            </w:r>
+          </w:p>
+        </w:tc>
+        <w:tc>
+          <w:tcPr>
+            <w:tcW w:type="dxa" w:w="6900"/>
+            <w:shd w:fill="F5F8FC" w:val="clear"/>
+            <w:tcMar>
+              <w:top w:type="dxa" w:w="60"/>
+              <w:left w:type="dxa" w:w="100"/>
+              <w:bottom w:type="dxa" w:w="60"/>
+              <w:right w:type="dxa" w:w="100"/>
+            </w:tcMar>
+            <w:vAlign w:val="center"/>
+          </w:tcPr>
+          <w:p>
+            <w:pPr>
+              <w:jc w:val="left"/>
+            </w:pPr>
+            <w:r>
+              <w:rPr>
+                <w:sz w:val="19"/>
+                <w:szCs w:val="19"/>
+              </w:rPr>
+              <w:t xml:space="preserve">Wrong URL, method, media type or malformed body now return 404 / 405 / 415 / 400 instead of 500.</w:t>
+            </w:r>
+          </w:p>
+        </w:tc>
+      </w:tr>
+    </w:tbl>
+    <w:p>
+      <w:pPr>
+        <w:spacing w:after="120"/>
+      </w:pPr>
+    </w:p>
+    <w:p>
+      <w:pPr>
+        <w:pStyle w:val="Heading2"/>
+        <w:spacing w:after="120" w:before="280"/>
+      </w:pPr>
+      <w:r>
+        <w:rPr>
+          <w:b/>
+          <w:bCs/>
+          <w:color w:val="2E5AA8"/>
+          <w:sz w:val="25"/>
+          <w:szCs w:val="25"/>
+        </w:rPr>
+        <w:t xml:space="preserve">13.2 Admin Portal</w:t>
+      </w:r>
+    </w:p>
+    <w:p>
+      <w:pPr>
+        <w:pStyle w:val="Heading3"/>
+        <w:spacing w:after="100" w:before="200"/>
+      </w:pPr>
+      <w:r>
+        <w:rPr>
+          <w:b/>
+          <w:bCs/>
+          <w:color w:val="2E5AA8"/>
+          <w:sz w:val="22"/>
+          <w:szCs w:val="22"/>
+        </w:rPr>
+        <w:t xml:space="preserve">Actor</w:t>
+      </w:r>
+    </w:p>
+    <w:p>
+      <w:pPr>
+        <w:spacing w:after="140" w:line="276"/>
+      </w:pPr>
+      <w:r>
+        <w:rPr>
+          <w:b/>
+          <w:bCs/>
+          <w:sz w:val="21"/>
+          <w:szCs w:val="21"/>
+        </w:rPr>
+        <w:t xml:space="preserve">Loan Operations / Servicing analyst</w:t>
+      </w:r>
+      <w:r>
+        <w:rPr>
+          <w:sz w:val="21"/>
+          <w:szCs w:val="21"/>
+        </w:rPr>
+        <w:t xml:space="preserve"> (and supervisors) — signs in with the shared administrator login and can only look, never change. The portal is a separate application from the Lending API.</w:t>
+      </w:r>
+    </w:p>
+    <w:p>
+      <w:pPr>
+        <w:pStyle w:val="Heading3"/>
+        <w:spacing w:after="100" w:before="200"/>
+      </w:pPr>
+      <w:r>
+        <w:rPr>
+          <w:b/>
+          <w:bCs/>
+          <w:color w:val="2E5AA8"/>
+          <w:sz w:val="22"/>
+          <w:szCs w:val="22"/>
+        </w:rPr>
+        <w:t xml:space="preserve">Signing in</w:t>
+      </w:r>
+    </w:p>
+    <w:p>
+      <w:pPr>
+        <w:pStyle w:val="ListParagraph"/>
+        <w:numPr>
+          <w:ilvl w:val="0"/>
+          <w:numId w:val="1"/>
+        </w:numPr>
+        <w:spacing w:after="80" w:line="264"/>
+      </w:pPr>
+      <w:r>
+        <w:rPr>
+          <w:sz w:val="21"/>
+          <w:szCs w:val="21"/>
+        </w:rPr>
+        <w:t xml:space="preserve">User id </w:t>
+      </w:r>
+      <w:r>
+        <w:rPr>
+          <w:b/>
+          <w:bCs/>
+          <w:sz w:val="21"/>
+          <w:szCs w:val="21"/>
+        </w:rPr>
+        <w:t xml:space="preserve">admin</w:t>
+      </w:r>
+      <w:r>
+        <w:rPr>
+          <w:sz w:val="21"/>
+          <w:szCs w:val="21"/>
+        </w:rPr>
+        <w:t xml:space="preserve">. Password: set by the environment variable </w:t>
+      </w:r>
+      <w:r>
+        <w:rPr>
+          <w:rFonts w:ascii="Consolas" w:hAnsi="Consolas" w:cs="Consolas"/>
+          <w:color w:val="1F3864"/>
+          <w:sz w:val="19"/>
+          <w:szCs w:val="19"/>
+        </w:rPr>
+        <w:t xml:space="preserve">ADMIN_PASSWORD</w:t>
+      </w:r>
+      <w:r>
+        <w:rPr>
+          <w:sz w:val="21"/>
+          <w:szCs w:val="21"/>
+        </w:rPr>
+        <w:t xml:space="preserve">; in the Render sandbox it is generated and visible in the Render dashboard (lending-admin-service &gt; Environment). For a local run the default is </w:t>
+      </w:r>
+      <w:r>
+        <w:rPr>
+          <w:rFonts w:ascii="Consolas" w:hAnsi="Consolas" w:cs="Consolas"/>
+          <w:color w:val="1F3864"/>
+          <w:sz w:val="19"/>
+          <w:szCs w:val="19"/>
+        </w:rPr>
+        <w:t xml:space="preserve">changeme</w:t>
+      </w:r>
+      <w:r>
+        <w:rPr>
+          <w:sz w:val="21"/>
+          <w:szCs w:val="21"/>
+        </w:rPr>
+        <w:t xml:space="preserve">.</w:t>
+      </w:r>
+    </w:p>
+    <w:p>
+      <w:pPr>
+        <w:pStyle w:val="ListParagraph"/>
+        <w:numPr>
+          <w:ilvl w:val="0"/>
+          <w:numId w:val="1"/>
+        </w:numPr>
+        <w:spacing w:after="80" w:line="264"/>
+      </w:pPr>
+      <w:r>
+        <w:rPr>
+          <w:sz w:val="21"/>
+          <w:szCs w:val="21"/>
+        </w:rPr>
+        <w:t xml:space="preserve">A wrong or missing login shows the portal's own sign-in screen; there is no self-service password change — an administrator changes the environment variable and redeploys.</w:t>
+      </w:r>
+    </w:p>
+    <w:p>
+      <w:pPr>
+        <w:pStyle w:val="Heading3"/>
+        <w:spacing w:after="100" w:before="200"/>
+      </w:pPr>
+      <w:r>
+        <w:rPr>
+          <w:b/>
+          <w:bCs/>
+          <w:color w:val="2E5AA8"/>
+          <w:sz w:val="22"/>
+          <w:szCs w:val="22"/>
+        </w:rPr>
+        <w:t xml:space="preserve">Screens</w:t>
+      </w:r>
+    </w:p>
+    <w:tbl>
+      <w:tblPr>
+        <w:tblW w:type="dxa" w:w="9500"/>
+        <w:tblBorders>
+          <w:top w:val="single" w:color="auto" w:sz="4"/>
+          <w:left w:val="single" w:color="auto" w:sz="4"/>
+          <w:bottom w:val="single" w:color="auto" w:sz="4"/>
+          <w:right w:val="single" w:color="auto" w:sz="4"/>
+          <w:insideH w:val="single" w:color="auto" w:sz="4"/>
+          <w:insideV w:val="single" w:color="auto" w:sz="4"/>
+        </w:tblBorders>
+      </w:tblPr>
+      <w:tblGrid>
+        <w:gridCol w:w="2100"/>
+        <w:gridCol w:w="7400"/>
+      </w:tblGrid>
+      <w:tr>
+        <w:trPr>
+          <w:tblHeader/>
+        </w:trPr>
+        <w:tc>
+          <w:tcPr>
+            <w:tcW w:type="dxa" w:w="2100"/>
+            <w:shd w:fill="1F3864" w:val="clear"/>
+            <w:tcMar>
+              <w:top w:type="dxa" w:w="60"/>
+              <w:left w:type="dxa" w:w="100"/>
+              <w:bottom w:type="dxa" w:w="60"/>
+              <w:right w:type="dxa" w:w="100"/>
+            </w:tcMar>
+            <w:vAlign w:val="center"/>
+          </w:tcPr>
+          <w:p>
+            <w:pPr>
+              <w:jc w:val="left"/>
+            </w:pPr>
+            <w:r>
+              <w:rPr>
+                <w:b/>
+                <w:bCs/>
+                <w:color w:val="FFFFFF"/>
+                <w:sz w:val="19"/>
+                <w:szCs w:val="19"/>
+              </w:rPr>
+              <w:t xml:space="preserve">Screen</w:t>
+            </w:r>
+          </w:p>
+        </w:tc>
+        <w:tc>
+          <w:tcPr>
+            <w:tcW w:type="dxa" w:w="7400"/>
+            <w:shd w:fill="1F3864" w:val="clear"/>
+            <w:tcMar>
+              <w:top w:type="dxa" w:w="60"/>
+              <w:left w:type="dxa" w:w="100"/>
+              <w:bottom w:type="dxa" w:w="60"/>
+              <w:right w:type="dxa" w:w="100"/>
+            </w:tcMar>
+            <w:vAlign w:val="center"/>
+          </w:tcPr>
+          <w:p>
+            <w:pPr>
+              <w:jc w:val="left"/>
+            </w:pPr>
+            <w:r>
+              <w:rPr>
+                <w:b/>
+                <w:bCs/>
+                <w:color w:val="FFFFFF"/>
+                <w:sz w:val="19"/>
+                <w:szCs w:val="19"/>
+              </w:rPr>
+              <w:t xml:space="preserve">What the user can do</w:t>
+            </w:r>
+          </w:p>
+        </w:tc>
+      </w:tr>
+      <w:tr>
+        <w:trPr>
+          <w:cantSplit/>
+        </w:trPr>
+        <w:tc>
+          <w:tcPr>
+            <w:tcW w:type="dxa" w:w="2100"/>
+            <w:tcMar>
+              <w:top w:type="dxa" w:w="60"/>
+              <w:left w:type="dxa" w:w="100"/>
+              <w:bottom w:type="dxa" w:w="60"/>
+              <w:right w:type="dxa" w:w="100"/>
+            </w:tcMar>
+            <w:vAlign w:val="center"/>
+          </w:tcPr>
+          <w:p>
+            <w:pPr>
+              <w:jc w:val="left"/>
+            </w:pPr>
+            <w:r>
+              <w:rPr>
+                <w:sz w:val="19"/>
+                <w:szCs w:val="19"/>
+              </w:rPr>
+              <w:t xml:space="preserve">Dashboard</w:t>
+            </w:r>
+          </w:p>
+        </w:tc>
+        <w:tc>
+          <w:tcPr>
+            <w:tcW w:type="dxa" w:w="7400"/>
+            <w:tcMar>
+              <w:top w:type="dxa" w:w="60"/>
+              <w:left w:type="dxa" w:w="100"/>
+              <w:bottom w:type="dxa" w:w="60"/>
+              <w:right w:type="dxa" w:w="100"/>
+            </w:tcMar>
+            <w:vAlign w:val="center"/>
+          </w:tcPr>
+          <w:p>
+            <w:pPr>
+              <w:jc w:val="left"/>
+            </w:pPr>
+            <w:r>
+              <w:rPr>
+                <w:sz w:val="19"/>
+                <w:szCs w:val="19"/>
+              </w:rPr>
+              <w:t xml:space="preserve">See total and active accounts, total disbursed, outstanding principal, overdue accounts and amount, instalments due in the next 7 days, collections month-to-date, the latest accrual date, the account-status mix and accrual and collection trends.</w:t>
+            </w:r>
+          </w:p>
+        </w:tc>
+      </w:tr>
+      <w:tr>
+        <w:trPr>
+          <w:cantSplit/>
+        </w:trPr>
+        <w:tc>
+          <w:tcPr>
+            <w:tcW w:type="dxa" w:w="2100"/>
+            <w:shd w:fill="F5F8FC" w:val="clear"/>
+            <w:tcMar>
+              <w:top w:type="dxa" w:w="60"/>
+              <w:left w:type="dxa" w:w="100"/>
+              <w:bottom w:type="dxa" w:w="60"/>
+              <w:right w:type="dxa" w:w="100"/>
+            </w:tcMar>
+            <w:vAlign w:val="center"/>
+          </w:tcPr>
+          <w:p>
+            <w:pPr>
+              <w:jc w:val="left"/>
+            </w:pPr>
+            <w:r>
+              <w:rPr>
+                <w:sz w:val="19"/>
+                <w:szCs w:val="19"/>
+              </w:rPr>
+              <w:t xml:space="preserve">Accounts</w:t>
+            </w:r>
+          </w:p>
+        </w:tc>
+        <w:tc>
+          <w:tcPr>
+            <w:tcW w:type="dxa" w:w="7400"/>
+            <w:shd w:fill="F5F8FC" w:val="clear"/>
+            <w:tcMar>
+              <w:top w:type="dxa" w:w="60"/>
+              <w:left w:type="dxa" w:w="100"/>
+              <w:bottom w:type="dxa" w:w="60"/>
+              <w:right w:type="dxa" w:w="100"/>
+            </w:tcMar>
+            <w:vAlign w:val="center"/>
+          </w:tcPr>
+          <w:p>
+            <w:pPr>
+              <w:jc w:val="left"/>
+            </w:pPr>
+            <w:r>
+              <w:rPr>
+                <w:sz w:val="19"/>
+                <w:szCs w:val="19"/>
+              </w:rPr>
+              <w:t xml:space="preserve">Search by account number or customer id; filter by status, account type and product; sort and page. Open any account.</w:t>
+            </w:r>
+          </w:p>
+        </w:tc>
+      </w:tr>
+      <w:tr>
+        <w:trPr>
+          <w:cantSplit/>
+        </w:trPr>
+        <w:tc>
+          <w:tcPr>
+            <w:tcW w:type="dxa" w:w="2100"/>
+            <w:tcMar>
+              <w:top w:type="dxa" w:w="60"/>
+              <w:left w:type="dxa" w:w="100"/>
+              <w:bottom w:type="dxa" w:w="60"/>
+              <w:right w:type="dxa" w:w="100"/>
+            </w:tcMar>
+            <w:vAlign w:val="center"/>
+          </w:tcPr>
+          <w:p>
+            <w:pPr>
+              <w:jc w:val="left"/>
+            </w:pPr>
+            <w:r>
+              <w:rPr>
+                <w:sz w:val="19"/>
+                <w:szCs w:val="19"/>
+              </w:rPr>
+              <w:t xml:space="preserve">Account — Overview</w:t>
+            </w:r>
+          </w:p>
+        </w:tc>
+        <w:tc>
+          <w:tcPr>
+            <w:tcW w:type="dxa" w:w="7400"/>
+            <w:tcMar>
+              <w:top w:type="dxa" w:w="60"/>
+              <w:left w:type="dxa" w:w="100"/>
+              <w:bottom w:type="dxa" w:w="60"/>
+              <w:right w:type="dxa" w:w="100"/>
+            </w:tcMar>
+            <w:vAlign w:val="center"/>
+          </w:tcPr>
+          <w:p>
+            <w:pPr>
+              <w:jc w:val="left"/>
+            </w:pPr>
+            <w:r>
+              <w:rPr>
+                <w:sz w:val="19"/>
+                <w:szCs w:val="19"/>
+              </w:rPr>
+              <w:t xml:space="preserve">Terms (sanctioned and disbursed amount, rate and type, tenure, EMI, day-count) and live figures: instalments paid of total, next due date and amount, overdue instalments and amount, outstanding principal.</w:t>
+            </w:r>
+          </w:p>
+        </w:tc>
+      </w:tr>
+      <w:tr>
+        <w:trPr>
+          <w:cantSplit/>
+        </w:trPr>
+        <w:tc>
+          <w:tcPr>
+            <w:tcW w:type="dxa" w:w="2100"/>
+            <w:shd w:fill="F5F8FC" w:val="clear"/>
+            <w:tcMar>
+              <w:top w:type="dxa" w:w="60"/>
+              <w:left w:type="dxa" w:w="100"/>
+              <w:bottom w:type="dxa" w:w="60"/>
+              <w:right w:type="dxa" w:w="100"/>
+            </w:tcMar>
+            <w:vAlign w:val="center"/>
+          </w:tcPr>
+          <w:p>
+            <w:pPr>
+              <w:jc w:val="left"/>
+            </w:pPr>
+            <w:r>
+              <w:rPr>
+                <w:sz w:val="19"/>
+                <w:szCs w:val="19"/>
+              </w:rPr>
+              <w:t xml:space="preserve">Account — Amortization</w:t>
+            </w:r>
+          </w:p>
+        </w:tc>
+        <w:tc>
+          <w:tcPr>
+            <w:tcW w:type="dxa" w:w="7400"/>
+            <w:shd w:fill="F5F8FC" w:val="clear"/>
+            <w:tcMar>
+              <w:top w:type="dxa" w:w="60"/>
+              <w:left w:type="dxa" w:w="100"/>
+              <w:bottom w:type="dxa" w:w="60"/>
+              <w:right w:type="dxa" w:w="100"/>
+            </w:tcMar>
+            <w:vAlign w:val="center"/>
+          </w:tcPr>
+          <w:p>
+            <w:pPr>
+              <w:jc w:val="left"/>
+            </w:pPr>
+            <w:r>
+              <w:rPr>
+                <w:sz w:val="19"/>
+                <w:szCs w:val="19"/>
+              </w:rPr>
+              <w:t xml:space="preserve">Full instalment table (due date, principal, interest, EMI, status). Choose the current schedule or any earlier version created by a part-payment or rate reset. Totals for paid, pending and overdue. Export to CSV.</w:t>
+            </w:r>
+          </w:p>
+        </w:tc>
+      </w:tr>
+      <w:tr>
+        <w:trPr>
+          <w:cantSplit/>
+        </w:trPr>
+        <w:tc>
+          <w:tcPr>
+            <w:tcW w:type="dxa" w:w="2100"/>
+            <w:tcMar>
+              <w:top w:type="dxa" w:w="60"/>
+              <w:left w:type="dxa" w:w="100"/>
+              <w:bottom w:type="dxa" w:w="60"/>
+              <w:right w:type="dxa" w:w="100"/>
+            </w:tcMar>
+            <w:vAlign w:val="center"/>
+          </w:tcPr>
+          <w:p>
+            <w:pPr>
+              <w:jc w:val="left"/>
+            </w:pPr>
+            <w:r>
+              <w:rPr>
+                <w:sz w:val="19"/>
+                <w:szCs w:val="19"/>
+              </w:rPr>
+              <w:t xml:space="preserve">Account — Accruals</w:t>
+            </w:r>
+          </w:p>
+        </w:tc>
+        <w:tc>
+          <w:tcPr>
+            <w:tcW w:type="dxa" w:w="7400"/>
+            <w:tcMar>
+              <w:top w:type="dxa" w:w="60"/>
+              <w:left w:type="dxa" w:w="100"/>
+              <w:bottom w:type="dxa" w:w="60"/>
+              <w:right w:type="dxa" w:w="100"/>
+            </w:tcMar>
+            <w:vAlign w:val="center"/>
+          </w:tcPr>
+          <w:p>
+            <w:pPr>
+              <w:jc w:val="left"/>
+            </w:pPr>
+            <w:r>
+              <w:rPr>
+                <w:sz w:val="19"/>
+                <w:szCs w:val="19"/>
+              </w:rPr>
+              <w:t xml:space="preserve">Daily interest accrued for a chosen date range with total and chart.</w:t>
+            </w:r>
+          </w:p>
+        </w:tc>
+      </w:tr>
+      <w:tr>
+        <w:trPr>
+          <w:cantSplit/>
+        </w:trPr>
+        <w:tc>
+          <w:tcPr>
+            <w:tcW w:type="dxa" w:w="2100"/>
+            <w:shd w:fill="F5F8FC" w:val="clear"/>
+            <w:tcMar>
+              <w:top w:type="dxa" w:w="60"/>
+              <w:left w:type="dxa" w:w="100"/>
+              <w:bottom w:type="dxa" w:w="60"/>
+              <w:right w:type="dxa" w:w="100"/>
+            </w:tcMar>
+            <w:vAlign w:val="center"/>
+          </w:tcPr>
+          <w:p>
+            <w:pPr>
+              <w:jc w:val="left"/>
+            </w:pPr>
+            <w:r>
+              <w:rPr>
+                <w:sz w:val="19"/>
+                <w:szCs w:val="19"/>
+              </w:rPr>
+              <w:t xml:space="preserve">Account — Payments</w:t>
+            </w:r>
+          </w:p>
+        </w:tc>
+        <w:tc>
+          <w:tcPr>
+            <w:tcW w:type="dxa" w:w="7400"/>
+            <w:shd w:fill="F5F8FC" w:val="clear"/>
+            <w:tcMar>
+              <w:top w:type="dxa" w:w="60"/>
+              <w:left w:type="dxa" w:w="100"/>
+              <w:bottom w:type="dxa" w:w="60"/>
+              <w:right w:type="dxa" w:w="100"/>
+            </w:tcMar>
+            <w:vAlign w:val="center"/>
+          </w:tcPr>
+          <w:p>
+            <w:pPr>
+              <w:jc w:val="left"/>
+            </w:pPr>
+            <w:r>
+              <w:rPr>
+                <w:sz w:val="19"/>
+                <w:szCs w:val="19"/>
+              </w:rPr>
+              <w:t xml:space="preserve">Every EMI transaction with value date, instalment, type, amount, principal and interest split, channel and status. Export to CSV.</w:t>
+            </w:r>
+          </w:p>
+        </w:tc>
+      </w:tr>
+      <w:tr>
+        <w:trPr>
+          <w:cantSplit/>
+        </w:trPr>
+        <w:tc>
+          <w:tcPr>
+            <w:tcW w:type="dxa" w:w="2100"/>
+            <w:tcMar>
+              <w:top w:type="dxa" w:w="60"/>
+              <w:left w:type="dxa" w:w="100"/>
+              <w:bottom w:type="dxa" w:w="60"/>
+              <w:right w:type="dxa" w:w="100"/>
+            </w:tcMar>
+            <w:vAlign w:val="center"/>
+          </w:tcPr>
+          <w:p>
+            <w:pPr>
+              <w:jc w:val="left"/>
+            </w:pPr>
+            <w:r>
+              <w:rPr>
+                <w:sz w:val="19"/>
+                <w:szCs w:val="19"/>
+              </w:rPr>
+              <w:t xml:space="preserve">Account — Mortgage</w:t>
+            </w:r>
+          </w:p>
+        </w:tc>
+        <w:tc>
+          <w:tcPr>
+            <w:tcW w:type="dxa" w:w="7400"/>
+            <w:tcMar>
+              <w:top w:type="dxa" w:w="60"/>
+              <w:left w:type="dxa" w:w="100"/>
+              <w:bottom w:type="dxa" w:w="60"/>
+              <w:right w:type="dxa" w:w="100"/>
+            </w:tcMar>
+            <w:vAlign w:val="center"/>
+          </w:tcPr>
+          <w:p>
+            <w:pPr>
+              <w:jc w:val="left"/>
+            </w:pPr>
+            <w:r>
+              <w:rPr>
+                <w:sz w:val="19"/>
+                <w:szCs w:val="19"/>
+              </w:rPr>
+              <w:t xml:space="preserve">For mortgage loans: property details, charge and registration references, LTV and valuation history.</w:t>
+            </w:r>
+          </w:p>
+        </w:tc>
+      </w:tr>
+      <w:tr>
+        <w:trPr>
+          <w:cantSplit/>
+        </w:trPr>
+        <w:tc>
+          <w:tcPr>
+            <w:tcW w:type="dxa" w:w="2100"/>
+            <w:shd w:fill="F5F8FC" w:val="clear"/>
+            <w:tcMar>
+              <w:top w:type="dxa" w:w="60"/>
+              <w:left w:type="dxa" w:w="100"/>
+              <w:bottom w:type="dxa" w:w="60"/>
+              <w:right w:type="dxa" w:w="100"/>
+            </w:tcMar>
+            <w:vAlign w:val="center"/>
+          </w:tcPr>
+          <w:p>
+            <w:pPr>
+              <w:jc w:val="left"/>
+            </w:pPr>
+            <w:r>
+              <w:rPr>
+                <w:sz w:val="19"/>
+                <w:szCs w:val="19"/>
+              </w:rPr>
+              <w:t xml:space="preserve">Download statement</w:t>
+            </w:r>
+          </w:p>
+        </w:tc>
+        <w:tc>
+          <w:tcPr>
+            <w:tcW w:type="dxa" w:w="7400"/>
+            <w:shd w:fill="F5F8FC" w:val="clear"/>
+            <w:tcMar>
+              <w:top w:type="dxa" w:w="60"/>
+              <w:left w:type="dxa" w:w="100"/>
+              <w:bottom w:type="dxa" w:w="60"/>
+              <w:right w:type="dxa" w:w="100"/>
+            </w:tcMar>
+            <w:vAlign w:val="center"/>
+          </w:tcPr>
+          <w:p>
+            <w:pPr>
+              <w:jc w:val="left"/>
+            </w:pPr>
+            <w:r>
+              <w:rPr>
+                <w:sz w:val="19"/>
+                <w:szCs w:val="19"/>
+              </w:rPr>
+              <w:t xml:space="preserve">Button on the account page that downloads the customer PDF statement.</w:t>
+            </w:r>
+          </w:p>
+        </w:tc>
+      </w:tr>
+      <w:tr>
+        <w:trPr>
+          <w:cantSplit/>
+        </w:trPr>
+        <w:tc>
+          <w:tcPr>
+            <w:tcW w:type="dxa" w:w="2100"/>
+            <w:tcMar>
+              <w:top w:type="dxa" w:w="60"/>
+              <w:left w:type="dxa" w:w="100"/>
+              <w:bottom w:type="dxa" w:w="60"/>
+              <w:right w:type="dxa" w:w="100"/>
+            </w:tcMar>
+            <w:vAlign w:val="center"/>
+          </w:tcPr>
+          <w:p>
+            <w:pPr>
+              <w:jc w:val="left"/>
+            </w:pPr>
+            <w:r>
+              <w:rPr>
+                <w:sz w:val="19"/>
+                <w:szCs w:val="19"/>
+              </w:rPr>
+              <w:t xml:space="preserve">Upcoming payments</w:t>
+            </w:r>
+          </w:p>
+        </w:tc>
+        <w:tc>
+          <w:tcPr>
+            <w:tcW w:type="dxa" w:w="7400"/>
+            <w:tcMar>
+              <w:top w:type="dxa" w:w="60"/>
+              <w:left w:type="dxa" w:w="100"/>
+              <w:bottom w:type="dxa" w:w="60"/>
+              <w:right w:type="dxa" w:w="100"/>
+            </w:tcMar>
+            <w:vAlign w:val="center"/>
+          </w:tcPr>
+          <w:p>
+            <w:pPr>
+              <w:jc w:val="left"/>
+            </w:pPr>
+            <w:r>
+              <w:rPr>
+                <w:sz w:val="19"/>
+                <w:szCs w:val="19"/>
+              </w:rPr>
+              <w:t xml:space="preserve">Instalments due in the next 7, 15, 30, 60 or 90 days, filterable by product, with count and total expected.</w:t>
+            </w:r>
+          </w:p>
+        </w:tc>
+      </w:tr>
+      <w:tr>
+        <w:trPr>
+          <w:cantSplit/>
+        </w:trPr>
+        <w:tc>
+          <w:tcPr>
+            <w:tcW w:type="dxa" w:w="2100"/>
+            <w:shd w:fill="F5F8FC" w:val="clear"/>
+            <w:tcMar>
+              <w:top w:type="dxa" w:w="60"/>
+              <w:left w:type="dxa" w:w="100"/>
+              <w:bottom w:type="dxa" w:w="60"/>
+              <w:right w:type="dxa" w:w="100"/>
+            </w:tcMar>
+            <w:vAlign w:val="center"/>
+          </w:tcPr>
+          <w:p>
+            <w:pPr>
+              <w:jc w:val="left"/>
+            </w:pPr>
+            <w:r>
+              <w:rPr>
+                <w:sz w:val="19"/>
+                <w:szCs w:val="19"/>
+              </w:rPr>
+              <w:t xml:space="preserve">Overdue</w:t>
+            </w:r>
+          </w:p>
+        </w:tc>
+        <w:tc>
+          <w:tcPr>
+            <w:tcW w:type="dxa" w:w="7400"/>
+            <w:shd w:fill="F5F8FC" w:val="clear"/>
+            <w:tcMar>
+              <w:top w:type="dxa" w:w="60"/>
+              <w:left w:type="dxa" w:w="100"/>
+              <w:bottom w:type="dxa" w:w="60"/>
+              <w:right w:type="dxa" w:w="100"/>
+            </w:tcMar>
+            <w:vAlign w:val="center"/>
+          </w:tcPr>
+          <w:p>
+            <w:pPr>
+              <w:jc w:val="left"/>
+            </w:pPr>
+            <w:r>
+              <w:rPr>
+                <w:sz w:val="19"/>
+                <w:szCs w:val="19"/>
+              </w:rPr>
+              <w:t xml:space="preserve">Unpaid instalments past their due date with days past due, plus a summary by bucket (1-30, 31-60, 61-90, 90+ days).</w:t>
+            </w:r>
+          </w:p>
+        </w:tc>
+      </w:tr>
+      <w:tr>
+        <w:trPr>
+          <w:cantSplit/>
+        </w:trPr>
+        <w:tc>
+          <w:tcPr>
+            <w:tcW w:type="dxa" w:w="2100"/>
+            <w:tcMar>
+              <w:top w:type="dxa" w:w="60"/>
+              <w:left w:type="dxa" w:w="100"/>
+              <w:bottom w:type="dxa" w:w="60"/>
+              <w:right w:type="dxa" w:w="100"/>
+            </w:tcMar>
+            <w:vAlign w:val="center"/>
+          </w:tcPr>
+          <w:p>
+            <w:pPr>
+              <w:jc w:val="left"/>
+            </w:pPr>
+            <w:r>
+              <w:rPr>
+                <w:sz w:val="19"/>
+                <w:szCs w:val="19"/>
+              </w:rPr>
+              <w:t xml:space="preserve">Payments</w:t>
+            </w:r>
+          </w:p>
+        </w:tc>
+        <w:tc>
+          <w:tcPr>
+            <w:tcW w:type="dxa" w:w="7400"/>
+            <w:tcMar>
+              <w:top w:type="dxa" w:w="60"/>
+              <w:left w:type="dxa" w:w="100"/>
+              <w:bottom w:type="dxa" w:w="60"/>
+              <w:right w:type="dxa" w:w="100"/>
+            </w:tcMar>
+            <w:vAlign w:val="center"/>
+          </w:tcPr>
+          <w:p>
+            <w:pPr>
+              <w:jc w:val="left"/>
+            </w:pPr>
+            <w:r>
+              <w:rPr>
+                <w:sz w:val="19"/>
+                <w:szCs w:val="19"/>
+              </w:rPr>
+              <w:t xml:space="preserve">All EMI transactions across accounts; filter by status, date range or account; see failed payments.</w:t>
+            </w:r>
+          </w:p>
+        </w:tc>
+      </w:tr>
+      <w:tr>
+        <w:trPr>
+          <w:cantSplit/>
+        </w:trPr>
+        <w:tc>
+          <w:tcPr>
+            <w:tcW w:type="dxa" w:w="2100"/>
+            <w:shd w:fill="F5F8FC" w:val="clear"/>
+            <w:tcMar>
+              <w:top w:type="dxa" w:w="60"/>
+              <w:left w:type="dxa" w:w="100"/>
+              <w:bottom w:type="dxa" w:w="60"/>
+              <w:right w:type="dxa" w:w="100"/>
+            </w:tcMar>
+            <w:vAlign w:val="center"/>
+          </w:tcPr>
+          <w:p>
+            <w:pPr>
+              <w:jc w:val="left"/>
+            </w:pPr>
+            <w:r>
+              <w:rPr>
+                <w:sz w:val="19"/>
+                <w:szCs w:val="19"/>
+              </w:rPr>
+              <w:t xml:space="preserve">Accruals</w:t>
+            </w:r>
+          </w:p>
+        </w:tc>
+        <w:tc>
+          <w:tcPr>
+            <w:tcW w:type="dxa" w:w="7400"/>
+            <w:shd w:fill="F5F8FC" w:val="clear"/>
+            <w:tcMar>
+              <w:top w:type="dxa" w:w="60"/>
+              <w:left w:type="dxa" w:w="100"/>
+              <w:bottom w:type="dxa" w:w="60"/>
+              <w:right w:type="dxa" w:w="100"/>
+            </w:tcMar>
+            <w:vAlign w:val="center"/>
+          </w:tcPr>
+          <w:p>
+            <w:pPr>
+              <w:jc w:val="left"/>
+            </w:pPr>
+            <w:r>
+              <w:rPr>
+                <w:sz w:val="19"/>
+                <w:szCs w:val="19"/>
+              </w:rPr>
+              <w:t xml:space="preserve">Daily accrual totals across the book; click a date to list each account's accrual.</w:t>
+            </w:r>
+          </w:p>
+        </w:tc>
+      </w:tr>
+      <w:tr>
+        <w:trPr>
+          <w:cantSplit/>
+        </w:trPr>
+        <w:tc>
+          <w:tcPr>
+            <w:tcW w:type="dxa" w:w="2100"/>
+            <w:tcMar>
+              <w:top w:type="dxa" w:w="60"/>
+              <w:left w:type="dxa" w:w="100"/>
+              <w:bottom w:type="dxa" w:w="60"/>
+              <w:right w:type="dxa" w:w="100"/>
+            </w:tcMar>
+            <w:vAlign w:val="center"/>
+          </w:tcPr>
+          <w:p>
+            <w:pPr>
+              <w:jc w:val="left"/>
+            </w:pPr>
+            <w:r>
+              <w:rPr>
+                <w:sz w:val="19"/>
+                <w:szCs w:val="19"/>
+              </w:rPr>
+              <w:t xml:space="preserve">Ledger outbox</w:t>
+            </w:r>
+          </w:p>
+        </w:tc>
+        <w:tc>
+          <w:tcPr>
+            <w:tcW w:type="dxa" w:w="7400"/>
+            <w:tcMar>
+              <w:top w:type="dxa" w:w="60"/>
+              <w:left w:type="dxa" w:w="100"/>
+              <w:bottom w:type="dxa" w:w="60"/>
+              <w:right w:type="dxa" w:w="100"/>
+            </w:tcMar>
+            <w:vAlign w:val="center"/>
+          </w:tcPr>
+          <w:p>
+            <w:pPr>
+              <w:jc w:val="left"/>
+            </w:pPr>
+            <w:r>
+              <w:rPr>
+                <w:sz w:val="19"/>
+                <w:szCs w:val="19"/>
+              </w:rPr>
+              <w:t xml:space="preserve">Counts of PENDING, POSTED and FAILED ledger entries and the individual entries with retry counts.</w:t>
+            </w:r>
+          </w:p>
+        </w:tc>
+      </w:tr>
+      <w:tr>
+        <w:trPr>
+          <w:cantSplit/>
+        </w:trPr>
+        <w:tc>
+          <w:tcPr>
+            <w:tcW w:type="dxa" w:w="2100"/>
+            <w:shd w:fill="F5F8FC" w:val="clear"/>
+            <w:tcMar>
+              <w:top w:type="dxa" w:w="60"/>
+              <w:left w:type="dxa" w:w="100"/>
+              <w:bottom w:type="dxa" w:w="60"/>
+              <w:right w:type="dxa" w:w="100"/>
+            </w:tcMar>
+            <w:vAlign w:val="center"/>
+          </w:tcPr>
+          <w:p>
+            <w:pPr>
+              <w:jc w:val="left"/>
+            </w:pPr>
+            <w:r>
+              <w:rPr>
+                <w:sz w:val="19"/>
+                <w:szCs w:val="19"/>
+              </w:rPr>
+              <w:t xml:space="preserve">Batch</w:t>
+            </w:r>
+          </w:p>
+        </w:tc>
+        <w:tc>
+          <w:tcPr>
+            <w:tcW w:type="dxa" w:w="7400"/>
+            <w:shd w:fill="F5F8FC" w:val="clear"/>
+            <w:tcMar>
+              <w:top w:type="dxa" w:w="60"/>
+              <w:left w:type="dxa" w:w="100"/>
+              <w:bottom w:type="dxa" w:w="60"/>
+              <w:right w:type="dxa" w:w="100"/>
+            </w:tcMar>
+            <w:vAlign w:val="center"/>
+          </w:tcPr>
+          <w:p>
+            <w:pPr>
+              <w:jc w:val="left"/>
+            </w:pPr>
+            <w:r>
+              <w:rPr>
+                <w:sz w:val="19"/>
+                <w:szCs w:val="19"/>
+              </w:rPr>
+              <w:t xml:space="preserve">The 36 batch job slots and recent executions; empty until the batch service has run.</w:t>
+            </w:r>
+          </w:p>
+        </w:tc>
+      </w:tr>
+    </w:tbl>
+    <w:p>
+      <w:pPr>
+        <w:spacing w:after="120"/>
+      </w:pPr>
+    </w:p>
+    <w:p>
+      <w:pPr>
+        <w:pStyle w:val="Heading3"/>
+        <w:spacing w:after="100" w:before="200"/>
+      </w:pPr>
+      <w:r>
+        <w:rPr>
+          <w:b/>
+          <w:bCs/>
+          <w:color w:val="2E5AA8"/>
+          <w:sz w:val="22"/>
+          <w:szCs w:val="22"/>
+        </w:rPr>
+        <w:t xml:space="preserve">Business rules the portal applies</w:t>
+      </w:r>
+    </w:p>
+    <w:p>
+      <w:pPr>
+        <w:pStyle w:val="ListParagraph"/>
+        <w:numPr>
+          <w:ilvl w:val="0"/>
+          <w:numId w:val="1"/>
+        </w:numPr>
+        <w:spacing w:after="80" w:line="264"/>
+      </w:pPr>
+      <w:r>
+        <w:rPr>
+          <w:b/>
+          <w:bCs/>
+          <w:sz w:val="21"/>
+          <w:szCs w:val="21"/>
+        </w:rPr>
+        <w:t xml:space="preserve">Current schedule:</w:t>
+      </w:r>
+      <w:r>
+        <w:rPr>
+          <w:sz w:val="21"/>
+          <w:szCs w:val="21"/>
+        </w:rPr>
+        <w:t xml:space="preserve"> for each instalment the highest schedule version wins. Earlier versions stay viewable.</w:t>
+      </w:r>
+    </w:p>
+    <w:p>
+      <w:pPr>
+        <w:pStyle w:val="ListParagraph"/>
+        <w:numPr>
+          <w:ilvl w:val="0"/>
+          <w:numId w:val="1"/>
+        </w:numPr>
+        <w:spacing w:after="80" w:line="264"/>
+      </w:pPr>
+      <w:r>
+        <w:rPr>
+          <w:b/>
+          <w:bCs/>
+          <w:sz w:val="21"/>
+          <w:szCs w:val="21"/>
+        </w:rPr>
+        <w:t xml:space="preserve">Overdue:</w:t>
+      </w:r>
+      <w:r>
+        <w:rPr>
+          <w:sz w:val="21"/>
+          <w:szCs w:val="21"/>
+        </w:rPr>
+        <w:t xml:space="preserve"> an instalment that is not PAID and whose due date is before today (India time) is overdue. Days past due = today minus the oldest unpaid due date of the account.</w:t>
+      </w:r>
+    </w:p>
+    <w:p>
+      <w:pPr>
+        <w:pStyle w:val="ListParagraph"/>
+        <w:numPr>
+          <w:ilvl w:val="0"/>
+          <w:numId w:val="1"/>
+        </w:numPr>
+        <w:spacing w:after="80" w:line="264"/>
+      </w:pPr>
+      <w:r>
+        <w:rPr>
+          <w:b/>
+          <w:bCs/>
+          <w:sz w:val="21"/>
+          <w:szCs w:val="21"/>
+        </w:rPr>
+        <w:t xml:space="preserve">Which accounts count:</w:t>
+      </w:r>
+      <w:r>
+        <w:rPr>
+          <w:sz w:val="21"/>
+          <w:szCs w:val="21"/>
+        </w:rPr>
+        <w:t xml:space="preserve"> overdue, upcoming and dashboard figures exclude accounts that are PENDING_DISBURSEMENT, CLOSED, FORECLOSED or WRITTEN_OFF.</w:t>
+      </w:r>
+    </w:p>
+    <w:p>
+      <w:pPr>
+        <w:pStyle w:val="ListParagraph"/>
+        <w:numPr>
+          <w:ilvl w:val="0"/>
+          <w:numId w:val="1"/>
+        </w:numPr>
+        <w:spacing w:after="80" w:line="264"/>
+      </w:pPr>
+      <w:r>
+        <w:rPr>
+          <w:b/>
+          <w:bCs/>
+          <w:sz w:val="21"/>
+          <w:szCs w:val="21"/>
+        </w:rPr>
+        <w:t xml:space="preserve">Outstanding principal:</w:t>
+      </w:r>
+      <w:r>
+        <w:rPr>
+          <w:sz w:val="21"/>
+          <w:szCs w:val="21"/>
+        </w:rPr>
+        <w:t xml:space="preserve"> not shown before disbursement; zero for closed and foreclosed loans.</w:t>
+      </w:r>
+    </w:p>
+    <w:p>
+      <w:pPr>
+        <w:pStyle w:val="ListParagraph"/>
+        <w:numPr>
+          <w:ilvl w:val="0"/>
+          <w:numId w:val="1"/>
+        </w:numPr>
+        <w:spacing w:after="80" w:line="264"/>
+      </w:pPr>
+      <w:r>
+        <w:rPr>
+          <w:b/>
+          <w:bCs/>
+          <w:sz w:val="21"/>
+          <w:szCs w:val="21"/>
+        </w:rPr>
+        <w:t xml:space="preserve">Upcoming:</w:t>
+      </w:r>
+      <w:r>
+        <w:rPr>
+          <w:sz w:val="21"/>
+          <w:szCs w:val="21"/>
+        </w:rPr>
+        <w:t xml:space="preserve"> unpaid instalments with a due date from today up to the selected window.</w:t>
+      </w:r>
+    </w:p>
+    <w:p>
+      <w:pPr>
+        <w:pStyle w:val="ListParagraph"/>
+        <w:numPr>
+          <w:ilvl w:val="0"/>
+          <w:numId w:val="1"/>
+        </w:numPr>
+        <w:spacing w:after="80" w:line="264"/>
+      </w:pPr>
+      <w:r>
+        <w:rPr>
+          <w:b/>
+          <w:bCs/>
+          <w:sz w:val="21"/>
+          <w:szCs w:val="21"/>
+        </w:rPr>
+        <w:t xml:space="preserve">Collections month-to-date:</w:t>
+      </w:r>
+      <w:r>
+        <w:rPr>
+          <w:sz w:val="21"/>
+          <w:szCs w:val="21"/>
+        </w:rPr>
+        <w:t xml:space="preserve"> sum of successful EMI transactions with a value date in the current month.</w:t>
+      </w:r>
+    </w:p>
+    <w:p>
+      <w:pPr>
+        <w:pStyle w:val="ListParagraph"/>
+        <w:numPr>
+          <w:ilvl w:val="0"/>
+          <w:numId w:val="1"/>
+        </w:numPr>
+        <w:spacing w:after="80" w:line="264"/>
+      </w:pPr>
+      <w:r>
+        <w:rPr>
+          <w:b/>
+          <w:bCs/>
+          <w:sz w:val="21"/>
+          <w:szCs w:val="21"/>
+        </w:rPr>
+        <w:t xml:space="preserve">Read-only:</w:t>
+      </w:r>
+      <w:r>
+        <w:rPr>
+          <w:sz w:val="21"/>
+          <w:szCs w:val="21"/>
+        </w:rPr>
+        <w:t xml:space="preserve"> the portal cannot create, change, disburse, waive or post anything. Corrections are made through the Lending API.</w:t>
+      </w:r>
+    </w:p>
+    <w:p>
+      <w:pPr>
+        <w:pStyle w:val="Heading3"/>
+        <w:spacing w:after="100" w:before="200"/>
+      </w:pPr>
+      <w:r>
+        <w:rPr>
+          <w:b/>
+          <w:bCs/>
+          <w:color w:val="2E5AA8"/>
+          <w:sz w:val="22"/>
+          <w:szCs w:val="22"/>
+        </w:rPr>
+        <w:t xml:space="preserve">Limits</w:t>
+      </w:r>
+    </w:p>
+    <w:p>
+      <w:pPr>
+        <w:pStyle w:val="ListParagraph"/>
+        <w:numPr>
+          <w:ilvl w:val="0"/>
+          <w:numId w:val="1"/>
+        </w:numPr>
+        <w:spacing w:after="80" w:line="264"/>
+      </w:pPr>
+      <w:r>
+        <w:rPr>
+          <w:sz w:val="21"/>
+          <w:szCs w:val="21"/>
+        </w:rPr>
+        <w:t xml:space="preserve">Single shared login with no individual users, roles or audit trail.</w:t>
+      </w:r>
+    </w:p>
+    <w:p>
+      <w:pPr>
+        <w:pStyle w:val="ListParagraph"/>
+        <w:numPr>
+          <w:ilvl w:val="0"/>
+          <w:numId w:val="1"/>
+        </w:numPr>
+        <w:spacing w:after="80" w:line="264"/>
+      </w:pPr>
+      <w:r>
+        <w:rPr>
+          <w:sz w:val="21"/>
+          <w:szCs w:val="21"/>
+        </w:rPr>
+        <w:t xml:space="preserve">Data is as fresh as the database; there is no caching, but the sandbox may be asleep (first load takes about a minute).</w:t>
+      </w:r>
+    </w:p>
+    <w:p>
+      <w:pPr>
+        <w:pStyle w:val="ListParagraph"/>
+        <w:numPr>
+          <w:ilvl w:val="0"/>
+          <w:numId w:val="1"/>
+        </w:numPr>
+        <w:spacing w:after="80" w:line="264"/>
+      </w:pPr>
+      <w:r>
+        <w:rPr>
+          <w:sz w:val="21"/>
+          <w:szCs w:val="21"/>
+        </w:rPr>
+        <w:t xml:space="preserve">The statement download needs the portal to be configured with the Lending API address.</w:t>
+      </w:r>
+    </w:p>
+    <w:p>
+      <w:pPr>
+        <w:pStyle w:val="Heading2"/>
+        <w:spacing w:after="120" w:before="280"/>
+      </w:pPr>
+      <w:r>
+        <w:rPr>
+          <w:b/>
+          <w:bCs/>
+          <w:color w:val="2E5AA8"/>
+          <w:sz w:val="25"/>
+          <w:szCs w:val="25"/>
+        </w:rPr>
+        <w:t xml:space="preserve">13.3 Customer Statement (PDF)</w:t>
+      </w:r>
+    </w:p>
+    <w:p>
+      <w:pPr>
+        <w:spacing w:after="140" w:line="276"/>
+      </w:pPr>
+      <w:r>
+        <w:rPr>
+          <w:b/>
+          <w:bCs/>
+          <w:sz w:val="21"/>
+          <w:szCs w:val="21"/>
+        </w:rPr>
+        <w:t xml:space="preserve">Endpoints:</w:t>
+      </w:r>
+      <w:r>
+        <w:rPr>
+          <w:sz w:val="21"/>
+          <w:szCs w:val="21"/>
+        </w:rPr>
+        <w:t xml:space="preserve"> </w:t>
+      </w:r>
+      <w:r>
+        <w:rPr>
+          <w:rFonts w:ascii="Consolas" w:hAnsi="Consolas" w:cs="Consolas"/>
+          <w:color w:val="1F3864"/>
+          <w:sz w:val="19"/>
+          <w:szCs w:val="19"/>
+        </w:rPr>
+        <w:t xml:space="preserve">GET /api/v1/loan-accounts/{accountId}/statement</w:t>
+      </w:r>
+      <w:r>
+        <w:rPr>
+          <w:sz w:val="21"/>
+          <w:szCs w:val="21"/>
+        </w:rPr>
+        <w:t xml:space="preserve"> and </w:t>
+      </w:r>
+      <w:r>
+        <w:rPr>
+          <w:rFonts w:ascii="Consolas" w:hAnsi="Consolas" w:cs="Consolas"/>
+          <w:color w:val="1F3864"/>
+          <w:sz w:val="19"/>
+          <w:szCs w:val="19"/>
+        </w:rPr>
+        <w:t xml:space="preserve">GET /api/v1/loan-accounts/by-account-number/{accountNumber}/statement</w:t>
+      </w:r>
+      <w:r>
+        <w:rPr>
+          <w:sz w:val="21"/>
+          <w:szCs w:val="21"/>
+        </w:rPr>
+        <w:t xml:space="preserve">. Response is a PDF.</w:t>
+      </w:r>
+    </w:p>
+    <w:p>
+      <w:pPr>
+        <w:pStyle w:val="ListParagraph"/>
+        <w:numPr>
+          <w:ilvl w:val="0"/>
+          <w:numId w:val="1"/>
+        </w:numPr>
+        <w:spacing w:after="80" w:line="264"/>
+      </w:pPr>
+      <w:r>
+        <w:rPr>
+          <w:b/>
+          <w:bCs/>
+          <w:sz w:val="21"/>
+          <w:szCs w:val="21"/>
+        </w:rPr>
+        <w:t xml:space="preserve">Contents:</w:t>
+      </w:r>
+      <w:r>
+        <w:rPr>
+          <w:sz w:val="21"/>
+          <w:szCs w:val="21"/>
+        </w:rPr>
+        <w:t xml:space="preserve"> account and loan terms; the repayment table in instalment order (instalments already paid under an earlier schedule version, followed by the current schedule); the payments that reached the account (successful or still processing); and summary figures — instalments paid of total, next instalment, overdue amount, total paid and outstanding principal.</w:t>
+      </w:r>
+    </w:p>
+    <w:p>
+      <w:pPr>
+        <w:pStyle w:val="ListParagraph"/>
+        <w:numPr>
+          <w:ilvl w:val="0"/>
+          <w:numId w:val="1"/>
+        </w:numPr>
+        <w:spacing w:after="80" w:line="264"/>
+      </w:pPr>
+      <w:r>
+        <w:rPr>
+          <w:b/>
+          <w:bCs/>
+          <w:sz w:val="21"/>
+          <w:szCs w:val="21"/>
+        </w:rPr>
+        <w:t xml:space="preserve">Rules:</w:t>
+      </w:r>
+      <w:r>
+        <w:rPr>
+          <w:sz w:val="21"/>
+          <w:szCs w:val="21"/>
+        </w:rPr>
+        <w:t xml:space="preserve"> outstanding principal is not stated before disbursement; closed and foreclosed loans show nothing owed. </w:t>
+      </w:r>
+    </w:p>
+    <w:p>
+      <w:pPr>
+        <w:pStyle w:val="Heading2"/>
+        <w:spacing w:after="120" w:before="280"/>
+      </w:pPr>
+      <w:r>
+        <w:rPr>
+          <w:b/>
+          <w:bCs/>
+          <w:color w:val="2E5AA8"/>
+          <w:sz w:val="25"/>
+          <w:szCs w:val="25"/>
+        </w:rPr>
+        <w:t xml:space="preserve">13.4 Bulk Create and Bulk Disburse</w:t>
+      </w:r>
+    </w:p>
+    <w:p>
+      <w:pPr>
+        <w:pStyle w:val="ListParagraph"/>
+        <w:numPr>
+          <w:ilvl w:val="0"/>
+          <w:numId w:val="1"/>
+        </w:numPr>
+        <w:spacing w:after="80" w:line="264"/>
+      </w:pPr>
+      <w:r>
+        <w:rPr>
+          <w:rFonts w:ascii="Consolas" w:hAnsi="Consolas" w:cs="Consolas"/>
+          <w:color w:val="1F3864"/>
+          <w:sz w:val="19"/>
+          <w:szCs w:val="19"/>
+        </w:rPr>
+        <w:t xml:space="preserve">POST /api/v1/loan-accounts/bulk/create</w:t>
+      </w:r>
+      <w:r>
+        <w:rPr>
+          <w:sz w:val="21"/>
+          <w:szCs w:val="21"/>
+        </w:rPr>
+        <w:t xml:space="preserve"> and </w:t>
+      </w:r>
+      <w:r>
+        <w:rPr>
+          <w:rFonts w:ascii="Consolas" w:hAnsi="Consolas" w:cs="Consolas"/>
+          <w:color w:val="1F3864"/>
+          <w:sz w:val="19"/>
+          <w:szCs w:val="19"/>
+        </w:rPr>
+        <w:t xml:space="preserve">POST /api/v1/loan-accounts/bulk/disburse</w:t>
+      </w:r>
+      <w:r>
+        <w:rPr>
+          <w:sz w:val="21"/>
+          <w:szCs w:val="21"/>
+        </w:rPr>
+        <w:t xml:space="preserve"> accept up to 200 items.</w:t>
+      </w:r>
+    </w:p>
+    <w:p>
+      <w:pPr>
+        <w:pStyle w:val="ListParagraph"/>
+        <w:numPr>
+          <w:ilvl w:val="0"/>
+          <w:numId w:val="1"/>
+        </w:numPr>
+        <w:spacing w:after="80" w:line="264"/>
+      </w:pPr>
+      <w:r>
+        <w:rPr>
+          <w:sz w:val="21"/>
+          <w:szCs w:val="21"/>
+        </w:rPr>
+        <w:t xml:space="preserve">Each item succeeds or fails on its own and gets its own result; a failing item never rolls back the others.</w:t>
+      </w:r>
+    </w:p>
+    <w:p>
+      <w:pPr>
+        <w:pStyle w:val="ListParagraph"/>
+        <w:numPr>
+          <w:ilvl w:val="0"/>
+          <w:numId w:val="1"/>
+        </w:numPr>
+        <w:spacing w:after="80" w:line="264"/>
+      </w:pPr>
+      <w:r>
+        <w:rPr>
+          <w:sz w:val="21"/>
+          <w:szCs w:val="21"/>
+        </w:rPr>
+        <w:t xml:space="preserve">Both calls are idempotent (the same request can be re-sent safely after a timeout).</w:t>
+      </w:r>
+    </w:p>
+    <w:p>
+      <w:pPr>
+        <w:pStyle w:val="ListParagraph"/>
+        <w:numPr>
+          <w:ilvl w:val="0"/>
+          <w:numId w:val="1"/>
+        </w:numPr>
+        <w:spacing w:after="80" w:line="264"/>
+      </w:pPr>
+      <w:r>
+        <w:rPr>
+          <w:sz w:val="21"/>
+          <w:szCs w:val="21"/>
+        </w:rPr>
+        <w:t xml:space="preserve">Sample payloads for 100 accounts are in the repository's </w:t>
+      </w:r>
+      <w:r>
+        <w:rPr>
+          <w:rFonts w:ascii="Consolas" w:hAnsi="Consolas" w:cs="Consolas"/>
+          <w:color w:val="1F3864"/>
+          <w:sz w:val="19"/>
+          <w:szCs w:val="19"/>
+        </w:rPr>
+        <w:t xml:space="preserve">samples/</w:t>
+      </w:r>
+      <w:r>
+        <w:rPr>
+          <w:sz w:val="21"/>
+          <w:szCs w:val="21"/>
+        </w:rPr>
+        <w:t xml:space="preserve"> folder; Swagger shows a valid example body for each call.</w:t>
+      </w:r>
+    </w:p>
+    <w:p>
+      <w:pPr>
+        <w:pStyle w:val="Heading2"/>
+        <w:spacing w:after="120" w:before="280"/>
+      </w:pPr>
+      <w:r>
+        <w:rPr>
+          <w:b/>
+          <w:bCs/>
+          <w:color w:val="2E5AA8"/>
+          <w:sz w:val="25"/>
+          <w:szCs w:val="25"/>
+        </w:rPr>
+        <w:t xml:space="preserve">13.5 Running Accrual for All Accounts</w:t>
+      </w:r>
+    </w:p>
+    <w:p>
+      <w:pPr>
+        <w:spacing w:after="140" w:line="276"/>
+      </w:pPr>
+      <w:r>
+        <w:rPr>
+          <w:sz w:val="21"/>
+          <w:szCs w:val="21"/>
+        </w:rPr>
+        <w:t xml:space="preserve">Daily interest accrues for every ACTIVE account through </w:t>
+      </w:r>
+      <w:r>
+        <w:rPr>
+          <w:rFonts w:ascii="Consolas" w:hAnsi="Consolas" w:cs="Consolas"/>
+          <w:color w:val="1F3864"/>
+          <w:sz w:val="19"/>
+          <w:szCs w:val="19"/>
+        </w:rPr>
+        <w:t xml:space="preserve">POST /api/v1/interest-accruals/run?businessDate=YYYY-MM-DD</w:t>
+      </w:r>
+      <w:r>
+        <w:rPr>
+          <w:sz w:val="21"/>
+          <w:szCs w:val="21"/>
+        </w:rPr>
+        <w:t xml:space="preserve"> (§5.3). The </w:t>
+      </w:r>
+      <w:r>
+        <w:rPr>
+          <w:rFonts w:ascii="Consolas" w:hAnsi="Consolas" w:cs="Consolas"/>
+          <w:color w:val="1F3864"/>
+          <w:sz w:val="19"/>
+          <w:szCs w:val="19"/>
+        </w:rPr>
+        <w:t xml:space="preserve">scripts/run-accrual</w:t>
+      </w:r>
+      <w:r>
+        <w:rPr>
+          <w:sz w:val="21"/>
+          <w:szCs w:val="21"/>
+        </w:rPr>
+        <w:t xml:space="preserve"> scripts (bash and PowerShell) wrap the call: set BASE_URL, optionally BUSINESS_DATE (default: today in India) and CHECK_ACCOUNT_ID for a spot check; the script retries while a sleeping sandbox wakes. Running it twice for the same date is harmless.</w:t>
+      </w:r>
+    </w:p>
+    <w:p>
+      <w:pPr>
+        <w:pStyle w:val="Heading3"/>
+        <w:spacing w:after="100" w:before="200"/>
+      </w:pPr>
+      <w:r>
+        <w:rPr>
+          <w:b/>
+          <w:bCs/>
+          <w:color w:val="2E5AA8"/>
+          <w:sz w:val="22"/>
+          <w:szCs w:val="22"/>
+        </w:rPr>
+        <w:t xml:space="preserve">The 409 Conflict on accrual or EMI posting</w:t>
+      </w:r>
+    </w:p>
+    <w:p>
+      <w:pPr>
+        <w:spacing w:after="140" w:line="276"/>
+      </w:pPr>
+      <w:r>
+        <w:rPr>
+          <w:sz w:val="21"/>
+          <w:szCs w:val="21"/>
+        </w:rPr>
+        <w:t xml:space="preserve">The response 'The request conflicts with an existing record' on the run call meant the database had no monthly partition for that business date, not that the accrual already existed. Partitions now exist from October 2026 to December 2027 and the service creates the current month plus six months ahead at startup and twice a month. A date far beyond that horizon can still return 409 until the next maintenance run.</w:t>
+      </w:r>
+    </w:p>
+    <w:p>
+      <w:pPr>
+        <w:pStyle w:val="Heading2"/>
+        <w:spacing w:after="120" w:before="280"/>
+      </w:pPr>
+      <w:r>
+        <w:rPr>
+          <w:b/>
+          <w:bCs/>
+          <w:color w:val="2E5AA8"/>
+          <w:sz w:val="25"/>
+          <w:szCs w:val="25"/>
+        </w:rPr>
+        <w:t xml:space="preserve">13.6 Sandbox Access</w:t>
+      </w:r>
+    </w:p>
+    <w:tbl>
+      <w:tblPr>
+        <w:tblW w:type="dxa" w:w="9500"/>
+        <w:tblBorders>
+          <w:top w:val="single" w:color="auto" w:sz="4"/>
+          <w:left w:val="single" w:color="auto" w:sz="4"/>
+          <w:bottom w:val="single" w:color="auto" w:sz="4"/>
+          <w:right w:val="single" w:color="auto" w:sz="4"/>
+          <w:insideH w:val="single" w:color="auto" w:sz="4"/>
+          <w:insideV w:val="single" w:color="auto" w:sz="4"/>
+        </w:tblBorders>
+      </w:tblPr>
+      <w:tblGrid>
+        <w:gridCol w:w="2300"/>
+        <w:gridCol w:w="4300"/>
+        <w:gridCol w:w="2900"/>
+      </w:tblGrid>
+      <w:tr>
+        <w:trPr>
+          <w:tblHeader/>
+        </w:trPr>
+        <w:tc>
+          <w:tcPr>
+            <w:tcW w:type="dxa" w:w="2300"/>
+            <w:shd w:fill="1F3864" w:val="clear"/>
+            <w:tcMar>
+              <w:top w:type="dxa" w:w="60"/>
+              <w:left w:type="dxa" w:w="100"/>
+              <w:bottom w:type="dxa" w:w="60"/>
+              <w:right w:type="dxa" w:w="100"/>
+            </w:tcMar>
+            <w:vAlign w:val="center"/>
+          </w:tcPr>
+          <w:p>
+            <w:pPr>
+              <w:jc w:val="left"/>
+            </w:pPr>
+            <w:r>
+              <w:rPr>
+                <w:b/>
+                <w:bCs/>
+                <w:color w:val="FFFFFF"/>
+                <w:sz w:val="19"/>
+                <w:szCs w:val="19"/>
+              </w:rPr>
+              <w:t xml:space="preserve">Item</w:t>
+            </w:r>
+          </w:p>
+        </w:tc>
+        <w:tc>
+          <w:tcPr>
+            <w:tcW w:type="dxa" w:w="4300"/>
+            <w:shd w:fill="1F3864" w:val="clear"/>
+            <w:tcMar>
+              <w:top w:type="dxa" w:w="60"/>
+              <w:left w:type="dxa" w:w="100"/>
+              <w:bottom w:type="dxa" w:w="60"/>
+              <w:right w:type="dxa" w:w="100"/>
+            </w:tcMar>
+            <w:vAlign w:val="center"/>
+          </w:tcPr>
+          <w:p>
+            <w:pPr>
+              <w:jc w:val="left"/>
+            </w:pPr>
+            <w:r>
+              <w:rPr>
+                <w:b/>
+                <w:bCs/>
+                <w:color w:val="FFFFFF"/>
+                <w:sz w:val="19"/>
+                <w:szCs w:val="19"/>
+              </w:rPr>
+              <w:t xml:space="preserve">URL</w:t>
+            </w:r>
+          </w:p>
+        </w:tc>
+        <w:tc>
+          <w:tcPr>
+            <w:tcW w:type="dxa" w:w="2900"/>
+            <w:shd w:fill="1F3864" w:val="clear"/>
+            <w:tcMar>
+              <w:top w:type="dxa" w:w="60"/>
+              <w:left w:type="dxa" w:w="100"/>
+              <w:bottom w:type="dxa" w:w="60"/>
+              <w:right w:type="dxa" w:w="100"/>
+            </w:tcMar>
+            <w:vAlign w:val="center"/>
+          </w:tcPr>
+          <w:p>
+            <w:pPr>
+              <w:jc w:val="left"/>
+            </w:pPr>
+            <w:r>
+              <w:rPr>
+                <w:b/>
+                <w:bCs/>
+                <w:color w:val="FFFFFF"/>
+                <w:sz w:val="19"/>
+                <w:szCs w:val="19"/>
+              </w:rPr>
+              <w:t xml:space="preserve">Notes</w:t>
+            </w:r>
+          </w:p>
+        </w:tc>
+      </w:tr>
+      <w:tr>
+        <w:trPr>
+          <w:cantSplit/>
+        </w:trPr>
+        <w:tc>
+          <w:tcPr>
+            <w:tcW w:type="dxa" w:w="2300"/>
+            <w:tcMar>
+              <w:top w:type="dxa" w:w="60"/>
+              <w:left w:type="dxa" w:w="100"/>
+              <w:bottom w:type="dxa" w:w="60"/>
+              <w:right w:type="dxa" w:w="100"/>
+            </w:tcMar>
+            <w:vAlign w:val="center"/>
+          </w:tcPr>
+          <w:p>
+            <w:pPr>
+              <w:jc w:val="left"/>
+            </w:pPr>
+            <w:r>
+              <w:rPr>
+                <w:sz w:val="19"/>
+                <w:szCs w:val="19"/>
+              </w:rPr>
+              <w:t xml:space="preserve">Lending API (sandbox)</w:t>
+            </w:r>
+          </w:p>
+        </w:tc>
+        <w:tc>
+          <w:tcPr>
+            <w:tcW w:type="dxa" w:w="4300"/>
+            <w:tcMar>
+              <w:top w:type="dxa" w:w="60"/>
+              <w:left w:type="dxa" w:w="100"/>
+              <w:bottom w:type="dxa" w:w="60"/>
+              <w:right w:type="dxa" w:w="100"/>
+            </w:tcMar>
+            <w:vAlign w:val="center"/>
+          </w:tcPr>
+          <w:p>
+            <w:pPr>
+              <w:jc w:val="left"/>
+            </w:pPr>
+            <w:r>
+              <w:rPr>
+                <w:sz w:val="19"/>
+                <w:szCs w:val="19"/>
+              </w:rPr>
+              <w:t xml:space="preserve">https://lending-service-5tqm.onrender.com</w:t>
+            </w:r>
+          </w:p>
+        </w:tc>
+        <w:tc>
+          <w:tcPr>
+            <w:tcW w:type="dxa" w:w="2900"/>
+            <w:tcMar>
+              <w:top w:type="dxa" w:w="60"/>
+              <w:left w:type="dxa" w:w="100"/>
+              <w:bottom w:type="dxa" w:w="60"/>
+              <w:right w:type="dxa" w:w="100"/>
+            </w:tcMar>
+            <w:vAlign w:val="center"/>
+          </w:tcPr>
+          <w:p>
+            <w:pPr>
+              <w:jc w:val="left"/>
+            </w:pPr>
+            <w:r>
+              <w:rPr>
+                <w:sz w:val="19"/>
+                <w:szCs w:val="19"/>
+              </w:rPr>
+              <w:t xml:space="preserve">Render free tier; sleeps when idle, first call takes ~1 minute</w:t>
+            </w:r>
+          </w:p>
+        </w:tc>
+      </w:tr>
+      <w:tr>
+        <w:trPr>
+          <w:cantSplit/>
+        </w:trPr>
+        <w:tc>
+          <w:tcPr>
+            <w:tcW w:type="dxa" w:w="2300"/>
+            <w:shd w:fill="F5F8FC" w:val="clear"/>
+            <w:tcMar>
+              <w:top w:type="dxa" w:w="60"/>
+              <w:left w:type="dxa" w:w="100"/>
+              <w:bottom w:type="dxa" w:w="60"/>
+              <w:right w:type="dxa" w:w="100"/>
+            </w:tcMar>
+            <w:vAlign w:val="center"/>
+          </w:tcPr>
+          <w:p>
+            <w:pPr>
+              <w:jc w:val="left"/>
+            </w:pPr>
+            <w:r>
+              <w:rPr>
+                <w:sz w:val="19"/>
+                <w:szCs w:val="19"/>
+              </w:rPr>
+              <w:t xml:space="preserve">Lending Swagger UI</w:t>
+            </w:r>
+          </w:p>
+        </w:tc>
+        <w:tc>
+          <w:tcPr>
+            <w:tcW w:type="dxa" w:w="4300"/>
+            <w:shd w:fill="F5F8FC" w:val="clear"/>
+            <w:tcMar>
+              <w:top w:type="dxa" w:w="60"/>
+              <w:left w:type="dxa" w:w="100"/>
+              <w:bottom w:type="dxa" w:w="60"/>
+              <w:right w:type="dxa" w:w="100"/>
+            </w:tcMar>
+            <w:vAlign w:val="center"/>
+          </w:tcPr>
+          <w:p>
+            <w:pPr>
+              <w:jc w:val="left"/>
+            </w:pPr>
+            <w:r>
+              <w:rPr>
+                <w:sz w:val="19"/>
+                <w:szCs w:val="19"/>
+              </w:rPr>
+              <w:t xml:space="preserve">https://lending-service-5tqm.onrender.com/swagger-ui.html</w:t>
+            </w:r>
+          </w:p>
+        </w:tc>
+        <w:tc>
+          <w:tcPr>
+            <w:tcW w:type="dxa" w:w="2900"/>
+            <w:shd w:fill="F5F8FC" w:val="clear"/>
+            <w:tcMar>
+              <w:top w:type="dxa" w:w="60"/>
+              <w:left w:type="dxa" w:w="100"/>
+              <w:bottom w:type="dxa" w:w="60"/>
+              <w:right w:type="dxa" w:w="100"/>
+            </w:tcMar>
+            <w:vAlign w:val="center"/>
+          </w:tcPr>
+          <w:p>
+            <w:pPr>
+              <w:jc w:val="left"/>
+            </w:pPr>
+            <w:r>
+              <w:rPr>
+                <w:sz w:val="19"/>
+                <w:szCs w:val="19"/>
+              </w:rPr>
+              <w:t xml:space="preserve">Try-it-out with pre-filled examples; OpenAPI JSON at /v3/api-docs</w:t>
+            </w:r>
+          </w:p>
+        </w:tc>
+      </w:tr>
+      <w:tr>
+        <w:trPr>
+          <w:cantSplit/>
+        </w:trPr>
+        <w:tc>
+          <w:tcPr>
+            <w:tcW w:type="dxa" w:w="2300"/>
+            <w:tcMar>
+              <w:top w:type="dxa" w:w="60"/>
+              <w:left w:type="dxa" w:w="100"/>
+              <w:bottom w:type="dxa" w:w="60"/>
+              <w:right w:type="dxa" w:w="100"/>
+            </w:tcMar>
+            <w:vAlign w:val="center"/>
+          </w:tcPr>
+          <w:p>
+            <w:pPr>
+              <w:jc w:val="left"/>
+            </w:pPr>
+            <w:r>
+              <w:rPr>
+                <w:sz w:val="19"/>
+                <w:szCs w:val="19"/>
+              </w:rPr>
+              <w:t xml:space="preserve">Admin portal (sandbox)</w:t>
+            </w:r>
+          </w:p>
+        </w:tc>
+        <w:tc>
+          <w:tcPr>
+            <w:tcW w:type="dxa" w:w="4300"/>
+            <w:tcMar>
+              <w:top w:type="dxa" w:w="60"/>
+              <w:left w:type="dxa" w:w="100"/>
+              <w:bottom w:type="dxa" w:w="60"/>
+              <w:right w:type="dxa" w:w="100"/>
+            </w:tcMar>
+            <w:vAlign w:val="center"/>
+          </w:tcPr>
+          <w:p>
+            <w:pPr>
+              <w:jc w:val="left"/>
+            </w:pPr>
+            <w:r>
+              <w:rPr>
+                <w:sz w:val="19"/>
+                <w:szCs w:val="19"/>
+              </w:rPr>
+              <w:t xml:space="preserve">https://lending-admin-service-&lt;suffix&gt;.onrender.com</w:t>
+            </w:r>
+          </w:p>
+        </w:tc>
+        <w:tc>
+          <w:tcPr>
+            <w:tcW w:type="dxa" w:w="2900"/>
+            <w:tcMar>
+              <w:top w:type="dxa" w:w="60"/>
+              <w:left w:type="dxa" w:w="100"/>
+              <w:bottom w:type="dxa" w:w="60"/>
+              <w:right w:type="dxa" w:w="100"/>
+            </w:tcMar>
+            <w:vAlign w:val="center"/>
+          </w:tcPr>
+          <w:p>
+            <w:pPr>
+              <w:jc w:val="left"/>
+            </w:pPr>
+            <w:r>
+              <w:rPr>
+                <w:sz w:val="19"/>
+                <w:szCs w:val="19"/>
+              </w:rPr>
+              <w:t xml:space="preserve">Render assigns the random suffix when the service is first created; copy it from the Render dashboard</w:t>
+            </w:r>
+          </w:p>
+        </w:tc>
+      </w:tr>
+      <w:tr>
+        <w:trPr>
+          <w:cantSplit/>
+        </w:trPr>
+        <w:tc>
+          <w:tcPr>
+            <w:tcW w:type="dxa" w:w="2300"/>
+            <w:shd w:fill="F5F8FC" w:val="clear"/>
+            <w:tcMar>
+              <w:top w:type="dxa" w:w="60"/>
+              <w:left w:type="dxa" w:w="100"/>
+              <w:bottom w:type="dxa" w:w="60"/>
+              <w:right w:type="dxa" w:w="100"/>
+            </w:tcMar>
+            <w:vAlign w:val="center"/>
+          </w:tcPr>
+          <w:p>
+            <w:pPr>
+              <w:jc w:val="left"/>
+            </w:pPr>
+            <w:r>
+              <w:rPr>
+                <w:sz w:val="19"/>
+                <w:szCs w:val="19"/>
+              </w:rPr>
+              <w:t xml:space="preserve">Admin Swagger UI</w:t>
+            </w:r>
+          </w:p>
+        </w:tc>
+        <w:tc>
+          <w:tcPr>
+            <w:tcW w:type="dxa" w:w="4300"/>
+            <w:shd w:fill="F5F8FC" w:val="clear"/>
+            <w:tcMar>
+              <w:top w:type="dxa" w:w="60"/>
+              <w:left w:type="dxa" w:w="100"/>
+              <w:bottom w:type="dxa" w:w="60"/>
+              <w:right w:type="dxa" w:w="100"/>
+            </w:tcMar>
+            <w:vAlign w:val="center"/>
+          </w:tcPr>
+          <w:p>
+            <w:pPr>
+              <w:jc w:val="left"/>
+            </w:pPr>
+            <w:r>
+              <w:rPr>
+                <w:sz w:val="19"/>
+                <w:szCs w:val="19"/>
+              </w:rPr>
+              <w:t xml:space="preserve">https://lending-admin-service-&lt;suffix&gt;.onrender.com/swagger-ui.html</w:t>
+            </w:r>
+          </w:p>
+        </w:tc>
+        <w:tc>
+          <w:tcPr>
+            <w:tcW w:type="dxa" w:w="2900"/>
+            <w:shd w:fill="F5F8FC" w:val="clear"/>
+            <w:tcMar>
+              <w:top w:type="dxa" w:w="60"/>
+              <w:left w:type="dxa" w:w="100"/>
+              <w:bottom w:type="dxa" w:w="60"/>
+              <w:right w:type="dxa" w:w="100"/>
+            </w:tcMar>
+            <w:vAlign w:val="center"/>
+          </w:tcPr>
+          <w:p>
+            <w:pPr>
+              <w:jc w:val="left"/>
+            </w:pPr>
+            <w:r>
+              <w:rPr>
+                <w:sz w:val="19"/>
+                <w:szCs w:val="19"/>
+              </w:rPr>
+              <w:t xml:space="preserve">Page is public; click Authorize and enter the admin login before Try-it-out</w:t>
+            </w:r>
+          </w:p>
+        </w:tc>
+      </w:tr>
+      <w:tr>
+        <w:trPr>
+          <w:cantSplit/>
+        </w:trPr>
+        <w:tc>
+          <w:tcPr>
+            <w:tcW w:type="dxa" w:w="2300"/>
+            <w:tcMar>
+              <w:top w:type="dxa" w:w="60"/>
+              <w:left w:type="dxa" w:w="100"/>
+              <w:bottom w:type="dxa" w:w="60"/>
+              <w:right w:type="dxa" w:w="100"/>
+            </w:tcMar>
+            <w:vAlign w:val="center"/>
+          </w:tcPr>
+          <w:p>
+            <w:pPr>
+              <w:jc w:val="left"/>
+            </w:pPr>
+            <w:r>
+              <w:rPr>
+                <w:sz w:val="19"/>
+                <w:szCs w:val="19"/>
+              </w:rPr>
+              <w:t xml:space="preserve">Admin health</w:t>
+            </w:r>
+          </w:p>
+        </w:tc>
+        <w:tc>
+          <w:tcPr>
+            <w:tcW w:type="dxa" w:w="4300"/>
+            <w:tcMar>
+              <w:top w:type="dxa" w:w="60"/>
+              <w:left w:type="dxa" w:w="100"/>
+              <w:bottom w:type="dxa" w:w="60"/>
+              <w:right w:type="dxa" w:w="100"/>
+            </w:tcMar>
+            <w:vAlign w:val="center"/>
+          </w:tcPr>
+          <w:p>
+            <w:pPr>
+              <w:jc w:val="left"/>
+            </w:pPr>
+            <w:r>
+              <w:rPr>
+                <w:sz w:val="19"/>
+                <w:szCs w:val="19"/>
+              </w:rPr>
+              <w:t xml:space="preserve">https://lending-admin-service-&lt;suffix&gt;.onrender.com/actuator/health</w:t>
+            </w:r>
+          </w:p>
+        </w:tc>
+        <w:tc>
+          <w:tcPr>
+            <w:tcW w:type="dxa" w:w="2900"/>
+            <w:tcMar>
+              <w:top w:type="dxa" w:w="60"/>
+              <w:left w:type="dxa" w:w="100"/>
+              <w:bottom w:type="dxa" w:w="60"/>
+              <w:right w:type="dxa" w:w="100"/>
+            </w:tcMar>
+            <w:vAlign w:val="center"/>
+          </w:tcPr>
+          <w:p>
+            <w:pPr>
+              <w:jc w:val="left"/>
+            </w:pPr>
+            <w:r>
+              <w:rPr>
+                <w:sz w:val="19"/>
+                <w:szCs w:val="19"/>
+              </w:rPr>
+              <w:t xml:space="preserve">Public; used by Render as the health check</w:t>
+            </w:r>
+          </w:p>
+        </w:tc>
+      </w:tr>
+      <w:tr>
+        <w:trPr>
+          <w:cantSplit/>
+        </w:trPr>
+        <w:tc>
+          <w:tcPr>
+            <w:tcW w:type="dxa" w:w="2300"/>
+            <w:shd w:fill="F5F8FC" w:val="clear"/>
+            <w:tcMar>
+              <w:top w:type="dxa" w:w="60"/>
+              <w:left w:type="dxa" w:w="100"/>
+              <w:bottom w:type="dxa" w:w="60"/>
+              <w:right w:type="dxa" w:w="100"/>
+            </w:tcMar>
+            <w:vAlign w:val="center"/>
+          </w:tcPr>
+          <w:p>
+            <w:pPr>
+              <w:jc w:val="left"/>
+            </w:pPr>
+            <w:r>
+              <w:rPr>
+                <w:sz w:val="19"/>
+                <w:szCs w:val="19"/>
+              </w:rPr>
+              <w:t xml:space="preserve">Admin login</w:t>
+            </w:r>
+          </w:p>
+        </w:tc>
+        <w:tc>
+          <w:tcPr>
+            <w:tcW w:type="dxa" w:w="4300"/>
+            <w:shd w:fill="F5F8FC" w:val="clear"/>
+            <w:tcMar>
+              <w:top w:type="dxa" w:w="60"/>
+              <w:left w:type="dxa" w:w="100"/>
+              <w:bottom w:type="dxa" w:w="60"/>
+              <w:right w:type="dxa" w:w="100"/>
+            </w:tcMar>
+            <w:vAlign w:val="center"/>
+          </w:tcPr>
+          <w:p>
+            <w:pPr>
+              <w:jc w:val="left"/>
+            </w:pPr>
+            <w:r>
+              <w:rPr>
+                <w:sz w:val="19"/>
+                <w:szCs w:val="19"/>
+              </w:rPr>
+              <w:t xml:space="preserve">user: admin</w:t>
+            </w:r>
+          </w:p>
+        </w:tc>
+        <w:tc>
+          <w:tcPr>
+            <w:tcW w:type="dxa" w:w="2900"/>
+            <w:shd w:fill="F5F8FC" w:val="clear"/>
+            <w:tcMar>
+              <w:top w:type="dxa" w:w="60"/>
+              <w:left w:type="dxa" w:w="100"/>
+              <w:bottom w:type="dxa" w:w="60"/>
+              <w:right w:type="dxa" w:w="100"/>
+            </w:tcMar>
+            <w:vAlign w:val="center"/>
+          </w:tcPr>
+          <w:p>
+            <w:pPr>
+              <w:jc w:val="left"/>
+            </w:pPr>
+            <w:r>
+              <w:rPr>
+                <w:sz w:val="19"/>
+                <w:szCs w:val="19"/>
+              </w:rPr>
+              <w:t xml:space="preserve">Password: Render dashboard &gt; lending-admin-service &gt; Environment &gt; ADMIN_PASSWORD (locally: changeme)</w:t>
+            </w:r>
+          </w:p>
+        </w:tc>
+      </w:tr>
+    </w:tbl>
+    <w:p>
+      <w:pPr>
+        <w:spacing w:after="120"/>
+      </w:pPr>
+    </w:p>
+    <w:p>
+      <w:pPr>
+        <w:pStyle w:val="Heading2"/>
+        <w:spacing w:after="120" w:before="280"/>
+      </w:pPr>
+      <w:r>
+        <w:rPr>
+          <w:b/>
+          <w:bCs/>
+          <w:color w:val="2E5AA8"/>
+          <w:sz w:val="25"/>
+          <w:szCs w:val="25"/>
+        </w:rPr>
+        <w:t xml:space="preserve">13.7 Friendlier Error Responses</w:t>
+      </w:r>
+    </w:p>
+    <w:p>
+      <w:pPr>
+        <w:spacing w:after="140" w:line="276"/>
+      </w:pPr>
+      <w:r>
+        <w:rPr>
+          <w:sz w:val="21"/>
+          <w:szCs w:val="21"/>
+        </w:rPr>
+        <w:t xml:space="preserve">Section 11.3 is extended: a URL that does not exist returns 404, a wrong HTTP method 405, an unsupported content type 415, and a malformed or unreadable body 400, all with the standard error body, instead of a generic 500.</w:t>
+      </w:r>
+    </w:p>
+    <w:p>
+      <w:pPr>
+        <w:pStyle w:val="Heading2"/>
+        <w:spacing w:after="120" w:before="280"/>
+      </w:pPr>
+      <w:r>
+        <w:rPr>
+          <w:b/>
+          <w:bCs/>
+          <w:color w:val="2E5AA8"/>
+          <w:sz w:val="25"/>
+          <w:szCs w:val="25"/>
+        </w:rPr>
+        <w:t xml:space="preserve">13.8 Updates to Earlier Chapters</w:t>
+      </w:r>
+    </w:p>
+    <w:p>
+      <w:pPr>
+        <w:pStyle w:val="ListParagraph"/>
+        <w:numPr>
+          <w:ilvl w:val="0"/>
+          <w:numId w:val="1"/>
+        </w:numPr>
+        <w:spacing w:after="80" w:line="264"/>
+      </w:pPr>
+      <w:r>
+        <w:rPr>
+          <w:b/>
+          <w:bCs/>
+          <w:sz w:val="21"/>
+          <w:szCs w:val="21"/>
+        </w:rPr>
+        <w:t xml:space="preserve">§1.2 Product scope:</w:t>
+      </w:r>
+      <w:r>
+        <w:rPr>
+          <w:sz w:val="21"/>
+          <w:szCs w:val="21"/>
+        </w:rPr>
+        <w:t xml:space="preserve"> the platform now includes the read-only Admin Portal alongside lending-service and lending-batch-service.</w:t>
+      </w:r>
+    </w:p>
+    <w:p>
+      <w:pPr>
+        <w:pStyle w:val="ListParagraph"/>
+        <w:numPr>
+          <w:ilvl w:val="0"/>
+          <w:numId w:val="1"/>
+        </w:numPr>
+        <w:spacing w:after="80" w:line="264"/>
+      </w:pPr>
+      <w:r>
+        <w:rPr>
+          <w:b/>
+          <w:bCs/>
+          <w:sz w:val="21"/>
+          <w:szCs w:val="21"/>
+        </w:rPr>
+        <w:t xml:space="preserve">§2 Actors:</w:t>
+      </w:r>
+      <w:r>
+        <w:rPr>
+          <w:sz w:val="21"/>
+          <w:szCs w:val="21"/>
+        </w:rPr>
+        <w:t xml:space="preserve"> add Loan Operations / Servicing analyst using the Admin Portal (view only).</w:t>
+      </w:r>
+    </w:p>
+    <w:p>
+      <w:pPr>
+        <w:pStyle w:val="ListParagraph"/>
+        <w:numPr>
+          <w:ilvl w:val="0"/>
+          <w:numId w:val="1"/>
+        </w:numPr>
+        <w:spacing w:after="80" w:line="264"/>
+      </w:pPr>
+      <w:r>
+        <w:rPr>
+          <w:b/>
+          <w:bCs/>
+          <w:sz w:val="21"/>
+          <w:szCs w:val="21"/>
+        </w:rPr>
+        <w:t xml:space="preserve">§3.4 List / Retrieve Accounts:</w:t>
+      </w:r>
+      <w:r>
+        <w:rPr>
+          <w:sz w:val="21"/>
+          <w:szCs w:val="21"/>
+        </w:rPr>
+        <w:t xml:space="preserve"> searching and listing across accounts is available in the Admin Portal; the Lending API itself still exposes retrieval by id or account number.</w:t>
+      </w:r>
+    </w:p>
+    <w:p>
+      <w:pPr>
+        <w:pStyle w:val="ListParagraph"/>
+        <w:numPr>
+          <w:ilvl w:val="0"/>
+          <w:numId w:val="1"/>
+        </w:numPr>
+        <w:spacing w:after="80" w:line="264"/>
+      </w:pPr>
+      <w:r>
+        <w:rPr>
+          <w:b/>
+          <w:bCs/>
+          <w:sz w:val="21"/>
+          <w:szCs w:val="21"/>
+        </w:rPr>
+        <w:t xml:space="preserve">§6.5 Transaction History:</w:t>
+      </w:r>
+      <w:r>
+        <w:rPr>
+          <w:sz w:val="21"/>
+          <w:szCs w:val="21"/>
+        </w:rPr>
+        <w:t xml:space="preserve"> the Admin Portal adds cross-account payment search and CSV export.</w:t>
+      </w:r>
+    </w:p>
+    <w:p>
+      <w:pPr>
+        <w:pStyle w:val="ListParagraph"/>
+        <w:numPr>
+          <w:ilvl w:val="0"/>
+          <w:numId w:val="1"/>
+        </w:numPr>
+        <w:spacing w:after="80" w:line="264"/>
+      </w:pPr>
+      <w:r>
+        <w:rPr>
+          <w:b/>
+          <w:bCs/>
+          <w:sz w:val="21"/>
+          <w:szCs w:val="21"/>
+        </w:rPr>
+        <w:t xml:space="preserve">§12 Open items:</w:t>
+      </w:r>
+      <w:r>
+        <w:rPr>
+          <w:sz w:val="21"/>
+          <w:szCs w:val="21"/>
+        </w:rPr>
+        <w:t xml:space="preserve"> statement download, bulk operations and the accrual partition fix move to 'Working today'.</w:t>
+      </w:r>
+    </w:p>
+    <w:p>
+      <w:pPr>
+        <w:pStyle w:val="Heading2"/>
+        <w:spacing w:after="120" w:before="280"/>
+      </w:pPr>
+      <w:r>
+        <w:rPr>
+          <w:b/>
+          <w:bCs/>
+          <w:color w:val="2E5AA8"/>
+          <w:sz w:val="25"/>
+          <w:szCs w:val="25"/>
+        </w:rPr>
+        <w:t xml:space="preserve">13.9 Open Items</w:t>
+      </w:r>
+    </w:p>
+    <w:p>
+      <w:pPr>
+        <w:pStyle w:val="ListParagraph"/>
+        <w:numPr>
+          <w:ilvl w:val="0"/>
+          <w:numId w:val="1"/>
+        </w:numPr>
+        <w:spacing w:after="80" w:line="264"/>
+      </w:pPr>
+      <w:r>
+        <w:rPr>
+          <w:sz w:val="21"/>
+          <w:szCs w:val="21"/>
+        </w:rPr>
+        <w:t xml:space="preserve">Admin Portal has one shared login; individual users, roles, SSO and audit logging are not built.</w:t>
+      </w:r>
+    </w:p>
+    <w:p>
+      <w:pPr>
+        <w:pStyle w:val="ListParagraph"/>
+        <w:numPr>
+          <w:ilvl w:val="0"/>
+          <w:numId w:val="1"/>
+        </w:numPr>
+        <w:spacing w:after="80" w:line="264"/>
+      </w:pPr>
+      <w:r>
+        <w:rPr>
+          <w:sz w:val="21"/>
+          <w:szCs w:val="21"/>
+        </w:rPr>
+        <w:t xml:space="preserve">Write actions (create, disburse, waive, post payment) are intentionally absent from the portal.</w:t>
+      </w:r>
+    </w:p>
+    <w:p>
+      <w:pPr>
+        <w:pStyle w:val="ListParagraph"/>
+        <w:numPr>
+          <w:ilvl w:val="0"/>
+          <w:numId w:val="1"/>
+        </w:numPr>
+        <w:spacing w:after="80" w:line="264"/>
+      </w:pPr>
+      <w:r>
+        <w:rPr>
+          <w:sz w:val="21"/>
+          <w:szCs w:val="21"/>
+        </w:rPr>
+        <w:t xml:space="preserve">Batch job bodies and the real ledger client remain stubs, so the Batch and Ledger screens reflect framework state only.</w:t>
+      </w:r>
+    </w:p>
+    <w:p>
+      <w:pPr>
+        <w:pStyle w:val="ListParagraph"/>
+        <w:numPr>
+          <w:ilvl w:val="0"/>
+          <w:numId w:val="1"/>
+        </w:numPr>
+        <w:spacing w:after="80" w:line="264"/>
+      </w:pPr>
+      <w:r>
+        <w:rPr>
+          <w:sz w:val="21"/>
+          <w:szCs w:val="21"/>
+        </w:rPr>
+        <w:t xml:space="preserve">Lending API authentication is still outstanding.</w:t>
       </w:r>
     </w:p>
     <w:sectPr>

</xml_diff>

<commit_message>
Docs: configuration inventory, admin Configuration screen, updated deck
- TDD chapter 15 and Functional Spec chapter 13 extended (Configuration screen, batch edit endpoint,
  15.11 full settings inventory); deck slides 2-4 now cover all three services, new configuration slide;
  README, CHANGELOG and CLOUD_DEPLOYMENT updated.

Co-Authored-By: Claude Sonnet 5.5 <noreply@anthropic.com>
Claude-Session: https://claude.ai/code/session_011Ly3TH5YUMArmTYksVUGUE
</commit_message>
<xml_diff>
--- a/docs/Lending_Platform_Functional_Specification.docx
+++ b/docs/Lending_Platform_Functional_Specification.docx
@@ -18237,7 +18237,7 @@
                 <w:sz w:val="19"/>
                 <w:szCs w:val="19"/>
               </w:rPr>
-              <w:t xml:space="preserve">Admin Portal</w:t>
+              <w:t xml:space="preserve">Configuration screen</w:t>
             </w:r>
           </w:p>
         </w:tc>
@@ -18261,7 +18261,7 @@
                 <w:sz w:val="19"/>
                 <w:szCs w:val="19"/>
               </w:rPr>
-              <w:t xml:space="preserve">Web console for operations staff to search accounts and inquire on amortization, accruals, payments, upcoming and overdue instalments, mortgage, ledger outbox and batch jobs — view only.</w:t>
+              <w:t xml:space="preserve">Edit batch job settings (schedule, enabled, chunk size, concurrency, retry and skip limits, timeout, order) and look up every service's settings and the fixed business rules.</w:t>
             </w:r>
           </w:p>
         </w:tc>
@@ -18291,7 +18291,7 @@
                 <w:sz w:val="19"/>
                 <w:szCs w:val="19"/>
               </w:rPr>
-              <w:t xml:space="preserve">Customer statement</w:t>
+              <w:t xml:space="preserve">Admin Portal</w:t>
             </w:r>
           </w:p>
         </w:tc>
@@ -18316,7 +18316,7 @@
                 <w:sz w:val="19"/>
                 <w:szCs w:val="19"/>
               </w:rPr>
-              <w:t xml:space="preserve">Downloadable PDF loan statement per account, from the API or from the Admin Portal.</w:t>
+              <w:t xml:space="preserve">Web console for operations staff to search accounts and inquire on amortization, accruals, payments, upcoming and overdue instalments, mortgage, ledger outbox and batch jobs — view only.</w:t>
             </w:r>
           </w:p>
         </w:tc>
@@ -18345,7 +18345,7 @@
                 <w:sz w:val="19"/>
                 <w:szCs w:val="19"/>
               </w:rPr>
-              <w:t xml:space="preserve">Bulk create / disburse</w:t>
+              <w:t xml:space="preserve">Customer statement</w:t>
             </w:r>
           </w:p>
         </w:tc>
@@ -18369,7 +18369,7 @@
                 <w:sz w:val="19"/>
                 <w:szCs w:val="19"/>
               </w:rPr>
-              <w:t xml:space="preserve">Create or disburse up to 200 accounts in one call with a result for each item.</w:t>
+              <w:t xml:space="preserve">Downloadable PDF loan statement per account, from the API or from the Admin Portal.</w:t>
             </w:r>
           </w:p>
         </w:tc>
@@ -18399,7 +18399,7 @@
                 <w:sz w:val="19"/>
                 <w:szCs w:val="19"/>
               </w:rPr>
-              <w:t xml:space="preserve">Run accrual for all</w:t>
+              <w:t xml:space="preserve">Bulk create / disburse</w:t>
             </w:r>
           </w:p>
         </w:tc>
@@ -18424,7 +18424,7 @@
                 <w:sz w:val="19"/>
                 <w:szCs w:val="19"/>
               </w:rPr>
-              <w:t xml:space="preserve">One call (or script) accrues interest for every active account for a business date.</w:t>
+              <w:t xml:space="preserve">Create or disburse up to 200 accounts in one call with a result for each item.</w:t>
             </w:r>
           </w:p>
         </w:tc>
@@ -18453,7 +18453,7 @@
                 <w:sz w:val="19"/>
                 <w:szCs w:val="19"/>
               </w:rPr>
-              <w:t xml:space="preserve">Partition fix</w:t>
+              <w:t xml:space="preserve">Run accrual for all</w:t>
             </w:r>
           </w:p>
         </w:tc>
@@ -18477,7 +18477,7 @@
                 <w:sz w:val="19"/>
                 <w:szCs w:val="19"/>
               </w:rPr>
-              <w:t xml:space="preserve">Accrual and EMI posting no longer fail with 409 when the month's storage partition was missing.</w:t>
+              <w:t xml:space="preserve">One call (or script) accrues interest for every active account for a business date.</w:t>
             </w:r>
           </w:p>
         </w:tc>
@@ -18507,7 +18507,7 @@
                 <w:sz w:val="19"/>
                 <w:szCs w:val="19"/>
               </w:rPr>
-              <w:t xml:space="preserve">Friendlier errors</w:t>
+              <w:t xml:space="preserve">Partition fix</w:t>
             </w:r>
           </w:p>
         </w:tc>
@@ -18515,6 +18515,59 @@
           <w:tcPr>
             <w:tcW w:type="dxa" w:w="6900"/>
             <w:shd w:fill="F5F8FC" w:val="clear"/>
+            <w:tcMar>
+              <w:top w:type="dxa" w:w="60"/>
+              <w:left w:type="dxa" w:w="100"/>
+              <w:bottom w:type="dxa" w:w="60"/>
+              <w:right w:type="dxa" w:w="100"/>
+            </w:tcMar>
+            <w:vAlign w:val="center"/>
+          </w:tcPr>
+          <w:p>
+            <w:pPr>
+              <w:jc w:val="left"/>
+            </w:pPr>
+            <w:r>
+              <w:rPr>
+                <w:sz w:val="19"/>
+                <w:szCs w:val="19"/>
+              </w:rPr>
+              <w:t xml:space="preserve">Accrual and EMI posting no longer fail with 409 when the month's storage partition was missing.</w:t>
+            </w:r>
+          </w:p>
+        </w:tc>
+      </w:tr>
+      <w:tr>
+        <w:trPr>
+          <w:cantSplit/>
+        </w:trPr>
+        <w:tc>
+          <w:tcPr>
+            <w:tcW w:type="dxa" w:w="2600"/>
+            <w:tcMar>
+              <w:top w:type="dxa" w:w="60"/>
+              <w:left w:type="dxa" w:w="100"/>
+              <w:bottom w:type="dxa" w:w="60"/>
+              <w:right w:type="dxa" w:w="100"/>
+            </w:tcMar>
+            <w:vAlign w:val="center"/>
+          </w:tcPr>
+          <w:p>
+            <w:pPr>
+              <w:jc w:val="left"/>
+            </w:pPr>
+            <w:r>
+              <w:rPr>
+                <w:sz w:val="19"/>
+                <w:szCs w:val="19"/>
+              </w:rPr>
+              <w:t xml:space="preserve">Friendlier errors</w:t>
+            </w:r>
+          </w:p>
+        </w:tc>
+        <w:tc>
+          <w:tcPr>
+            <w:tcW w:type="dxa" w:w="6900"/>
             <w:tcMar>
               <w:top w:type="dxa" w:w="60"/>
               <w:left w:type="dxa" w:w="100"/>
@@ -19543,6 +19596,59 @@
           </w:p>
         </w:tc>
       </w:tr>
+      <w:tr>
+        <w:trPr>
+          <w:cantSplit/>
+        </w:trPr>
+        <w:tc>
+          <w:tcPr>
+            <w:tcW w:type="dxa" w:w="2100"/>
+            <w:tcMar>
+              <w:top w:type="dxa" w:w="60"/>
+              <w:left w:type="dxa" w:w="100"/>
+              <w:bottom w:type="dxa" w:w="60"/>
+              <w:right w:type="dxa" w:w="100"/>
+            </w:tcMar>
+            <w:vAlign w:val="center"/>
+          </w:tcPr>
+          <w:p>
+            <w:pPr>
+              <w:jc w:val="left"/>
+            </w:pPr>
+            <w:r>
+              <w:rPr>
+                <w:sz w:val="19"/>
+                <w:szCs w:val="19"/>
+              </w:rPr>
+              <w:t xml:space="preserve">Configuration</w:t>
+            </w:r>
+          </w:p>
+        </w:tc>
+        <w:tc>
+          <w:tcPr>
+            <w:tcW w:type="dxa" w:w="7400"/>
+            <w:tcMar>
+              <w:top w:type="dxa" w:w="60"/>
+              <w:left w:type="dxa" w:w="100"/>
+              <w:bottom w:type="dxa" w:w="60"/>
+              <w:right w:type="dxa" w:w="100"/>
+            </w:tcMar>
+            <w:vAlign w:val="center"/>
+          </w:tcPr>
+          <w:p>
+            <w:pPr>
+              <w:jc w:val="left"/>
+            </w:pPr>
+            <w:r>
+              <w:rPr>
+                <w:sz w:val="19"/>
+                <w:szCs w:val="19"/>
+              </w:rPr>
+              <w:t xml:space="preserve">Edit batch job settings; view the settings of all three services and the business rules fixed in code (see 13.10).</w:t>
+            </w:r>
+          </w:p>
+        </w:tc>
+      </w:tr>
     </w:tbl>
     <w:p>
       <w:pPr>
@@ -19737,14 +19843,14 @@
           <w:sz w:val="21"/>
           <w:szCs w:val="21"/>
         </w:rPr>
-        <w:t xml:space="preserve">Read-only:</w:t>
+        <w:t xml:space="preserve">Read-only for lending data:</w:t>
       </w:r>
       <w:r>
         <w:rPr>
           <w:sz w:val="21"/>
           <w:szCs w:val="21"/>
         </w:rPr>
-        <w:t xml:space="preserve"> the portal cannot create, change, disburse, waive or post anything. Corrections are made through the Lending API.</w:t>
+        <w:t xml:space="preserve"> the portal cannot create, change, disburse, waive or post anything. Corrections are made through the Lending API. The only thing it can change is batch job settings (13.10).</w:t>
       </w:r>
     </w:p>
     <w:p>
@@ -19777,7 +19883,7 @@
           <w:sz w:val="21"/>
           <w:szCs w:val="21"/>
         </w:rPr>
-        <w:t xml:space="preserve">Single shared login with no individual users, roles or audit trail.</w:t>
+        <w:t xml:space="preserve">Single shared login with no individual users, roles or audit trail; anyone who can sign in can edit batch job settings.</w:t>
       </w:r>
     </w:p>
     <w:p>
@@ -21003,6 +21109,1476 @@
           <w:szCs w:val="21"/>
         </w:rPr>
         <w:t xml:space="preserve">Lending API authentication is still outstanding.</w:t>
+      </w:r>
+    </w:p>
+    <w:p>
+      <w:pPr>
+        <w:pStyle w:val="ListParagraph"/>
+        <w:numPr>
+          <w:ilvl w:val="0"/>
+          <w:numId w:val="1"/>
+        </w:numPr>
+        <w:spacing w:after="80" w:line="264"/>
+      </w:pPr>
+      <w:r>
+        <w:rPr>
+          <w:sz w:val="21"/>
+          <w:szCs w:val="21"/>
+        </w:rPr>
+        <w:t xml:space="preserve">Batch job edits are not audited (who changed what) and have no approval step.</w:t>
+      </w:r>
+    </w:p>
+    <w:p>
+      <w:pPr>
+        <w:pStyle w:val="Heading2"/>
+        <w:spacing w:after="120" w:before="280"/>
+      </w:pPr>
+      <w:r>
+        <w:rPr>
+          <w:b/>
+          <w:bCs/>
+          <w:color w:val="2E5AA8"/>
+          <w:sz w:val="25"/>
+          <w:szCs w:val="25"/>
+        </w:rPr>
+        <w:t xml:space="preserve">13.10 Configuration Screen</w:t>
+      </w:r>
+    </w:p>
+    <w:p>
+      <w:pPr>
+        <w:spacing w:after="140" w:line="276"/>
+      </w:pPr>
+      <w:r>
+        <w:rPr>
+          <w:sz w:val="21"/>
+          <w:szCs w:val="21"/>
+        </w:rPr>
+        <w:t xml:space="preserve">The Configuration screen answers 'what can be configured, and where?' and lets an operator change the one kind of setting that is meant to change at runtime: how each batch job runs.</w:t>
+      </w:r>
+    </w:p>
+    <w:p>
+      <w:pPr>
+        <w:pStyle w:val="Heading3"/>
+        <w:spacing w:after="100" w:before="200"/>
+      </w:pPr>
+      <w:r>
+        <w:rPr>
+          <w:b/>
+          <w:bCs/>
+          <w:color w:val="2E5AA8"/>
+          <w:sz w:val="22"/>
+          <w:szCs w:val="22"/>
+        </w:rPr>
+        <w:t xml:space="preserve">Three kinds of setting</w:t>
+      </w:r>
+    </w:p>
+    <w:tbl>
+      <w:tblPr>
+        <w:tblW w:type="dxa" w:w="9500"/>
+        <w:tblBorders>
+          <w:top w:val="single" w:color="auto" w:sz="4"/>
+          <w:left w:val="single" w:color="auto" w:sz="4"/>
+          <w:bottom w:val="single" w:color="auto" w:sz="4"/>
+          <w:right w:val="single" w:color="auto" w:sz="4"/>
+          <w:insideH w:val="single" w:color="auto" w:sz="4"/>
+          <w:insideV w:val="single" w:color="auto" w:sz="4"/>
+        </w:tblBorders>
+      </w:tblPr>
+      <w:tblGrid>
+        <w:gridCol w:w="2300"/>
+        <w:gridCol w:w="3300"/>
+        <w:gridCol w:w="3900"/>
+      </w:tblGrid>
+      <w:tr>
+        <w:trPr>
+          <w:tblHeader/>
+        </w:trPr>
+        <w:tc>
+          <w:tcPr>
+            <w:tcW w:type="dxa" w:w="2300"/>
+            <w:shd w:fill="1F3864" w:val="clear"/>
+            <w:tcMar>
+              <w:top w:type="dxa" w:w="60"/>
+              <w:left w:type="dxa" w:w="100"/>
+              <w:bottom w:type="dxa" w:w="60"/>
+              <w:right w:type="dxa" w:w="100"/>
+            </w:tcMar>
+            <w:vAlign w:val="center"/>
+          </w:tcPr>
+          <w:p>
+            <w:pPr>
+              <w:jc w:val="left"/>
+            </w:pPr>
+            <w:r>
+              <w:rPr>
+                <w:b/>
+                <w:bCs/>
+                <w:color w:val="FFFFFF"/>
+                <w:sz w:val="19"/>
+                <w:szCs w:val="19"/>
+              </w:rPr>
+              <w:t xml:space="preserve">Kind</w:t>
+            </w:r>
+          </w:p>
+        </w:tc>
+        <w:tc>
+          <w:tcPr>
+            <w:tcW w:type="dxa" w:w="3300"/>
+            <w:shd w:fill="1F3864" w:val="clear"/>
+            <w:tcMar>
+              <w:top w:type="dxa" w:w="60"/>
+              <w:left w:type="dxa" w:w="100"/>
+              <w:bottom w:type="dxa" w:w="60"/>
+              <w:right w:type="dxa" w:w="100"/>
+            </w:tcMar>
+            <w:vAlign w:val="center"/>
+          </w:tcPr>
+          <w:p>
+            <w:pPr>
+              <w:jc w:val="left"/>
+            </w:pPr>
+            <w:r>
+              <w:rPr>
+                <w:b/>
+                <w:bCs/>
+                <w:color w:val="FFFFFF"/>
+                <w:sz w:val="19"/>
+                <w:szCs w:val="19"/>
+              </w:rPr>
+              <w:t xml:space="preserve">Examples</w:t>
+            </w:r>
+          </w:p>
+        </w:tc>
+        <w:tc>
+          <w:tcPr>
+            <w:tcW w:type="dxa" w:w="3900"/>
+            <w:shd w:fill="1F3864" w:val="clear"/>
+            <w:tcMar>
+              <w:top w:type="dxa" w:w="60"/>
+              <w:left w:type="dxa" w:w="100"/>
+              <w:bottom w:type="dxa" w:w="60"/>
+              <w:right w:type="dxa" w:w="100"/>
+            </w:tcMar>
+            <w:vAlign w:val="center"/>
+          </w:tcPr>
+          <w:p>
+            <w:pPr>
+              <w:jc w:val="left"/>
+            </w:pPr>
+            <w:r>
+              <w:rPr>
+                <w:b/>
+                <w:bCs/>
+                <w:color w:val="FFFFFF"/>
+                <w:sz w:val="19"/>
+                <w:szCs w:val="19"/>
+              </w:rPr>
+              <w:t xml:space="preserve">How to change</w:t>
+            </w:r>
+          </w:p>
+        </w:tc>
+      </w:tr>
+      <w:tr>
+        <w:trPr>
+          <w:cantSplit/>
+        </w:trPr>
+        <w:tc>
+          <w:tcPr>
+            <w:tcW w:type="dxa" w:w="2300"/>
+            <w:tcMar>
+              <w:top w:type="dxa" w:w="60"/>
+              <w:left w:type="dxa" w:w="100"/>
+              <w:bottom w:type="dxa" w:w="60"/>
+              <w:right w:type="dxa" w:w="100"/>
+            </w:tcMar>
+            <w:vAlign w:val="center"/>
+          </w:tcPr>
+          <w:p>
+            <w:pPr>
+              <w:jc w:val="left"/>
+            </w:pPr>
+            <w:r>
+              <w:rPr>
+                <w:sz w:val="19"/>
+                <w:szCs w:val="19"/>
+              </w:rPr>
+              <w:t xml:space="preserve">Editable at runtime</w:t>
+            </w:r>
+          </w:p>
+        </w:tc>
+        <w:tc>
+          <w:tcPr>
+            <w:tcW w:type="dxa" w:w="3300"/>
+            <w:tcMar>
+              <w:top w:type="dxa" w:w="60"/>
+              <w:left w:type="dxa" w:w="100"/>
+              <w:bottom w:type="dxa" w:w="60"/>
+              <w:right w:type="dxa" w:w="100"/>
+            </w:tcMar>
+            <w:vAlign w:val="center"/>
+          </w:tcPr>
+          <w:p>
+            <w:pPr>
+              <w:jc w:val="left"/>
+            </w:pPr>
+            <w:r>
+              <w:rPr>
+                <w:sz w:val="19"/>
+                <w:szCs w:val="19"/>
+              </w:rPr>
+              <w:t xml:space="preserve">Per batch job: enabled, schedule, restartable, chunk size, concurrency, thread limit, retry limit, skip limit, timeout, order</w:t>
+            </w:r>
+          </w:p>
+        </w:tc>
+        <w:tc>
+          <w:tcPr>
+            <w:tcW w:type="dxa" w:w="3900"/>
+            <w:tcMar>
+              <w:top w:type="dxa" w:w="60"/>
+              <w:left w:type="dxa" w:w="100"/>
+              <w:bottom w:type="dxa" w:w="60"/>
+              <w:right w:type="dxa" w:w="100"/>
+            </w:tcMar>
+            <w:vAlign w:val="center"/>
+          </w:tcPr>
+          <w:p>
+            <w:pPr>
+              <w:jc w:val="left"/>
+            </w:pPr>
+            <w:r>
+              <w:rPr>
+                <w:sz w:val="19"/>
+                <w:szCs w:val="19"/>
+              </w:rPr>
+              <w:t xml:space="preserve">Configuration &gt; Batch jobs &gt; Edit, then Save and apply. No restart.</w:t>
+            </w:r>
+          </w:p>
+        </w:tc>
+      </w:tr>
+      <w:tr>
+        <w:trPr>
+          <w:cantSplit/>
+        </w:trPr>
+        <w:tc>
+          <w:tcPr>
+            <w:tcW w:type="dxa" w:w="2300"/>
+            <w:shd w:fill="F5F8FC" w:val="clear"/>
+            <w:tcMar>
+              <w:top w:type="dxa" w:w="60"/>
+              <w:left w:type="dxa" w:w="100"/>
+              <w:bottom w:type="dxa" w:w="60"/>
+              <w:right w:type="dxa" w:w="100"/>
+            </w:tcMar>
+            <w:vAlign w:val="center"/>
+          </w:tcPr>
+          <w:p>
+            <w:pPr>
+              <w:jc w:val="left"/>
+            </w:pPr>
+            <w:r>
+              <w:rPr>
+                <w:sz w:val="19"/>
+                <w:szCs w:val="19"/>
+              </w:rPr>
+              <w:t xml:space="preserve">Environment settings</w:t>
+            </w:r>
+          </w:p>
+        </w:tc>
+        <w:tc>
+          <w:tcPr>
+            <w:tcW w:type="dxa" w:w="3300"/>
+            <w:shd w:fill="F5F8FC" w:val="clear"/>
+            <w:tcMar>
+              <w:top w:type="dxa" w:w="60"/>
+              <w:left w:type="dxa" w:w="100"/>
+              <w:bottom w:type="dxa" w:w="60"/>
+              <w:right w:type="dxa" w:w="100"/>
+            </w:tcMar>
+            <w:vAlign w:val="center"/>
+          </w:tcPr>
+          <w:p>
+            <w:pPr>
+              <w:jc w:val="left"/>
+            </w:pPr>
+            <w:r>
+              <w:rPr>
+                <w:sz w:val="19"/>
+                <w:szCs w:val="19"/>
+              </w:rPr>
+              <w:t xml:space="preserve">Database connection and pool size, ports, JVM memory, logins, links between services, statement institution name / currency / footer / timezone, Kafka address, business timezone</w:t>
+            </w:r>
+          </w:p>
+        </w:tc>
+        <w:tc>
+          <w:tcPr>
+            <w:tcW w:type="dxa" w:w="3900"/>
+            <w:shd w:fill="F5F8FC" w:val="clear"/>
+            <w:tcMar>
+              <w:top w:type="dxa" w:w="60"/>
+              <w:left w:type="dxa" w:w="100"/>
+              <w:bottom w:type="dxa" w:w="60"/>
+              <w:right w:type="dxa" w:w="100"/>
+            </w:tcMar>
+            <w:vAlign w:val="center"/>
+          </w:tcPr>
+          <w:p>
+            <w:pPr>
+              <w:jc w:val="left"/>
+            </w:pPr>
+            <w:r>
+              <w:rPr>
+                <w:sz w:val="19"/>
+                <w:szCs w:val="19"/>
+              </w:rPr>
+              <w:t xml:space="preserve">Change the service's environment in Render (or docker-compose.yml) and restart it. The screen shows every one, with its default and the sandbox value; secrets are never shown.</w:t>
+            </w:r>
+          </w:p>
+        </w:tc>
+      </w:tr>
+      <w:tr>
+        <w:trPr>
+          <w:cantSplit/>
+        </w:trPr>
+        <w:tc>
+          <w:tcPr>
+            <w:tcW w:type="dxa" w:w="2300"/>
+            <w:tcMar>
+              <w:top w:type="dxa" w:w="60"/>
+              <w:left w:type="dxa" w:w="100"/>
+              <w:bottom w:type="dxa" w:w="60"/>
+              <w:right w:type="dxa" w:w="100"/>
+            </w:tcMar>
+            <w:vAlign w:val="center"/>
+          </w:tcPr>
+          <w:p>
+            <w:pPr>
+              <w:jc w:val="left"/>
+            </w:pPr>
+            <w:r>
+              <w:rPr>
+                <w:sz w:val="19"/>
+                <w:szCs w:val="19"/>
+              </w:rPr>
+              <w:t xml:space="preserve">Fixed in code</w:t>
+            </w:r>
+          </w:p>
+        </w:tc>
+        <w:tc>
+          <w:tcPr>
+            <w:tcW w:type="dxa" w:w="3300"/>
+            <w:tcMar>
+              <w:top w:type="dxa" w:w="60"/>
+              <w:left w:type="dxa" w:w="100"/>
+              <w:bottom w:type="dxa" w:w="60"/>
+              <w:right w:type="dxa" w:w="100"/>
+            </w:tcMar>
+            <w:vAlign w:val="center"/>
+          </w:tcPr>
+          <w:p>
+            <w:pPr>
+              <w:jc w:val="left"/>
+            </w:pPr>
+            <w:r>
+              <w:rPr>
+                <w:sz w:val="19"/>
+                <w:szCs w:val="19"/>
+              </w:rPr>
+              <w:t xml:space="preserve">Interest formula and day-count conventions, EMI formula, delinquency bands, LTV, idempotency keys, bulk limit of 200, monthly partition horizon</w:t>
+            </w:r>
+          </w:p>
+        </w:tc>
+        <w:tc>
+          <w:tcPr>
+            <w:tcW w:type="dxa" w:w="3900"/>
+            <w:tcMar>
+              <w:top w:type="dxa" w:w="60"/>
+              <w:left w:type="dxa" w:w="100"/>
+              <w:bottom w:type="dxa" w:w="60"/>
+              <w:right w:type="dxa" w:w="100"/>
+            </w:tcMar>
+            <w:vAlign w:val="center"/>
+          </w:tcPr>
+          <w:p>
+            <w:pPr>
+              <w:jc w:val="left"/>
+            </w:pPr>
+            <w:r>
+              <w:rPr>
+                <w:sz w:val="19"/>
+                <w:szCs w:val="19"/>
+              </w:rPr>
+              <w:t xml:space="preserve">Needs a code change and a release; shown for reference.</w:t>
+            </w:r>
+          </w:p>
+        </w:tc>
+      </w:tr>
+    </w:tbl>
+    <w:p>
+      <w:pPr>
+        <w:spacing w:after="120"/>
+      </w:pPr>
+    </w:p>
+    <w:p>
+      <w:pPr>
+        <w:pStyle w:val="Heading3"/>
+        <w:spacing w:after="100" w:before="200"/>
+      </w:pPr>
+      <w:r>
+        <w:rPr>
+          <w:b/>
+          <w:bCs/>
+          <w:color w:val="2E5AA8"/>
+          <w:sz w:val="22"/>
+          <w:szCs w:val="22"/>
+        </w:rPr>
+        <w:t xml:space="preserve">Editing a batch job</w:t>
+      </w:r>
+    </w:p>
+    <w:p>
+      <w:pPr>
+        <w:pStyle w:val="ListParagraph"/>
+        <w:numPr>
+          <w:ilvl w:val="0"/>
+          <w:numId w:val="1"/>
+        </w:numPr>
+        <w:spacing w:after="80" w:line="264"/>
+      </w:pPr>
+      <w:r>
+        <w:rPr>
+          <w:sz w:val="21"/>
+          <w:szCs w:val="21"/>
+        </w:rPr>
+        <w:t xml:space="preserve">Open Configuration &gt; Batch jobs, filter by name, category or enabled, and click Edit on a job. Change any of the fields below; only the changed fields are sent.</w:t>
+      </w:r>
+    </w:p>
+    <w:p>
+      <w:pPr>
+        <w:pStyle w:val="ListParagraph"/>
+        <w:numPr>
+          <w:ilvl w:val="0"/>
+          <w:numId w:val="1"/>
+        </w:numPr>
+        <w:spacing w:after="80" w:line="264"/>
+      </w:pPr>
+      <w:r>
+        <w:rPr>
+          <w:b/>
+          <w:bCs/>
+          <w:sz w:val="21"/>
+          <w:szCs w:val="21"/>
+        </w:rPr>
+        <w:t xml:space="preserve">Save and apply</w:t>
+      </w:r>
+      <w:r>
+        <w:rPr>
+          <w:sz w:val="21"/>
+          <w:szCs w:val="21"/>
+        </w:rPr>
+        <w:t xml:space="preserve"> saves the change and reloads the scheduler so it takes effect at once. </w:t>
+      </w:r>
+      <w:r>
+        <w:rPr>
+          <w:b/>
+          <w:bCs/>
+          <w:sz w:val="21"/>
+          <w:szCs w:val="21"/>
+        </w:rPr>
+        <w:t xml:space="preserve">Save only</w:t>
+      </w:r>
+      <w:r>
+        <w:rPr>
+          <w:sz w:val="21"/>
+          <w:szCs w:val="21"/>
+        </w:rPr>
+        <w:t xml:space="preserve"> saves it; use </w:t>
+      </w:r>
+      <w:r>
+        <w:rPr>
+          <w:b/>
+          <w:bCs/>
+          <w:sz w:val="21"/>
+          <w:szCs w:val="21"/>
+        </w:rPr>
+        <w:t xml:space="preserve">Apply changes</w:t>
+      </w:r>
+      <w:r>
+        <w:rPr>
+          <w:sz w:val="21"/>
+          <w:szCs w:val="21"/>
+        </w:rPr>
+        <w:t xml:space="preserve"> later to reload (a badge reminds you while changes are waiting).</w:t>
+      </w:r>
+    </w:p>
+    <w:p>
+      <w:pPr>
+        <w:pStyle w:val="ListParagraph"/>
+        <w:numPr>
+          <w:ilvl w:val="0"/>
+          <w:numId w:val="1"/>
+        </w:numPr>
+        <w:spacing w:after="80" w:line="264"/>
+      </w:pPr>
+      <w:r>
+        <w:rPr>
+          <w:sz w:val="21"/>
+          <w:szCs w:val="21"/>
+        </w:rPr>
+        <w:t xml:space="preserve">If someone else changed the same job after you opened it, the save is refused with a message asking you to reload and retry.</w:t>
+      </w:r>
+    </w:p>
+    <w:p>
+      <w:pPr>
+        <w:pStyle w:val="ListParagraph"/>
+        <w:numPr>
+          <w:ilvl w:val="0"/>
+          <w:numId w:val="1"/>
+        </w:numPr>
+        <w:spacing w:after="80" w:line="264"/>
+      </w:pPr>
+      <w:r>
+        <w:rPr>
+          <w:sz w:val="21"/>
+          <w:szCs w:val="21"/>
+        </w:rPr>
+        <w:t xml:space="preserve">An invalid value is refused with the reason, for example a cron expression that is not valid, a chunk size of 0, or a negative retry limit. Nothing is saved.</w:t>
+      </w:r>
+    </w:p>
+    <w:p>
+      <w:pPr>
+        <w:pStyle w:val="ListParagraph"/>
+        <w:numPr>
+          <w:ilvl w:val="0"/>
+          <w:numId w:val="1"/>
+        </w:numPr>
+        <w:spacing w:after="80" w:line="264"/>
+      </w:pPr>
+      <w:r>
+        <w:rPr>
+          <w:sz w:val="21"/>
+          <w:szCs w:val="21"/>
+        </w:rPr>
+        <w:t xml:space="preserve">Disabling a job stops its schedule at the next apply; it can still be run by hand through the batch admin API.</w:t>
+      </w:r>
+    </w:p>
+    <w:tbl>
+      <w:tblPr>
+        <w:tblW w:type="dxa" w:w="9500"/>
+        <w:tblBorders>
+          <w:top w:val="single" w:color="auto" w:sz="4"/>
+          <w:left w:val="single" w:color="auto" w:sz="4"/>
+          <w:bottom w:val="single" w:color="auto" w:sz="4"/>
+          <w:right w:val="single" w:color="auto" w:sz="4"/>
+          <w:insideH w:val="single" w:color="auto" w:sz="4"/>
+          <w:insideV w:val="single" w:color="auto" w:sz="4"/>
+        </w:tblBorders>
+      </w:tblPr>
+      <w:tblGrid>
+        <w:gridCol w:w="2300"/>
+        <w:gridCol w:w="4900"/>
+        <w:gridCol w:w="2300"/>
+      </w:tblGrid>
+      <w:tr>
+        <w:trPr>
+          <w:tblHeader/>
+        </w:trPr>
+        <w:tc>
+          <w:tcPr>
+            <w:tcW w:type="dxa" w:w="2300"/>
+            <w:shd w:fill="1F3864" w:val="clear"/>
+            <w:tcMar>
+              <w:top w:type="dxa" w:w="60"/>
+              <w:left w:type="dxa" w:w="100"/>
+              <w:bottom w:type="dxa" w:w="60"/>
+              <w:right w:type="dxa" w:w="100"/>
+            </w:tcMar>
+            <w:vAlign w:val="center"/>
+          </w:tcPr>
+          <w:p>
+            <w:pPr>
+              <w:jc w:val="left"/>
+            </w:pPr>
+            <w:r>
+              <w:rPr>
+                <w:b/>
+                <w:bCs/>
+                <w:color w:val="FFFFFF"/>
+                <w:sz w:val="19"/>
+                <w:szCs w:val="19"/>
+              </w:rPr>
+              <w:t xml:space="preserve">Field</w:t>
+            </w:r>
+          </w:p>
+        </w:tc>
+        <w:tc>
+          <w:tcPr>
+            <w:tcW w:type="dxa" w:w="4900"/>
+            <w:shd w:fill="1F3864" w:val="clear"/>
+            <w:tcMar>
+              <w:top w:type="dxa" w:w="60"/>
+              <w:left w:type="dxa" w:w="100"/>
+              <w:bottom w:type="dxa" w:w="60"/>
+              <w:right w:type="dxa" w:w="100"/>
+            </w:tcMar>
+            <w:vAlign w:val="center"/>
+          </w:tcPr>
+          <w:p>
+            <w:pPr>
+              <w:jc w:val="left"/>
+            </w:pPr>
+            <w:r>
+              <w:rPr>
+                <w:b/>
+                <w:bCs/>
+                <w:color w:val="FFFFFF"/>
+                <w:sz w:val="19"/>
+                <w:szCs w:val="19"/>
+              </w:rPr>
+              <w:t xml:space="preserve">Meaning and validation</w:t>
+            </w:r>
+          </w:p>
+        </w:tc>
+        <w:tc>
+          <w:tcPr>
+            <w:tcW w:type="dxa" w:w="2300"/>
+            <w:shd w:fill="1F3864" w:val="clear"/>
+            <w:tcMar>
+              <w:top w:type="dxa" w:w="60"/>
+              <w:left w:type="dxa" w:w="100"/>
+              <w:bottom w:type="dxa" w:w="60"/>
+              <w:right w:type="dxa" w:w="100"/>
+            </w:tcMar>
+            <w:vAlign w:val="center"/>
+          </w:tcPr>
+          <w:p>
+            <w:pPr>
+              <w:jc w:val="left"/>
+            </w:pPr>
+            <w:r>
+              <w:rPr>
+                <w:b/>
+                <w:bCs/>
+                <w:color w:val="FFFFFF"/>
+                <w:sz w:val="19"/>
+                <w:szCs w:val="19"/>
+              </w:rPr>
+              <w:t xml:space="preserve">When it takes effect</w:t>
+            </w:r>
+          </w:p>
+        </w:tc>
+      </w:tr>
+      <w:tr>
+        <w:trPr>
+          <w:cantSplit/>
+        </w:trPr>
+        <w:tc>
+          <w:tcPr>
+            <w:tcW w:type="dxa" w:w="2300"/>
+            <w:tcMar>
+              <w:top w:type="dxa" w:w="60"/>
+              <w:left w:type="dxa" w:w="100"/>
+              <w:bottom w:type="dxa" w:w="60"/>
+              <w:right w:type="dxa" w:w="100"/>
+            </w:tcMar>
+            <w:vAlign w:val="center"/>
+          </w:tcPr>
+          <w:p>
+            <w:pPr>
+              <w:jc w:val="left"/>
+            </w:pPr>
+            <w:r>
+              <w:rPr>
+                <w:sz w:val="19"/>
+                <w:szCs w:val="19"/>
+              </w:rPr>
+              <w:t xml:space="preserve">Enabled</w:t>
+            </w:r>
+          </w:p>
+        </w:tc>
+        <w:tc>
+          <w:tcPr>
+            <w:tcW w:type="dxa" w:w="4900"/>
+            <w:tcMar>
+              <w:top w:type="dxa" w:w="60"/>
+              <w:left w:type="dxa" w:w="100"/>
+              <w:bottom w:type="dxa" w:w="60"/>
+              <w:right w:type="dxa" w:w="100"/>
+            </w:tcMar>
+            <w:vAlign w:val="center"/>
+          </w:tcPr>
+          <w:p>
+            <w:pPr>
+              <w:jc w:val="left"/>
+            </w:pPr>
+            <w:r>
+              <w:rPr>
+                <w:sz w:val="19"/>
+                <w:szCs w:val="19"/>
+              </w:rPr>
+              <w:t xml:space="preserve">Whether the job is scheduled to run</w:t>
+            </w:r>
+          </w:p>
+        </w:tc>
+        <w:tc>
+          <w:tcPr>
+            <w:tcW w:type="dxa" w:w="2300"/>
+            <w:tcMar>
+              <w:top w:type="dxa" w:w="60"/>
+              <w:left w:type="dxa" w:w="100"/>
+              <w:bottom w:type="dxa" w:w="60"/>
+              <w:right w:type="dxa" w:w="100"/>
+            </w:tcMar>
+            <w:vAlign w:val="center"/>
+          </w:tcPr>
+          <w:p>
+            <w:pPr>
+              <w:jc w:val="left"/>
+            </w:pPr>
+            <w:r>
+              <w:rPr>
+                <w:sz w:val="19"/>
+                <w:szCs w:val="19"/>
+              </w:rPr>
+              <w:t xml:space="preserve">Takes effect after Apply</w:t>
+            </w:r>
+          </w:p>
+        </w:tc>
+      </w:tr>
+      <w:tr>
+        <w:trPr>
+          <w:cantSplit/>
+        </w:trPr>
+        <w:tc>
+          <w:tcPr>
+            <w:tcW w:type="dxa" w:w="2300"/>
+            <w:shd w:fill="F5F8FC" w:val="clear"/>
+            <w:tcMar>
+              <w:top w:type="dxa" w:w="60"/>
+              <w:left w:type="dxa" w:w="100"/>
+              <w:bottom w:type="dxa" w:w="60"/>
+              <w:right w:type="dxa" w:w="100"/>
+            </w:tcMar>
+            <w:vAlign w:val="center"/>
+          </w:tcPr>
+          <w:p>
+            <w:pPr>
+              <w:jc w:val="left"/>
+            </w:pPr>
+            <w:r>
+              <w:rPr>
+                <w:sz w:val="19"/>
+                <w:szCs w:val="19"/>
+              </w:rPr>
+              <w:t xml:space="preserve">Schedule (cron)</w:t>
+            </w:r>
+          </w:p>
+        </w:tc>
+        <w:tc>
+          <w:tcPr>
+            <w:tcW w:type="dxa" w:w="4900"/>
+            <w:shd w:fill="F5F8FC" w:val="clear"/>
+            <w:tcMar>
+              <w:top w:type="dxa" w:w="60"/>
+              <w:left w:type="dxa" w:w="100"/>
+              <w:bottom w:type="dxa" w:w="60"/>
+              <w:right w:type="dxa" w:w="100"/>
+            </w:tcMar>
+            <w:vAlign w:val="center"/>
+          </w:tcPr>
+          <w:p>
+            <w:pPr>
+              <w:jc w:val="left"/>
+            </w:pPr>
+            <w:r>
+              <w:rPr>
+                <w:sz w:val="19"/>
+                <w:szCs w:val="19"/>
+              </w:rPr>
+              <w:t xml:space="preserve">Six-field cron expression, e.g. </w:t>
+            </w:r>
+            <w:r>
+              <w:rPr>
+                <w:rFonts w:ascii="Consolas" w:hAnsi="Consolas" w:cs="Consolas"/>
+                <w:color w:val="1F3864"/>
+                <w:sz w:val="17"/>
+                <w:szCs w:val="17"/>
+              </w:rPr>
+              <w:t xml:space="preserve">0 0 1 * * ?</w:t>
+            </w:r>
+            <w:r>
+              <w:rPr>
+                <w:sz w:val="19"/>
+                <w:szCs w:val="19"/>
+              </w:rPr>
+              <w:t xml:space="preserve">. Required unless the job is event-triggered; must be valid</w:t>
+            </w:r>
+          </w:p>
+        </w:tc>
+        <w:tc>
+          <w:tcPr>
+            <w:tcW w:type="dxa" w:w="2300"/>
+            <w:shd w:fill="F5F8FC" w:val="clear"/>
+            <w:tcMar>
+              <w:top w:type="dxa" w:w="60"/>
+              <w:left w:type="dxa" w:w="100"/>
+              <w:bottom w:type="dxa" w:w="60"/>
+              <w:right w:type="dxa" w:w="100"/>
+            </w:tcMar>
+            <w:vAlign w:val="center"/>
+          </w:tcPr>
+          <w:p>
+            <w:pPr>
+              <w:jc w:val="left"/>
+            </w:pPr>
+            <w:r>
+              <w:rPr>
+                <w:sz w:val="19"/>
+                <w:szCs w:val="19"/>
+              </w:rPr>
+              <w:t xml:space="preserve">Re-scheduled on Apply</w:t>
+            </w:r>
+          </w:p>
+        </w:tc>
+      </w:tr>
+      <w:tr>
+        <w:trPr>
+          <w:cantSplit/>
+        </w:trPr>
+        <w:tc>
+          <w:tcPr>
+            <w:tcW w:type="dxa" w:w="2300"/>
+            <w:tcMar>
+              <w:top w:type="dxa" w:w="60"/>
+              <w:left w:type="dxa" w:w="100"/>
+              <w:bottom w:type="dxa" w:w="60"/>
+              <w:right w:type="dxa" w:w="100"/>
+            </w:tcMar>
+            <w:vAlign w:val="center"/>
+          </w:tcPr>
+          <w:p>
+            <w:pPr>
+              <w:jc w:val="left"/>
+            </w:pPr>
+            <w:r>
+              <w:rPr>
+                <w:sz w:val="19"/>
+                <w:szCs w:val="19"/>
+              </w:rPr>
+              <w:t xml:space="preserve">Restartable</w:t>
+            </w:r>
+          </w:p>
+        </w:tc>
+        <w:tc>
+          <w:tcPr>
+            <w:tcW w:type="dxa" w:w="4900"/>
+            <w:tcMar>
+              <w:top w:type="dxa" w:w="60"/>
+              <w:left w:type="dxa" w:w="100"/>
+              <w:bottom w:type="dxa" w:w="60"/>
+              <w:right w:type="dxa" w:w="100"/>
+            </w:tcMar>
+            <w:vAlign w:val="center"/>
+          </w:tcPr>
+          <w:p>
+            <w:pPr>
+              <w:jc w:val="left"/>
+            </w:pPr>
+            <w:r>
+              <w:rPr>
+                <w:sz w:val="19"/>
+                <w:szCs w:val="19"/>
+              </w:rPr>
+              <w:t xml:space="preserve">Whether a failed run can be restarted</w:t>
+            </w:r>
+          </w:p>
+        </w:tc>
+        <w:tc>
+          <w:tcPr>
+            <w:tcW w:type="dxa" w:w="2300"/>
+            <w:tcMar>
+              <w:top w:type="dxa" w:w="60"/>
+              <w:left w:type="dxa" w:w="100"/>
+              <w:bottom w:type="dxa" w:w="60"/>
+              <w:right w:type="dxa" w:w="100"/>
+            </w:tcMar>
+            <w:vAlign w:val="center"/>
+          </w:tcPr>
+          <w:p>
+            <w:pPr>
+              <w:jc w:val="left"/>
+            </w:pPr>
+            <w:r>
+              <w:rPr>
+                <w:sz w:val="19"/>
+                <w:szCs w:val="19"/>
+              </w:rPr>
+              <w:t xml:space="preserve">Applied when the job is rebuilt (Apply)</w:t>
+            </w:r>
+          </w:p>
+        </w:tc>
+      </w:tr>
+      <w:tr>
+        <w:trPr>
+          <w:cantSplit/>
+        </w:trPr>
+        <w:tc>
+          <w:tcPr>
+            <w:tcW w:type="dxa" w:w="2300"/>
+            <w:shd w:fill="F5F8FC" w:val="clear"/>
+            <w:tcMar>
+              <w:top w:type="dxa" w:w="60"/>
+              <w:left w:type="dxa" w:w="100"/>
+              <w:bottom w:type="dxa" w:w="60"/>
+              <w:right w:type="dxa" w:w="100"/>
+            </w:tcMar>
+            <w:vAlign w:val="center"/>
+          </w:tcPr>
+          <w:p>
+            <w:pPr>
+              <w:jc w:val="left"/>
+            </w:pPr>
+            <w:r>
+              <w:rPr>
+                <w:sz w:val="19"/>
+                <w:szCs w:val="19"/>
+              </w:rPr>
+              <w:t xml:space="preserve">Chunk size</w:t>
+            </w:r>
+          </w:p>
+        </w:tc>
+        <w:tc>
+          <w:tcPr>
+            <w:tcW w:type="dxa" w:w="4900"/>
+            <w:shd w:fill="F5F8FC" w:val="clear"/>
+            <w:tcMar>
+              <w:top w:type="dxa" w:w="60"/>
+              <w:left w:type="dxa" w:w="100"/>
+              <w:bottom w:type="dxa" w:w="60"/>
+              <w:right w:type="dxa" w:w="100"/>
+            </w:tcMar>
+            <w:vAlign w:val="center"/>
+          </w:tcPr>
+          <w:p>
+            <w:pPr>
+              <w:jc w:val="left"/>
+            </w:pPr>
+            <w:r>
+              <w:rPr>
+                <w:sz w:val="19"/>
+                <w:szCs w:val="19"/>
+              </w:rPr>
+              <w:t xml:space="preserve">Records per commit; chunk jobs only; must be above 0</w:t>
+            </w:r>
+          </w:p>
+        </w:tc>
+        <w:tc>
+          <w:tcPr>
+            <w:tcW w:type="dxa" w:w="2300"/>
+            <w:shd w:fill="F5F8FC" w:val="clear"/>
+            <w:tcMar>
+              <w:top w:type="dxa" w:w="60"/>
+              <w:left w:type="dxa" w:w="100"/>
+              <w:bottom w:type="dxa" w:w="60"/>
+              <w:right w:type="dxa" w:w="100"/>
+            </w:tcMar>
+            <w:vAlign w:val="center"/>
+          </w:tcPr>
+          <w:p>
+            <w:pPr>
+              <w:jc w:val="left"/>
+            </w:pPr>
+            <w:r>
+              <w:rPr>
+                <w:sz w:val="19"/>
+                <w:szCs w:val="19"/>
+              </w:rPr>
+              <w:t xml:space="preserve">Applied on Apply</w:t>
+            </w:r>
+          </w:p>
+        </w:tc>
+      </w:tr>
+      <w:tr>
+        <w:trPr>
+          <w:cantSplit/>
+        </w:trPr>
+        <w:tc>
+          <w:tcPr>
+            <w:tcW w:type="dxa" w:w="2300"/>
+            <w:tcMar>
+              <w:top w:type="dxa" w:w="60"/>
+              <w:left w:type="dxa" w:w="100"/>
+              <w:bottom w:type="dxa" w:w="60"/>
+              <w:right w:type="dxa" w:w="100"/>
+            </w:tcMar>
+            <w:vAlign w:val="center"/>
+          </w:tcPr>
+          <w:p>
+            <w:pPr>
+              <w:jc w:val="left"/>
+            </w:pPr>
+            <w:r>
+              <w:rPr>
+                <w:sz w:val="19"/>
+                <w:szCs w:val="19"/>
+              </w:rPr>
+              <w:t xml:space="preserve">Concurrency</w:t>
+            </w:r>
+          </w:p>
+        </w:tc>
+        <w:tc>
+          <w:tcPr>
+            <w:tcW w:type="dxa" w:w="4900"/>
+            <w:tcMar>
+              <w:top w:type="dxa" w:w="60"/>
+              <w:left w:type="dxa" w:w="100"/>
+              <w:bottom w:type="dxa" w:w="60"/>
+              <w:right w:type="dxa" w:w="100"/>
+            </w:tcMar>
+            <w:vAlign w:val="center"/>
+          </w:tcPr>
+          <w:p>
+            <w:pPr>
+              <w:jc w:val="left"/>
+            </w:pPr>
+            <w:r>
+              <w:rPr>
+                <w:sz w:val="19"/>
+                <w:szCs w:val="19"/>
+              </w:rPr>
+              <w:t xml:space="preserve">Number of partitions for chunk jobs; at least 1</w:t>
+            </w:r>
+          </w:p>
+        </w:tc>
+        <w:tc>
+          <w:tcPr>
+            <w:tcW w:type="dxa" w:w="2300"/>
+            <w:tcMar>
+              <w:top w:type="dxa" w:w="60"/>
+              <w:left w:type="dxa" w:w="100"/>
+              <w:bottom w:type="dxa" w:w="60"/>
+              <w:right w:type="dxa" w:w="100"/>
+            </w:tcMar>
+            <w:vAlign w:val="center"/>
+          </w:tcPr>
+          <w:p>
+            <w:pPr>
+              <w:jc w:val="left"/>
+            </w:pPr>
+            <w:r>
+              <w:rPr>
+                <w:sz w:val="19"/>
+                <w:szCs w:val="19"/>
+              </w:rPr>
+              <w:t xml:space="preserve">Applied on Apply</w:t>
+            </w:r>
+          </w:p>
+        </w:tc>
+      </w:tr>
+      <w:tr>
+        <w:trPr>
+          <w:cantSplit/>
+        </w:trPr>
+        <w:tc>
+          <w:tcPr>
+            <w:tcW w:type="dxa" w:w="2300"/>
+            <w:shd w:fill="F5F8FC" w:val="clear"/>
+            <w:tcMar>
+              <w:top w:type="dxa" w:w="60"/>
+              <w:left w:type="dxa" w:w="100"/>
+              <w:bottom w:type="dxa" w:w="60"/>
+              <w:right w:type="dxa" w:w="100"/>
+            </w:tcMar>
+            <w:vAlign w:val="center"/>
+          </w:tcPr>
+          <w:p>
+            <w:pPr>
+              <w:jc w:val="left"/>
+            </w:pPr>
+            <w:r>
+              <w:rPr>
+                <w:sz w:val="19"/>
+                <w:szCs w:val="19"/>
+              </w:rPr>
+              <w:t xml:space="preserve">Thread limit</w:t>
+            </w:r>
+          </w:p>
+        </w:tc>
+        <w:tc>
+          <w:tcPr>
+            <w:tcW w:type="dxa" w:w="4900"/>
+            <w:shd w:fill="F5F8FC" w:val="clear"/>
+            <w:tcMar>
+              <w:top w:type="dxa" w:w="60"/>
+              <w:left w:type="dxa" w:w="100"/>
+              <w:bottom w:type="dxa" w:w="60"/>
+              <w:right w:type="dxa" w:w="100"/>
+            </w:tcMar>
+            <w:vAlign w:val="center"/>
+          </w:tcPr>
+          <w:p>
+            <w:pPr>
+              <w:jc w:val="left"/>
+            </w:pPr>
+            <w:r>
+              <w:rPr>
+                <w:sz w:val="19"/>
+                <w:szCs w:val="19"/>
+              </w:rPr>
+              <w:t xml:space="preserve">Threads used to process the partitions; at least 1</w:t>
+            </w:r>
+          </w:p>
+        </w:tc>
+        <w:tc>
+          <w:tcPr>
+            <w:tcW w:type="dxa" w:w="2300"/>
+            <w:shd w:fill="F5F8FC" w:val="clear"/>
+            <w:tcMar>
+              <w:top w:type="dxa" w:w="60"/>
+              <w:left w:type="dxa" w:w="100"/>
+              <w:bottom w:type="dxa" w:w="60"/>
+              <w:right w:type="dxa" w:w="100"/>
+            </w:tcMar>
+            <w:vAlign w:val="center"/>
+          </w:tcPr>
+          <w:p>
+            <w:pPr>
+              <w:jc w:val="left"/>
+            </w:pPr>
+            <w:r>
+              <w:rPr>
+                <w:sz w:val="19"/>
+                <w:szCs w:val="19"/>
+              </w:rPr>
+              <w:t xml:space="preserve">Applied on Apply</w:t>
+            </w:r>
+          </w:p>
+        </w:tc>
+      </w:tr>
+      <w:tr>
+        <w:trPr>
+          <w:cantSplit/>
+        </w:trPr>
+        <w:tc>
+          <w:tcPr>
+            <w:tcW w:type="dxa" w:w="2300"/>
+            <w:tcMar>
+              <w:top w:type="dxa" w:w="60"/>
+              <w:left w:type="dxa" w:w="100"/>
+              <w:bottom w:type="dxa" w:w="60"/>
+              <w:right w:type="dxa" w:w="100"/>
+            </w:tcMar>
+            <w:vAlign w:val="center"/>
+          </w:tcPr>
+          <w:p>
+            <w:pPr>
+              <w:jc w:val="left"/>
+            </w:pPr>
+            <w:r>
+              <w:rPr>
+                <w:sz w:val="19"/>
+                <w:szCs w:val="19"/>
+              </w:rPr>
+              <w:t xml:space="preserve">Retry limit / Skip limit</w:t>
+            </w:r>
+          </w:p>
+        </w:tc>
+        <w:tc>
+          <w:tcPr>
+            <w:tcW w:type="dxa" w:w="4900"/>
+            <w:tcMar>
+              <w:top w:type="dxa" w:w="60"/>
+              <w:left w:type="dxa" w:w="100"/>
+              <w:bottom w:type="dxa" w:w="60"/>
+              <w:right w:type="dxa" w:w="100"/>
+            </w:tcMar>
+            <w:vAlign w:val="center"/>
+          </w:tcPr>
+          <w:p>
+            <w:pPr>
+              <w:jc w:val="left"/>
+            </w:pPr>
+            <w:r>
+              <w:rPr>
+                <w:sz w:val="19"/>
+                <w:szCs w:val="19"/>
+              </w:rPr>
+              <w:t xml:space="preserve">Per-record retries and tolerated skipped records; 0 or more</w:t>
+            </w:r>
+          </w:p>
+        </w:tc>
+        <w:tc>
+          <w:tcPr>
+            <w:tcW w:type="dxa" w:w="2300"/>
+            <w:tcMar>
+              <w:top w:type="dxa" w:w="60"/>
+              <w:left w:type="dxa" w:w="100"/>
+              <w:bottom w:type="dxa" w:w="60"/>
+              <w:right w:type="dxa" w:w="100"/>
+            </w:tcMar>
+            <w:vAlign w:val="center"/>
+          </w:tcPr>
+          <w:p>
+            <w:pPr>
+              <w:jc w:val="left"/>
+            </w:pPr>
+            <w:r>
+              <w:rPr>
+                <w:sz w:val="19"/>
+                <w:szCs w:val="19"/>
+              </w:rPr>
+              <w:t xml:space="preserve">Applied on Apply</w:t>
+            </w:r>
+          </w:p>
+        </w:tc>
+      </w:tr>
+      <w:tr>
+        <w:trPr>
+          <w:cantSplit/>
+        </w:trPr>
+        <w:tc>
+          <w:tcPr>
+            <w:tcW w:type="dxa" w:w="2300"/>
+            <w:shd w:fill="F5F8FC" w:val="clear"/>
+            <w:tcMar>
+              <w:top w:type="dxa" w:w="60"/>
+              <w:left w:type="dxa" w:w="100"/>
+              <w:bottom w:type="dxa" w:w="60"/>
+              <w:right w:type="dxa" w:w="100"/>
+            </w:tcMar>
+            <w:vAlign w:val="center"/>
+          </w:tcPr>
+          <w:p>
+            <w:pPr>
+              <w:jc w:val="left"/>
+            </w:pPr>
+            <w:r>
+              <w:rPr>
+                <w:sz w:val="19"/>
+                <w:szCs w:val="19"/>
+              </w:rPr>
+              <w:t xml:space="preserve">Order (priority)</w:t>
+            </w:r>
+          </w:p>
+        </w:tc>
+        <w:tc>
+          <w:tcPr>
+            <w:tcW w:type="dxa" w:w="4900"/>
+            <w:shd w:fill="F5F8FC" w:val="clear"/>
+            <w:tcMar>
+              <w:top w:type="dxa" w:w="60"/>
+              <w:left w:type="dxa" w:w="100"/>
+              <w:bottom w:type="dxa" w:w="60"/>
+              <w:right w:type="dxa" w:w="100"/>
+            </w:tcMar>
+            <w:vAlign w:val="center"/>
+          </w:tcPr>
+          <w:p>
+            <w:pPr>
+              <w:jc w:val="left"/>
+            </w:pPr>
+            <w:r>
+              <w:rPr>
+                <w:sz w:val="19"/>
+                <w:szCs w:val="19"/>
+              </w:rPr>
+              <w:t xml:space="preserve">Lower runs first when several jobs fire at the same moment</w:t>
+            </w:r>
+          </w:p>
+        </w:tc>
+        <w:tc>
+          <w:tcPr>
+            <w:tcW w:type="dxa" w:w="2300"/>
+            <w:shd w:fill="F5F8FC" w:val="clear"/>
+            <w:tcMar>
+              <w:top w:type="dxa" w:w="60"/>
+              <w:left w:type="dxa" w:w="100"/>
+              <w:bottom w:type="dxa" w:w="60"/>
+              <w:right w:type="dxa" w:w="100"/>
+            </w:tcMar>
+            <w:vAlign w:val="center"/>
+          </w:tcPr>
+          <w:p>
+            <w:pPr>
+              <w:jc w:val="left"/>
+            </w:pPr>
+            <w:r>
+              <w:rPr>
+                <w:sz w:val="19"/>
+                <w:szCs w:val="19"/>
+              </w:rPr>
+              <w:t xml:space="preserve">Applied on Apply</w:t>
+            </w:r>
+          </w:p>
+        </w:tc>
+      </w:tr>
+      <w:tr>
+        <w:trPr>
+          <w:cantSplit/>
+        </w:trPr>
+        <w:tc>
+          <w:tcPr>
+            <w:tcW w:type="dxa" w:w="2300"/>
+            <w:tcMar>
+              <w:top w:type="dxa" w:w="60"/>
+              <w:left w:type="dxa" w:w="100"/>
+              <w:bottom w:type="dxa" w:w="60"/>
+              <w:right w:type="dxa" w:w="100"/>
+            </w:tcMar>
+            <w:vAlign w:val="center"/>
+          </w:tcPr>
+          <w:p>
+            <w:pPr>
+              <w:jc w:val="left"/>
+            </w:pPr>
+            <w:r>
+              <w:rPr>
+                <w:sz w:val="19"/>
+                <w:szCs w:val="19"/>
+              </w:rPr>
+              <w:t xml:space="preserve">Timeout (minutes)</w:t>
+            </w:r>
+          </w:p>
+        </w:tc>
+        <w:tc>
+          <w:tcPr>
+            <w:tcW w:type="dxa" w:w="4900"/>
+            <w:tcMar>
+              <w:top w:type="dxa" w:w="60"/>
+              <w:left w:type="dxa" w:w="100"/>
+              <w:bottom w:type="dxa" w:w="60"/>
+              <w:right w:type="dxa" w:w="100"/>
+            </w:tcMar>
+            <w:vAlign w:val="center"/>
+          </w:tcPr>
+          <w:p>
+            <w:pPr>
+              <w:jc w:val="left"/>
+            </w:pPr>
+            <w:r>
+              <w:rPr>
+                <w:sz w:val="19"/>
+                <w:szCs w:val="19"/>
+              </w:rPr>
+              <w:t xml:space="preserve">Maximum run time; above 0 when set</w:t>
+            </w:r>
+          </w:p>
+        </w:tc>
+        <w:tc>
+          <w:tcPr>
+            <w:tcW w:type="dxa" w:w="2300"/>
+            <w:tcMar>
+              <w:top w:type="dxa" w:w="60"/>
+              <w:left w:type="dxa" w:w="100"/>
+              <w:bottom w:type="dxa" w:w="60"/>
+              <w:right w:type="dxa" w:w="100"/>
+            </w:tcMar>
+            <w:vAlign w:val="center"/>
+          </w:tcPr>
+          <w:p>
+            <w:pPr>
+              <w:jc w:val="left"/>
+            </w:pPr>
+            <w:r>
+              <w:rPr>
+                <w:sz w:val="19"/>
+                <w:szCs w:val="19"/>
+              </w:rPr>
+              <w:t xml:space="preserve">Applied on Apply</w:t>
+            </w:r>
+          </w:p>
+        </w:tc>
+      </w:tr>
+    </w:tbl>
+    <w:p>
+      <w:pPr>
+        <w:spacing w:after="120"/>
+      </w:pPr>
+    </w:p>
+    <w:p>
+      <w:pPr>
+        <w:pStyle w:val="Heading3"/>
+        <w:spacing w:after="100" w:before="200"/>
+      </w:pPr>
+      <w:r>
+        <w:rPr>
+          <w:b/>
+          <w:bCs/>
+          <w:color w:val="2E5AA8"/>
+          <w:sz w:val="22"/>
+          <w:szCs w:val="22"/>
+        </w:rPr>
+        <w:t xml:space="preserve">Prerequisites</w:t>
+      </w:r>
+    </w:p>
+    <w:p>
+      <w:pPr>
+        <w:spacing w:after="140" w:line="276"/>
+      </w:pPr>
+      <w:r>
+        <w:rPr>
+          <w:sz w:val="21"/>
+          <w:szCs w:val="21"/>
+        </w:rPr>
+        <w:t xml:space="preserve">Editing needs the admin portal to know where the batch service is and to hold its admin login (</w:t>
+      </w:r>
+      <w:r>
+        <w:rPr>
+          <w:rFonts w:ascii="Consolas" w:hAnsi="Consolas" w:cs="Consolas"/>
+          <w:color w:val="1F3864"/>
+          <w:sz w:val="19"/>
+          <w:szCs w:val="19"/>
+        </w:rPr>
+        <w:t xml:space="preserve">BATCH_SERVICE_URL</w:t>
+      </w:r>
+      <w:r>
+        <w:rPr>
+          <w:sz w:val="21"/>
+          <w:szCs w:val="21"/>
+        </w:rPr>
+        <w:t xml:space="preserve">, </w:t>
+      </w:r>
+      <w:r>
+        <w:rPr>
+          <w:rFonts w:ascii="Consolas" w:hAnsi="Consolas" w:cs="Consolas"/>
+          <w:color w:val="1F3864"/>
+          <w:sz w:val="19"/>
+          <w:szCs w:val="19"/>
+        </w:rPr>
+        <w:t xml:space="preserve">BATCH_ADMIN_PASSWORD</w:t>
+      </w:r>
+      <w:r>
+        <w:rPr>
+          <w:sz w:val="21"/>
+          <w:szCs w:val="21"/>
+        </w:rPr>
+        <w:t xml:space="preserve">). Without them the screen is view-only and says so. The batch service must be awake: on the free sandbox the first save after a pause can take about a minute.</w:t>
+      </w:r>
+    </w:p>
+    <w:p>
+      <w:pPr>
+        <w:pStyle w:val="Heading3"/>
+        <w:spacing w:after="100" w:before="200"/>
+      </w:pPr>
+      <w:r>
+        <w:rPr>
+          <w:b/>
+          <w:bCs/>
+          <w:color w:val="2E5AA8"/>
+          <w:sz w:val="22"/>
+          <w:szCs w:val="22"/>
+        </w:rPr>
+        <w:t xml:space="preserve">Settings reference</w:t>
+      </w:r>
+    </w:p>
+    <w:p>
+      <w:pPr>
+        <w:spacing w:after="140" w:line="276"/>
+      </w:pPr>
+      <w:r>
+        <w:rPr>
+          <w:sz w:val="21"/>
+          <w:szCs w:val="21"/>
+        </w:rPr>
+        <w:t xml:space="preserve">The complete list of settings, with defaults and sandbox values, is in the Technical Design Document, section 15.11, and on the Service settings tab.</w:t>
       </w:r>
     </w:p>
     <w:sectPr>

</xml_diff>

<commit_message>
Docs v1.2: loan products in Technical Design Document, Functional Specification, README, deployment notes and deck
Co-Authored-By: Claude Sonnet 5.5 <noreply@anthropic.com>
Claude-Session: https://claude.ai/code/session_011Ly3TH5YUMArmTYksVUGUE
</commit_message>
<xml_diff>
--- a/docs/Lending_Platform_Functional_Specification.docx
+++ b/docs/Lending_Platform_Functional_Specification.docx
@@ -79,7 +79,7 @@
           <w:sz w:val="20"/>
           <w:szCs w:val="20"/>
         </w:rPr>
-        <w:t xml:space="preserve">Document version 1.1 — updated 10 October 2026 (adds Admin Portal and changes since v1.0)</w:t>
+        <w:t xml:space="preserve">Document version 1.2 — updated 11 October 2026 (adds Admin Portal, loan product master and changes since v1.0)</w:t>
       </w:r>
     </w:p>
     <w:p>
@@ -215,14 +215,14 @@
           <w:sz w:val="21"/>
           <w:szCs w:val="21"/>
         </w:rPr>
-        <w:t xml:space="preserve">Version 1.1 (10 October 2026):</w:t>
+        <w:t xml:space="preserve">Version 1.2 (11 October 2026):</w:t>
       </w:r>
       <w:r>
         <w:rPr>
           <w:sz w:val="21"/>
           <w:szCs w:val="21"/>
         </w:rPr>
-        <w:t xml:space="preserve"> adds the read-only Admin Portal and the functions delivered since v1.0 — customer PDF statement, bulk create and disburse, run-accrual-for-all, and the partition fix. They are collected in Chapter 13, which also lists the sandbox and Swagger URLs.</w:t>
+        <w:t xml:space="preserve"> adds the Admin Portal, loan products and the functions delivered since v1.0 — customer PDF statement, bulk create and disburse, run-accrual-for-all, and the partition fix. They are collected in Chapter 13, which also lists the sandbox and Swagger URLs.</w:t>
       </w:r>
     </w:p>
     <w:p>
@@ -18237,7 +18237,7 @@
                 <w:sz w:val="19"/>
                 <w:szCs w:val="19"/>
               </w:rPr>
-              <w:t xml:space="preserve">Configuration screen</w:t>
+              <w:t xml:space="preserve">Loan products</w:t>
             </w:r>
           </w:p>
         </w:tc>
@@ -18261,7 +18261,7 @@
                 <w:sz w:val="19"/>
                 <w:szCs w:val="19"/>
               </w:rPr>
-              <w:t xml:space="preserve">Edit batch job settings (schedule, enabled, chunk size, concurrency, retry and skip limits, timeout, order) and look up every service's settings and the fixed business rules.</w:t>
+              <w:t xml:space="preserve">Product master that defines default terms and limits (rate type, rate, benchmark, spread, day count, schedule type, rate / spread / amount / tenure bands). An account is opened from a product and takes its terms by default (13.11).</w:t>
             </w:r>
           </w:p>
         </w:tc>
@@ -18291,7 +18291,7 @@
                 <w:sz w:val="19"/>
                 <w:szCs w:val="19"/>
               </w:rPr>
-              <w:t xml:space="preserve">Admin Portal</w:t>
+              <w:t xml:space="preserve">Configuration screen</w:t>
             </w:r>
           </w:p>
         </w:tc>
@@ -18316,7 +18316,7 @@
                 <w:sz w:val="19"/>
                 <w:szCs w:val="19"/>
               </w:rPr>
-              <w:t xml:space="preserve">Web console for operations staff to search accounts and inquire on amortization, accruals, payments, upcoming and overdue instalments, mortgage, ledger outbox and batch jobs — view only.</w:t>
+              <w:t xml:space="preserve">Edit batch job settings (schedule, enabled, chunk size, concurrency, retry and skip limits, timeout, order) and look up every service's settings and the fixed business rules.</w:t>
             </w:r>
           </w:p>
         </w:tc>
@@ -18345,7 +18345,7 @@
                 <w:sz w:val="19"/>
                 <w:szCs w:val="19"/>
               </w:rPr>
-              <w:t xml:space="preserve">Customer statement</w:t>
+              <w:t xml:space="preserve">Admin Portal</w:t>
             </w:r>
           </w:p>
         </w:tc>
@@ -18369,7 +18369,7 @@
                 <w:sz w:val="19"/>
                 <w:szCs w:val="19"/>
               </w:rPr>
-              <w:t xml:space="preserve">Downloadable PDF loan statement per account, from the API or from the Admin Portal.</w:t>
+              <w:t xml:space="preserve">Web console for operations staff to search accounts and inquire on amortization, accruals, payments, upcoming and overdue instalments, mortgage, ledger outbox and batch jobs — view only.</w:t>
             </w:r>
           </w:p>
         </w:tc>
@@ -18399,7 +18399,7 @@
                 <w:sz w:val="19"/>
                 <w:szCs w:val="19"/>
               </w:rPr>
-              <w:t xml:space="preserve">Bulk create / disburse</w:t>
+              <w:t xml:space="preserve">Customer statement</w:t>
             </w:r>
           </w:p>
         </w:tc>
@@ -18424,7 +18424,7 @@
                 <w:sz w:val="19"/>
                 <w:szCs w:val="19"/>
               </w:rPr>
-              <w:t xml:space="preserve">Create or disburse up to 200 accounts in one call with a result for each item.</w:t>
+              <w:t xml:space="preserve">Downloadable PDF loan statement per account, from the API or from the Admin Portal.</w:t>
             </w:r>
           </w:p>
         </w:tc>
@@ -18453,7 +18453,7 @@
                 <w:sz w:val="19"/>
                 <w:szCs w:val="19"/>
               </w:rPr>
-              <w:t xml:space="preserve">Run accrual for all</w:t>
+              <w:t xml:space="preserve">Bulk create / disburse</w:t>
             </w:r>
           </w:p>
         </w:tc>
@@ -18477,7 +18477,7 @@
                 <w:sz w:val="19"/>
                 <w:szCs w:val="19"/>
               </w:rPr>
-              <w:t xml:space="preserve">One call (or script) accrues interest for every active account for a business date.</w:t>
+              <w:t xml:space="preserve">Create or disburse up to 200 accounts in one call with a result for each item.</w:t>
             </w:r>
           </w:p>
         </w:tc>
@@ -18507,7 +18507,7 @@
                 <w:sz w:val="19"/>
                 <w:szCs w:val="19"/>
               </w:rPr>
-              <w:t xml:space="preserve">Partition fix</w:t>
+              <w:t xml:space="preserve">Run accrual for all</w:t>
             </w:r>
           </w:p>
         </w:tc>
@@ -18532,7 +18532,7 @@
                 <w:sz w:val="19"/>
                 <w:szCs w:val="19"/>
               </w:rPr>
-              <w:t xml:space="preserve">Accrual and EMI posting no longer fail with 409 when the month's storage partition was missing.</w:t>
+              <w:t xml:space="preserve">One call (or script) accrues interest for every active account for a business date.</w:t>
             </w:r>
           </w:p>
         </w:tc>
@@ -18561,6 +18561,60 @@
                 <w:sz w:val="19"/>
                 <w:szCs w:val="19"/>
               </w:rPr>
+              <w:t xml:space="preserve">Partition fix</w:t>
+            </w:r>
+          </w:p>
+        </w:tc>
+        <w:tc>
+          <w:tcPr>
+            <w:tcW w:type="dxa" w:w="6900"/>
+            <w:tcMar>
+              <w:top w:type="dxa" w:w="60"/>
+              <w:left w:type="dxa" w:w="100"/>
+              <w:bottom w:type="dxa" w:w="60"/>
+              <w:right w:type="dxa" w:w="100"/>
+            </w:tcMar>
+            <w:vAlign w:val="center"/>
+          </w:tcPr>
+          <w:p>
+            <w:pPr>
+              <w:jc w:val="left"/>
+            </w:pPr>
+            <w:r>
+              <w:rPr>
+                <w:sz w:val="19"/>
+                <w:szCs w:val="19"/>
+              </w:rPr>
+              <w:t xml:space="preserve">Accrual and EMI posting no longer fail with 409 when the month's storage partition was missing.</w:t>
+            </w:r>
+          </w:p>
+        </w:tc>
+      </w:tr>
+      <w:tr>
+        <w:trPr>
+          <w:cantSplit/>
+        </w:trPr>
+        <w:tc>
+          <w:tcPr>
+            <w:tcW w:type="dxa" w:w="2600"/>
+            <w:shd w:fill="F5F8FC" w:val="clear"/>
+            <w:tcMar>
+              <w:top w:type="dxa" w:w="60"/>
+              <w:left w:type="dxa" w:w="100"/>
+              <w:bottom w:type="dxa" w:w="60"/>
+              <w:right w:type="dxa" w:w="100"/>
+            </w:tcMar>
+            <w:vAlign w:val="center"/>
+          </w:tcPr>
+          <w:p>
+            <w:pPr>
+              <w:jc w:val="left"/>
+            </w:pPr>
+            <w:r>
+              <w:rPr>
+                <w:sz w:val="19"/>
+                <w:szCs w:val="19"/>
+              </w:rPr>
               <w:t xml:space="preserve">Friendlier errors</w:t>
             </w:r>
           </w:p>
@@ -18568,6 +18622,7 @@
         <w:tc>
           <w:tcPr>
             <w:tcW w:type="dxa" w:w="6900"/>
+            <w:shd w:fill="F5F8FC" w:val="clear"/>
             <w:tcMar>
               <w:top w:type="dxa" w:w="60"/>
               <w:left w:type="dxa" w:w="100"/>
@@ -18918,7 +18973,7 @@
                 <w:sz w:val="19"/>
                 <w:szCs w:val="19"/>
               </w:rPr>
-              <w:t xml:space="preserve">Accounts</w:t>
+              <w:t xml:space="preserve">Products</w:t>
             </w:r>
           </w:p>
         </w:tc>
@@ -18943,7 +18998,7 @@
                 <w:sz w:val="19"/>
                 <w:szCs w:val="19"/>
               </w:rPr>
-              <w:t xml:space="preserve">Search by account number or customer id; filter by status, account type and product; sort and page. Open any account.</w:t>
+              <w:t xml:space="preserve">See every loan product with its default terms, bands, status and number of accounts. Create a product or edit one (13.11). A change applies to accounts opened afterwards and to a floating rate reset of an individual account, not to existing accounts.</w:t>
             </w:r>
           </w:p>
         </w:tc>
@@ -18972,7 +19027,7 @@
                 <w:sz w:val="19"/>
                 <w:szCs w:val="19"/>
               </w:rPr>
-              <w:t xml:space="preserve">Account — Overview</w:t>
+              <w:t xml:space="preserve">Accounts</w:t>
             </w:r>
           </w:p>
         </w:tc>
@@ -18996,7 +19051,7 @@
                 <w:sz w:val="19"/>
                 <w:szCs w:val="19"/>
               </w:rPr>
-              <w:t xml:space="preserve">Terms (sanctioned and disbursed amount, rate and type, tenure, EMI, day-count) and live figures: instalments paid of total, next due date and amount, overdue instalments and amount, outstanding principal.</w:t>
+              <w:t xml:space="preserve">Search by account number or customer id; filter by status, account type and product; sort and page. Open any account.</w:t>
             </w:r>
           </w:p>
         </w:tc>
@@ -19026,7 +19081,7 @@
                 <w:sz w:val="19"/>
                 <w:szCs w:val="19"/>
               </w:rPr>
-              <w:t xml:space="preserve">Account — Amortization</w:t>
+              <w:t xml:space="preserve">Account — Overview</w:t>
             </w:r>
           </w:p>
         </w:tc>
@@ -19051,7 +19106,7 @@
                 <w:sz w:val="19"/>
                 <w:szCs w:val="19"/>
               </w:rPr>
-              <w:t xml:space="preserve">Full instalment table (due date, principal, interest, EMI, status). Choose the current schedule or any earlier version created by a part-payment or rate reset. Totals for paid, pending and overdue. Export to CSV.</w:t>
+              <w:t xml:space="preserve">Terms (sanctioned and disbursed amount, rate and type, tenure, EMI, day-count) and live figures: instalments paid of total, next due date and amount, overdue instalments and amount, outstanding principal.</w:t>
             </w:r>
           </w:p>
         </w:tc>
@@ -19080,7 +19135,7 @@
                 <w:sz w:val="19"/>
                 <w:szCs w:val="19"/>
               </w:rPr>
-              <w:t xml:space="preserve">Account — Accruals</w:t>
+              <w:t xml:space="preserve">Account — Amortization</w:t>
             </w:r>
           </w:p>
         </w:tc>
@@ -19104,7 +19159,7 @@
                 <w:sz w:val="19"/>
                 <w:szCs w:val="19"/>
               </w:rPr>
-              <w:t xml:space="preserve">Daily interest accrued for a chosen date range with total and chart.</w:t>
+              <w:t xml:space="preserve">Full instalment table (due date, principal, interest, EMI, status). Choose the current schedule or any earlier version created by a part-payment or rate reset. Totals for paid, pending and overdue. Export to CSV.</w:t>
             </w:r>
           </w:p>
         </w:tc>
@@ -19134,7 +19189,7 @@
                 <w:sz w:val="19"/>
                 <w:szCs w:val="19"/>
               </w:rPr>
-              <w:t xml:space="preserve">Account — Payments</w:t>
+              <w:t xml:space="preserve">Account — Accruals</w:t>
             </w:r>
           </w:p>
         </w:tc>
@@ -19159,7 +19214,7 @@
                 <w:sz w:val="19"/>
                 <w:szCs w:val="19"/>
               </w:rPr>
-              <w:t xml:space="preserve">Every EMI transaction with value date, instalment, type, amount, principal and interest split, channel and status. Export to CSV.</w:t>
+              <w:t xml:space="preserve">Daily interest accrued for a chosen date range with total and chart.</w:t>
             </w:r>
           </w:p>
         </w:tc>
@@ -19188,7 +19243,7 @@
                 <w:sz w:val="19"/>
                 <w:szCs w:val="19"/>
               </w:rPr>
-              <w:t xml:space="preserve">Account — Mortgage</w:t>
+              <w:t xml:space="preserve">Account — Payments</w:t>
             </w:r>
           </w:p>
         </w:tc>
@@ -19212,7 +19267,7 @@
                 <w:sz w:val="19"/>
                 <w:szCs w:val="19"/>
               </w:rPr>
-              <w:t xml:space="preserve">For mortgage loans: property details, charge and registration references, LTV and valuation history.</w:t>
+              <w:t xml:space="preserve">Every EMI transaction with value date, instalment, type, amount, principal and interest split, channel and status. Export to CSV.</w:t>
             </w:r>
           </w:p>
         </w:tc>
@@ -19242,7 +19297,7 @@
                 <w:sz w:val="19"/>
                 <w:szCs w:val="19"/>
               </w:rPr>
-              <w:t xml:space="preserve">Download statement</w:t>
+              <w:t xml:space="preserve">Account — Mortgage</w:t>
             </w:r>
           </w:p>
         </w:tc>
@@ -19267,7 +19322,7 @@
                 <w:sz w:val="19"/>
                 <w:szCs w:val="19"/>
               </w:rPr>
-              <w:t xml:space="preserve">Button on the account page that downloads the customer PDF statement.</w:t>
+              <w:t xml:space="preserve">For mortgage loans: property details, charge and registration references, LTV and valuation history.</w:t>
             </w:r>
           </w:p>
         </w:tc>
@@ -19296,7 +19351,7 @@
                 <w:sz w:val="19"/>
                 <w:szCs w:val="19"/>
               </w:rPr>
-              <w:t xml:space="preserve">Upcoming payments</w:t>
+              <w:t xml:space="preserve">Download statement</w:t>
             </w:r>
           </w:p>
         </w:tc>
@@ -19320,7 +19375,7 @@
                 <w:sz w:val="19"/>
                 <w:szCs w:val="19"/>
               </w:rPr>
-              <w:t xml:space="preserve">Instalments due in the next 7, 15, 30, 60 or 90 days, filterable by product, with count and total expected.</w:t>
+              <w:t xml:space="preserve">Button on the account page that downloads the customer PDF statement.</w:t>
             </w:r>
           </w:p>
         </w:tc>
@@ -19350,7 +19405,7 @@
                 <w:sz w:val="19"/>
                 <w:szCs w:val="19"/>
               </w:rPr>
-              <w:t xml:space="preserve">Overdue</w:t>
+              <w:t xml:space="preserve">Upcoming payments</w:t>
             </w:r>
           </w:p>
         </w:tc>
@@ -19375,7 +19430,7 @@
                 <w:sz w:val="19"/>
                 <w:szCs w:val="19"/>
               </w:rPr>
-              <w:t xml:space="preserve">Unpaid instalments past their due date with days past due, plus a summary by bucket (1-30, 31-60, 61-90, 90+ days).</w:t>
+              <w:t xml:space="preserve">Instalments due in the next 7, 15, 30, 60 or 90 days, filterable by product, with count and total expected.</w:t>
             </w:r>
           </w:p>
         </w:tc>
@@ -19404,7 +19459,7 @@
                 <w:sz w:val="19"/>
                 <w:szCs w:val="19"/>
               </w:rPr>
-              <w:t xml:space="preserve">Payments</w:t>
+              <w:t xml:space="preserve">Overdue</w:t>
             </w:r>
           </w:p>
         </w:tc>
@@ -19428,7 +19483,7 @@
                 <w:sz w:val="19"/>
                 <w:szCs w:val="19"/>
               </w:rPr>
-              <w:t xml:space="preserve">All EMI transactions across accounts; filter by status, date range or account; see failed payments.</w:t>
+              <w:t xml:space="preserve">Unpaid instalments past their due date with days past due, plus a summary by bucket (1-30, 31-60, 61-90, 90+ days).</w:t>
             </w:r>
           </w:p>
         </w:tc>
@@ -19458,7 +19513,7 @@
                 <w:sz w:val="19"/>
                 <w:szCs w:val="19"/>
               </w:rPr>
-              <w:t xml:space="preserve">Accruals</w:t>
+              <w:t xml:space="preserve">Payments</w:t>
             </w:r>
           </w:p>
         </w:tc>
@@ -19483,7 +19538,7 @@
                 <w:sz w:val="19"/>
                 <w:szCs w:val="19"/>
               </w:rPr>
-              <w:t xml:space="preserve">Daily accrual totals across the book; click a date to list each account's accrual.</w:t>
+              <w:t xml:space="preserve">All EMI transactions across accounts; filter by status, date range or account; see failed payments.</w:t>
             </w:r>
           </w:p>
         </w:tc>
@@ -19512,7 +19567,7 @@
                 <w:sz w:val="19"/>
                 <w:szCs w:val="19"/>
               </w:rPr>
-              <w:t xml:space="preserve">Ledger outbox</w:t>
+              <w:t xml:space="preserve">Accruals</w:t>
             </w:r>
           </w:p>
         </w:tc>
@@ -19536,7 +19591,7 @@
                 <w:sz w:val="19"/>
                 <w:szCs w:val="19"/>
               </w:rPr>
-              <w:t xml:space="preserve">Counts of PENDING, POSTED and FAILED ledger entries and the individual entries with retry counts.</w:t>
+              <w:t xml:space="preserve">Daily accrual totals across the book; click a date to list each account's accrual.</w:t>
             </w:r>
           </w:p>
         </w:tc>
@@ -19566,7 +19621,7 @@
                 <w:sz w:val="19"/>
                 <w:szCs w:val="19"/>
               </w:rPr>
-              <w:t xml:space="preserve">Batch</w:t>
+              <w:t xml:space="preserve">Ledger outbox</w:t>
             </w:r>
           </w:p>
         </w:tc>
@@ -19591,7 +19646,7 @@
                 <w:sz w:val="19"/>
                 <w:szCs w:val="19"/>
               </w:rPr>
-              <w:t xml:space="preserve">The 36 batch job slots and recent executions; empty until the batch service has run.</w:t>
+              <w:t xml:space="preserve">Counts of PENDING, POSTED and FAILED ledger entries and the individual entries with retry counts.</w:t>
             </w:r>
           </w:p>
         </w:tc>
@@ -19620,6 +19675,60 @@
                 <w:sz w:val="19"/>
                 <w:szCs w:val="19"/>
               </w:rPr>
+              <w:t xml:space="preserve">Batch</w:t>
+            </w:r>
+          </w:p>
+        </w:tc>
+        <w:tc>
+          <w:tcPr>
+            <w:tcW w:type="dxa" w:w="7400"/>
+            <w:tcMar>
+              <w:top w:type="dxa" w:w="60"/>
+              <w:left w:type="dxa" w:w="100"/>
+              <w:bottom w:type="dxa" w:w="60"/>
+              <w:right w:type="dxa" w:w="100"/>
+            </w:tcMar>
+            <w:vAlign w:val="center"/>
+          </w:tcPr>
+          <w:p>
+            <w:pPr>
+              <w:jc w:val="left"/>
+            </w:pPr>
+            <w:r>
+              <w:rPr>
+                <w:sz w:val="19"/>
+                <w:szCs w:val="19"/>
+              </w:rPr>
+              <w:t xml:space="preserve">The 36 batch job slots and recent executions; empty until the batch service has run.</w:t>
+            </w:r>
+          </w:p>
+        </w:tc>
+      </w:tr>
+      <w:tr>
+        <w:trPr>
+          <w:cantSplit/>
+        </w:trPr>
+        <w:tc>
+          <w:tcPr>
+            <w:tcW w:type="dxa" w:w="2100"/>
+            <w:shd w:fill="F5F8FC" w:val="clear"/>
+            <w:tcMar>
+              <w:top w:type="dxa" w:w="60"/>
+              <w:left w:type="dxa" w:w="100"/>
+              <w:bottom w:type="dxa" w:w="60"/>
+              <w:right w:type="dxa" w:w="100"/>
+            </w:tcMar>
+            <w:vAlign w:val="center"/>
+          </w:tcPr>
+          <w:p>
+            <w:pPr>
+              <w:jc w:val="left"/>
+            </w:pPr>
+            <w:r>
+              <w:rPr>
+                <w:sz w:val="19"/>
+                <w:szCs w:val="19"/>
+              </w:rPr>
               <w:t xml:space="preserve">Configuration</w:t>
             </w:r>
           </w:p>
@@ -19627,6 +19736,7 @@
         <w:tc>
           <w:tcPr>
             <w:tcW w:type="dxa" w:w="7400"/>
+            <w:shd w:fill="F5F8FC" w:val="clear"/>
             <w:tcMar>
               <w:top w:type="dxa" w:w="60"/>
               <w:left w:type="dxa" w:w="100"/>
@@ -19850,7 +19960,7 @@
           <w:sz w:val="21"/>
           <w:szCs w:val="21"/>
         </w:rPr>
-        <w:t xml:space="preserve"> the portal cannot create, change, disburse, waive or post anything. Corrections are made through the Lending API. The only thing it can change is batch job settings (13.10).</w:t>
+        <w:t xml:space="preserve"> the portal cannot create, change, disburse, waive or post anything. Corrections are made through the Lending API. The only things it can change are batch job settings (13.10) and loan products (13.11).</w:t>
       </w:r>
     </w:p>
     <w:p>
@@ -19883,7 +19993,7 @@
           <w:sz w:val="21"/>
           <w:szCs w:val="21"/>
         </w:rPr>
-        <w:t xml:space="preserve">Single shared login with no individual users, roles or audit trail; anyone who can sign in can edit batch job settings.</w:t>
+        <w:t xml:space="preserve">Single shared login with no individual users, roles or audit trail; anyone who can sign in can edit batch job settings and loan products.</w:t>
       </w:r>
     </w:p>
     <w:p>
@@ -20965,14 +21075,30 @@
           <w:sz w:val="21"/>
           <w:szCs w:val="21"/>
         </w:rPr>
-        <w:t xml:space="preserve">§3.4 List / Retrieve Accounts:</w:t>
+        <w:t xml:space="preserve">§3 Account creation:</w:t>
       </w:r>
       <w:r>
         <w:rPr>
           <w:sz w:val="21"/>
           <w:szCs w:val="21"/>
         </w:rPr>
-        <w:t xml:space="preserve"> searching and listing across accounts is available in the Admin Portal; the Lending API itself still exposes retrieval by id or account number.</w:t>
+        <w:t xml:space="preserve"> </w:t>
+      </w:r>
+      <w:r>
+        <w:rPr>
+          <w:rFonts w:ascii="Consolas" w:hAnsi="Consolas" w:cs="Consolas"/>
+          <w:color w:val="1F3864"/>
+          <w:sz w:val="19"/>
+          <w:szCs w:val="19"/>
+        </w:rPr>
+        <w:t xml:space="preserve">productCode</w:t>
+      </w:r>
+      <w:r>
+        <w:rPr>
+          <w:sz w:val="21"/>
+          <w:szCs w:val="21"/>
+        </w:rPr>
+        <w:t xml:space="preserve"> must now name an ACTIVE loan product (13.11). Account type, rate type, interest rate, benchmark, spread and day-count convention become optional and default from the product; supplied values must stay inside the product's limits. The response also returns the product id and schedule type.</w:t>
       </w:r>
     </w:p>
     <w:p>
@@ -20991,14 +21117,14 @@
           <w:sz w:val="21"/>
           <w:szCs w:val="21"/>
         </w:rPr>
-        <w:t xml:space="preserve">§6.5 Transaction History:</w:t>
+        <w:t xml:space="preserve">§3.4 List / Retrieve Accounts:</w:t>
       </w:r>
       <w:r>
         <w:rPr>
           <w:sz w:val="21"/>
           <w:szCs w:val="21"/>
         </w:rPr>
-        <w:t xml:space="preserve"> the Admin Portal adds cross-account payment search and CSV export.</w:t>
+        <w:t xml:space="preserve"> searching and listing across accounts is available in the Admin Portal; the Lending API itself still exposes retrieval by id or account number.</w:t>
       </w:r>
     </w:p>
     <w:p>
@@ -21017,30 +21143,14 @@
           <w:sz w:val="21"/>
           <w:szCs w:val="21"/>
         </w:rPr>
-        <w:t xml:space="preserve">§12 Open items:</w:t>
+        <w:t xml:space="preserve">§6.5 Transaction History:</w:t>
       </w:r>
       <w:r>
         <w:rPr>
           <w:sz w:val="21"/>
           <w:szCs w:val="21"/>
         </w:rPr>
-        <w:t xml:space="preserve"> statement download, bulk operations and the accrual partition fix move to 'Working today'.</w:t>
-      </w:r>
-    </w:p>
-    <w:p>
-      <w:pPr>
-        <w:pStyle w:val="Heading2"/>
-        <w:spacing w:after="120" w:before="280"/>
-      </w:pPr>
-      <w:r>
-        <w:rPr>
-          <w:b/>
-          <w:bCs/>
-          <w:color w:val="2E5AA8"/>
-          <w:sz w:val="25"/>
-          <w:szCs w:val="25"/>
-        </w:rPr>
-        <w:t xml:space="preserve">13.9 Open Items</w:t>
+        <w:t xml:space="preserve"> the Admin Portal adds cross-account payment search and CSV export.</w:t>
       </w:r>
     </w:p>
     <w:p>
@@ -21054,10 +21164,35 @@
       </w:pPr>
       <w:r>
         <w:rPr>
+          <w:b/>
+          <w:bCs/>
           <w:sz w:val="21"/>
           <w:szCs w:val="21"/>
         </w:rPr>
-        <w:t xml:space="preserve">Admin Portal has one shared login; individual users, roles, SSO and audit logging are not built.</w:t>
+        <w:t xml:space="preserve">§12 Open items:</w:t>
+      </w:r>
+      <w:r>
+        <w:rPr>
+          <w:sz w:val="21"/>
+          <w:szCs w:val="21"/>
+        </w:rPr>
+        <w:t xml:space="preserve"> statement download, bulk operations and the accrual partition fix move to 'Working today'.</w:t>
+      </w:r>
+    </w:p>
+    <w:p>
+      <w:pPr>
+        <w:pStyle w:val="Heading2"/>
+        <w:spacing w:after="120" w:before="280"/>
+      </w:pPr>
+      <w:r>
+        <w:rPr>
+          <w:b/>
+          <w:bCs/>
+          <w:color w:val="2E5AA8"/>
+          <w:sz w:val="25"/>
+          <w:szCs w:val="25"/>
+        </w:rPr>
+        <w:t xml:space="preserve">13.9 Open Items</w:t>
       </w:r>
     </w:p>
     <w:p>
@@ -21074,7 +21209,7 @@
           <w:sz w:val="21"/>
           <w:szCs w:val="21"/>
         </w:rPr>
-        <w:t xml:space="preserve">Write actions (create, disburse, waive, post payment) are intentionally absent from the portal.</w:t>
+        <w:t xml:space="preserve">Admin Portal has one shared login; individual users, roles, SSO and audit logging are not built.</w:t>
       </w:r>
     </w:p>
     <w:p>
@@ -21091,7 +21226,7 @@
           <w:sz w:val="21"/>
           <w:szCs w:val="21"/>
         </w:rPr>
-        <w:t xml:space="preserve">Batch job bodies and the real ledger client remain stubs, so the Batch and Ledger screens reflect framework state only.</w:t>
+        <w:t xml:space="preserve">Write actions (create, disburse, waive, post payment) are intentionally absent from the portal.</w:t>
       </w:r>
     </w:p>
     <w:p>
@@ -21108,7 +21243,58 @@
           <w:sz w:val="21"/>
           <w:szCs w:val="21"/>
         </w:rPr>
+        <w:t xml:space="preserve">Batch job bodies and the real ledger client remain stubs, so the Batch and Ledger screens reflect framework state only.</w:t>
+      </w:r>
+    </w:p>
+    <w:p>
+      <w:pPr>
+        <w:pStyle w:val="ListParagraph"/>
+        <w:numPr>
+          <w:ilvl w:val="0"/>
+          <w:numId w:val="1"/>
+        </w:numPr>
+        <w:spacing w:after="80" w:line="264"/>
+      </w:pPr>
+      <w:r>
+        <w:rPr>
+          <w:sz w:val="21"/>
+          <w:szCs w:val="21"/>
+        </w:rPr>
         <w:t xml:space="preserve">Lending API authentication is still outstanding.</w:t>
+      </w:r>
+    </w:p>
+    <w:p>
+      <w:pPr>
+        <w:pStyle w:val="ListParagraph"/>
+        <w:numPr>
+          <w:ilvl w:val="0"/>
+          <w:numId w:val="1"/>
+        </w:numPr>
+        <w:spacing w:after="80" w:line="264"/>
+      </w:pPr>
+      <w:r>
+        <w:rPr>
+          <w:sz w:val="21"/>
+          <w:szCs w:val="21"/>
+        </w:rPr>
+        <w:t xml:space="preserve">Product changes are not audited (who changed what), and there is no approval step. The product API is unauthenticated like the rest of the Lending API.</w:t>
+      </w:r>
+    </w:p>
+    <w:p>
+      <w:pPr>
+        <w:pStyle w:val="ListParagraph"/>
+        <w:numPr>
+          <w:ilvl w:val="0"/>
+          <w:numId w:val="1"/>
+        </w:numPr>
+        <w:spacing w:after="80" w:line="264"/>
+      </w:pPr>
+      <w:r>
+        <w:rPr>
+          <w:sz w:val="21"/>
+          <w:szCs w:val="21"/>
+        </w:rPr>
+        <w:t xml:space="preserve">Only the EMI schedule type exists. There is no function to reprice or reschedule all accounts of a product after a product change; it was left out on purpose (13.11).</w:t>
       </w:r>
     </w:p>
     <w:p>
@@ -22579,6 +22765,3096 @@
           <w:szCs w:val="21"/>
         </w:rPr>
         <w:t xml:space="preserve">The complete list of settings, with defaults and sandbox values, is in the Technical Design Document, section 15.11, and on the Service settings tab.</w:t>
+      </w:r>
+    </w:p>
+    <w:p>
+      <w:pPr>
+        <w:pStyle w:val="Heading2"/>
+        <w:spacing w:after="120" w:before="280"/>
+      </w:pPr>
+      <w:r>
+        <w:rPr>
+          <w:b/>
+          <w:bCs/>
+          <w:color w:val="2E5AA8"/>
+          <w:sz w:val="25"/>
+          <w:szCs w:val="25"/>
+        </w:rPr>
+        <w:t xml:space="preserve">13.11 Loan Products</w:t>
+      </w:r>
+    </w:p>
+    <w:p>
+      <w:pPr>
+        <w:spacing w:after="140" w:line="276"/>
+      </w:pPr>
+      <w:r>
+        <w:rPr>
+          <w:sz w:val="21"/>
+          <w:szCs w:val="21"/>
+        </w:rPr>
+        <w:t xml:space="preserve">A </w:t>
+      </w:r>
+      <w:r>
+        <w:rPr>
+          <w:b/>
+          <w:bCs/>
+          <w:sz w:val="21"/>
+          <w:szCs w:val="21"/>
+        </w:rPr>
+        <w:t xml:space="preserve">loan product</w:t>
+      </w:r>
+      <w:r>
+        <w:rPr>
+          <w:sz w:val="21"/>
+          <w:szCs w:val="21"/>
+        </w:rPr>
+        <w:t xml:space="preserve"> defines the terms a kind of loan is offered on. Before this change the product code on an account was only a label. Now every account is opened from a product: it takes the product's terms by default, can differ from them only inside the product's limits, and keeps its own copy afterwards.</w:t>
+      </w:r>
+    </w:p>
+    <w:p>
+      <w:pPr>
+        <w:pStyle w:val="Heading3"/>
+        <w:spacing w:after="100" w:before="200"/>
+      </w:pPr>
+      <w:r>
+        <w:rPr>
+          <w:b/>
+          <w:bCs/>
+          <w:color w:val="2E5AA8"/>
+          <w:sz w:val="22"/>
+          <w:szCs w:val="22"/>
+        </w:rPr>
+        <w:t xml:space="preserve">What a product defines</w:t>
+      </w:r>
+    </w:p>
+    <w:tbl>
+      <w:tblPr>
+        <w:tblW w:type="dxa" w:w="9500"/>
+        <w:tblBorders>
+          <w:top w:val="single" w:color="auto" w:sz="4"/>
+          <w:left w:val="single" w:color="auto" w:sz="4"/>
+          <w:bottom w:val="single" w:color="auto" w:sz="4"/>
+          <w:right w:val="single" w:color="auto" w:sz="4"/>
+          <w:insideH w:val="single" w:color="auto" w:sz="4"/>
+          <w:insideV w:val="single" w:color="auto" w:sz="4"/>
+        </w:tblBorders>
+      </w:tblPr>
+      <w:tblGrid>
+        <w:gridCol w:w="2300"/>
+        <w:gridCol w:w="4300"/>
+        <w:gridCol w:w="2900"/>
+      </w:tblGrid>
+      <w:tr>
+        <w:trPr>
+          <w:tblHeader/>
+        </w:trPr>
+        <w:tc>
+          <w:tcPr>
+            <w:tcW w:type="dxa" w:w="2300"/>
+            <w:shd w:fill="1F3864" w:val="clear"/>
+            <w:tcMar>
+              <w:top w:type="dxa" w:w="60"/>
+              <w:left w:type="dxa" w:w="100"/>
+              <w:bottom w:type="dxa" w:w="60"/>
+              <w:right w:type="dxa" w:w="100"/>
+            </w:tcMar>
+            <w:vAlign w:val="center"/>
+          </w:tcPr>
+          <w:p>
+            <w:pPr>
+              <w:jc w:val="left"/>
+            </w:pPr>
+            <w:r>
+              <w:rPr>
+                <w:b/>
+                <w:bCs/>
+                <w:color w:val="FFFFFF"/>
+                <w:sz w:val="19"/>
+                <w:szCs w:val="19"/>
+              </w:rPr>
+              <w:t xml:space="preserve">Parameter</w:t>
+            </w:r>
+          </w:p>
+        </w:tc>
+        <w:tc>
+          <w:tcPr>
+            <w:tcW w:type="dxa" w:w="4300"/>
+            <w:shd w:fill="1F3864" w:val="clear"/>
+            <w:tcMar>
+              <w:top w:type="dxa" w:w="60"/>
+              <w:left w:type="dxa" w:w="100"/>
+              <w:bottom w:type="dxa" w:w="60"/>
+              <w:right w:type="dxa" w:w="100"/>
+            </w:tcMar>
+            <w:vAlign w:val="center"/>
+          </w:tcPr>
+          <w:p>
+            <w:pPr>
+              <w:jc w:val="left"/>
+            </w:pPr>
+            <w:r>
+              <w:rPr>
+                <w:b/>
+                <w:bCs/>
+                <w:color w:val="FFFFFF"/>
+                <w:sz w:val="19"/>
+                <w:szCs w:val="19"/>
+              </w:rPr>
+              <w:t xml:space="preserve">Rules</w:t>
+            </w:r>
+          </w:p>
+        </w:tc>
+        <w:tc>
+          <w:tcPr>
+            <w:tcW w:type="dxa" w:w="2900"/>
+            <w:shd w:fill="1F3864" w:val="clear"/>
+            <w:tcMar>
+              <w:top w:type="dxa" w:w="60"/>
+              <w:left w:type="dxa" w:w="100"/>
+              <w:bottom w:type="dxa" w:w="60"/>
+              <w:right w:type="dxa" w:w="100"/>
+            </w:tcMar>
+            <w:vAlign w:val="center"/>
+          </w:tcPr>
+          <w:p>
+            <w:pPr>
+              <w:jc w:val="left"/>
+            </w:pPr>
+            <w:r>
+              <w:rPr>
+                <w:b/>
+                <w:bCs/>
+                <w:color w:val="FFFFFF"/>
+                <w:sz w:val="19"/>
+                <w:szCs w:val="19"/>
+              </w:rPr>
+              <w:t xml:space="preserve">Effect on an account</w:t>
+            </w:r>
+          </w:p>
+        </w:tc>
+      </w:tr>
+      <w:tr>
+        <w:trPr>
+          <w:cantSplit/>
+        </w:trPr>
+        <w:tc>
+          <w:tcPr>
+            <w:tcW w:type="dxa" w:w="2300"/>
+            <w:tcMar>
+              <w:top w:type="dxa" w:w="60"/>
+              <w:left w:type="dxa" w:w="100"/>
+              <w:bottom w:type="dxa" w:w="60"/>
+              <w:right w:type="dxa" w:w="100"/>
+            </w:tcMar>
+            <w:vAlign w:val="center"/>
+          </w:tcPr>
+          <w:p>
+            <w:pPr>
+              <w:jc w:val="left"/>
+            </w:pPr>
+            <w:r>
+              <w:rPr>
+                <w:sz w:val="19"/>
+                <w:szCs w:val="19"/>
+              </w:rPr>
+              <w:t xml:space="preserve">Product code</w:t>
+            </w:r>
+          </w:p>
+        </w:tc>
+        <w:tc>
+          <w:tcPr>
+            <w:tcW w:type="dxa" w:w="4300"/>
+            <w:tcMar>
+              <w:top w:type="dxa" w:w="60"/>
+              <w:left w:type="dxa" w:w="100"/>
+              <w:bottom w:type="dxa" w:w="60"/>
+              <w:right w:type="dxa" w:w="100"/>
+            </w:tcMar>
+            <w:vAlign w:val="center"/>
+          </w:tcPr>
+          <w:p>
+            <w:pPr>
+              <w:jc w:val="left"/>
+            </w:pPr>
+            <w:r>
+              <w:rPr>
+                <w:sz w:val="19"/>
+                <w:szCs w:val="19"/>
+              </w:rPr>
+              <w:t xml:space="preserve">Up to 10 characters (letters, digits, - and _); unique; cannot be changed</w:t>
+            </w:r>
+          </w:p>
+        </w:tc>
+        <w:tc>
+          <w:tcPr>
+            <w:tcW w:type="dxa" w:w="2900"/>
+            <w:tcMar>
+              <w:top w:type="dxa" w:w="60"/>
+              <w:left w:type="dxa" w:w="100"/>
+              <w:bottom w:type="dxa" w:w="60"/>
+              <w:right w:type="dxa" w:w="100"/>
+            </w:tcMar>
+            <w:vAlign w:val="center"/>
+          </w:tcPr>
+          <w:p>
+            <w:pPr>
+              <w:jc w:val="left"/>
+            </w:pPr>
+            <w:r>
+              <w:rPr>
+                <w:sz w:val="19"/>
+                <w:szCs w:val="19"/>
+              </w:rPr>
+              <w:t xml:space="preserve">Copied to the account (account number prefix, reports)</w:t>
+            </w:r>
+          </w:p>
+        </w:tc>
+      </w:tr>
+      <w:tr>
+        <w:trPr>
+          <w:cantSplit/>
+        </w:trPr>
+        <w:tc>
+          <w:tcPr>
+            <w:tcW w:type="dxa" w:w="2300"/>
+            <w:shd w:fill="F5F8FC" w:val="clear"/>
+            <w:tcMar>
+              <w:top w:type="dxa" w:w="60"/>
+              <w:left w:type="dxa" w:w="100"/>
+              <w:bottom w:type="dxa" w:w="60"/>
+              <w:right w:type="dxa" w:w="100"/>
+            </w:tcMar>
+            <w:vAlign w:val="center"/>
+          </w:tcPr>
+          <w:p>
+            <w:pPr>
+              <w:jc w:val="left"/>
+            </w:pPr>
+            <w:r>
+              <w:rPr>
+                <w:sz w:val="19"/>
+                <w:szCs w:val="19"/>
+              </w:rPr>
+              <w:t xml:space="preserve">Name, description</w:t>
+            </w:r>
+          </w:p>
+        </w:tc>
+        <w:tc>
+          <w:tcPr>
+            <w:tcW w:type="dxa" w:w="4300"/>
+            <w:shd w:fill="F5F8FC" w:val="clear"/>
+            <w:tcMar>
+              <w:top w:type="dxa" w:w="60"/>
+              <w:left w:type="dxa" w:w="100"/>
+              <w:bottom w:type="dxa" w:w="60"/>
+              <w:right w:type="dxa" w:w="100"/>
+            </w:tcMar>
+            <w:vAlign w:val="center"/>
+          </w:tcPr>
+          <w:p>
+            <w:pPr>
+              <w:jc w:val="left"/>
+            </w:pPr>
+            <w:r>
+              <w:rPr>
+                <w:sz w:val="19"/>
+                <w:szCs w:val="19"/>
+              </w:rPr>
+              <w:t xml:space="preserve">Free text</w:t>
+            </w:r>
+          </w:p>
+        </w:tc>
+        <w:tc>
+          <w:tcPr>
+            <w:tcW w:type="dxa" w:w="2900"/>
+            <w:shd w:fill="F5F8FC" w:val="clear"/>
+            <w:tcMar>
+              <w:top w:type="dxa" w:w="60"/>
+              <w:left w:type="dxa" w:w="100"/>
+              <w:bottom w:type="dxa" w:w="60"/>
+              <w:right w:type="dxa" w:w="100"/>
+            </w:tcMar>
+            <w:vAlign w:val="center"/>
+          </w:tcPr>
+          <w:p>
+            <w:pPr>
+              <w:jc w:val="left"/>
+            </w:pPr>
+            <w:r>
+              <w:rPr>
+                <w:sz w:val="19"/>
+                <w:szCs w:val="19"/>
+              </w:rPr>
+              <w:t xml:space="preserve">Display only</w:t>
+            </w:r>
+          </w:p>
+        </w:tc>
+      </w:tr>
+      <w:tr>
+        <w:trPr>
+          <w:cantSplit/>
+        </w:trPr>
+        <w:tc>
+          <w:tcPr>
+            <w:tcW w:type="dxa" w:w="2300"/>
+            <w:tcMar>
+              <w:top w:type="dxa" w:w="60"/>
+              <w:left w:type="dxa" w:w="100"/>
+              <w:bottom w:type="dxa" w:w="60"/>
+              <w:right w:type="dxa" w:w="100"/>
+            </w:tcMar>
+            <w:vAlign w:val="center"/>
+          </w:tcPr>
+          <w:p>
+            <w:pPr>
+              <w:jc w:val="left"/>
+            </w:pPr>
+            <w:r>
+              <w:rPr>
+                <w:sz w:val="19"/>
+                <w:szCs w:val="19"/>
+              </w:rPr>
+              <w:t xml:space="preserve">Account type</w:t>
+            </w:r>
+          </w:p>
+        </w:tc>
+        <w:tc>
+          <w:tcPr>
+            <w:tcW w:type="dxa" w:w="4300"/>
+            <w:tcMar>
+              <w:top w:type="dxa" w:w="60"/>
+              <w:left w:type="dxa" w:w="100"/>
+              <w:bottom w:type="dxa" w:w="60"/>
+              <w:right w:type="dxa" w:w="100"/>
+            </w:tcMar>
+            <w:vAlign w:val="center"/>
+          </w:tcPr>
+          <w:p>
+            <w:pPr>
+              <w:jc w:val="left"/>
+            </w:pPr>
+            <w:r>
+              <w:rPr>
+                <w:sz w:val="19"/>
+                <w:szCs w:val="19"/>
+              </w:rPr>
+              <w:t xml:space="preserve">UNSECURED or MORTGAGE</w:t>
+            </w:r>
+          </w:p>
+        </w:tc>
+        <w:tc>
+          <w:tcPr>
+            <w:tcW w:type="dxa" w:w="2900"/>
+            <w:tcMar>
+              <w:top w:type="dxa" w:w="60"/>
+              <w:left w:type="dxa" w:w="100"/>
+              <w:bottom w:type="dxa" w:w="60"/>
+              <w:right w:type="dxa" w:w="100"/>
+            </w:tcMar>
+            <w:vAlign w:val="center"/>
+          </w:tcPr>
+          <w:p>
+            <w:pPr>
+              <w:jc w:val="left"/>
+            </w:pPr>
+            <w:r>
+              <w:rPr>
+                <w:sz w:val="19"/>
+                <w:szCs w:val="19"/>
+              </w:rPr>
+              <w:t xml:space="preserve">Defaulted onto the account; if the request gives one it must match</w:t>
+            </w:r>
+          </w:p>
+        </w:tc>
+      </w:tr>
+      <w:tr>
+        <w:trPr>
+          <w:cantSplit/>
+        </w:trPr>
+        <w:tc>
+          <w:tcPr>
+            <w:tcW w:type="dxa" w:w="2300"/>
+            <w:shd w:fill="F5F8FC" w:val="clear"/>
+            <w:tcMar>
+              <w:top w:type="dxa" w:w="60"/>
+              <w:left w:type="dxa" w:w="100"/>
+              <w:bottom w:type="dxa" w:w="60"/>
+              <w:right w:type="dxa" w:w="100"/>
+            </w:tcMar>
+            <w:vAlign w:val="center"/>
+          </w:tcPr>
+          <w:p>
+            <w:pPr>
+              <w:jc w:val="left"/>
+            </w:pPr>
+            <w:r>
+              <w:rPr>
+                <w:sz w:val="19"/>
+                <w:szCs w:val="19"/>
+              </w:rPr>
+              <w:t xml:space="preserve">Rate type</w:t>
+            </w:r>
+          </w:p>
+        </w:tc>
+        <w:tc>
+          <w:tcPr>
+            <w:tcW w:type="dxa" w:w="4300"/>
+            <w:shd w:fill="F5F8FC" w:val="clear"/>
+            <w:tcMar>
+              <w:top w:type="dxa" w:w="60"/>
+              <w:left w:type="dxa" w:w="100"/>
+              <w:bottom w:type="dxa" w:w="60"/>
+              <w:right w:type="dxa" w:w="100"/>
+            </w:tcMar>
+            <w:vAlign w:val="center"/>
+          </w:tcPr>
+          <w:p>
+            <w:pPr>
+              <w:jc w:val="left"/>
+            </w:pPr>
+            <w:r>
+              <w:rPr>
+                <w:sz w:val="19"/>
+                <w:szCs w:val="19"/>
+              </w:rPr>
+              <w:t xml:space="preserve">FIXED or FLOATING</w:t>
+            </w:r>
+          </w:p>
+        </w:tc>
+        <w:tc>
+          <w:tcPr>
+            <w:tcW w:type="dxa" w:w="2900"/>
+            <w:shd w:fill="F5F8FC" w:val="clear"/>
+            <w:tcMar>
+              <w:top w:type="dxa" w:w="60"/>
+              <w:left w:type="dxa" w:w="100"/>
+              <w:bottom w:type="dxa" w:w="60"/>
+              <w:right w:type="dxa" w:w="100"/>
+            </w:tcMar>
+            <w:vAlign w:val="center"/>
+          </w:tcPr>
+          <w:p>
+            <w:pPr>
+              <w:jc w:val="left"/>
+            </w:pPr>
+            <w:r>
+              <w:rPr>
+                <w:sz w:val="19"/>
+                <w:szCs w:val="19"/>
+              </w:rPr>
+              <w:t xml:space="preserve">Defaulted onto the account; if the request gives one it must match</w:t>
+            </w:r>
+          </w:p>
+        </w:tc>
+      </w:tr>
+      <w:tr>
+        <w:trPr>
+          <w:cantSplit/>
+        </w:trPr>
+        <w:tc>
+          <w:tcPr>
+            <w:tcW w:type="dxa" w:w="2300"/>
+            <w:tcMar>
+              <w:top w:type="dxa" w:w="60"/>
+              <w:left w:type="dxa" w:w="100"/>
+              <w:bottom w:type="dxa" w:w="60"/>
+              <w:right w:type="dxa" w:w="100"/>
+            </w:tcMar>
+            <w:vAlign w:val="center"/>
+          </w:tcPr>
+          <w:p>
+            <w:pPr>
+              <w:jc w:val="left"/>
+            </w:pPr>
+            <w:r>
+              <w:rPr>
+                <w:sz w:val="19"/>
+                <w:szCs w:val="19"/>
+              </w:rPr>
+              <w:t xml:space="preserve">Schedule type</w:t>
+            </w:r>
+          </w:p>
+        </w:tc>
+        <w:tc>
+          <w:tcPr>
+            <w:tcW w:type="dxa" w:w="4300"/>
+            <w:tcMar>
+              <w:top w:type="dxa" w:w="60"/>
+              <w:left w:type="dxa" w:w="100"/>
+              <w:bottom w:type="dxa" w:w="60"/>
+              <w:right w:type="dxa" w:w="100"/>
+            </w:tcMar>
+            <w:vAlign w:val="center"/>
+          </w:tcPr>
+          <w:p>
+            <w:pPr>
+              <w:jc w:val="left"/>
+            </w:pPr>
+            <w:r>
+              <w:rPr>
+                <w:sz w:val="19"/>
+                <w:szCs w:val="19"/>
+              </w:rPr>
+              <w:t xml:space="preserve">EMI (reducing balance, equated monthly instalments). The only type implemented</w:t>
+            </w:r>
+          </w:p>
+        </w:tc>
+        <w:tc>
+          <w:tcPr>
+            <w:tcW w:type="dxa" w:w="2900"/>
+            <w:tcMar>
+              <w:top w:type="dxa" w:w="60"/>
+              <w:left w:type="dxa" w:w="100"/>
+              <w:bottom w:type="dxa" w:w="60"/>
+              <w:right w:type="dxa" w:w="100"/>
+            </w:tcMar>
+            <w:vAlign w:val="center"/>
+          </w:tcPr>
+          <w:p>
+            <w:pPr>
+              <w:jc w:val="left"/>
+            </w:pPr>
+            <w:r>
+              <w:rPr>
+                <w:sz w:val="19"/>
+                <w:szCs w:val="19"/>
+              </w:rPr>
+              <w:t xml:space="preserve">Copied to the account (</w:t>
+            </w:r>
+            <w:r>
+              <w:rPr>
+                <w:rFonts w:ascii="Consolas" w:hAnsi="Consolas" w:cs="Consolas"/>
+                <w:color w:val="1F3864"/>
+                <w:sz w:val="17"/>
+                <w:szCs w:val="17"/>
+              </w:rPr>
+              <w:t xml:space="preserve">loan_account.schedule_type</w:t>
+            </w:r>
+            <w:r>
+              <w:rPr>
+                <w:sz w:val="19"/>
+                <w:szCs w:val="19"/>
+              </w:rPr>
+              <w:t xml:space="preserve">)</w:t>
+            </w:r>
+          </w:p>
+        </w:tc>
+      </w:tr>
+      <w:tr>
+        <w:trPr>
+          <w:cantSplit/>
+        </w:trPr>
+        <w:tc>
+          <w:tcPr>
+            <w:tcW w:type="dxa" w:w="2300"/>
+            <w:shd w:fill="F5F8FC" w:val="clear"/>
+            <w:tcMar>
+              <w:top w:type="dxa" w:w="60"/>
+              <w:left w:type="dxa" w:w="100"/>
+              <w:bottom w:type="dxa" w:w="60"/>
+              <w:right w:type="dxa" w:w="100"/>
+            </w:tcMar>
+            <w:vAlign w:val="center"/>
+          </w:tcPr>
+          <w:p>
+            <w:pPr>
+              <w:jc w:val="left"/>
+            </w:pPr>
+            <w:r>
+              <w:rPr>
+                <w:sz w:val="19"/>
+                <w:szCs w:val="19"/>
+              </w:rPr>
+              <w:t xml:space="preserve">Day-count convention</w:t>
+            </w:r>
+          </w:p>
+        </w:tc>
+        <w:tc>
+          <w:tcPr>
+            <w:tcW w:type="dxa" w:w="4300"/>
+            <w:shd w:fill="F5F8FC" w:val="clear"/>
+            <w:tcMar>
+              <w:top w:type="dxa" w:w="60"/>
+              <w:left w:type="dxa" w:w="100"/>
+              <w:bottom w:type="dxa" w:w="60"/>
+              <w:right w:type="dxa" w:w="100"/>
+            </w:tcMar>
+            <w:vAlign w:val="center"/>
+          </w:tcPr>
+          <w:p>
+            <w:pPr>
+              <w:jc w:val="left"/>
+            </w:pPr>
+            <w:r>
+              <w:rPr>
+                <w:sz w:val="19"/>
+                <w:szCs w:val="19"/>
+              </w:rPr>
+              <w:t xml:space="preserve">ACT/365, ACT/ACT or 30/360</w:t>
+            </w:r>
+          </w:p>
+        </w:tc>
+        <w:tc>
+          <w:tcPr>
+            <w:tcW w:type="dxa" w:w="2900"/>
+            <w:shd w:fill="F5F8FC" w:val="clear"/>
+            <w:tcMar>
+              <w:top w:type="dxa" w:w="60"/>
+              <w:left w:type="dxa" w:w="100"/>
+              <w:bottom w:type="dxa" w:w="60"/>
+              <w:right w:type="dxa" w:w="100"/>
+            </w:tcMar>
+            <w:vAlign w:val="center"/>
+          </w:tcPr>
+          <w:p>
+            <w:pPr>
+              <w:jc w:val="left"/>
+            </w:pPr>
+            <w:r>
+              <w:rPr>
+                <w:sz w:val="19"/>
+                <w:szCs w:val="19"/>
+              </w:rPr>
+              <w:t xml:space="preserve">Defaulted; the request may override</w:t>
+            </w:r>
+          </w:p>
+        </w:tc>
+      </w:tr>
+      <w:tr>
+        <w:trPr>
+          <w:cantSplit/>
+        </w:trPr>
+        <w:tc>
+          <w:tcPr>
+            <w:tcW w:type="dxa" w:w="2300"/>
+            <w:tcMar>
+              <w:top w:type="dxa" w:w="60"/>
+              <w:left w:type="dxa" w:w="100"/>
+              <w:bottom w:type="dxa" w:w="60"/>
+              <w:right w:type="dxa" w:w="100"/>
+            </w:tcMar>
+            <w:vAlign w:val="center"/>
+          </w:tcPr>
+          <w:p>
+            <w:pPr>
+              <w:jc w:val="left"/>
+            </w:pPr>
+            <w:r>
+              <w:rPr>
+                <w:sz w:val="19"/>
+                <w:szCs w:val="19"/>
+              </w:rPr>
+              <w:t xml:space="preserve">Benchmark</w:t>
+            </w:r>
+          </w:p>
+        </w:tc>
+        <w:tc>
+          <w:tcPr>
+            <w:tcW w:type="dxa" w:w="4300"/>
+            <w:tcMar>
+              <w:top w:type="dxa" w:w="60"/>
+              <w:left w:type="dxa" w:w="100"/>
+              <w:bottom w:type="dxa" w:w="60"/>
+              <w:right w:type="dxa" w:w="100"/>
+            </w:tcMar>
+            <w:vAlign w:val="center"/>
+          </w:tcPr>
+          <w:p>
+            <w:pPr>
+              <w:jc w:val="left"/>
+            </w:pPr>
+            <w:r>
+              <w:rPr>
+                <w:sz w:val="19"/>
+                <w:szCs w:val="19"/>
+              </w:rPr>
+              <w:t xml:space="preserve">Required for FLOATING (for example REPO, MCLR_1Y); not allowed for FIXED</w:t>
+            </w:r>
+          </w:p>
+        </w:tc>
+        <w:tc>
+          <w:tcPr>
+            <w:tcW w:type="dxa" w:w="2900"/>
+            <w:tcMar>
+              <w:top w:type="dxa" w:w="60"/>
+              <w:left w:type="dxa" w:w="100"/>
+              <w:bottom w:type="dxa" w:w="60"/>
+              <w:right w:type="dxa" w:w="100"/>
+            </w:tcMar>
+            <w:vAlign w:val="center"/>
+          </w:tcPr>
+          <w:p>
+            <w:pPr>
+              <w:jc w:val="left"/>
+            </w:pPr>
+            <w:r>
+              <w:rPr>
+                <w:sz w:val="19"/>
+                <w:szCs w:val="19"/>
+              </w:rPr>
+              <w:t xml:space="preserve">Defaulted; the request may override</w:t>
+            </w:r>
+          </w:p>
+        </w:tc>
+      </w:tr>
+      <w:tr>
+        <w:trPr>
+          <w:cantSplit/>
+        </w:trPr>
+        <w:tc>
+          <w:tcPr>
+            <w:tcW w:type="dxa" w:w="2300"/>
+            <w:shd w:fill="F5F8FC" w:val="clear"/>
+            <w:tcMar>
+              <w:top w:type="dxa" w:w="60"/>
+              <w:left w:type="dxa" w:w="100"/>
+              <w:bottom w:type="dxa" w:w="60"/>
+              <w:right w:type="dxa" w:w="100"/>
+            </w:tcMar>
+            <w:vAlign w:val="center"/>
+          </w:tcPr>
+          <w:p>
+            <w:pPr>
+              <w:jc w:val="left"/>
+            </w:pPr>
+            <w:r>
+              <w:rPr>
+                <w:sz w:val="19"/>
+                <w:szCs w:val="19"/>
+              </w:rPr>
+              <w:t xml:space="preserve">Default interest rate</w:t>
+            </w:r>
+          </w:p>
+        </w:tc>
+        <w:tc>
+          <w:tcPr>
+            <w:tcW w:type="dxa" w:w="4300"/>
+            <w:shd w:fill="F5F8FC" w:val="clear"/>
+            <w:tcMar>
+              <w:top w:type="dxa" w:w="60"/>
+              <w:left w:type="dxa" w:w="100"/>
+              <w:bottom w:type="dxa" w:w="60"/>
+              <w:right w:type="dxa" w:w="100"/>
+            </w:tcMar>
+            <w:vAlign w:val="center"/>
+          </w:tcPr>
+          <w:p>
+            <w:pPr>
+              <w:jc w:val="left"/>
+            </w:pPr>
+            <w:r>
+              <w:rPr>
+                <w:sz w:val="19"/>
+                <w:szCs w:val="19"/>
+              </w:rPr>
+              <w:t xml:space="preserve">Annual %, between 0 and 99.9999; must lie inside the rate band</w:t>
+            </w:r>
+          </w:p>
+        </w:tc>
+        <w:tc>
+          <w:tcPr>
+            <w:tcW w:type="dxa" w:w="2900"/>
+            <w:shd w:fill="F5F8FC" w:val="clear"/>
+            <w:tcMar>
+              <w:top w:type="dxa" w:w="60"/>
+              <w:left w:type="dxa" w:w="100"/>
+              <w:bottom w:type="dxa" w:w="60"/>
+              <w:right w:type="dxa" w:w="100"/>
+            </w:tcMar>
+            <w:vAlign w:val="center"/>
+          </w:tcPr>
+          <w:p>
+            <w:pPr>
+              <w:jc w:val="left"/>
+            </w:pPr>
+            <w:r>
+              <w:rPr>
+                <w:sz w:val="19"/>
+                <w:szCs w:val="19"/>
+              </w:rPr>
+              <w:t xml:space="preserve">Used when the request gives no rate</w:t>
+            </w:r>
+          </w:p>
+        </w:tc>
+      </w:tr>
+      <w:tr>
+        <w:trPr>
+          <w:cantSplit/>
+        </w:trPr>
+        <w:tc>
+          <w:tcPr>
+            <w:tcW w:type="dxa" w:w="2300"/>
+            <w:tcMar>
+              <w:top w:type="dxa" w:w="60"/>
+              <w:left w:type="dxa" w:w="100"/>
+              <w:bottom w:type="dxa" w:w="60"/>
+              <w:right w:type="dxa" w:w="100"/>
+            </w:tcMar>
+            <w:vAlign w:val="center"/>
+          </w:tcPr>
+          <w:p>
+            <w:pPr>
+              <w:jc w:val="left"/>
+            </w:pPr>
+            <w:r>
+              <w:rPr>
+                <w:sz w:val="19"/>
+                <w:szCs w:val="19"/>
+              </w:rPr>
+              <w:t xml:space="preserve">Default spread</w:t>
+            </w:r>
+          </w:p>
+        </w:tc>
+        <w:tc>
+          <w:tcPr>
+            <w:tcW w:type="dxa" w:w="4300"/>
+            <w:tcMar>
+              <w:top w:type="dxa" w:w="60"/>
+              <w:left w:type="dxa" w:w="100"/>
+              <w:bottom w:type="dxa" w:w="60"/>
+              <w:right w:type="dxa" w:w="100"/>
+            </w:tcMar>
+            <w:vAlign w:val="center"/>
+          </w:tcPr>
+          <w:p>
+            <w:pPr>
+              <w:jc w:val="left"/>
+            </w:pPr>
+            <w:r>
+              <w:rPr>
+                <w:sz w:val="19"/>
+                <w:szCs w:val="19"/>
+              </w:rPr>
+              <w:t xml:space="preserve">FLOATING only; must lie inside the spread band</w:t>
+            </w:r>
+          </w:p>
+        </w:tc>
+        <w:tc>
+          <w:tcPr>
+            <w:tcW w:type="dxa" w:w="2900"/>
+            <w:tcMar>
+              <w:top w:type="dxa" w:w="60"/>
+              <w:left w:type="dxa" w:w="100"/>
+              <w:bottom w:type="dxa" w:w="60"/>
+              <w:right w:type="dxa" w:w="100"/>
+            </w:tcMar>
+            <w:vAlign w:val="center"/>
+          </w:tcPr>
+          <w:p>
+            <w:pPr>
+              <w:jc w:val="left"/>
+            </w:pPr>
+            <w:r>
+              <w:rPr>
+                <w:sz w:val="19"/>
+                <w:szCs w:val="19"/>
+              </w:rPr>
+              <w:t xml:space="preserve">Used when the request gives no spread</w:t>
+            </w:r>
+          </w:p>
+        </w:tc>
+      </w:tr>
+      <w:tr>
+        <w:trPr>
+          <w:cantSplit/>
+        </w:trPr>
+        <w:tc>
+          <w:tcPr>
+            <w:tcW w:type="dxa" w:w="2300"/>
+            <w:shd w:fill="F5F8FC" w:val="clear"/>
+            <w:tcMar>
+              <w:top w:type="dxa" w:w="60"/>
+              <w:left w:type="dxa" w:w="100"/>
+              <w:bottom w:type="dxa" w:w="60"/>
+              <w:right w:type="dxa" w:w="100"/>
+            </w:tcMar>
+            <w:vAlign w:val="center"/>
+          </w:tcPr>
+          <w:p>
+            <w:pPr>
+              <w:jc w:val="left"/>
+            </w:pPr>
+            <w:r>
+              <w:rPr>
+                <w:sz w:val="19"/>
+                <w:szCs w:val="19"/>
+              </w:rPr>
+              <w:t xml:space="preserve">Rate band (min / max)</w:t>
+            </w:r>
+          </w:p>
+        </w:tc>
+        <w:tc>
+          <w:tcPr>
+            <w:tcW w:type="dxa" w:w="4300"/>
+            <w:shd w:fill="F5F8FC" w:val="clear"/>
+            <w:tcMar>
+              <w:top w:type="dxa" w:w="60"/>
+              <w:left w:type="dxa" w:w="100"/>
+              <w:bottom w:type="dxa" w:w="60"/>
+              <w:right w:type="dxa" w:w="100"/>
+            </w:tcMar>
+            <w:vAlign w:val="center"/>
+          </w:tcPr>
+          <w:p>
+            <w:pPr>
+              <w:jc w:val="left"/>
+            </w:pPr>
+            <w:r>
+              <w:rPr>
+                <w:sz w:val="19"/>
+                <w:szCs w:val="19"/>
+              </w:rPr>
+              <w:t xml:space="preserve">Annual %; empty = no limit</w:t>
+            </w:r>
+          </w:p>
+        </w:tc>
+        <w:tc>
+          <w:tcPr>
+            <w:tcW w:type="dxa" w:w="2900"/>
+            <w:shd w:fill="F5F8FC" w:val="clear"/>
+            <w:tcMar>
+              <w:top w:type="dxa" w:w="60"/>
+              <w:left w:type="dxa" w:w="100"/>
+              <w:bottom w:type="dxa" w:w="60"/>
+              <w:right w:type="dxa" w:w="100"/>
+            </w:tcMar>
+            <w:vAlign w:val="center"/>
+          </w:tcPr>
+          <w:p>
+            <w:pPr>
+              <w:jc w:val="left"/>
+            </w:pPr>
+            <w:r>
+              <w:rPr>
+                <w:sz w:val="19"/>
+                <w:szCs w:val="19"/>
+              </w:rPr>
+              <w:t xml:space="preserve">Account rate must lie inside; also floors and caps a floating rate reset</w:t>
+            </w:r>
+          </w:p>
+        </w:tc>
+      </w:tr>
+      <w:tr>
+        <w:trPr>
+          <w:cantSplit/>
+        </w:trPr>
+        <w:tc>
+          <w:tcPr>
+            <w:tcW w:type="dxa" w:w="2300"/>
+            <w:tcMar>
+              <w:top w:type="dxa" w:w="60"/>
+              <w:left w:type="dxa" w:w="100"/>
+              <w:bottom w:type="dxa" w:w="60"/>
+              <w:right w:type="dxa" w:w="100"/>
+            </w:tcMar>
+            <w:vAlign w:val="center"/>
+          </w:tcPr>
+          <w:p>
+            <w:pPr>
+              <w:jc w:val="left"/>
+            </w:pPr>
+            <w:r>
+              <w:rPr>
+                <w:sz w:val="19"/>
+                <w:szCs w:val="19"/>
+              </w:rPr>
+              <w:t xml:space="preserve">Spread band (min / max)</w:t>
+            </w:r>
+          </w:p>
+        </w:tc>
+        <w:tc>
+          <w:tcPr>
+            <w:tcW w:type="dxa" w:w="4300"/>
+            <w:tcMar>
+              <w:top w:type="dxa" w:w="60"/>
+              <w:left w:type="dxa" w:w="100"/>
+              <w:bottom w:type="dxa" w:w="60"/>
+              <w:right w:type="dxa" w:w="100"/>
+            </w:tcMar>
+            <w:vAlign w:val="center"/>
+          </w:tcPr>
+          <w:p>
+            <w:pPr>
+              <w:jc w:val="left"/>
+            </w:pPr>
+            <w:r>
+              <w:rPr>
+                <w:sz w:val="19"/>
+                <w:szCs w:val="19"/>
+              </w:rPr>
+              <w:t xml:space="preserve">FLOATING only; empty = no limit</w:t>
+            </w:r>
+          </w:p>
+        </w:tc>
+        <w:tc>
+          <w:tcPr>
+            <w:tcW w:type="dxa" w:w="2900"/>
+            <w:tcMar>
+              <w:top w:type="dxa" w:w="60"/>
+              <w:left w:type="dxa" w:w="100"/>
+              <w:bottom w:type="dxa" w:w="60"/>
+              <w:right w:type="dxa" w:w="100"/>
+            </w:tcMar>
+            <w:vAlign w:val="center"/>
+          </w:tcPr>
+          <w:p>
+            <w:pPr>
+              <w:jc w:val="left"/>
+            </w:pPr>
+            <w:r>
+              <w:rPr>
+                <w:sz w:val="19"/>
+                <w:szCs w:val="19"/>
+              </w:rPr>
+              <w:t xml:space="preserve">Account spread must lie inside</w:t>
+            </w:r>
+          </w:p>
+        </w:tc>
+      </w:tr>
+      <w:tr>
+        <w:trPr>
+          <w:cantSplit/>
+        </w:trPr>
+        <w:tc>
+          <w:tcPr>
+            <w:tcW w:type="dxa" w:w="2300"/>
+            <w:shd w:fill="F5F8FC" w:val="clear"/>
+            <w:tcMar>
+              <w:top w:type="dxa" w:w="60"/>
+              <w:left w:type="dxa" w:w="100"/>
+              <w:bottom w:type="dxa" w:w="60"/>
+              <w:right w:type="dxa" w:w="100"/>
+            </w:tcMar>
+            <w:vAlign w:val="center"/>
+          </w:tcPr>
+          <w:p>
+            <w:pPr>
+              <w:jc w:val="left"/>
+            </w:pPr>
+            <w:r>
+              <w:rPr>
+                <w:sz w:val="19"/>
+                <w:szCs w:val="19"/>
+              </w:rPr>
+              <w:t xml:space="preserve">Sanctioned amount band</w:t>
+            </w:r>
+          </w:p>
+        </w:tc>
+        <w:tc>
+          <w:tcPr>
+            <w:tcW w:type="dxa" w:w="4300"/>
+            <w:shd w:fill="F5F8FC" w:val="clear"/>
+            <w:tcMar>
+              <w:top w:type="dxa" w:w="60"/>
+              <w:left w:type="dxa" w:w="100"/>
+              <w:bottom w:type="dxa" w:w="60"/>
+              <w:right w:type="dxa" w:w="100"/>
+            </w:tcMar>
+            <w:vAlign w:val="center"/>
+          </w:tcPr>
+          <w:p>
+            <w:pPr>
+              <w:jc w:val="left"/>
+            </w:pPr>
+            <w:r>
+              <w:rPr>
+                <w:sz w:val="19"/>
+                <w:szCs w:val="19"/>
+              </w:rPr>
+              <w:t xml:space="preserve">Empty = no limit</w:t>
+            </w:r>
+          </w:p>
+        </w:tc>
+        <w:tc>
+          <w:tcPr>
+            <w:tcW w:type="dxa" w:w="2900"/>
+            <w:shd w:fill="F5F8FC" w:val="clear"/>
+            <w:tcMar>
+              <w:top w:type="dxa" w:w="60"/>
+              <w:left w:type="dxa" w:w="100"/>
+              <w:bottom w:type="dxa" w:w="60"/>
+              <w:right w:type="dxa" w:w="100"/>
+            </w:tcMar>
+            <w:vAlign w:val="center"/>
+          </w:tcPr>
+          <w:p>
+            <w:pPr>
+              <w:jc w:val="left"/>
+            </w:pPr>
+            <w:r>
+              <w:rPr>
+                <w:sz w:val="19"/>
+                <w:szCs w:val="19"/>
+              </w:rPr>
+              <w:t xml:space="preserve">Sanctioned amount must lie inside</w:t>
+            </w:r>
+          </w:p>
+        </w:tc>
+      </w:tr>
+      <w:tr>
+        <w:trPr>
+          <w:cantSplit/>
+        </w:trPr>
+        <w:tc>
+          <w:tcPr>
+            <w:tcW w:type="dxa" w:w="2300"/>
+            <w:tcMar>
+              <w:top w:type="dxa" w:w="60"/>
+              <w:left w:type="dxa" w:w="100"/>
+              <w:bottom w:type="dxa" w:w="60"/>
+              <w:right w:type="dxa" w:w="100"/>
+            </w:tcMar>
+            <w:vAlign w:val="center"/>
+          </w:tcPr>
+          <w:p>
+            <w:pPr>
+              <w:jc w:val="left"/>
+            </w:pPr>
+            <w:r>
+              <w:rPr>
+                <w:sz w:val="19"/>
+                <w:szCs w:val="19"/>
+              </w:rPr>
+              <w:t xml:space="preserve">Tenure band (months)</w:t>
+            </w:r>
+          </w:p>
+        </w:tc>
+        <w:tc>
+          <w:tcPr>
+            <w:tcW w:type="dxa" w:w="4300"/>
+            <w:tcMar>
+              <w:top w:type="dxa" w:w="60"/>
+              <w:left w:type="dxa" w:w="100"/>
+              <w:bottom w:type="dxa" w:w="60"/>
+              <w:right w:type="dxa" w:w="100"/>
+            </w:tcMar>
+            <w:vAlign w:val="center"/>
+          </w:tcPr>
+          <w:p>
+            <w:pPr>
+              <w:jc w:val="left"/>
+            </w:pPr>
+            <w:r>
+              <w:rPr>
+                <w:sz w:val="19"/>
+                <w:szCs w:val="19"/>
+              </w:rPr>
+              <w:t xml:space="preserve">Empty = no limit</w:t>
+            </w:r>
+          </w:p>
+        </w:tc>
+        <w:tc>
+          <w:tcPr>
+            <w:tcW w:type="dxa" w:w="2900"/>
+            <w:tcMar>
+              <w:top w:type="dxa" w:w="60"/>
+              <w:left w:type="dxa" w:w="100"/>
+              <w:bottom w:type="dxa" w:w="60"/>
+              <w:right w:type="dxa" w:w="100"/>
+            </w:tcMar>
+            <w:vAlign w:val="center"/>
+          </w:tcPr>
+          <w:p>
+            <w:pPr>
+              <w:jc w:val="left"/>
+            </w:pPr>
+            <w:r>
+              <w:rPr>
+                <w:sz w:val="19"/>
+                <w:szCs w:val="19"/>
+              </w:rPr>
+              <w:t xml:space="preserve">Tenure must lie inside</w:t>
+            </w:r>
+          </w:p>
+        </w:tc>
+      </w:tr>
+      <w:tr>
+        <w:trPr>
+          <w:cantSplit/>
+        </w:trPr>
+        <w:tc>
+          <w:tcPr>
+            <w:tcW w:type="dxa" w:w="2300"/>
+            <w:shd w:fill="F5F8FC" w:val="clear"/>
+            <w:tcMar>
+              <w:top w:type="dxa" w:w="60"/>
+              <w:left w:type="dxa" w:w="100"/>
+              <w:bottom w:type="dxa" w:w="60"/>
+              <w:right w:type="dxa" w:w="100"/>
+            </w:tcMar>
+            <w:vAlign w:val="center"/>
+          </w:tcPr>
+          <w:p>
+            <w:pPr>
+              <w:jc w:val="left"/>
+            </w:pPr>
+            <w:r>
+              <w:rPr>
+                <w:sz w:val="19"/>
+                <w:szCs w:val="19"/>
+              </w:rPr>
+              <w:t xml:space="preserve">Status</w:t>
+            </w:r>
+          </w:p>
+        </w:tc>
+        <w:tc>
+          <w:tcPr>
+            <w:tcW w:type="dxa" w:w="4300"/>
+            <w:shd w:fill="F5F8FC" w:val="clear"/>
+            <w:tcMar>
+              <w:top w:type="dxa" w:w="60"/>
+              <w:left w:type="dxa" w:w="100"/>
+              <w:bottom w:type="dxa" w:w="60"/>
+              <w:right w:type="dxa" w:w="100"/>
+            </w:tcMar>
+            <w:vAlign w:val="center"/>
+          </w:tcPr>
+          <w:p>
+            <w:pPr>
+              <w:jc w:val="left"/>
+            </w:pPr>
+            <w:r>
+              <w:rPr>
+                <w:sz w:val="19"/>
+                <w:szCs w:val="19"/>
+              </w:rPr>
+              <w:t xml:space="preserve">ACTIVE or INACTIVE</w:t>
+            </w:r>
+          </w:p>
+        </w:tc>
+        <w:tc>
+          <w:tcPr>
+            <w:tcW w:type="dxa" w:w="2900"/>
+            <w:shd w:fill="F5F8FC" w:val="clear"/>
+            <w:tcMar>
+              <w:top w:type="dxa" w:w="60"/>
+              <w:left w:type="dxa" w:w="100"/>
+              <w:bottom w:type="dxa" w:w="60"/>
+              <w:right w:type="dxa" w:w="100"/>
+            </w:tcMar>
+            <w:vAlign w:val="center"/>
+          </w:tcPr>
+          <w:p>
+            <w:pPr>
+              <w:jc w:val="left"/>
+            </w:pPr>
+            <w:r>
+              <w:rPr>
+                <w:sz w:val="19"/>
+                <w:szCs w:val="19"/>
+              </w:rPr>
+              <w:t xml:space="preserve">Only ACTIVE products can be used for new accounts</w:t>
+            </w:r>
+          </w:p>
+        </w:tc>
+      </w:tr>
+    </w:tbl>
+    <w:p>
+      <w:pPr>
+        <w:spacing w:after="120"/>
+      </w:pPr>
+    </w:p>
+    <w:p>
+      <w:pPr>
+        <w:pStyle w:val="Heading3"/>
+        <w:spacing w:after="100" w:before="200"/>
+      </w:pPr>
+      <w:r>
+        <w:rPr>
+          <w:b/>
+          <w:bCs/>
+          <w:color w:val="2E5AA8"/>
+          <w:sz w:val="22"/>
+          <w:szCs w:val="22"/>
+        </w:rPr>
+        <w:t xml:space="preserve">Standard products</w:t>
+      </w:r>
+    </w:p>
+    <w:p>
+      <w:pPr>
+        <w:spacing w:after="140" w:line="276"/>
+      </w:pPr>
+      <w:r>
+        <w:rPr>
+          <w:sz w:val="21"/>
+          <w:szCs w:val="21"/>
+        </w:rPr>
+        <w:t xml:space="preserve">These six products are available from the start. Amounts are in rupees. The rate band applies to the account's annual rate, and for floating products there is also a spread band of 1% to 5%.</w:t>
+      </w:r>
+    </w:p>
+    <w:tbl>
+      <w:tblPr>
+        <w:tblW w:type="dxa" w:w="9500"/>
+        <w:tblBorders>
+          <w:top w:val="single" w:color="auto" w:sz="4"/>
+          <w:left w:val="single" w:color="auto" w:sz="4"/>
+          <w:bottom w:val="single" w:color="auto" w:sz="4"/>
+          <w:right w:val="single" w:color="auto" w:sz="4"/>
+          <w:insideH w:val="single" w:color="auto" w:sz="4"/>
+          <w:insideV w:val="single" w:color="auto" w:sz="4"/>
+        </w:tblBorders>
+      </w:tblPr>
+      <w:tblGrid>
+        <w:gridCol w:w="700"/>
+        <w:gridCol w:w="1400"/>
+        <w:gridCol w:w="1200"/>
+        <w:gridCol w:w="1800"/>
+        <w:gridCol w:w="800"/>
+        <w:gridCol w:w="1300"/>
+        <w:gridCol w:w="1500"/>
+        <w:gridCol w:w="800"/>
+      </w:tblGrid>
+      <w:tr>
+        <w:trPr>
+          <w:tblHeader/>
+        </w:trPr>
+        <w:tc>
+          <w:tcPr>
+            <w:tcW w:type="dxa" w:w="700"/>
+            <w:shd w:fill="1F3864" w:val="clear"/>
+            <w:tcMar>
+              <w:top w:type="dxa" w:w="60"/>
+              <w:left w:type="dxa" w:w="100"/>
+              <w:bottom w:type="dxa" w:w="60"/>
+              <w:right w:type="dxa" w:w="100"/>
+            </w:tcMar>
+            <w:vAlign w:val="center"/>
+          </w:tcPr>
+          <w:p>
+            <w:pPr>
+              <w:jc w:val="left"/>
+            </w:pPr>
+            <w:r>
+              <w:rPr>
+                <w:b/>
+                <w:bCs/>
+                <w:color w:val="FFFFFF"/>
+                <w:sz w:val="19"/>
+                <w:szCs w:val="19"/>
+              </w:rPr>
+              <w:t xml:space="preserve">Code</w:t>
+            </w:r>
+          </w:p>
+        </w:tc>
+        <w:tc>
+          <w:tcPr>
+            <w:tcW w:type="dxa" w:w="1400"/>
+            <w:shd w:fill="1F3864" w:val="clear"/>
+            <w:tcMar>
+              <w:top w:type="dxa" w:w="60"/>
+              <w:left w:type="dxa" w:w="100"/>
+              <w:bottom w:type="dxa" w:w="60"/>
+              <w:right w:type="dxa" w:w="100"/>
+            </w:tcMar>
+            <w:vAlign w:val="center"/>
+          </w:tcPr>
+          <w:p>
+            <w:pPr>
+              <w:jc w:val="left"/>
+            </w:pPr>
+            <w:r>
+              <w:rPr>
+                <w:b/>
+                <w:bCs/>
+                <w:color w:val="FFFFFF"/>
+                <w:sz w:val="19"/>
+                <w:szCs w:val="19"/>
+              </w:rPr>
+              <w:t xml:space="preserve">Name</w:t>
+            </w:r>
+          </w:p>
+        </w:tc>
+        <w:tc>
+          <w:tcPr>
+            <w:tcW w:type="dxa" w:w="1200"/>
+            <w:shd w:fill="1F3864" w:val="clear"/>
+            <w:tcMar>
+              <w:top w:type="dxa" w:w="60"/>
+              <w:left w:type="dxa" w:w="100"/>
+              <w:bottom w:type="dxa" w:w="60"/>
+              <w:right w:type="dxa" w:w="100"/>
+            </w:tcMar>
+            <w:vAlign w:val="center"/>
+          </w:tcPr>
+          <w:p>
+            <w:pPr>
+              <w:jc w:val="left"/>
+            </w:pPr>
+            <w:r>
+              <w:rPr>
+                <w:b/>
+                <w:bCs/>
+                <w:color w:val="FFFFFF"/>
+                <w:sz w:val="19"/>
+                <w:szCs w:val="19"/>
+              </w:rPr>
+              <w:t xml:space="preserve">Account type</w:t>
+            </w:r>
+          </w:p>
+        </w:tc>
+        <w:tc>
+          <w:tcPr>
+            <w:tcW w:type="dxa" w:w="1800"/>
+            <w:shd w:fill="1F3864" w:val="clear"/>
+            <w:tcMar>
+              <w:top w:type="dxa" w:w="60"/>
+              <w:left w:type="dxa" w:w="100"/>
+              <w:bottom w:type="dxa" w:w="60"/>
+              <w:right w:type="dxa" w:w="100"/>
+            </w:tcMar>
+            <w:vAlign w:val="center"/>
+          </w:tcPr>
+          <w:p>
+            <w:pPr>
+              <w:jc w:val="left"/>
+            </w:pPr>
+            <w:r>
+              <w:rPr>
+                <w:b/>
+                <w:bCs/>
+                <w:color w:val="FFFFFF"/>
+                <w:sz w:val="19"/>
+                <w:szCs w:val="19"/>
+              </w:rPr>
+              <w:t xml:space="preserve">Rate type</w:t>
+            </w:r>
+          </w:p>
+        </w:tc>
+        <w:tc>
+          <w:tcPr>
+            <w:tcW w:type="dxa" w:w="800"/>
+            <w:shd w:fill="1F3864" w:val="clear"/>
+            <w:tcMar>
+              <w:top w:type="dxa" w:w="60"/>
+              <w:left w:type="dxa" w:w="100"/>
+              <w:bottom w:type="dxa" w:w="60"/>
+              <w:right w:type="dxa" w:w="100"/>
+            </w:tcMar>
+            <w:vAlign w:val="center"/>
+          </w:tcPr>
+          <w:p>
+            <w:pPr>
+              <w:jc w:val="left"/>
+            </w:pPr>
+            <w:r>
+              <w:rPr>
+                <w:b/>
+                <w:bCs/>
+                <w:color w:val="FFFFFF"/>
+                <w:sz w:val="19"/>
+                <w:szCs w:val="19"/>
+              </w:rPr>
+              <w:t xml:space="preserve">Default rate</w:t>
+            </w:r>
+          </w:p>
+        </w:tc>
+        <w:tc>
+          <w:tcPr>
+            <w:tcW w:type="dxa" w:w="1300"/>
+            <w:shd w:fill="1F3864" w:val="clear"/>
+            <w:tcMar>
+              <w:top w:type="dxa" w:w="60"/>
+              <w:left w:type="dxa" w:w="100"/>
+              <w:bottom w:type="dxa" w:w="60"/>
+              <w:right w:type="dxa" w:w="100"/>
+            </w:tcMar>
+            <w:vAlign w:val="center"/>
+          </w:tcPr>
+          <w:p>
+            <w:pPr>
+              <w:jc w:val="left"/>
+            </w:pPr>
+            <w:r>
+              <w:rPr>
+                <w:b/>
+                <w:bCs/>
+                <w:color w:val="FFFFFF"/>
+                <w:sz w:val="19"/>
+                <w:szCs w:val="19"/>
+              </w:rPr>
+              <w:t xml:space="preserve">Rate band</w:t>
+            </w:r>
+          </w:p>
+        </w:tc>
+        <w:tc>
+          <w:tcPr>
+            <w:tcW w:type="dxa" w:w="1500"/>
+            <w:shd w:fill="1F3864" w:val="clear"/>
+            <w:tcMar>
+              <w:top w:type="dxa" w:w="60"/>
+              <w:left w:type="dxa" w:w="100"/>
+              <w:bottom w:type="dxa" w:w="60"/>
+              <w:right w:type="dxa" w:w="100"/>
+            </w:tcMar>
+            <w:vAlign w:val="center"/>
+          </w:tcPr>
+          <w:p>
+            <w:pPr>
+              <w:jc w:val="left"/>
+            </w:pPr>
+            <w:r>
+              <w:rPr>
+                <w:b/>
+                <w:bCs/>
+                <w:color w:val="FFFFFF"/>
+                <w:sz w:val="19"/>
+                <w:szCs w:val="19"/>
+              </w:rPr>
+              <w:t xml:space="preserve">Amount band</w:t>
+            </w:r>
+          </w:p>
+        </w:tc>
+        <w:tc>
+          <w:tcPr>
+            <w:tcW w:type="dxa" w:w="800"/>
+            <w:shd w:fill="1F3864" w:val="clear"/>
+            <w:tcMar>
+              <w:top w:type="dxa" w:w="60"/>
+              <w:left w:type="dxa" w:w="100"/>
+              <w:bottom w:type="dxa" w:w="60"/>
+              <w:right w:type="dxa" w:w="100"/>
+            </w:tcMar>
+            <w:vAlign w:val="center"/>
+          </w:tcPr>
+          <w:p>
+            <w:pPr>
+              <w:jc w:val="left"/>
+            </w:pPr>
+            <w:r>
+              <w:rPr>
+                <w:b/>
+                <w:bCs/>
+                <w:color w:val="FFFFFF"/>
+                <w:sz w:val="19"/>
+                <w:szCs w:val="19"/>
+              </w:rPr>
+              <w:t xml:space="preserve">Months</w:t>
+            </w:r>
+          </w:p>
+        </w:tc>
+      </w:tr>
+      <w:tr>
+        <w:trPr>
+          <w:cantSplit/>
+        </w:trPr>
+        <w:tc>
+          <w:tcPr>
+            <w:tcW w:type="dxa" w:w="700"/>
+            <w:tcMar>
+              <w:top w:type="dxa" w:w="60"/>
+              <w:left w:type="dxa" w:w="100"/>
+              <w:bottom w:type="dxa" w:w="60"/>
+              <w:right w:type="dxa" w:w="100"/>
+            </w:tcMar>
+            <w:vAlign w:val="center"/>
+          </w:tcPr>
+          <w:p>
+            <w:pPr>
+              <w:jc w:val="left"/>
+            </w:pPr>
+            <w:r>
+              <w:rPr>
+                <w:sz w:val="19"/>
+                <w:szCs w:val="19"/>
+              </w:rPr>
+              <w:t xml:space="preserve">PL01</w:t>
+            </w:r>
+          </w:p>
+        </w:tc>
+        <w:tc>
+          <w:tcPr>
+            <w:tcW w:type="dxa" w:w="1400"/>
+            <w:tcMar>
+              <w:top w:type="dxa" w:w="60"/>
+              <w:left w:type="dxa" w:w="100"/>
+              <w:bottom w:type="dxa" w:w="60"/>
+              <w:right w:type="dxa" w:w="100"/>
+            </w:tcMar>
+            <w:vAlign w:val="center"/>
+          </w:tcPr>
+          <w:p>
+            <w:pPr>
+              <w:jc w:val="left"/>
+            </w:pPr>
+            <w:r>
+              <w:rPr>
+                <w:sz w:val="19"/>
+                <w:szCs w:val="19"/>
+              </w:rPr>
+              <w:t xml:space="preserve">Personal Loan</w:t>
+            </w:r>
+          </w:p>
+        </w:tc>
+        <w:tc>
+          <w:tcPr>
+            <w:tcW w:type="dxa" w:w="1200"/>
+            <w:tcMar>
+              <w:top w:type="dxa" w:w="60"/>
+              <w:left w:type="dxa" w:w="100"/>
+              <w:bottom w:type="dxa" w:w="60"/>
+              <w:right w:type="dxa" w:w="100"/>
+            </w:tcMar>
+            <w:vAlign w:val="center"/>
+          </w:tcPr>
+          <w:p>
+            <w:pPr>
+              <w:jc w:val="left"/>
+            </w:pPr>
+            <w:r>
+              <w:rPr>
+                <w:sz w:val="19"/>
+                <w:szCs w:val="19"/>
+              </w:rPr>
+              <w:t xml:space="preserve">Unsecured</w:t>
+            </w:r>
+          </w:p>
+        </w:tc>
+        <w:tc>
+          <w:tcPr>
+            <w:tcW w:type="dxa" w:w="1800"/>
+            <w:tcMar>
+              <w:top w:type="dxa" w:w="60"/>
+              <w:left w:type="dxa" w:w="100"/>
+              <w:bottom w:type="dxa" w:w="60"/>
+              <w:right w:type="dxa" w:w="100"/>
+            </w:tcMar>
+            <w:vAlign w:val="center"/>
+          </w:tcPr>
+          <w:p>
+            <w:pPr>
+              <w:jc w:val="left"/>
+            </w:pPr>
+            <w:r>
+              <w:rPr>
+                <w:sz w:val="19"/>
+                <w:szCs w:val="19"/>
+              </w:rPr>
+              <w:t xml:space="preserve">Fixed</w:t>
+            </w:r>
+          </w:p>
+        </w:tc>
+        <w:tc>
+          <w:tcPr>
+            <w:tcW w:type="dxa" w:w="800"/>
+            <w:tcMar>
+              <w:top w:type="dxa" w:w="60"/>
+              <w:left w:type="dxa" w:w="100"/>
+              <w:bottom w:type="dxa" w:w="60"/>
+              <w:right w:type="dxa" w:w="100"/>
+            </w:tcMar>
+            <w:vAlign w:val="center"/>
+          </w:tcPr>
+          <w:p>
+            <w:pPr>
+              <w:jc w:val="left"/>
+            </w:pPr>
+            <w:r>
+              <w:rPr>
+                <w:sz w:val="19"/>
+                <w:szCs w:val="19"/>
+              </w:rPr>
+              <w:t xml:space="preserve">10.50%</w:t>
+            </w:r>
+          </w:p>
+        </w:tc>
+        <w:tc>
+          <w:tcPr>
+            <w:tcW w:type="dxa" w:w="1300"/>
+            <w:tcMar>
+              <w:top w:type="dxa" w:w="60"/>
+              <w:left w:type="dxa" w:w="100"/>
+              <w:bottom w:type="dxa" w:w="60"/>
+              <w:right w:type="dxa" w:w="100"/>
+            </w:tcMar>
+            <w:vAlign w:val="center"/>
+          </w:tcPr>
+          <w:p>
+            <w:pPr>
+              <w:jc w:val="left"/>
+            </w:pPr>
+            <w:r>
+              <w:rPr>
+                <w:sz w:val="19"/>
+                <w:szCs w:val="19"/>
+              </w:rPr>
+              <w:t xml:space="preserve">8.00% to 17.00%</w:t>
+            </w:r>
+          </w:p>
+        </w:tc>
+        <w:tc>
+          <w:tcPr>
+            <w:tcW w:type="dxa" w:w="1500"/>
+            <w:tcMar>
+              <w:top w:type="dxa" w:w="60"/>
+              <w:left w:type="dxa" w:w="100"/>
+              <w:bottom w:type="dxa" w:w="60"/>
+              <w:right w:type="dxa" w:w="100"/>
+            </w:tcMar>
+            <w:vAlign w:val="center"/>
+          </w:tcPr>
+          <w:p>
+            <w:pPr>
+              <w:jc w:val="left"/>
+            </w:pPr>
+            <w:r>
+              <w:rPr>
+                <w:sz w:val="19"/>
+                <w:szCs w:val="19"/>
+              </w:rPr>
+              <w:t xml:space="preserve">50,000 to 50,00,000</w:t>
+            </w:r>
+          </w:p>
+        </w:tc>
+        <w:tc>
+          <w:tcPr>
+            <w:tcW w:type="dxa" w:w="800"/>
+            <w:tcMar>
+              <w:top w:type="dxa" w:w="60"/>
+              <w:left w:type="dxa" w:w="100"/>
+              <w:bottom w:type="dxa" w:w="60"/>
+              <w:right w:type="dxa" w:w="100"/>
+            </w:tcMar>
+            <w:vAlign w:val="center"/>
+          </w:tcPr>
+          <w:p>
+            <w:pPr>
+              <w:jc w:val="left"/>
+            </w:pPr>
+            <w:r>
+              <w:rPr>
+                <w:sz w:val="19"/>
+                <w:szCs w:val="19"/>
+              </w:rPr>
+              <w:t xml:space="preserve">6 to 84</w:t>
+            </w:r>
+          </w:p>
+        </w:tc>
+      </w:tr>
+      <w:tr>
+        <w:trPr>
+          <w:cantSplit/>
+        </w:trPr>
+        <w:tc>
+          <w:tcPr>
+            <w:tcW w:type="dxa" w:w="700"/>
+            <w:shd w:fill="F5F8FC" w:val="clear"/>
+            <w:tcMar>
+              <w:top w:type="dxa" w:w="60"/>
+              <w:left w:type="dxa" w:w="100"/>
+              <w:bottom w:type="dxa" w:w="60"/>
+              <w:right w:type="dxa" w:w="100"/>
+            </w:tcMar>
+            <w:vAlign w:val="center"/>
+          </w:tcPr>
+          <w:p>
+            <w:pPr>
+              <w:jc w:val="left"/>
+            </w:pPr>
+            <w:r>
+              <w:rPr>
+                <w:sz w:val="19"/>
+                <w:szCs w:val="19"/>
+              </w:rPr>
+              <w:t xml:space="preserve">BL01</w:t>
+            </w:r>
+          </w:p>
+        </w:tc>
+        <w:tc>
+          <w:tcPr>
+            <w:tcW w:type="dxa" w:w="1400"/>
+            <w:shd w:fill="F5F8FC" w:val="clear"/>
+            <w:tcMar>
+              <w:top w:type="dxa" w:w="60"/>
+              <w:left w:type="dxa" w:w="100"/>
+              <w:bottom w:type="dxa" w:w="60"/>
+              <w:right w:type="dxa" w:w="100"/>
+            </w:tcMar>
+            <w:vAlign w:val="center"/>
+          </w:tcPr>
+          <w:p>
+            <w:pPr>
+              <w:jc w:val="left"/>
+            </w:pPr>
+            <w:r>
+              <w:rPr>
+                <w:sz w:val="19"/>
+                <w:szCs w:val="19"/>
+              </w:rPr>
+              <w:t xml:space="preserve">Business Loan</w:t>
+            </w:r>
+          </w:p>
+        </w:tc>
+        <w:tc>
+          <w:tcPr>
+            <w:tcW w:type="dxa" w:w="1200"/>
+            <w:shd w:fill="F5F8FC" w:val="clear"/>
+            <w:tcMar>
+              <w:top w:type="dxa" w:w="60"/>
+              <w:left w:type="dxa" w:w="100"/>
+              <w:bottom w:type="dxa" w:w="60"/>
+              <w:right w:type="dxa" w:w="100"/>
+            </w:tcMar>
+            <w:vAlign w:val="center"/>
+          </w:tcPr>
+          <w:p>
+            <w:pPr>
+              <w:jc w:val="left"/>
+            </w:pPr>
+            <w:r>
+              <w:rPr>
+                <w:sz w:val="19"/>
+                <w:szCs w:val="19"/>
+              </w:rPr>
+              <w:t xml:space="preserve">Unsecured</w:t>
+            </w:r>
+          </w:p>
+        </w:tc>
+        <w:tc>
+          <w:tcPr>
+            <w:tcW w:type="dxa" w:w="1800"/>
+            <w:shd w:fill="F5F8FC" w:val="clear"/>
+            <w:tcMar>
+              <w:top w:type="dxa" w:w="60"/>
+              <w:left w:type="dxa" w:w="100"/>
+              <w:bottom w:type="dxa" w:w="60"/>
+              <w:right w:type="dxa" w:w="100"/>
+            </w:tcMar>
+            <w:vAlign w:val="center"/>
+          </w:tcPr>
+          <w:p>
+            <w:pPr>
+              <w:jc w:val="left"/>
+            </w:pPr>
+            <w:r>
+              <w:rPr>
+                <w:sz w:val="19"/>
+                <w:szCs w:val="19"/>
+              </w:rPr>
+              <w:t xml:space="preserve">Fixed</w:t>
+            </w:r>
+          </w:p>
+        </w:tc>
+        <w:tc>
+          <w:tcPr>
+            <w:tcW w:type="dxa" w:w="800"/>
+            <w:shd w:fill="F5F8FC" w:val="clear"/>
+            <w:tcMar>
+              <w:top w:type="dxa" w:w="60"/>
+              <w:left w:type="dxa" w:w="100"/>
+              <w:bottom w:type="dxa" w:w="60"/>
+              <w:right w:type="dxa" w:w="100"/>
+            </w:tcMar>
+            <w:vAlign w:val="center"/>
+          </w:tcPr>
+          <w:p>
+            <w:pPr>
+              <w:jc w:val="left"/>
+            </w:pPr>
+            <w:r>
+              <w:rPr>
+                <w:sz w:val="19"/>
+                <w:szCs w:val="19"/>
+              </w:rPr>
+              <w:t xml:space="preserve">11.50%</w:t>
+            </w:r>
+          </w:p>
+        </w:tc>
+        <w:tc>
+          <w:tcPr>
+            <w:tcW w:type="dxa" w:w="1300"/>
+            <w:shd w:fill="F5F8FC" w:val="clear"/>
+            <w:tcMar>
+              <w:top w:type="dxa" w:w="60"/>
+              <w:left w:type="dxa" w:w="100"/>
+              <w:bottom w:type="dxa" w:w="60"/>
+              <w:right w:type="dxa" w:w="100"/>
+            </w:tcMar>
+            <w:vAlign w:val="center"/>
+          </w:tcPr>
+          <w:p>
+            <w:pPr>
+              <w:jc w:val="left"/>
+            </w:pPr>
+            <w:r>
+              <w:rPr>
+                <w:sz w:val="19"/>
+                <w:szCs w:val="19"/>
+              </w:rPr>
+              <w:t xml:space="preserve">9.00% to 17.00%</w:t>
+            </w:r>
+          </w:p>
+        </w:tc>
+        <w:tc>
+          <w:tcPr>
+            <w:tcW w:type="dxa" w:w="1500"/>
+            <w:shd w:fill="F5F8FC" w:val="clear"/>
+            <w:tcMar>
+              <w:top w:type="dxa" w:w="60"/>
+              <w:left w:type="dxa" w:w="100"/>
+              <w:bottom w:type="dxa" w:w="60"/>
+              <w:right w:type="dxa" w:w="100"/>
+            </w:tcMar>
+            <w:vAlign w:val="center"/>
+          </w:tcPr>
+          <w:p>
+            <w:pPr>
+              <w:jc w:val="left"/>
+            </w:pPr>
+            <w:r>
+              <w:rPr>
+                <w:sz w:val="19"/>
+                <w:szCs w:val="19"/>
+              </w:rPr>
+              <w:t xml:space="preserve">1,00,000 to 1,00,00,000</w:t>
+            </w:r>
+          </w:p>
+        </w:tc>
+        <w:tc>
+          <w:tcPr>
+            <w:tcW w:type="dxa" w:w="800"/>
+            <w:shd w:fill="F5F8FC" w:val="clear"/>
+            <w:tcMar>
+              <w:top w:type="dxa" w:w="60"/>
+              <w:left w:type="dxa" w:w="100"/>
+              <w:bottom w:type="dxa" w:w="60"/>
+              <w:right w:type="dxa" w:w="100"/>
+            </w:tcMar>
+            <w:vAlign w:val="center"/>
+          </w:tcPr>
+          <w:p>
+            <w:pPr>
+              <w:jc w:val="left"/>
+            </w:pPr>
+            <w:r>
+              <w:rPr>
+                <w:sz w:val="19"/>
+                <w:szCs w:val="19"/>
+              </w:rPr>
+              <w:t xml:space="preserve">12 to 120</w:t>
+            </w:r>
+          </w:p>
+        </w:tc>
+      </w:tr>
+      <w:tr>
+        <w:trPr>
+          <w:cantSplit/>
+        </w:trPr>
+        <w:tc>
+          <w:tcPr>
+            <w:tcW w:type="dxa" w:w="700"/>
+            <w:tcMar>
+              <w:top w:type="dxa" w:w="60"/>
+              <w:left w:type="dxa" w:w="100"/>
+              <w:bottom w:type="dxa" w:w="60"/>
+              <w:right w:type="dxa" w:w="100"/>
+            </w:tcMar>
+            <w:vAlign w:val="center"/>
+          </w:tcPr>
+          <w:p>
+            <w:pPr>
+              <w:jc w:val="left"/>
+            </w:pPr>
+            <w:r>
+              <w:rPr>
+                <w:sz w:val="19"/>
+                <w:szCs w:val="19"/>
+              </w:rPr>
+              <w:t xml:space="preserve">EL01</w:t>
+            </w:r>
+          </w:p>
+        </w:tc>
+        <w:tc>
+          <w:tcPr>
+            <w:tcW w:type="dxa" w:w="1400"/>
+            <w:tcMar>
+              <w:top w:type="dxa" w:w="60"/>
+              <w:left w:type="dxa" w:w="100"/>
+              <w:bottom w:type="dxa" w:w="60"/>
+              <w:right w:type="dxa" w:w="100"/>
+            </w:tcMar>
+            <w:vAlign w:val="center"/>
+          </w:tcPr>
+          <w:p>
+            <w:pPr>
+              <w:jc w:val="left"/>
+            </w:pPr>
+            <w:r>
+              <w:rPr>
+                <w:sz w:val="19"/>
+                <w:szCs w:val="19"/>
+              </w:rPr>
+              <w:t xml:space="preserve">Education Loan</w:t>
+            </w:r>
+          </w:p>
+        </w:tc>
+        <w:tc>
+          <w:tcPr>
+            <w:tcW w:type="dxa" w:w="1200"/>
+            <w:tcMar>
+              <w:top w:type="dxa" w:w="60"/>
+              <w:left w:type="dxa" w:w="100"/>
+              <w:bottom w:type="dxa" w:w="60"/>
+              <w:right w:type="dxa" w:w="100"/>
+            </w:tcMar>
+            <w:vAlign w:val="center"/>
+          </w:tcPr>
+          <w:p>
+            <w:pPr>
+              <w:jc w:val="left"/>
+            </w:pPr>
+            <w:r>
+              <w:rPr>
+                <w:sz w:val="19"/>
+                <w:szCs w:val="19"/>
+              </w:rPr>
+              <w:t xml:space="preserve">Unsecured</w:t>
+            </w:r>
+          </w:p>
+        </w:tc>
+        <w:tc>
+          <w:tcPr>
+            <w:tcW w:type="dxa" w:w="1800"/>
+            <w:tcMar>
+              <w:top w:type="dxa" w:w="60"/>
+              <w:left w:type="dxa" w:w="100"/>
+              <w:bottom w:type="dxa" w:w="60"/>
+              <w:right w:type="dxa" w:w="100"/>
+            </w:tcMar>
+            <w:vAlign w:val="center"/>
+          </w:tcPr>
+          <w:p>
+            <w:pPr>
+              <w:jc w:val="left"/>
+            </w:pPr>
+            <w:r>
+              <w:rPr>
+                <w:sz w:val="19"/>
+                <w:szCs w:val="19"/>
+              </w:rPr>
+              <w:t xml:space="preserve">Fixed</w:t>
+            </w:r>
+          </w:p>
+        </w:tc>
+        <w:tc>
+          <w:tcPr>
+            <w:tcW w:type="dxa" w:w="800"/>
+            <w:tcMar>
+              <w:top w:type="dxa" w:w="60"/>
+              <w:left w:type="dxa" w:w="100"/>
+              <w:bottom w:type="dxa" w:w="60"/>
+              <w:right w:type="dxa" w:w="100"/>
+            </w:tcMar>
+            <w:vAlign w:val="center"/>
+          </w:tcPr>
+          <w:p>
+            <w:pPr>
+              <w:jc w:val="left"/>
+            </w:pPr>
+            <w:r>
+              <w:rPr>
+                <w:sz w:val="19"/>
+                <w:szCs w:val="19"/>
+              </w:rPr>
+              <w:t xml:space="preserve">9.50%</w:t>
+            </w:r>
+          </w:p>
+        </w:tc>
+        <w:tc>
+          <w:tcPr>
+            <w:tcW w:type="dxa" w:w="1300"/>
+            <w:tcMar>
+              <w:top w:type="dxa" w:w="60"/>
+              <w:left w:type="dxa" w:w="100"/>
+              <w:bottom w:type="dxa" w:w="60"/>
+              <w:right w:type="dxa" w:w="100"/>
+            </w:tcMar>
+            <w:vAlign w:val="center"/>
+          </w:tcPr>
+          <w:p>
+            <w:pPr>
+              <w:jc w:val="left"/>
+            </w:pPr>
+            <w:r>
+              <w:rPr>
+                <w:sz w:val="19"/>
+                <w:szCs w:val="19"/>
+              </w:rPr>
+              <w:t xml:space="preserve">8.00% to 13.00%</w:t>
+            </w:r>
+          </w:p>
+        </w:tc>
+        <w:tc>
+          <w:tcPr>
+            <w:tcW w:type="dxa" w:w="1500"/>
+            <w:tcMar>
+              <w:top w:type="dxa" w:w="60"/>
+              <w:left w:type="dxa" w:w="100"/>
+              <w:bottom w:type="dxa" w:w="60"/>
+              <w:right w:type="dxa" w:w="100"/>
+            </w:tcMar>
+            <w:vAlign w:val="center"/>
+          </w:tcPr>
+          <w:p>
+            <w:pPr>
+              <w:jc w:val="left"/>
+            </w:pPr>
+            <w:r>
+              <w:rPr>
+                <w:sz w:val="19"/>
+                <w:szCs w:val="19"/>
+              </w:rPr>
+              <w:t xml:space="preserve">1,00,000 to 50,00,000</w:t>
+            </w:r>
+          </w:p>
+        </w:tc>
+        <w:tc>
+          <w:tcPr>
+            <w:tcW w:type="dxa" w:w="800"/>
+            <w:tcMar>
+              <w:top w:type="dxa" w:w="60"/>
+              <w:left w:type="dxa" w:w="100"/>
+              <w:bottom w:type="dxa" w:w="60"/>
+              <w:right w:type="dxa" w:w="100"/>
+            </w:tcMar>
+            <w:vAlign w:val="center"/>
+          </w:tcPr>
+          <w:p>
+            <w:pPr>
+              <w:jc w:val="left"/>
+            </w:pPr>
+            <w:r>
+              <w:rPr>
+                <w:sz w:val="19"/>
+                <w:szCs w:val="19"/>
+              </w:rPr>
+              <w:t xml:space="preserve">12 to 120</w:t>
+            </w:r>
+          </w:p>
+        </w:tc>
+      </w:tr>
+      <w:tr>
+        <w:trPr>
+          <w:cantSplit/>
+        </w:trPr>
+        <w:tc>
+          <w:tcPr>
+            <w:tcW w:type="dxa" w:w="700"/>
+            <w:shd w:fill="F5F8FC" w:val="clear"/>
+            <w:tcMar>
+              <w:top w:type="dxa" w:w="60"/>
+              <w:left w:type="dxa" w:w="100"/>
+              <w:bottom w:type="dxa" w:w="60"/>
+              <w:right w:type="dxa" w:w="100"/>
+            </w:tcMar>
+            <w:vAlign w:val="center"/>
+          </w:tcPr>
+          <w:p>
+            <w:pPr>
+              <w:jc w:val="left"/>
+            </w:pPr>
+            <w:r>
+              <w:rPr>
+                <w:sz w:val="19"/>
+                <w:szCs w:val="19"/>
+              </w:rPr>
+              <w:t xml:space="preserve">GL01</w:t>
+            </w:r>
+          </w:p>
+        </w:tc>
+        <w:tc>
+          <w:tcPr>
+            <w:tcW w:type="dxa" w:w="1400"/>
+            <w:shd w:fill="F5F8FC" w:val="clear"/>
+            <w:tcMar>
+              <w:top w:type="dxa" w:w="60"/>
+              <w:left w:type="dxa" w:w="100"/>
+              <w:bottom w:type="dxa" w:w="60"/>
+              <w:right w:type="dxa" w:w="100"/>
+            </w:tcMar>
+            <w:vAlign w:val="center"/>
+          </w:tcPr>
+          <w:p>
+            <w:pPr>
+              <w:jc w:val="left"/>
+            </w:pPr>
+            <w:r>
+              <w:rPr>
+                <w:sz w:val="19"/>
+                <w:szCs w:val="19"/>
+              </w:rPr>
+              <w:t xml:space="preserve">Gold Loan</w:t>
+            </w:r>
+          </w:p>
+        </w:tc>
+        <w:tc>
+          <w:tcPr>
+            <w:tcW w:type="dxa" w:w="1200"/>
+            <w:shd w:fill="F5F8FC" w:val="clear"/>
+            <w:tcMar>
+              <w:top w:type="dxa" w:w="60"/>
+              <w:left w:type="dxa" w:w="100"/>
+              <w:bottom w:type="dxa" w:w="60"/>
+              <w:right w:type="dxa" w:w="100"/>
+            </w:tcMar>
+            <w:vAlign w:val="center"/>
+          </w:tcPr>
+          <w:p>
+            <w:pPr>
+              <w:jc w:val="left"/>
+            </w:pPr>
+            <w:r>
+              <w:rPr>
+                <w:sz w:val="19"/>
+                <w:szCs w:val="19"/>
+              </w:rPr>
+              <w:t xml:space="preserve">Unsecured</w:t>
+            </w:r>
+          </w:p>
+        </w:tc>
+        <w:tc>
+          <w:tcPr>
+            <w:tcW w:type="dxa" w:w="1800"/>
+            <w:shd w:fill="F5F8FC" w:val="clear"/>
+            <w:tcMar>
+              <w:top w:type="dxa" w:w="60"/>
+              <w:left w:type="dxa" w:w="100"/>
+              <w:bottom w:type="dxa" w:w="60"/>
+              <w:right w:type="dxa" w:w="100"/>
+            </w:tcMar>
+            <w:vAlign w:val="center"/>
+          </w:tcPr>
+          <w:p>
+            <w:pPr>
+              <w:jc w:val="left"/>
+            </w:pPr>
+            <w:r>
+              <w:rPr>
+                <w:sz w:val="19"/>
+                <w:szCs w:val="19"/>
+              </w:rPr>
+              <w:t xml:space="preserve">Fixed</w:t>
+            </w:r>
+          </w:p>
+        </w:tc>
+        <w:tc>
+          <w:tcPr>
+            <w:tcW w:type="dxa" w:w="800"/>
+            <w:shd w:fill="F5F8FC" w:val="clear"/>
+            <w:tcMar>
+              <w:top w:type="dxa" w:w="60"/>
+              <w:left w:type="dxa" w:w="100"/>
+              <w:bottom w:type="dxa" w:w="60"/>
+              <w:right w:type="dxa" w:w="100"/>
+            </w:tcMar>
+            <w:vAlign w:val="center"/>
+          </w:tcPr>
+          <w:p>
+            <w:pPr>
+              <w:jc w:val="left"/>
+            </w:pPr>
+            <w:r>
+              <w:rPr>
+                <w:sz w:val="19"/>
+                <w:szCs w:val="19"/>
+              </w:rPr>
+              <w:t xml:space="preserve">9.00%</w:t>
+            </w:r>
+          </w:p>
+        </w:tc>
+        <w:tc>
+          <w:tcPr>
+            <w:tcW w:type="dxa" w:w="1300"/>
+            <w:shd w:fill="F5F8FC" w:val="clear"/>
+            <w:tcMar>
+              <w:top w:type="dxa" w:w="60"/>
+              <w:left w:type="dxa" w:w="100"/>
+              <w:bottom w:type="dxa" w:w="60"/>
+              <w:right w:type="dxa" w:w="100"/>
+            </w:tcMar>
+            <w:vAlign w:val="center"/>
+          </w:tcPr>
+          <w:p>
+            <w:pPr>
+              <w:jc w:val="left"/>
+            </w:pPr>
+            <w:r>
+              <w:rPr>
+                <w:sz w:val="19"/>
+                <w:szCs w:val="19"/>
+              </w:rPr>
+              <w:t xml:space="preserve">7.00% to 13.00%</w:t>
+            </w:r>
+          </w:p>
+        </w:tc>
+        <w:tc>
+          <w:tcPr>
+            <w:tcW w:type="dxa" w:w="1500"/>
+            <w:shd w:fill="F5F8FC" w:val="clear"/>
+            <w:tcMar>
+              <w:top w:type="dxa" w:w="60"/>
+              <w:left w:type="dxa" w:w="100"/>
+              <w:bottom w:type="dxa" w:w="60"/>
+              <w:right w:type="dxa" w:w="100"/>
+            </w:tcMar>
+            <w:vAlign w:val="center"/>
+          </w:tcPr>
+          <w:p>
+            <w:pPr>
+              <w:jc w:val="left"/>
+            </w:pPr>
+            <w:r>
+              <w:rPr>
+                <w:sz w:val="19"/>
+                <w:szCs w:val="19"/>
+              </w:rPr>
+              <w:t xml:space="preserve">10,000 to 10,00,000</w:t>
+            </w:r>
+          </w:p>
+        </w:tc>
+        <w:tc>
+          <w:tcPr>
+            <w:tcW w:type="dxa" w:w="800"/>
+            <w:shd w:fill="F5F8FC" w:val="clear"/>
+            <w:tcMar>
+              <w:top w:type="dxa" w:w="60"/>
+              <w:left w:type="dxa" w:w="100"/>
+              <w:bottom w:type="dxa" w:w="60"/>
+              <w:right w:type="dxa" w:w="100"/>
+            </w:tcMar>
+            <w:vAlign w:val="center"/>
+          </w:tcPr>
+          <w:p>
+            <w:pPr>
+              <w:jc w:val="left"/>
+            </w:pPr>
+            <w:r>
+              <w:rPr>
+                <w:sz w:val="19"/>
+                <w:szCs w:val="19"/>
+              </w:rPr>
+              <w:t xml:space="preserve">3 to 36</w:t>
+            </w:r>
+          </w:p>
+        </w:tc>
+      </w:tr>
+      <w:tr>
+        <w:trPr>
+          <w:cantSplit/>
+        </w:trPr>
+        <w:tc>
+          <w:tcPr>
+            <w:tcW w:type="dxa" w:w="700"/>
+            <w:tcMar>
+              <w:top w:type="dxa" w:w="60"/>
+              <w:left w:type="dxa" w:w="100"/>
+              <w:bottom w:type="dxa" w:w="60"/>
+              <w:right w:type="dxa" w:w="100"/>
+            </w:tcMar>
+            <w:vAlign w:val="center"/>
+          </w:tcPr>
+          <w:p>
+            <w:pPr>
+              <w:jc w:val="left"/>
+            </w:pPr>
+            <w:r>
+              <w:rPr>
+                <w:sz w:val="19"/>
+                <w:szCs w:val="19"/>
+              </w:rPr>
+              <w:t xml:space="preserve">AL01</w:t>
+            </w:r>
+          </w:p>
+        </w:tc>
+        <w:tc>
+          <w:tcPr>
+            <w:tcW w:type="dxa" w:w="1400"/>
+            <w:tcMar>
+              <w:top w:type="dxa" w:w="60"/>
+              <w:left w:type="dxa" w:w="100"/>
+              <w:bottom w:type="dxa" w:w="60"/>
+              <w:right w:type="dxa" w:w="100"/>
+            </w:tcMar>
+            <w:vAlign w:val="center"/>
+          </w:tcPr>
+          <w:p>
+            <w:pPr>
+              <w:jc w:val="left"/>
+            </w:pPr>
+            <w:r>
+              <w:rPr>
+                <w:sz w:val="19"/>
+                <w:szCs w:val="19"/>
+              </w:rPr>
+              <w:t xml:space="preserve">Auto Loan</w:t>
+            </w:r>
+          </w:p>
+        </w:tc>
+        <w:tc>
+          <w:tcPr>
+            <w:tcW w:type="dxa" w:w="1200"/>
+            <w:tcMar>
+              <w:top w:type="dxa" w:w="60"/>
+              <w:left w:type="dxa" w:w="100"/>
+              <w:bottom w:type="dxa" w:w="60"/>
+              <w:right w:type="dxa" w:w="100"/>
+            </w:tcMar>
+            <w:vAlign w:val="center"/>
+          </w:tcPr>
+          <w:p>
+            <w:pPr>
+              <w:jc w:val="left"/>
+            </w:pPr>
+            <w:r>
+              <w:rPr>
+                <w:sz w:val="19"/>
+                <w:szCs w:val="19"/>
+              </w:rPr>
+              <w:t xml:space="preserve">Unsecured</w:t>
+            </w:r>
+          </w:p>
+        </w:tc>
+        <w:tc>
+          <w:tcPr>
+            <w:tcW w:type="dxa" w:w="1800"/>
+            <w:tcMar>
+              <w:top w:type="dxa" w:w="60"/>
+              <w:left w:type="dxa" w:w="100"/>
+              <w:bottom w:type="dxa" w:w="60"/>
+              <w:right w:type="dxa" w:w="100"/>
+            </w:tcMar>
+            <w:vAlign w:val="center"/>
+          </w:tcPr>
+          <w:p>
+            <w:pPr>
+              <w:jc w:val="left"/>
+            </w:pPr>
+            <w:r>
+              <w:rPr>
+                <w:sz w:val="19"/>
+                <w:szCs w:val="19"/>
+              </w:rPr>
+              <w:t xml:space="preserve">Floating, REPO + 3.00% (spread 1% to 5%)</w:t>
+            </w:r>
+          </w:p>
+        </w:tc>
+        <w:tc>
+          <w:tcPr>
+            <w:tcW w:type="dxa" w:w="800"/>
+            <w:tcMar>
+              <w:top w:type="dxa" w:w="60"/>
+              <w:left w:type="dxa" w:w="100"/>
+              <w:bottom w:type="dxa" w:w="60"/>
+              <w:right w:type="dxa" w:w="100"/>
+            </w:tcMar>
+            <w:vAlign w:val="center"/>
+          </w:tcPr>
+          <w:p>
+            <w:pPr>
+              <w:jc w:val="left"/>
+            </w:pPr>
+            <w:r>
+              <w:rPr>
+                <w:sz w:val="19"/>
+                <w:szCs w:val="19"/>
+              </w:rPr>
+              <w:t xml:space="preserve">9.75%</w:t>
+            </w:r>
+          </w:p>
+        </w:tc>
+        <w:tc>
+          <w:tcPr>
+            <w:tcW w:type="dxa" w:w="1300"/>
+            <w:tcMar>
+              <w:top w:type="dxa" w:w="60"/>
+              <w:left w:type="dxa" w:w="100"/>
+              <w:bottom w:type="dxa" w:w="60"/>
+              <w:right w:type="dxa" w:w="100"/>
+            </w:tcMar>
+            <w:vAlign w:val="center"/>
+          </w:tcPr>
+          <w:p>
+            <w:pPr>
+              <w:jc w:val="left"/>
+            </w:pPr>
+            <w:r>
+              <w:rPr>
+                <w:sz w:val="19"/>
+                <w:szCs w:val="19"/>
+              </w:rPr>
+              <w:t xml:space="preserve">8.00% to 13.00%</w:t>
+            </w:r>
+          </w:p>
+        </w:tc>
+        <w:tc>
+          <w:tcPr>
+            <w:tcW w:type="dxa" w:w="1500"/>
+            <w:tcMar>
+              <w:top w:type="dxa" w:w="60"/>
+              <w:left w:type="dxa" w:w="100"/>
+              <w:bottom w:type="dxa" w:w="60"/>
+              <w:right w:type="dxa" w:w="100"/>
+            </w:tcMar>
+            <w:vAlign w:val="center"/>
+          </w:tcPr>
+          <w:p>
+            <w:pPr>
+              <w:jc w:val="left"/>
+            </w:pPr>
+            <w:r>
+              <w:rPr>
+                <w:sz w:val="19"/>
+                <w:szCs w:val="19"/>
+              </w:rPr>
+              <w:t xml:space="preserve">1,00,000 to 50,00,000</w:t>
+            </w:r>
+          </w:p>
+        </w:tc>
+        <w:tc>
+          <w:tcPr>
+            <w:tcW w:type="dxa" w:w="800"/>
+            <w:tcMar>
+              <w:top w:type="dxa" w:w="60"/>
+              <w:left w:type="dxa" w:w="100"/>
+              <w:bottom w:type="dxa" w:w="60"/>
+              <w:right w:type="dxa" w:w="100"/>
+            </w:tcMar>
+            <w:vAlign w:val="center"/>
+          </w:tcPr>
+          <w:p>
+            <w:pPr>
+              <w:jc w:val="left"/>
+            </w:pPr>
+            <w:r>
+              <w:rPr>
+                <w:sz w:val="19"/>
+                <w:szCs w:val="19"/>
+              </w:rPr>
+              <w:t xml:space="preserve">12 to 84</w:t>
+            </w:r>
+          </w:p>
+        </w:tc>
+      </w:tr>
+      <w:tr>
+        <w:trPr>
+          <w:cantSplit/>
+        </w:trPr>
+        <w:tc>
+          <w:tcPr>
+            <w:tcW w:type="dxa" w:w="700"/>
+            <w:shd w:fill="F5F8FC" w:val="clear"/>
+            <w:tcMar>
+              <w:top w:type="dxa" w:w="60"/>
+              <w:left w:type="dxa" w:w="100"/>
+              <w:bottom w:type="dxa" w:w="60"/>
+              <w:right w:type="dxa" w:w="100"/>
+            </w:tcMar>
+            <w:vAlign w:val="center"/>
+          </w:tcPr>
+          <w:p>
+            <w:pPr>
+              <w:jc w:val="left"/>
+            </w:pPr>
+            <w:r>
+              <w:rPr>
+                <w:sz w:val="19"/>
+                <w:szCs w:val="19"/>
+              </w:rPr>
+              <w:t xml:space="preserve">HL01</w:t>
+            </w:r>
+          </w:p>
+        </w:tc>
+        <w:tc>
+          <w:tcPr>
+            <w:tcW w:type="dxa" w:w="1400"/>
+            <w:shd w:fill="F5F8FC" w:val="clear"/>
+            <w:tcMar>
+              <w:top w:type="dxa" w:w="60"/>
+              <w:left w:type="dxa" w:w="100"/>
+              <w:bottom w:type="dxa" w:w="60"/>
+              <w:right w:type="dxa" w:w="100"/>
+            </w:tcMar>
+            <w:vAlign w:val="center"/>
+          </w:tcPr>
+          <w:p>
+            <w:pPr>
+              <w:jc w:val="left"/>
+            </w:pPr>
+            <w:r>
+              <w:rPr>
+                <w:sz w:val="19"/>
+                <w:szCs w:val="19"/>
+              </w:rPr>
+              <w:t xml:space="preserve">Home Loan</w:t>
+            </w:r>
+          </w:p>
+        </w:tc>
+        <w:tc>
+          <w:tcPr>
+            <w:tcW w:type="dxa" w:w="1200"/>
+            <w:shd w:fill="F5F8FC" w:val="clear"/>
+            <w:tcMar>
+              <w:top w:type="dxa" w:w="60"/>
+              <w:left w:type="dxa" w:w="100"/>
+              <w:bottom w:type="dxa" w:w="60"/>
+              <w:right w:type="dxa" w:w="100"/>
+            </w:tcMar>
+            <w:vAlign w:val="center"/>
+          </w:tcPr>
+          <w:p>
+            <w:pPr>
+              <w:jc w:val="left"/>
+            </w:pPr>
+            <w:r>
+              <w:rPr>
+                <w:sz w:val="19"/>
+                <w:szCs w:val="19"/>
+              </w:rPr>
+              <w:t xml:space="preserve">Mortgage</w:t>
+            </w:r>
+          </w:p>
+        </w:tc>
+        <w:tc>
+          <w:tcPr>
+            <w:tcW w:type="dxa" w:w="1800"/>
+            <w:shd w:fill="F5F8FC" w:val="clear"/>
+            <w:tcMar>
+              <w:top w:type="dxa" w:w="60"/>
+              <w:left w:type="dxa" w:w="100"/>
+              <w:bottom w:type="dxa" w:w="60"/>
+              <w:right w:type="dxa" w:w="100"/>
+            </w:tcMar>
+            <w:vAlign w:val="center"/>
+          </w:tcPr>
+          <w:p>
+            <w:pPr>
+              <w:jc w:val="left"/>
+            </w:pPr>
+            <w:r>
+              <w:rPr>
+                <w:sz w:val="19"/>
+                <w:szCs w:val="19"/>
+              </w:rPr>
+              <w:t xml:space="preserve">Floating, REPO + 2.50% (spread 1% to 5%)</w:t>
+            </w:r>
+          </w:p>
+        </w:tc>
+        <w:tc>
+          <w:tcPr>
+            <w:tcW w:type="dxa" w:w="800"/>
+            <w:shd w:fill="F5F8FC" w:val="clear"/>
+            <w:tcMar>
+              <w:top w:type="dxa" w:w="60"/>
+              <w:left w:type="dxa" w:w="100"/>
+              <w:bottom w:type="dxa" w:w="60"/>
+              <w:right w:type="dxa" w:w="100"/>
+            </w:tcMar>
+            <w:vAlign w:val="center"/>
+          </w:tcPr>
+          <w:p>
+            <w:pPr>
+              <w:jc w:val="left"/>
+            </w:pPr>
+            <w:r>
+              <w:rPr>
+                <w:sz w:val="19"/>
+                <w:szCs w:val="19"/>
+              </w:rPr>
+              <w:t xml:space="preserve">8.75%</w:t>
+            </w:r>
+          </w:p>
+        </w:tc>
+        <w:tc>
+          <w:tcPr>
+            <w:tcW w:type="dxa" w:w="1300"/>
+            <w:shd w:fill="F5F8FC" w:val="clear"/>
+            <w:tcMar>
+              <w:top w:type="dxa" w:w="60"/>
+              <w:left w:type="dxa" w:w="100"/>
+              <w:bottom w:type="dxa" w:w="60"/>
+              <w:right w:type="dxa" w:w="100"/>
+            </w:tcMar>
+            <w:vAlign w:val="center"/>
+          </w:tcPr>
+          <w:p>
+            <w:pPr>
+              <w:jc w:val="left"/>
+            </w:pPr>
+            <w:r>
+              <w:rPr>
+                <w:sz w:val="19"/>
+                <w:szCs w:val="19"/>
+              </w:rPr>
+              <w:t xml:space="preserve">8.00% to 13.00%</w:t>
+            </w:r>
+          </w:p>
+        </w:tc>
+        <w:tc>
+          <w:tcPr>
+            <w:tcW w:type="dxa" w:w="1500"/>
+            <w:shd w:fill="F5F8FC" w:val="clear"/>
+            <w:tcMar>
+              <w:top w:type="dxa" w:w="60"/>
+              <w:left w:type="dxa" w:w="100"/>
+              <w:bottom w:type="dxa" w:w="60"/>
+              <w:right w:type="dxa" w:w="100"/>
+            </w:tcMar>
+            <w:vAlign w:val="center"/>
+          </w:tcPr>
+          <w:p>
+            <w:pPr>
+              <w:jc w:val="left"/>
+            </w:pPr>
+            <w:r>
+              <w:rPr>
+                <w:sz w:val="19"/>
+                <w:szCs w:val="19"/>
+              </w:rPr>
+              <w:t xml:space="preserve">5,00,000 to 5,00,00,000</w:t>
+            </w:r>
+          </w:p>
+        </w:tc>
+        <w:tc>
+          <w:tcPr>
+            <w:tcW w:type="dxa" w:w="800"/>
+            <w:shd w:fill="F5F8FC" w:val="clear"/>
+            <w:tcMar>
+              <w:top w:type="dxa" w:w="60"/>
+              <w:left w:type="dxa" w:w="100"/>
+              <w:bottom w:type="dxa" w:w="60"/>
+              <w:right w:type="dxa" w:w="100"/>
+            </w:tcMar>
+            <w:vAlign w:val="center"/>
+          </w:tcPr>
+          <w:p>
+            <w:pPr>
+              <w:jc w:val="left"/>
+            </w:pPr>
+            <w:r>
+              <w:rPr>
+                <w:sz w:val="19"/>
+                <w:szCs w:val="19"/>
+              </w:rPr>
+              <w:t xml:space="preserve">60 to 360</w:t>
+            </w:r>
+          </w:p>
+        </w:tc>
+      </w:tr>
+    </w:tbl>
+    <w:p>
+      <w:pPr>
+        <w:spacing w:after="120"/>
+      </w:pPr>
+    </w:p>
+    <w:p>
+      <w:pPr>
+        <w:spacing w:after="140" w:line="276"/>
+      </w:pPr>
+      <w:r>
+        <w:rPr>
+          <w:sz w:val="21"/>
+          <w:szCs w:val="21"/>
+        </w:rPr>
+        <w:t xml:space="preserve">Product codes already used by existing accounts that are not in this list are kept as 'Legacy product' entries without limits, so nothing existing is blocked.</w:t>
+      </w:r>
+    </w:p>
+    <w:p>
+      <w:pPr>
+        <w:pStyle w:val="Heading3"/>
+        <w:spacing w:after="100" w:before="200"/>
+      </w:pPr>
+      <w:r>
+        <w:rPr>
+          <w:b/>
+          <w:bCs/>
+          <w:color w:val="2E5AA8"/>
+          <w:sz w:val="22"/>
+          <w:szCs w:val="22"/>
+        </w:rPr>
+        <w:t xml:space="preserve">Opening an account from a product</w:t>
+      </w:r>
+    </w:p>
+    <w:p>
+      <w:pPr>
+        <w:pStyle w:val="ListParagraph"/>
+        <w:numPr>
+          <w:ilvl w:val="0"/>
+          <w:numId w:val="1"/>
+        </w:numPr>
+        <w:spacing w:after="80" w:line="264"/>
+      </w:pPr>
+      <w:r>
+        <w:rPr>
+          <w:sz w:val="21"/>
+          <w:szCs w:val="21"/>
+        </w:rPr>
+        <w:t xml:space="preserve">Give the product code, the customer, the sanctioned amount and the tenure. Everything else is optional.</w:t>
+      </w:r>
+    </w:p>
+    <w:p>
+      <w:pPr>
+        <w:pStyle w:val="ListParagraph"/>
+        <w:numPr>
+          <w:ilvl w:val="0"/>
+          <w:numId w:val="1"/>
+        </w:numPr>
+        <w:spacing w:after="80" w:line="264"/>
+      </w:pPr>
+      <w:r>
+        <w:rPr>
+          <w:sz w:val="21"/>
+          <w:szCs w:val="21"/>
+        </w:rPr>
+        <w:t xml:space="preserve">Left out: the account takes the product's account type, rate type, default rate, benchmark and spread (floating), day-count convention and schedule type.</w:t>
+      </w:r>
+    </w:p>
+    <w:p>
+      <w:pPr>
+        <w:pStyle w:val="ListParagraph"/>
+        <w:numPr>
+          <w:ilvl w:val="0"/>
+          <w:numId w:val="1"/>
+        </w:numPr>
+        <w:spacing w:after="80" w:line="264"/>
+      </w:pPr>
+      <w:r>
+        <w:rPr>
+          <w:sz w:val="21"/>
+          <w:szCs w:val="21"/>
+        </w:rPr>
+        <w:t xml:space="preserve">Given: the value is used instead of the default if it is inside the product's limits. Account type and rate type cannot differ from the product's. Benchmark and spread apply to floating products only.</w:t>
+      </w:r>
+    </w:p>
+    <w:p>
+      <w:pPr>
+        <w:pStyle w:val="ListParagraph"/>
+        <w:numPr>
+          <w:ilvl w:val="0"/>
+          <w:numId w:val="1"/>
+        </w:numPr>
+        <w:spacing w:after="80" w:line="264"/>
+      </w:pPr>
+      <w:r>
+        <w:rPr>
+          <w:sz w:val="21"/>
+          <w:szCs w:val="21"/>
+        </w:rPr>
+        <w:t xml:space="preserve">Refused: an unknown product (not found), an inactive product (conflict), or any value outside a limit (bad request). The message lists every problem at once, for example 'Account does not satisfy product PL01: interestRate 30 is above the maximum 17; tenureMonths 120 is above the maximum 84'. In a bulk call each item gets its own message and the others are still created.</w:t>
+      </w:r>
+    </w:p>
+    <w:p>
+      <w:pPr>
+        <w:pStyle w:val="ListParagraph"/>
+        <w:numPr>
+          <w:ilvl w:val="0"/>
+          <w:numId w:val="1"/>
+        </w:numPr>
+        <w:spacing w:after="80" w:line="264"/>
+      </w:pPr>
+      <w:r>
+        <w:rPr>
+          <w:sz w:val="21"/>
+          <w:szCs w:val="21"/>
+        </w:rPr>
+        <w:t xml:space="preserve">Repeating a request with the same sanction reference returns the account that already exists, as before.</w:t>
+      </w:r>
+    </w:p>
+    <w:p>
+      <w:pPr>
+        <w:pStyle w:val="Heading3"/>
+        <w:spacing w:after="100" w:before="200"/>
+      </w:pPr>
+      <w:r>
+        <w:rPr>
+          <w:b/>
+          <w:bCs/>
+          <w:color w:val="2E5AA8"/>
+          <w:sz w:val="22"/>
+          <w:szCs w:val="22"/>
+        </w:rPr>
+        <w:t xml:space="preserve">Changing a product</w:t>
+      </w:r>
+    </w:p>
+    <w:p>
+      <w:pPr>
+        <w:pStyle w:val="ListParagraph"/>
+        <w:numPr>
+          <w:ilvl w:val="0"/>
+          <w:numId w:val="1"/>
+        </w:numPr>
+        <w:spacing w:after="80" w:line="264"/>
+      </w:pPr>
+      <w:r>
+        <w:rPr>
+          <w:sz w:val="21"/>
+          <w:szCs w:val="21"/>
+        </w:rPr>
+        <w:t xml:space="preserve">Products are created and edited on the Products screen of the Admin Portal (or through the Loan Products API in Swagger). Edit conflicts are detected: if someone else saved first, you are asked to reload.</w:t>
+      </w:r>
+    </w:p>
+    <w:p>
+      <w:pPr>
+        <w:pStyle w:val="ListParagraph"/>
+        <w:numPr>
+          <w:ilvl w:val="0"/>
+          <w:numId w:val="1"/>
+        </w:numPr>
+        <w:spacing w:after="80" w:line="264"/>
+      </w:pPr>
+      <w:r>
+        <w:rPr>
+          <w:sz w:val="21"/>
+          <w:szCs w:val="21"/>
+        </w:rPr>
+        <w:t xml:space="preserve">A change applies to </w:t>
+      </w:r>
+      <w:r>
+        <w:rPr>
+          <w:b/>
+          <w:bCs/>
+          <w:sz w:val="21"/>
+          <w:szCs w:val="21"/>
+        </w:rPr>
+        <w:t xml:space="preserve">accounts opened afterwards</w:t>
+      </w:r>
+      <w:r>
+        <w:rPr>
+          <w:sz w:val="21"/>
+          <w:szCs w:val="21"/>
+        </w:rPr>
+        <w:t xml:space="preserve">. Existing accounts keep the terms they were opened with.</w:t>
+      </w:r>
+    </w:p>
+    <w:p>
+      <w:pPr>
+        <w:pStyle w:val="ListParagraph"/>
+        <w:numPr>
+          <w:ilvl w:val="0"/>
+          <w:numId w:val="1"/>
+        </w:numPr>
+        <w:spacing w:after="80" w:line="264"/>
+      </w:pPr>
+      <w:r>
+        <w:rPr>
+          <w:sz w:val="21"/>
+          <w:szCs w:val="21"/>
+        </w:rPr>
+        <w:t xml:space="preserve">A change also applies to an </w:t>
+      </w:r>
+      <w:r>
+        <w:rPr>
+          <w:b/>
+          <w:bCs/>
+          <w:sz w:val="21"/>
+          <w:szCs w:val="21"/>
+        </w:rPr>
+        <w:t xml:space="preserve">individual account when it is rescheduled by a floating rate reset</w:t>
+      </w:r>
+      <w:r>
+        <w:rPr>
+          <w:sz w:val="21"/>
+          <w:szCs w:val="21"/>
+        </w:rPr>
+        <w:t xml:space="preserve">: the new rate (benchmark plus the account's spread) is raised to the product's minimum rate or lowered to its maximum rate if it falls outside the band. Rescheduling after a part-payment does not use the product.</w:t>
+      </w:r>
+    </w:p>
+    <w:p>
+      <w:pPr>
+        <w:pStyle w:val="ListParagraph"/>
+        <w:numPr>
+          <w:ilvl w:val="0"/>
+          <w:numId w:val="1"/>
+        </w:numPr>
+        <w:spacing w:after="80" w:line="264"/>
+      </w:pPr>
+      <w:r>
+        <w:rPr>
+          <w:sz w:val="21"/>
+          <w:szCs w:val="21"/>
+        </w:rPr>
+        <w:t xml:space="preserve">There is </w:t>
+      </w:r>
+      <w:r>
+        <w:rPr>
+          <w:b/>
+          <w:bCs/>
+          <w:sz w:val="21"/>
+          <w:szCs w:val="21"/>
+        </w:rPr>
+        <w:t xml:space="preserve">no function that reprices or reschedules all accounts of a product</w:t>
+      </w:r>
+      <w:r>
+        <w:rPr>
+          <w:sz w:val="21"/>
+          <w:szCs w:val="21"/>
+        </w:rPr>
+        <w:t xml:space="preserve"> when it is changed. That is intentionally left out for now.</w:t>
+      </w:r>
+    </w:p>
+    <w:p>
+      <w:pPr>
+        <w:pStyle w:val="ListParagraph"/>
+        <w:numPr>
+          <w:ilvl w:val="0"/>
+          <w:numId w:val="1"/>
+        </w:numPr>
+        <w:spacing w:after="80" w:line="264"/>
+      </w:pPr>
+      <w:r>
+        <w:rPr>
+          <w:sz w:val="21"/>
+          <w:szCs w:val="21"/>
+        </w:rPr>
+        <w:t xml:space="preserve">Setting a product to Inactive stops new accounts being opened on it; existing accounts continue to be serviced.</w:t>
+      </w:r>
+    </w:p>
+    <w:p>
+      <w:pPr>
+        <w:pStyle w:val="Heading3"/>
+        <w:spacing w:after="100" w:before="200"/>
+      </w:pPr>
+      <w:r>
+        <w:rPr>
+          <w:b/>
+          <w:bCs/>
+          <w:color w:val="2E5AA8"/>
+          <w:sz w:val="22"/>
+          <w:szCs w:val="22"/>
+        </w:rPr>
+        <w:t xml:space="preserve">Not covered</w:t>
+      </w:r>
+    </w:p>
+    <w:p>
+      <w:pPr>
+        <w:pStyle w:val="ListParagraph"/>
+        <w:numPr>
+          <w:ilvl w:val="0"/>
+          <w:numId w:val="1"/>
+        </w:numPr>
+        <w:spacing w:after="80" w:line="264"/>
+      </w:pPr>
+      <w:r>
+        <w:rPr>
+          <w:sz w:val="21"/>
+          <w:szCs w:val="21"/>
+        </w:rPr>
+        <w:t xml:space="preserve">Only the EMI (equated monthly instalment, reducing balance) schedule exists; equal-principal and interest-only schedules are not available.</w:t>
+      </w:r>
+    </w:p>
+    <w:p>
+      <w:pPr>
+        <w:pStyle w:val="ListParagraph"/>
+        <w:numPr>
+          <w:ilvl w:val="0"/>
+          <w:numId w:val="1"/>
+        </w:numPr>
+        <w:spacing w:after="80" w:line="264"/>
+      </w:pPr>
+      <w:r>
+        <w:rPr>
+          <w:sz w:val="21"/>
+          <w:szCs w:val="21"/>
+        </w:rPr>
+        <w:t xml:space="preserve">There is no history of product changes and no approval step.</w:t>
       </w:r>
     </w:p>
     <w:sectPr>

</xml_diff>

<commit_message>
Update documentation to version 1.4
Functional Specification and Technical Design Document cover the business
date, end of day, batch-to-lending and admin/test suite changes. Architecture
deck v1.4 (red and black theme, 25 slides). README, batch README and cloud
deployment notes updated.

Co-Authored-By: Claude Sonnet 5.5 <noreply@anthropic.com>
Claude-Session: https://claude.ai/code/session_011Ly3TH5YUMArmTYksVUGUE
</commit_message>
<xml_diff>
--- a/docs/Lending_Platform_Functional_Specification.docx
+++ b/docs/Lending_Platform_Functional_Specification.docx
@@ -79,7 +79,7 @@
           <w:sz w:val="20"/>
           <w:szCs w:val="20"/>
         </w:rPr>
-        <w:t xml:space="preserve">Document version 1.3 — updated 11 October 2026 (adds Admin Portal, loan product master, day-count conventions and schedule types)</w:t>
+        <w:t xml:space="preserve">Document version 1.4 — updated 12 October 2026 (adds business date and end of day, batch jobs that call lending-service, and an admin portal and test suite that follow the business date)</w:t>
       </w:r>
     </w:p>
     <w:p>
@@ -244,6 +244,27 @@
           <w:szCs w:val="21"/>
         </w:rPr>
         <w:t xml:space="preserve"> adds more day-count conventions, five repayment schedule types and the product settings that go with them (repayment frequency, moratorium, balloon %, step-up %). See 13.12.</w:t>
+      </w:r>
+    </w:p>
+    <w:p>
+      <w:pPr>
+        <w:spacing w:after="140" w:line="276"/>
+      </w:pPr>
+      <w:r>
+        <w:rPr>
+          <w:b/>
+          <w:bCs/>
+          <w:sz w:val="21"/>
+          <w:szCs w:val="21"/>
+        </w:rPr>
+        <w:t xml:space="preserve">Version 1.4 (12 October 2026):</w:t>
+      </w:r>
+      <w:r>
+        <w:rPr>
+          <w:sz w:val="21"/>
+          <w:szCs w:val="21"/>
+        </w:rPr>
+        <w:t xml:space="preserve"> adds one platform business date with a nightly end of day (13.13, 13.14), nine batch jobs that now call lending-service (13.15), and the admin portal and end-to-end test suite working on the business date (13.16).</w:t>
       </w:r>
     </w:p>
     <w:p>
@@ -21255,22 +21276,6 @@
     </w:p>
     <w:p>
       <w:pPr>
-        <w:pStyle w:val="Heading2"/>
-        <w:spacing w:after="120" w:before="280"/>
-      </w:pPr>
-      <w:r>
-        <w:rPr>
-          <w:b/>
-          <w:bCs/>
-          <w:color w:val="2E5AA8"/>
-          <w:sz w:val="25"/>
-          <w:szCs w:val="25"/>
-        </w:rPr>
-        <w:t xml:space="preserve">13.9 Open Items</w:t>
-      </w:r>
-    </w:p>
-    <w:p>
-      <w:pPr>
         <w:pStyle w:val="ListParagraph"/>
         <w:numPr>
           <w:ilvl w:val="0"/>
@@ -21280,10 +21285,51 @@
       </w:pPr>
       <w:r>
         <w:rPr>
+          <w:b/>
+          <w:bCs/>
           <w:sz w:val="21"/>
           <w:szCs w:val="21"/>
         </w:rPr>
-        <w:t xml:space="preserve">Admin Portal has one shared login; individual users, roles, SSO and audit logging are not built.</w:t>
+        <w:t xml:space="preserve">§9 Batch Administration:</w:t>
+      </w:r>
+      <w:r>
+        <w:rPr>
+          <w:sz w:val="21"/>
+          <w:szCs w:val="21"/>
+        </w:rPr>
+        <w:t xml:space="preserve"> two new operator endpoints, </w:t>
+      </w:r>
+      <w:r>
+        <w:rPr>
+          <w:rFonts w:ascii="Consolas" w:hAnsi="Consolas" w:cs="Consolas"/>
+          <w:color w:val="1F3864"/>
+          <w:sz w:val="19"/>
+          <w:szCs w:val="19"/>
+        </w:rPr>
+        <w:t xml:space="preserve">POST /api/v1/batch-admin/eod/run</w:t>
+      </w:r>
+      <w:r>
+        <w:rPr>
+          <w:sz w:val="21"/>
+          <w:szCs w:val="21"/>
+        </w:rPr>
+        <w:t xml:space="preserve"> and </w:t>
+      </w:r>
+      <w:r>
+        <w:rPr>
+          <w:rFonts w:ascii="Consolas" w:hAnsi="Consolas" w:cs="Consolas"/>
+          <w:color w:val="1F3864"/>
+          <w:sz w:val="19"/>
+          <w:szCs w:val="19"/>
+        </w:rPr>
+        <w:t xml:space="preserve">GET /api/v1/batch-admin/eod/status</w:t>
+      </w:r>
+      <w:r>
+        <w:rPr>
+          <w:sz w:val="21"/>
+          <w:szCs w:val="21"/>
+        </w:rPr>
+        <w:t xml:space="preserve"> (13.14). A manual job trigger without a business date now uses the platform business date, not the calendar date.</w:t>
       </w:r>
     </w:p>
     <w:p>
@@ -21297,10 +21343,19 @@
       </w:pPr>
       <w:r>
         <w:rPr>
+          <w:b/>
+          <w:bCs/>
           <w:sz w:val="21"/>
           <w:szCs w:val="21"/>
         </w:rPr>
-        <w:t xml:space="preserve">Write actions (create, disburse, waive, post payment) are intentionally absent from the portal.</w:t>
+        <w:t xml:space="preserve">§10 Batch Job Catalog:</w:t>
+      </w:r>
+      <w:r>
+        <w:rPr>
+          <w:sz w:val="21"/>
+          <w:szCs w:val="21"/>
+        </w:rPr>
+        <w:t xml:space="preserve"> nine jobs now call lending-service instead of doing nothing (13.15); the other 27 remain stubs. All enabled DAILY jobs run in the nightly end of day (13.14); MONTHLY and PERIODIC jobs still run from their own schedules.</w:t>
       </w:r>
     </w:p>
     <w:p>
@@ -21314,10 +21369,19 @@
       </w:pPr>
       <w:r>
         <w:rPr>
+          <w:b/>
+          <w:bCs/>
           <w:sz w:val="21"/>
           <w:szCs w:val="21"/>
         </w:rPr>
-        <w:t xml:space="preserve">Batch job bodies and the real ledger client remain stubs, so the Batch and Ledger screens reflect framework state only.</w:t>
+        <w:t xml:space="preserve">Payments (EMI, part-payment, foreclosure), interest accrual, delinquency classification and floating-rate reset:</w:t>
+      </w:r>
+      <w:r>
+        <w:rPr>
+          <w:sz w:val="21"/>
+          <w:szCs w:val="21"/>
+        </w:rPr>
+        <w:t xml:space="preserve"> the date supplied may not be after the business date (13.13). Earlier dates are still accepted.</w:t>
       </w:r>
     </w:p>
     <w:p>
@@ -21331,10 +21395,35 @@
       </w:pPr>
       <w:r>
         <w:rPr>
+          <w:b/>
+          <w:bCs/>
           <w:sz w:val="21"/>
           <w:szCs w:val="21"/>
         </w:rPr>
-        <w:t xml:space="preserve">Lending API authentication is still outstanding.</w:t>
+        <w:t xml:space="preserve">Customer statement:</w:t>
+      </w:r>
+      <w:r>
+        <w:rPr>
+          <w:sz w:val="21"/>
+          <w:szCs w:val="21"/>
+        </w:rPr>
+        <w:t xml:space="preserve"> the statement is dated by the business date.</w:t>
+      </w:r>
+    </w:p>
+    <w:p>
+      <w:pPr>
+        <w:pStyle w:val="Heading2"/>
+        <w:spacing w:after="120" w:before="280"/>
+      </w:pPr>
+      <w:r>
+        <w:rPr>
+          <w:b/>
+          <w:bCs/>
+          <w:color w:val="2E5AA8"/>
+          <w:sz w:val="25"/>
+          <w:szCs w:val="25"/>
+        </w:rPr>
+        <w:t xml:space="preserve">13.9 Open Items</w:t>
       </w:r>
     </w:p>
     <w:p>
@@ -21351,7 +21440,7 @@
           <w:sz w:val="21"/>
           <w:szCs w:val="21"/>
         </w:rPr>
-        <w:t xml:space="preserve">Product changes are not audited (who changed what), and there is no approval step. The product API is unauthenticated like the rest of the Lending API.</w:t>
+        <w:t xml:space="preserve">Admin Portal has one shared login; individual users, roles, SSO and audit logging are not built.</w:t>
       </w:r>
     </w:p>
     <w:p>
@@ -21368,7 +21457,7 @@
           <w:sz w:val="21"/>
           <w:szCs w:val="21"/>
         </w:rPr>
-        <w:t xml:space="preserve">There is no function to reprice or reschedule all accounts of a product after a product change; it was left out on purpose (13.11).</w:t>
+        <w:t xml:space="preserve">Write actions (create, disburse, waive, post payment) are intentionally absent from the portal.</w:t>
       </w:r>
     </w:p>
     <w:p>
@@ -21385,7 +21474,7 @@
           <w:sz w:val="21"/>
           <w:szCs w:val="21"/>
         </w:rPr>
-        <w:t xml:space="preserve">Schedule changes after opening (switching schedule type, day count or frequency, a new moratorium) are not available; part-payment shortens nothing, it recalculates the instalment over the same number of instalments. Due dates are not moved for holidays (13.12).</w:t>
+        <w:t xml:space="preserve">Batch job bodies and the real ledger client remain stubs, so the Batch and Ledger screens reflect framework state only.</w:t>
       </w:r>
     </w:p>
     <w:p>
@@ -21402,7 +21491,177 @@
           <w:sz w:val="21"/>
           <w:szCs w:val="21"/>
         </w:rPr>
+        <w:t xml:space="preserve">Lending API authentication is still outstanding.</w:t>
+      </w:r>
+    </w:p>
+    <w:p>
+      <w:pPr>
+        <w:pStyle w:val="ListParagraph"/>
+        <w:numPr>
+          <w:ilvl w:val="0"/>
+          <w:numId w:val="1"/>
+        </w:numPr>
+        <w:spacing w:after="80" w:line="264"/>
+      </w:pPr>
+      <w:r>
+        <w:rPr>
+          <w:sz w:val="21"/>
+          <w:szCs w:val="21"/>
+        </w:rPr>
+        <w:t xml:space="preserve">Product changes are not audited (who changed what), and there is no approval step. The product API is unauthenticated like the rest of the Lending API.</w:t>
+      </w:r>
+    </w:p>
+    <w:p>
+      <w:pPr>
+        <w:pStyle w:val="ListParagraph"/>
+        <w:numPr>
+          <w:ilvl w:val="0"/>
+          <w:numId w:val="1"/>
+        </w:numPr>
+        <w:spacing w:after="80" w:line="264"/>
+      </w:pPr>
+      <w:r>
+        <w:rPr>
+          <w:sz w:val="21"/>
+          <w:szCs w:val="21"/>
+        </w:rPr>
+        <w:t xml:space="preserve">There is no function to reprice or reschedule all accounts of a product after a product change; it was left out on purpose (13.11).</w:t>
+      </w:r>
+    </w:p>
+    <w:p>
+      <w:pPr>
+        <w:pStyle w:val="ListParagraph"/>
+        <w:numPr>
+          <w:ilvl w:val="0"/>
+          <w:numId w:val="1"/>
+        </w:numPr>
+        <w:spacing w:after="80" w:line="264"/>
+      </w:pPr>
+      <w:r>
+        <w:rPr>
+          <w:sz w:val="21"/>
+          <w:szCs w:val="21"/>
+        </w:rPr>
+        <w:t xml:space="preserve">Schedule changes after opening (switching schedule type, day count or frequency, a new moratorium) are not available; part-payment shortens nothing, it recalculates the instalment over the same number of instalments. Due dates are not moved for holidays (13.12).</w:t>
+      </w:r>
+    </w:p>
+    <w:p>
+      <w:pPr>
+        <w:pStyle w:val="ListParagraph"/>
+        <w:numPr>
+          <w:ilvl w:val="0"/>
+          <w:numId w:val="1"/>
+        </w:numPr>
+        <w:spacing w:after="80" w:line="264"/>
+      </w:pPr>
+      <w:r>
+        <w:rPr>
+          <w:sz w:val="21"/>
+          <w:szCs w:val="21"/>
+        </w:rPr>
         <w:t xml:space="preserve">Batch job edits are not audited (who changed what) and have no approval step.</w:t>
+      </w:r>
+    </w:p>
+    <w:p>
+      <w:pPr>
+        <w:pStyle w:val="ListParagraph"/>
+        <w:numPr>
+          <w:ilvl w:val="0"/>
+          <w:numId w:val="1"/>
+        </w:numPr>
+        <w:spacing w:after="80" w:line="264"/>
+      </w:pPr>
+      <w:r>
+        <w:rPr>
+          <w:sz w:val="21"/>
+          <w:szCs w:val="21"/>
+        </w:rPr>
+        <w:t xml:space="preserve">The business date can be set by anyone who can reach the Lending API, which has no authentication; moving it backwards is off by default and is meant for test environments only.</w:t>
+      </w:r>
+    </w:p>
+    <w:p>
+      <w:pPr>
+        <w:pStyle w:val="ListParagraph"/>
+        <w:numPr>
+          <w:ilvl w:val="0"/>
+          <w:numId w:val="1"/>
+        </w:numPr>
+        <w:spacing w:after="80" w:line="264"/>
+      </w:pPr>
+      <w:r>
+        <w:rPr>
+          <w:sz w:val="21"/>
+          <w:szCs w:val="21"/>
+        </w:rPr>
+        <w:t xml:space="preserve">MONTHLY and PERIODIC batch jobs are not part of end of day. They start from their own schedules and take the business date at that moment, which may already have moved on.</w:t>
+      </w:r>
+    </w:p>
+    <w:p>
+      <w:pPr>
+        <w:pStyle w:val="ListParagraph"/>
+        <w:numPr>
+          <w:ilvl w:val="0"/>
+          <w:numId w:val="1"/>
+        </w:numPr>
+        <w:spacing w:after="80" w:line="264"/>
+      </w:pPr>
+      <w:r>
+        <w:rPr>
+          <w:sz w:val="21"/>
+          <w:szCs w:val="21"/>
+        </w:rPr>
+        <w:t xml:space="preserve">Dates always advance by one calendar day. Weekends and holidays are recorded and reported but do not change the date, and instalment due dates are not moved off non-working days.</w:t>
+      </w:r>
+    </w:p>
+    <w:p>
+      <w:pPr>
+        <w:pStyle w:val="ListParagraph"/>
+        <w:numPr>
+          <w:ilvl w:val="0"/>
+          <w:numId w:val="1"/>
+        </w:numPr>
+        <w:spacing w:after="80" w:line="264"/>
+      </w:pPr>
+      <w:r>
+        <w:rPr>
+          <w:sz w:val="21"/>
+          <w:szCs w:val="21"/>
+        </w:rPr>
+        <w:t xml:space="preserve">Delinquency (days past due) is calculated when asked and is not stored; the DPD and NPA jobs call the same function, and the bands are fixed.</w:t>
+      </w:r>
+    </w:p>
+    <w:p>
+      <w:pPr>
+        <w:pStyle w:val="ListParagraph"/>
+        <w:numPr>
+          <w:ilvl w:val="0"/>
+          <w:numId w:val="1"/>
+        </w:numPr>
+        <w:spacing w:after="80" w:line="264"/>
+      </w:pPr>
+      <w:r>
+        <w:rPr>
+          <w:sz w:val="21"/>
+          <w:szCs w:val="21"/>
+        </w:rPr>
+        <w:t xml:space="preserve">27 batch jobs remain stubs; GL reconciliation and month-end close check the ledger outbox only, because the real ledger client does not exist.</w:t>
+      </w:r>
+    </w:p>
+    <w:p>
+      <w:pPr>
+        <w:pStyle w:val="ListParagraph"/>
+        <w:numPr>
+          <w:ilvl w:val="0"/>
+          <w:numId w:val="1"/>
+        </w:numPr>
+        <w:spacing w:after="80" w:line="264"/>
+      </w:pPr>
+      <w:r>
+        <w:rPr>
+          <w:sz w:val="21"/>
+          <w:szCs w:val="21"/>
+        </w:rPr>
+        <w:t xml:space="preserve">The business date, end of day and batch-to-lending work has not been built or run with Maven (see 13.16 for what was checked).</w:t>
       </w:r>
     </w:p>
     <w:p>
@@ -28557,6 +28816,4424 @@
           <w:szCs w:val="21"/>
         </w:rPr>
         <w:t xml:space="preserve">No holiday or business-day adjustment of due dates, and no way to change a live account's schedule type, day count or frequency.</w:t>
+      </w:r>
+    </w:p>
+    <w:p>
+      <w:pPr>
+        <w:pStyle w:val="Heading2"/>
+        <w:spacing w:after="120" w:before="280"/>
+      </w:pPr>
+      <w:r>
+        <w:rPr>
+          <w:b/>
+          <w:bCs/>
+          <w:color w:val="2E5AA8"/>
+          <w:sz w:val="25"/>
+          <w:szCs w:val="25"/>
+        </w:rPr>
+        <w:t xml:space="preserve">13.13 Business Date</w:t>
+      </w:r>
+    </w:p>
+    <w:p>
+      <w:pPr>
+        <w:spacing w:after="140" w:line="276"/>
+      </w:pPr>
+      <w:r>
+        <w:rPr>
+          <w:sz w:val="21"/>
+          <w:szCs w:val="21"/>
+        </w:rPr>
+        <w:t xml:space="preserve">The platform keeps </w:t>
+      </w:r>
+      <w:r>
+        <w:rPr>
+          <w:b/>
+          <w:bCs/>
+          <w:sz w:val="21"/>
+          <w:szCs w:val="21"/>
+        </w:rPr>
+        <w:t xml:space="preserve">one business date</w:t>
+      </w:r>
+      <w:r>
+        <w:rPr>
+          <w:sz w:val="21"/>
+          <w:szCs w:val="21"/>
+        </w:rPr>
+        <w:t xml:space="preserve">. Everything that depends on "today" — payments, interest accrual, delinquency, rate resets, the customer statement, the batch jobs and the admin portal — uses this date and not the calendar date. lending-service owns it; the other services read it. This lets a bank close a day, post late items against an earlier date, and run end of day for a date that is not today.</w:t>
+      </w:r>
+    </w:p>
+    <w:p>
+      <w:pPr>
+        <w:pStyle w:val="Heading3"/>
+        <w:spacing w:after="100" w:before="200"/>
+      </w:pPr>
+      <w:r>
+        <w:rPr>
+          <w:b/>
+          <w:bCs/>
+          <w:color w:val="2E5AA8"/>
+          <w:sz w:val="22"/>
+          <w:szCs w:val="22"/>
+        </w:rPr>
+        <w:t xml:space="preserve">Rules</w:t>
+      </w:r>
+    </w:p>
+    <w:tbl>
+      <w:tblPr>
+        <w:tblW w:type="dxa" w:w="9500"/>
+        <w:tblBorders>
+          <w:top w:val="single" w:color="auto" w:sz="4"/>
+          <w:left w:val="single" w:color="auto" w:sz="4"/>
+          <w:bottom w:val="single" w:color="auto" w:sz="4"/>
+          <w:right w:val="single" w:color="auto" w:sz="4"/>
+          <w:insideH w:val="single" w:color="auto" w:sz="4"/>
+          <w:insideV w:val="single" w:color="auto" w:sz="4"/>
+        </w:tblBorders>
+      </w:tblPr>
+      <w:tblGrid>
+        <w:gridCol w:w="2100"/>
+        <w:gridCol w:w="7400"/>
+      </w:tblGrid>
+      <w:tr>
+        <w:trPr>
+          <w:tblHeader/>
+        </w:trPr>
+        <w:tc>
+          <w:tcPr>
+            <w:tcW w:type="dxa" w:w="2100"/>
+            <w:shd w:fill="1F3864" w:val="clear"/>
+            <w:tcMar>
+              <w:top w:type="dxa" w:w="60"/>
+              <w:left w:type="dxa" w:w="100"/>
+              <w:bottom w:type="dxa" w:w="60"/>
+              <w:right w:type="dxa" w:w="100"/>
+            </w:tcMar>
+            <w:vAlign w:val="center"/>
+          </w:tcPr>
+          <w:p>
+            <w:pPr>
+              <w:jc w:val="left"/>
+            </w:pPr>
+            <w:r>
+              <w:rPr>
+                <w:b/>
+                <w:bCs/>
+                <w:color w:val="FFFFFF"/>
+                <w:sz w:val="19"/>
+                <w:szCs w:val="19"/>
+              </w:rPr>
+              <w:t xml:space="preserve">Rule</w:t>
+            </w:r>
+          </w:p>
+        </w:tc>
+        <w:tc>
+          <w:tcPr>
+            <w:tcW w:type="dxa" w:w="7400"/>
+            <w:shd w:fill="1F3864" w:val="clear"/>
+            <w:tcMar>
+              <w:top w:type="dxa" w:w="60"/>
+              <w:left w:type="dxa" w:w="100"/>
+              <w:bottom w:type="dxa" w:w="60"/>
+              <w:right w:type="dxa" w:w="100"/>
+            </w:tcMar>
+            <w:vAlign w:val="center"/>
+          </w:tcPr>
+          <w:p>
+            <w:pPr>
+              <w:jc w:val="left"/>
+            </w:pPr>
+            <w:r>
+              <w:rPr>
+                <w:b/>
+                <w:bCs/>
+                <w:color w:val="FFFFFF"/>
+                <w:sz w:val="19"/>
+                <w:szCs w:val="19"/>
+              </w:rPr>
+              <w:t xml:space="preserve">Behaviour</w:t>
+            </w:r>
+          </w:p>
+        </w:tc>
+      </w:tr>
+      <w:tr>
+        <w:trPr>
+          <w:cantSplit/>
+        </w:trPr>
+        <w:tc>
+          <w:tcPr>
+            <w:tcW w:type="dxa" w:w="2100"/>
+            <w:tcMar>
+              <w:top w:type="dxa" w:w="60"/>
+              <w:left w:type="dxa" w:w="100"/>
+              <w:bottom w:type="dxa" w:w="60"/>
+              <w:right w:type="dxa" w:w="100"/>
+            </w:tcMar>
+            <w:vAlign w:val="center"/>
+          </w:tcPr>
+          <w:p>
+            <w:pPr>
+              <w:jc w:val="left"/>
+            </w:pPr>
+            <w:r>
+              <w:rPr>
+                <w:sz w:val="19"/>
+                <w:szCs w:val="19"/>
+              </w:rPr>
+              <w:t xml:space="preserve">One date</w:t>
+            </w:r>
+          </w:p>
+        </w:tc>
+        <w:tc>
+          <w:tcPr>
+            <w:tcW w:type="dxa" w:w="7400"/>
+            <w:tcMar>
+              <w:top w:type="dxa" w:w="60"/>
+              <w:left w:type="dxa" w:w="100"/>
+              <w:bottom w:type="dxa" w:w="60"/>
+              <w:right w:type="dxa" w:w="100"/>
+            </w:tcMar>
+            <w:vAlign w:val="center"/>
+          </w:tcPr>
+          <w:p>
+            <w:pPr>
+              <w:jc w:val="left"/>
+            </w:pPr>
+            <w:r>
+              <w:rPr>
+                <w:sz w:val="19"/>
+                <w:szCs w:val="19"/>
+              </w:rPr>
+              <w:t xml:space="preserve">A single business date for the whole platform, with a status of </w:t>
+            </w:r>
+            <w:r>
+              <w:rPr>
+                <w:b/>
+                <w:bCs/>
+                <w:sz w:val="19"/>
+                <w:szCs w:val="19"/>
+              </w:rPr>
+              <w:t xml:space="preserve">OPEN</w:t>
+            </w:r>
+            <w:r>
+              <w:rPr>
+                <w:sz w:val="19"/>
+                <w:szCs w:val="19"/>
+              </w:rPr>
+              <w:t xml:space="preserve"> (normal working) or </w:t>
+            </w:r>
+            <w:r>
+              <w:rPr>
+                <w:b/>
+                <w:bCs/>
+                <w:sz w:val="19"/>
+                <w:szCs w:val="19"/>
+              </w:rPr>
+              <w:t xml:space="preserve">EOD_RUNNING</w:t>
+            </w:r>
+            <w:r>
+              <w:rPr>
+                <w:sz w:val="19"/>
+                <w:szCs w:val="19"/>
+              </w:rPr>
+              <w:t xml:space="preserve"> (end of day has started and has not finished).</w:t>
+            </w:r>
+          </w:p>
+        </w:tc>
+      </w:tr>
+      <w:tr>
+        <w:trPr>
+          <w:cantSplit/>
+        </w:trPr>
+        <w:tc>
+          <w:tcPr>
+            <w:tcW w:type="dxa" w:w="2100"/>
+            <w:shd w:fill="F5F8FC" w:val="clear"/>
+            <w:tcMar>
+              <w:top w:type="dxa" w:w="60"/>
+              <w:left w:type="dxa" w:w="100"/>
+              <w:bottom w:type="dxa" w:w="60"/>
+              <w:right w:type="dxa" w:w="100"/>
+            </w:tcMar>
+            <w:vAlign w:val="center"/>
+          </w:tcPr>
+          <w:p>
+            <w:pPr>
+              <w:jc w:val="left"/>
+            </w:pPr>
+            <w:r>
+              <w:rPr>
+                <w:sz w:val="19"/>
+                <w:szCs w:val="19"/>
+              </w:rPr>
+              <w:t xml:space="preserve">Starting value</w:t>
+            </w:r>
+          </w:p>
+        </w:tc>
+        <w:tc>
+          <w:tcPr>
+            <w:tcW w:type="dxa" w:w="7400"/>
+            <w:shd w:fill="F5F8FC" w:val="clear"/>
+            <w:tcMar>
+              <w:top w:type="dxa" w:w="60"/>
+              <w:left w:type="dxa" w:w="100"/>
+              <w:bottom w:type="dxa" w:w="60"/>
+              <w:right w:type="dxa" w:w="100"/>
+            </w:tcMar>
+            <w:vAlign w:val="center"/>
+          </w:tcPr>
+          <w:p>
+            <w:pPr>
+              <w:jc w:val="left"/>
+            </w:pPr>
+            <w:r>
+              <w:rPr>
+                <w:sz w:val="19"/>
+                <w:szCs w:val="19"/>
+              </w:rPr>
+              <w:t xml:space="preserve">The first time the platform starts, the business date is set to the current date in India (Asia/Kolkata). After that it only moves as described below.</w:t>
+            </w:r>
+          </w:p>
+        </w:tc>
+      </w:tr>
+      <w:tr>
+        <w:trPr>
+          <w:cantSplit/>
+        </w:trPr>
+        <w:tc>
+          <w:tcPr>
+            <w:tcW w:type="dxa" w:w="2100"/>
+            <w:tcMar>
+              <w:top w:type="dxa" w:w="60"/>
+              <w:left w:type="dxa" w:w="100"/>
+              <w:bottom w:type="dxa" w:w="60"/>
+              <w:right w:type="dxa" w:w="100"/>
+            </w:tcMar>
+            <w:vAlign w:val="center"/>
+          </w:tcPr>
+          <w:p>
+            <w:pPr>
+              <w:jc w:val="left"/>
+            </w:pPr>
+            <w:r>
+              <w:rPr>
+                <w:sz w:val="19"/>
+                <w:szCs w:val="19"/>
+              </w:rPr>
+              <w:t xml:space="preserve">How it moves</w:t>
+            </w:r>
+          </w:p>
+        </w:tc>
+        <w:tc>
+          <w:tcPr>
+            <w:tcW w:type="dxa" w:w="7400"/>
+            <w:tcMar>
+              <w:top w:type="dxa" w:w="60"/>
+              <w:left w:type="dxa" w:w="100"/>
+              <w:bottom w:type="dxa" w:w="60"/>
+              <w:right w:type="dxa" w:w="100"/>
+            </w:tcMar>
+            <w:vAlign w:val="center"/>
+          </w:tcPr>
+          <w:p>
+            <w:pPr>
+              <w:jc w:val="left"/>
+            </w:pPr>
+            <w:r>
+              <w:rPr>
+                <w:sz w:val="19"/>
+                <w:szCs w:val="19"/>
+              </w:rPr>
+              <w:t xml:space="preserve">End of day moves it forward by one calendar day, and only after every daily batch job has completed (13.14). It can also be set directly, for first-time set-up and testing, while the status is OPEN; setting it backwards is refused unless the environment explicitly allows it.</w:t>
+            </w:r>
+          </w:p>
+        </w:tc>
+      </w:tr>
+      <w:tr>
+        <w:trPr>
+          <w:cantSplit/>
+        </w:trPr>
+        <w:tc>
+          <w:tcPr>
+            <w:tcW w:type="dxa" w:w="2100"/>
+            <w:shd w:fill="F5F8FC" w:val="clear"/>
+            <w:tcMar>
+              <w:top w:type="dxa" w:w="60"/>
+              <w:left w:type="dxa" w:w="100"/>
+              <w:bottom w:type="dxa" w:w="60"/>
+              <w:right w:type="dxa" w:w="100"/>
+            </w:tcMar>
+            <w:vAlign w:val="center"/>
+          </w:tcPr>
+          <w:p>
+            <w:pPr>
+              <w:jc w:val="left"/>
+            </w:pPr>
+            <w:r>
+              <w:rPr>
+                <w:sz w:val="19"/>
+                <w:szCs w:val="19"/>
+              </w:rPr>
+              <w:t xml:space="preserve">No future dates</w:t>
+            </w:r>
+          </w:p>
+        </w:tc>
+        <w:tc>
+          <w:tcPr>
+            <w:tcW w:type="dxa" w:w="7400"/>
+            <w:shd w:fill="F5F8FC" w:val="clear"/>
+            <w:tcMar>
+              <w:top w:type="dxa" w:w="60"/>
+              <w:left w:type="dxa" w:w="100"/>
+              <w:bottom w:type="dxa" w:w="60"/>
+              <w:right w:type="dxa" w:w="100"/>
+            </w:tcMar>
+            <w:vAlign w:val="center"/>
+          </w:tcPr>
+          <w:p>
+            <w:pPr>
+              <w:jc w:val="left"/>
+            </w:pPr>
+            <w:r>
+              <w:rPr>
+                <w:sz w:val="19"/>
+                <w:szCs w:val="19"/>
+              </w:rPr>
+              <w:t xml:space="preserve">A payment, accrual, classification or rate-reset date after the business date is refused with HTTP 400 and a message naming both dates. This can be switched off for throw-away environments.</w:t>
+            </w:r>
+          </w:p>
+        </w:tc>
+      </w:tr>
+      <w:tr>
+        <w:trPr>
+          <w:cantSplit/>
+        </w:trPr>
+        <w:tc>
+          <w:tcPr>
+            <w:tcW w:type="dxa" w:w="2100"/>
+            <w:tcMar>
+              <w:top w:type="dxa" w:w="60"/>
+              <w:left w:type="dxa" w:w="100"/>
+              <w:bottom w:type="dxa" w:w="60"/>
+              <w:right w:type="dxa" w:w="100"/>
+            </w:tcMar>
+            <w:vAlign w:val="center"/>
+          </w:tcPr>
+          <w:p>
+            <w:pPr>
+              <w:jc w:val="left"/>
+            </w:pPr>
+            <w:r>
+              <w:rPr>
+                <w:sz w:val="19"/>
+                <w:szCs w:val="19"/>
+              </w:rPr>
+              <w:t xml:space="preserve">Earlier dates</w:t>
+            </w:r>
+          </w:p>
+        </w:tc>
+        <w:tc>
+          <w:tcPr>
+            <w:tcW w:type="dxa" w:w="7400"/>
+            <w:tcMar>
+              <w:top w:type="dxa" w:w="60"/>
+              <w:left w:type="dxa" w:w="100"/>
+              <w:bottom w:type="dxa" w:w="60"/>
+              <w:right w:type="dxa" w:w="100"/>
+            </w:tcMar>
+            <w:vAlign w:val="center"/>
+          </w:tcPr>
+          <w:p>
+            <w:pPr>
+              <w:jc w:val="left"/>
+            </w:pPr>
+            <w:r>
+              <w:rPr>
+                <w:sz w:val="19"/>
+                <w:szCs w:val="19"/>
+              </w:rPr>
+              <w:t xml:space="preserve">Earlier dates are accepted, so a late payment can be recorded against the day it was made.</w:t>
+            </w:r>
+          </w:p>
+        </w:tc>
+      </w:tr>
+      <w:tr>
+        <w:trPr>
+          <w:cantSplit/>
+        </w:trPr>
+        <w:tc>
+          <w:tcPr>
+            <w:tcW w:type="dxa" w:w="2100"/>
+            <w:shd w:fill="F5F8FC" w:val="clear"/>
+            <w:tcMar>
+              <w:top w:type="dxa" w:w="60"/>
+              <w:left w:type="dxa" w:w="100"/>
+              <w:bottom w:type="dxa" w:w="60"/>
+              <w:right w:type="dxa" w:w="100"/>
+            </w:tcMar>
+            <w:vAlign w:val="center"/>
+          </w:tcPr>
+          <w:p>
+            <w:pPr>
+              <w:jc w:val="left"/>
+            </w:pPr>
+            <w:r>
+              <w:rPr>
+                <w:sz w:val="19"/>
+                <w:szCs w:val="19"/>
+              </w:rPr>
+              <w:t xml:space="preserve">Working days</w:t>
+            </w:r>
+          </w:p>
+        </w:tc>
+        <w:tc>
+          <w:tcPr>
+            <w:tcW w:type="dxa" w:w="7400"/>
+            <w:shd w:fill="F5F8FC" w:val="clear"/>
+            <w:tcMar>
+              <w:top w:type="dxa" w:w="60"/>
+              <w:left w:type="dxa" w:w="100"/>
+              <w:bottom w:type="dxa" w:w="60"/>
+              <w:right w:type="dxa" w:w="100"/>
+            </w:tcMar>
+            <w:vAlign w:val="center"/>
+          </w:tcPr>
+          <w:p>
+            <w:pPr>
+              <w:jc w:val="left"/>
+            </w:pPr>
+            <w:r>
+              <w:rPr>
+                <w:sz w:val="19"/>
+                <w:szCs w:val="19"/>
+              </w:rPr>
+              <w:t xml:space="preserve">Saturday and Sunday (configurable) and the holidays entered in the holiday calendar are non-working days. The business date endpoint reports whether the date is a working day. The date still moves one calendar day at a time, and instalment due dates are not moved off non-working days.</w:t>
+            </w:r>
+          </w:p>
+        </w:tc>
+      </w:tr>
+      <w:tr>
+        <w:trPr>
+          <w:cantSplit/>
+        </w:trPr>
+        <w:tc>
+          <w:tcPr>
+            <w:tcW w:type="dxa" w:w="2100"/>
+            <w:tcMar>
+              <w:top w:type="dxa" w:w="60"/>
+              <w:left w:type="dxa" w:w="100"/>
+              <w:bottom w:type="dxa" w:w="60"/>
+              <w:right w:type="dxa" w:w="100"/>
+            </w:tcMar>
+            <w:vAlign w:val="center"/>
+          </w:tcPr>
+          <w:p>
+            <w:pPr>
+              <w:jc w:val="left"/>
+            </w:pPr>
+            <w:r>
+              <w:rPr>
+                <w:sz w:val="19"/>
+                <w:szCs w:val="19"/>
+              </w:rPr>
+              <w:t xml:space="preserve">History</w:t>
+            </w:r>
+          </w:p>
+        </w:tc>
+        <w:tc>
+          <w:tcPr>
+            <w:tcW w:type="dxa" w:w="7400"/>
+            <w:tcMar>
+              <w:top w:type="dxa" w:w="60"/>
+              <w:left w:type="dxa" w:w="100"/>
+              <w:bottom w:type="dxa" w:w="60"/>
+              <w:right w:type="dxa" w:w="100"/>
+            </w:tcMar>
+            <w:vAlign w:val="center"/>
+          </w:tcPr>
+          <w:p>
+            <w:pPr>
+              <w:jc w:val="left"/>
+            </w:pPr>
+            <w:r>
+              <w:rPr>
+                <w:sz w:val="19"/>
+                <w:szCs w:val="19"/>
+              </w:rPr>
+              <w:t xml:space="preserve">For every business date the platform records when it opened, when end of day started, when it closed and who closed it. Setting the date records the reason.</w:t>
+            </w:r>
+          </w:p>
+        </w:tc>
+      </w:tr>
+      <w:tr>
+        <w:trPr>
+          <w:cantSplit/>
+        </w:trPr>
+        <w:tc>
+          <w:tcPr>
+            <w:tcW w:type="dxa" w:w="2100"/>
+            <w:shd w:fill="F5F8FC" w:val="clear"/>
+            <w:tcMar>
+              <w:top w:type="dxa" w:w="60"/>
+              <w:left w:type="dxa" w:w="100"/>
+              <w:bottom w:type="dxa" w:w="60"/>
+              <w:right w:type="dxa" w:w="100"/>
+            </w:tcMar>
+            <w:vAlign w:val="center"/>
+          </w:tcPr>
+          <w:p>
+            <w:pPr>
+              <w:jc w:val="left"/>
+            </w:pPr>
+            <w:r>
+              <w:rPr>
+                <w:sz w:val="19"/>
+                <w:szCs w:val="19"/>
+              </w:rPr>
+              <w:t xml:space="preserve">Concurrency</w:t>
+            </w:r>
+          </w:p>
+        </w:tc>
+        <w:tc>
+          <w:tcPr>
+            <w:tcW w:type="dxa" w:w="7400"/>
+            <w:shd w:fill="F5F8FC" w:val="clear"/>
+            <w:tcMar>
+              <w:top w:type="dxa" w:w="60"/>
+              <w:left w:type="dxa" w:w="100"/>
+              <w:bottom w:type="dxa" w:w="60"/>
+              <w:right w:type="dxa" w:w="100"/>
+            </w:tcMar>
+            <w:vAlign w:val="center"/>
+          </w:tcPr>
+          <w:p>
+            <w:pPr>
+              <w:jc w:val="left"/>
+            </w:pPr>
+            <w:r>
+              <w:rPr>
+                <w:sz w:val="19"/>
+                <w:szCs w:val="19"/>
+              </w:rPr>
+              <w:t xml:space="preserve">Starting end of day, advancing and setting the date are done one at a time. Advancing is safe to repeat: asking to close a date that is already closed changes nothing and reports the current date.</w:t>
+            </w:r>
+          </w:p>
+        </w:tc>
+      </w:tr>
+    </w:tbl>
+    <w:p>
+      <w:pPr>
+        <w:spacing w:after="60"/>
+      </w:pPr>
+    </w:p>
+    <w:p>
+      <w:pPr>
+        <w:pStyle w:val="Heading3"/>
+        <w:spacing w:after="100" w:before="200"/>
+      </w:pPr>
+      <w:r>
+        <w:rPr>
+          <w:b/>
+          <w:bCs/>
+          <w:color w:val="2E5AA8"/>
+          <w:sz w:val="22"/>
+          <w:szCs w:val="22"/>
+        </w:rPr>
+        <w:t xml:space="preserve">Which functions check the date</w:t>
+      </w:r>
+    </w:p>
+    <w:tbl>
+      <w:tblPr>
+        <w:tblW w:type="dxa" w:w="9500"/>
+        <w:tblBorders>
+          <w:top w:val="single" w:color="auto" w:sz="4"/>
+          <w:left w:val="single" w:color="auto" w:sz="4"/>
+          <w:bottom w:val="single" w:color="auto" w:sz="4"/>
+          <w:right w:val="single" w:color="auto" w:sz="4"/>
+          <w:insideH w:val="single" w:color="auto" w:sz="4"/>
+          <w:insideV w:val="single" w:color="auto" w:sz="4"/>
+        </w:tblBorders>
+      </w:tblPr>
+      <w:tblGrid>
+        <w:gridCol w:w="3300"/>
+        <w:gridCol w:w="2500"/>
+        <w:gridCol w:w="3700"/>
+      </w:tblGrid>
+      <w:tr>
+        <w:trPr>
+          <w:tblHeader/>
+        </w:trPr>
+        <w:tc>
+          <w:tcPr>
+            <w:tcW w:type="dxa" w:w="3300"/>
+            <w:shd w:fill="1F3864" w:val="clear"/>
+            <w:tcMar>
+              <w:top w:type="dxa" w:w="60"/>
+              <w:left w:type="dxa" w:w="100"/>
+              <w:bottom w:type="dxa" w:w="60"/>
+              <w:right w:type="dxa" w:w="100"/>
+            </w:tcMar>
+            <w:vAlign w:val="center"/>
+          </w:tcPr>
+          <w:p>
+            <w:pPr>
+              <w:jc w:val="left"/>
+            </w:pPr>
+            <w:r>
+              <w:rPr>
+                <w:b/>
+                <w:bCs/>
+                <w:color w:val="FFFFFF"/>
+                <w:sz w:val="19"/>
+                <w:szCs w:val="19"/>
+              </w:rPr>
+              <w:t xml:space="preserve">Function</w:t>
+            </w:r>
+          </w:p>
+        </w:tc>
+        <w:tc>
+          <w:tcPr>
+            <w:tcW w:type="dxa" w:w="2500"/>
+            <w:shd w:fill="1F3864" w:val="clear"/>
+            <w:tcMar>
+              <w:top w:type="dxa" w:w="60"/>
+              <w:left w:type="dxa" w:w="100"/>
+              <w:bottom w:type="dxa" w:w="60"/>
+              <w:right w:type="dxa" w:w="100"/>
+            </w:tcMar>
+            <w:vAlign w:val="center"/>
+          </w:tcPr>
+          <w:p>
+            <w:pPr>
+              <w:jc w:val="left"/>
+            </w:pPr>
+            <w:r>
+              <w:rPr>
+                <w:b/>
+                <w:bCs/>
+                <w:color w:val="FFFFFF"/>
+                <w:sz w:val="19"/>
+                <w:szCs w:val="19"/>
+              </w:rPr>
+              <w:t xml:space="preserve">Date that is checked</w:t>
+            </w:r>
+          </w:p>
+        </w:tc>
+        <w:tc>
+          <w:tcPr>
+            <w:tcW w:type="dxa" w:w="3700"/>
+            <w:shd w:fill="1F3864" w:val="clear"/>
+            <w:tcMar>
+              <w:top w:type="dxa" w:w="60"/>
+              <w:left w:type="dxa" w:w="100"/>
+              <w:bottom w:type="dxa" w:w="60"/>
+              <w:right w:type="dxa" w:w="100"/>
+            </w:tcMar>
+            <w:vAlign w:val="center"/>
+          </w:tcPr>
+          <w:p>
+            <w:pPr>
+              <w:jc w:val="left"/>
+            </w:pPr>
+            <w:r>
+              <w:rPr>
+                <w:b/>
+                <w:bCs/>
+                <w:color w:val="FFFFFF"/>
+                <w:sz w:val="19"/>
+                <w:szCs w:val="19"/>
+              </w:rPr>
+              <w:t xml:space="preserve">If it is after the business date</w:t>
+            </w:r>
+          </w:p>
+        </w:tc>
+      </w:tr>
+      <w:tr>
+        <w:trPr>
+          <w:cantSplit/>
+        </w:trPr>
+        <w:tc>
+          <w:tcPr>
+            <w:tcW w:type="dxa" w:w="3300"/>
+            <w:tcMar>
+              <w:top w:type="dxa" w:w="60"/>
+              <w:left w:type="dxa" w:w="100"/>
+              <w:bottom w:type="dxa" w:w="60"/>
+              <w:right w:type="dxa" w:w="100"/>
+            </w:tcMar>
+            <w:vAlign w:val="center"/>
+          </w:tcPr>
+          <w:p>
+            <w:pPr>
+              <w:jc w:val="left"/>
+            </w:pPr>
+            <w:r>
+              <w:rPr>
+                <w:sz w:val="19"/>
+                <w:szCs w:val="19"/>
+              </w:rPr>
+              <w:t xml:space="preserve">EMI payment</w:t>
+            </w:r>
+          </w:p>
+        </w:tc>
+        <w:tc>
+          <w:tcPr>
+            <w:tcW w:type="dxa" w:w="2500"/>
+            <w:tcMar>
+              <w:top w:type="dxa" w:w="60"/>
+              <w:left w:type="dxa" w:w="100"/>
+              <w:bottom w:type="dxa" w:w="60"/>
+              <w:right w:type="dxa" w:w="100"/>
+            </w:tcMar>
+            <w:vAlign w:val="center"/>
+          </w:tcPr>
+          <w:p>
+            <w:pPr>
+              <w:jc w:val="left"/>
+            </w:pPr>
+            <w:r>
+              <w:rPr>
+                <w:rFonts w:ascii="Consolas" w:hAnsi="Consolas" w:cs="Consolas"/>
+                <w:color w:val="1F3864"/>
+                <w:sz w:val="17"/>
+                <w:szCs w:val="17"/>
+              </w:rPr>
+              <w:t xml:space="preserve">valueDate</w:t>
+            </w:r>
+          </w:p>
+        </w:tc>
+        <w:tc>
+          <w:tcPr>
+            <w:tcW w:type="dxa" w:w="3700"/>
+            <w:tcMar>
+              <w:top w:type="dxa" w:w="60"/>
+              <w:left w:type="dxa" w:w="100"/>
+              <w:bottom w:type="dxa" w:w="60"/>
+              <w:right w:type="dxa" w:w="100"/>
+            </w:tcMar>
+            <w:vAlign w:val="center"/>
+          </w:tcPr>
+          <w:p>
+            <w:pPr>
+              <w:jc w:val="left"/>
+            </w:pPr>
+            <w:r>
+              <w:rPr>
+                <w:sz w:val="19"/>
+                <w:szCs w:val="19"/>
+              </w:rPr>
+              <w:t xml:space="preserve">Rejected, HTTP 400</w:t>
+            </w:r>
+          </w:p>
+        </w:tc>
+      </w:tr>
+      <w:tr>
+        <w:trPr>
+          <w:cantSplit/>
+        </w:trPr>
+        <w:tc>
+          <w:tcPr>
+            <w:tcW w:type="dxa" w:w="3300"/>
+            <w:shd w:fill="F5F8FC" w:val="clear"/>
+            <w:tcMar>
+              <w:top w:type="dxa" w:w="60"/>
+              <w:left w:type="dxa" w:w="100"/>
+              <w:bottom w:type="dxa" w:w="60"/>
+              <w:right w:type="dxa" w:w="100"/>
+            </w:tcMar>
+            <w:vAlign w:val="center"/>
+          </w:tcPr>
+          <w:p>
+            <w:pPr>
+              <w:jc w:val="left"/>
+            </w:pPr>
+            <w:r>
+              <w:rPr>
+                <w:sz w:val="19"/>
+                <w:szCs w:val="19"/>
+              </w:rPr>
+              <w:t xml:space="preserve">Part-payment</w:t>
+            </w:r>
+          </w:p>
+        </w:tc>
+        <w:tc>
+          <w:tcPr>
+            <w:tcW w:type="dxa" w:w="2500"/>
+            <w:shd w:fill="F5F8FC" w:val="clear"/>
+            <w:tcMar>
+              <w:top w:type="dxa" w:w="60"/>
+              <w:left w:type="dxa" w:w="100"/>
+              <w:bottom w:type="dxa" w:w="60"/>
+              <w:right w:type="dxa" w:w="100"/>
+            </w:tcMar>
+            <w:vAlign w:val="center"/>
+          </w:tcPr>
+          <w:p>
+            <w:pPr>
+              <w:jc w:val="left"/>
+            </w:pPr>
+            <w:r>
+              <w:rPr>
+                <w:rFonts w:ascii="Consolas" w:hAnsi="Consolas" w:cs="Consolas"/>
+                <w:color w:val="1F3864"/>
+                <w:sz w:val="17"/>
+                <w:szCs w:val="17"/>
+              </w:rPr>
+              <w:t xml:space="preserve">valueDate</w:t>
+            </w:r>
+          </w:p>
+        </w:tc>
+        <w:tc>
+          <w:tcPr>
+            <w:tcW w:type="dxa" w:w="3700"/>
+            <w:shd w:fill="F5F8FC" w:val="clear"/>
+            <w:tcMar>
+              <w:top w:type="dxa" w:w="60"/>
+              <w:left w:type="dxa" w:w="100"/>
+              <w:bottom w:type="dxa" w:w="60"/>
+              <w:right w:type="dxa" w:w="100"/>
+            </w:tcMar>
+            <w:vAlign w:val="center"/>
+          </w:tcPr>
+          <w:p>
+            <w:pPr>
+              <w:jc w:val="left"/>
+            </w:pPr>
+            <w:r>
+              <w:rPr>
+                <w:sz w:val="19"/>
+                <w:szCs w:val="19"/>
+              </w:rPr>
+              <w:t xml:space="preserve">Rejected, HTTP 400</w:t>
+            </w:r>
+          </w:p>
+        </w:tc>
+      </w:tr>
+      <w:tr>
+        <w:trPr>
+          <w:cantSplit/>
+        </w:trPr>
+        <w:tc>
+          <w:tcPr>
+            <w:tcW w:type="dxa" w:w="3300"/>
+            <w:tcMar>
+              <w:top w:type="dxa" w:w="60"/>
+              <w:left w:type="dxa" w:w="100"/>
+              <w:bottom w:type="dxa" w:w="60"/>
+              <w:right w:type="dxa" w:w="100"/>
+            </w:tcMar>
+            <w:vAlign w:val="center"/>
+          </w:tcPr>
+          <w:p>
+            <w:pPr>
+              <w:jc w:val="left"/>
+            </w:pPr>
+            <w:r>
+              <w:rPr>
+                <w:sz w:val="19"/>
+                <w:szCs w:val="19"/>
+              </w:rPr>
+              <w:t xml:space="preserve">Foreclosure</w:t>
+            </w:r>
+          </w:p>
+        </w:tc>
+        <w:tc>
+          <w:tcPr>
+            <w:tcW w:type="dxa" w:w="2500"/>
+            <w:tcMar>
+              <w:top w:type="dxa" w:w="60"/>
+              <w:left w:type="dxa" w:w="100"/>
+              <w:bottom w:type="dxa" w:w="60"/>
+              <w:right w:type="dxa" w:w="100"/>
+            </w:tcMar>
+            <w:vAlign w:val="center"/>
+          </w:tcPr>
+          <w:p>
+            <w:pPr>
+              <w:jc w:val="left"/>
+            </w:pPr>
+            <w:r>
+              <w:rPr>
+                <w:rFonts w:ascii="Consolas" w:hAnsi="Consolas" w:cs="Consolas"/>
+                <w:color w:val="1F3864"/>
+                <w:sz w:val="17"/>
+                <w:szCs w:val="17"/>
+              </w:rPr>
+              <w:t xml:space="preserve">foreclosureDate</w:t>
+            </w:r>
+          </w:p>
+        </w:tc>
+        <w:tc>
+          <w:tcPr>
+            <w:tcW w:type="dxa" w:w="3700"/>
+            <w:tcMar>
+              <w:top w:type="dxa" w:w="60"/>
+              <w:left w:type="dxa" w:w="100"/>
+              <w:bottom w:type="dxa" w:w="60"/>
+              <w:right w:type="dxa" w:w="100"/>
+            </w:tcMar>
+            <w:vAlign w:val="center"/>
+          </w:tcPr>
+          <w:p>
+            <w:pPr>
+              <w:jc w:val="left"/>
+            </w:pPr>
+            <w:r>
+              <w:rPr>
+                <w:sz w:val="19"/>
+                <w:szCs w:val="19"/>
+              </w:rPr>
+              <w:t xml:space="preserve">Rejected, HTTP 400</w:t>
+            </w:r>
+          </w:p>
+        </w:tc>
+      </w:tr>
+      <w:tr>
+        <w:trPr>
+          <w:cantSplit/>
+        </w:trPr>
+        <w:tc>
+          <w:tcPr>
+            <w:tcW w:type="dxa" w:w="3300"/>
+            <w:shd w:fill="F5F8FC" w:val="clear"/>
+            <w:tcMar>
+              <w:top w:type="dxa" w:w="60"/>
+              <w:left w:type="dxa" w:w="100"/>
+              <w:bottom w:type="dxa" w:w="60"/>
+              <w:right w:type="dxa" w:w="100"/>
+            </w:tcMar>
+            <w:vAlign w:val="center"/>
+          </w:tcPr>
+          <w:p>
+            <w:pPr>
+              <w:jc w:val="left"/>
+            </w:pPr>
+            <w:r>
+              <w:rPr>
+                <w:sz w:val="19"/>
+                <w:szCs w:val="19"/>
+              </w:rPr>
+              <w:t xml:space="preserve">Interest accrual (all accounts, or one account)</w:t>
+            </w:r>
+          </w:p>
+        </w:tc>
+        <w:tc>
+          <w:tcPr>
+            <w:tcW w:type="dxa" w:w="2500"/>
+            <w:shd w:fill="F5F8FC" w:val="clear"/>
+            <w:tcMar>
+              <w:top w:type="dxa" w:w="60"/>
+              <w:left w:type="dxa" w:w="100"/>
+              <w:bottom w:type="dxa" w:w="60"/>
+              <w:right w:type="dxa" w:w="100"/>
+            </w:tcMar>
+            <w:vAlign w:val="center"/>
+          </w:tcPr>
+          <w:p>
+            <w:pPr>
+              <w:jc w:val="left"/>
+            </w:pPr>
+            <w:r>
+              <w:rPr>
+                <w:rFonts w:ascii="Consolas" w:hAnsi="Consolas" w:cs="Consolas"/>
+                <w:color w:val="1F3864"/>
+                <w:sz w:val="17"/>
+                <w:szCs w:val="17"/>
+              </w:rPr>
+              <w:t xml:space="preserve">businessDate</w:t>
+            </w:r>
+          </w:p>
+        </w:tc>
+        <w:tc>
+          <w:tcPr>
+            <w:tcW w:type="dxa" w:w="3700"/>
+            <w:shd w:fill="F5F8FC" w:val="clear"/>
+            <w:tcMar>
+              <w:top w:type="dxa" w:w="60"/>
+              <w:left w:type="dxa" w:w="100"/>
+              <w:bottom w:type="dxa" w:w="60"/>
+              <w:right w:type="dxa" w:w="100"/>
+            </w:tcMar>
+            <w:vAlign w:val="center"/>
+          </w:tcPr>
+          <w:p>
+            <w:pPr>
+              <w:jc w:val="left"/>
+            </w:pPr>
+            <w:r>
+              <w:rPr>
+                <w:sz w:val="19"/>
+                <w:szCs w:val="19"/>
+              </w:rPr>
+              <w:t xml:space="preserve">Rejected, HTTP 400</w:t>
+            </w:r>
+          </w:p>
+        </w:tc>
+      </w:tr>
+      <w:tr>
+        <w:trPr>
+          <w:cantSplit/>
+        </w:trPr>
+        <w:tc>
+          <w:tcPr>
+            <w:tcW w:type="dxa" w:w="3300"/>
+            <w:tcMar>
+              <w:top w:type="dxa" w:w="60"/>
+              <w:left w:type="dxa" w:w="100"/>
+              <w:bottom w:type="dxa" w:w="60"/>
+              <w:right w:type="dxa" w:w="100"/>
+            </w:tcMar>
+            <w:vAlign w:val="center"/>
+          </w:tcPr>
+          <w:p>
+            <w:pPr>
+              <w:jc w:val="left"/>
+            </w:pPr>
+            <w:r>
+              <w:rPr>
+                <w:sz w:val="19"/>
+                <w:szCs w:val="19"/>
+              </w:rPr>
+              <w:t xml:space="preserve">Delinquency classification (all accounts, or one account)</w:t>
+            </w:r>
+          </w:p>
+        </w:tc>
+        <w:tc>
+          <w:tcPr>
+            <w:tcW w:type="dxa" w:w="2500"/>
+            <w:tcMar>
+              <w:top w:type="dxa" w:w="60"/>
+              <w:left w:type="dxa" w:w="100"/>
+              <w:bottom w:type="dxa" w:w="60"/>
+              <w:right w:type="dxa" w:w="100"/>
+            </w:tcMar>
+            <w:vAlign w:val="center"/>
+          </w:tcPr>
+          <w:p>
+            <w:pPr>
+              <w:jc w:val="left"/>
+            </w:pPr>
+            <w:r>
+              <w:rPr>
+                <w:rFonts w:ascii="Consolas" w:hAnsi="Consolas" w:cs="Consolas"/>
+                <w:color w:val="1F3864"/>
+                <w:sz w:val="17"/>
+                <w:szCs w:val="17"/>
+              </w:rPr>
+              <w:t xml:space="preserve">asOfDate</w:t>
+            </w:r>
+          </w:p>
+        </w:tc>
+        <w:tc>
+          <w:tcPr>
+            <w:tcW w:type="dxa" w:w="3700"/>
+            <w:tcMar>
+              <w:top w:type="dxa" w:w="60"/>
+              <w:left w:type="dxa" w:w="100"/>
+              <w:bottom w:type="dxa" w:w="60"/>
+              <w:right w:type="dxa" w:w="100"/>
+            </w:tcMar>
+            <w:vAlign w:val="center"/>
+          </w:tcPr>
+          <w:p>
+            <w:pPr>
+              <w:jc w:val="left"/>
+            </w:pPr>
+            <w:r>
+              <w:rPr>
+                <w:sz w:val="19"/>
+                <w:szCs w:val="19"/>
+              </w:rPr>
+              <w:t xml:space="preserve">Rejected, HTTP 400</w:t>
+            </w:r>
+          </w:p>
+        </w:tc>
+      </w:tr>
+      <w:tr>
+        <w:trPr>
+          <w:cantSplit/>
+        </w:trPr>
+        <w:tc>
+          <w:tcPr>
+            <w:tcW w:type="dxa" w:w="3300"/>
+            <w:shd w:fill="F5F8FC" w:val="clear"/>
+            <w:tcMar>
+              <w:top w:type="dxa" w:w="60"/>
+              <w:left w:type="dxa" w:w="100"/>
+              <w:bottom w:type="dxa" w:w="60"/>
+              <w:right w:type="dxa" w:w="100"/>
+            </w:tcMar>
+            <w:vAlign w:val="center"/>
+          </w:tcPr>
+          <w:p>
+            <w:pPr>
+              <w:jc w:val="left"/>
+            </w:pPr>
+            <w:r>
+              <w:rPr>
+                <w:sz w:val="19"/>
+                <w:szCs w:val="19"/>
+              </w:rPr>
+              <w:t xml:space="preserve">Floating-rate reset for one account</w:t>
+            </w:r>
+          </w:p>
+        </w:tc>
+        <w:tc>
+          <w:tcPr>
+            <w:tcW w:type="dxa" w:w="2500"/>
+            <w:shd w:fill="F5F8FC" w:val="clear"/>
+            <w:tcMar>
+              <w:top w:type="dxa" w:w="60"/>
+              <w:left w:type="dxa" w:w="100"/>
+              <w:bottom w:type="dxa" w:w="60"/>
+              <w:right w:type="dxa" w:w="100"/>
+            </w:tcMar>
+            <w:vAlign w:val="center"/>
+          </w:tcPr>
+          <w:p>
+            <w:pPr>
+              <w:jc w:val="left"/>
+            </w:pPr>
+            <w:r>
+              <w:rPr>
+                <w:rFonts w:ascii="Consolas" w:hAnsi="Consolas" w:cs="Consolas"/>
+                <w:color w:val="1F3864"/>
+                <w:sz w:val="17"/>
+                <w:szCs w:val="17"/>
+              </w:rPr>
+              <w:t xml:space="preserve">businessDate</w:t>
+            </w:r>
+          </w:p>
+        </w:tc>
+        <w:tc>
+          <w:tcPr>
+            <w:tcW w:type="dxa" w:w="3700"/>
+            <w:shd w:fill="F5F8FC" w:val="clear"/>
+            <w:tcMar>
+              <w:top w:type="dxa" w:w="60"/>
+              <w:left w:type="dxa" w:w="100"/>
+              <w:bottom w:type="dxa" w:w="60"/>
+              <w:right w:type="dxa" w:w="100"/>
+            </w:tcMar>
+            <w:vAlign w:val="center"/>
+          </w:tcPr>
+          <w:p>
+            <w:pPr>
+              <w:jc w:val="left"/>
+            </w:pPr>
+            <w:r>
+              <w:rPr>
+                <w:sz w:val="19"/>
+                <w:szCs w:val="19"/>
+              </w:rPr>
+              <w:t xml:space="preserve">Rejected, HTTP 400</w:t>
+            </w:r>
+          </w:p>
+        </w:tc>
+      </w:tr>
+      <w:tr>
+        <w:trPr>
+          <w:cantSplit/>
+        </w:trPr>
+        <w:tc>
+          <w:tcPr>
+            <w:tcW w:type="dxa" w:w="3300"/>
+            <w:tcMar>
+              <w:top w:type="dxa" w:w="60"/>
+              <w:left w:type="dxa" w:w="100"/>
+              <w:bottom w:type="dxa" w:w="60"/>
+              <w:right w:type="dxa" w:w="100"/>
+            </w:tcMar>
+            <w:vAlign w:val="center"/>
+          </w:tcPr>
+          <w:p>
+            <w:pPr>
+              <w:jc w:val="left"/>
+            </w:pPr>
+            <w:r>
+              <w:rPr>
+                <w:sz w:val="19"/>
+                <w:szCs w:val="19"/>
+              </w:rPr>
+              <w:t xml:space="preserve">Customer statement</w:t>
+            </w:r>
+          </w:p>
+        </w:tc>
+        <w:tc>
+          <w:tcPr>
+            <w:tcW w:type="dxa" w:w="2500"/>
+            <w:tcMar>
+              <w:top w:type="dxa" w:w="60"/>
+              <w:left w:type="dxa" w:w="100"/>
+              <w:bottom w:type="dxa" w:w="60"/>
+              <w:right w:type="dxa" w:w="100"/>
+            </w:tcMar>
+            <w:vAlign w:val="center"/>
+          </w:tcPr>
+          <w:p>
+            <w:pPr>
+              <w:jc w:val="left"/>
+            </w:pPr>
+            <w:r>
+              <w:rPr>
+                <w:sz w:val="19"/>
+                <w:szCs w:val="19"/>
+              </w:rPr>
+              <w:t xml:space="preserve">Statement date</w:t>
+            </w:r>
+          </w:p>
+        </w:tc>
+        <w:tc>
+          <w:tcPr>
+            <w:tcW w:type="dxa" w:w="3700"/>
+            <w:tcMar>
+              <w:top w:type="dxa" w:w="60"/>
+              <w:left w:type="dxa" w:w="100"/>
+              <w:bottom w:type="dxa" w:w="60"/>
+              <w:right w:type="dxa" w:w="100"/>
+            </w:tcMar>
+            <w:vAlign w:val="center"/>
+          </w:tcPr>
+          <w:p>
+            <w:pPr>
+              <w:jc w:val="left"/>
+            </w:pPr>
+            <w:r>
+              <w:rPr>
+                <w:sz w:val="19"/>
+                <w:szCs w:val="19"/>
+              </w:rPr>
+              <w:t xml:space="preserve">Uses the business date</w:t>
+            </w:r>
+          </w:p>
+        </w:tc>
+      </w:tr>
+    </w:tbl>
+    <w:p>
+      <w:pPr>
+        <w:spacing w:after="60"/>
+      </w:pPr>
+    </w:p>
+    <w:p>
+      <w:pPr>
+        <w:spacing w:after="140" w:line="276"/>
+      </w:pPr>
+      <w:r>
+        <w:rPr>
+          <w:sz w:val="21"/>
+          <w:szCs w:val="21"/>
+        </w:rPr>
+        <w:t xml:space="preserve">A repeated payment request (same Idempotency-Key) returns the earlier result before the date is checked, so a safe retry is not rejected because the date has since changed.</w:t>
+      </w:r>
+    </w:p>
+    <w:p>
+      <w:pPr>
+        <w:pStyle w:val="Heading3"/>
+        <w:spacing w:after="100" w:before="200"/>
+      </w:pPr>
+      <w:r>
+        <w:rPr>
+          <w:b/>
+          <w:bCs/>
+          <w:color w:val="2E5AA8"/>
+          <w:sz w:val="22"/>
+          <w:szCs w:val="22"/>
+        </w:rPr>
+        <w:t xml:space="preserve">Business date API (lending-service)</w:t>
+      </w:r>
+    </w:p>
+    <w:tbl>
+      <w:tblPr>
+        <w:tblW w:type="dxa" w:w="9500"/>
+        <w:tblBorders>
+          <w:top w:val="single" w:color="auto" w:sz="4"/>
+          <w:left w:val="single" w:color="auto" w:sz="4"/>
+          <w:bottom w:val="single" w:color="auto" w:sz="4"/>
+          <w:right w:val="single" w:color="auto" w:sz="4"/>
+          <w:insideH w:val="single" w:color="auto" w:sz="4"/>
+          <w:insideV w:val="single" w:color="auto" w:sz="4"/>
+        </w:tblBorders>
+      </w:tblPr>
+      <w:tblGrid>
+        <w:gridCol w:w="3700"/>
+        <w:gridCol w:w="5800"/>
+      </w:tblGrid>
+      <w:tr>
+        <w:trPr>
+          <w:tblHeader/>
+        </w:trPr>
+        <w:tc>
+          <w:tcPr>
+            <w:tcW w:type="dxa" w:w="3700"/>
+            <w:shd w:fill="1F3864" w:val="clear"/>
+            <w:tcMar>
+              <w:top w:type="dxa" w:w="60"/>
+              <w:left w:type="dxa" w:w="100"/>
+              <w:bottom w:type="dxa" w:w="60"/>
+              <w:right w:type="dxa" w:w="100"/>
+            </w:tcMar>
+            <w:vAlign w:val="center"/>
+          </w:tcPr>
+          <w:p>
+            <w:pPr>
+              <w:jc w:val="left"/>
+            </w:pPr>
+            <w:r>
+              <w:rPr>
+                <w:b/>
+                <w:bCs/>
+                <w:color w:val="FFFFFF"/>
+                <w:sz w:val="19"/>
+                <w:szCs w:val="19"/>
+              </w:rPr>
+              <w:t xml:space="preserve">Method and path</w:t>
+            </w:r>
+          </w:p>
+        </w:tc>
+        <w:tc>
+          <w:tcPr>
+            <w:tcW w:type="dxa" w:w="5800"/>
+            <w:shd w:fill="1F3864" w:val="clear"/>
+            <w:tcMar>
+              <w:top w:type="dxa" w:w="60"/>
+              <w:left w:type="dxa" w:w="100"/>
+              <w:bottom w:type="dxa" w:w="60"/>
+              <w:right w:type="dxa" w:w="100"/>
+            </w:tcMar>
+            <w:vAlign w:val="center"/>
+          </w:tcPr>
+          <w:p>
+            <w:pPr>
+              <w:jc w:val="left"/>
+            </w:pPr>
+            <w:r>
+              <w:rPr>
+                <w:b/>
+                <w:bCs/>
+                <w:color w:val="FFFFFF"/>
+                <w:sz w:val="19"/>
+                <w:szCs w:val="19"/>
+              </w:rPr>
+              <w:t xml:space="preserve">Purpose</w:t>
+            </w:r>
+          </w:p>
+        </w:tc>
+      </w:tr>
+      <w:tr>
+        <w:trPr>
+          <w:cantSplit/>
+        </w:trPr>
+        <w:tc>
+          <w:tcPr>
+            <w:tcW w:type="dxa" w:w="3700"/>
+            <w:tcMar>
+              <w:top w:type="dxa" w:w="60"/>
+              <w:left w:type="dxa" w:w="100"/>
+              <w:bottom w:type="dxa" w:w="60"/>
+              <w:right w:type="dxa" w:w="100"/>
+            </w:tcMar>
+            <w:vAlign w:val="center"/>
+          </w:tcPr>
+          <w:p>
+            <w:pPr>
+              <w:jc w:val="left"/>
+            </w:pPr>
+            <w:r>
+              <w:rPr>
+                <w:rFonts w:ascii="Consolas" w:hAnsi="Consolas" w:cs="Consolas"/>
+                <w:color w:val="1F3864"/>
+                <w:sz w:val="17"/>
+                <w:szCs w:val="17"/>
+              </w:rPr>
+              <w:t xml:space="preserve">GET /api/v1/business-date</w:t>
+            </w:r>
+          </w:p>
+        </w:tc>
+        <w:tc>
+          <w:tcPr>
+            <w:tcW w:type="dxa" w:w="5800"/>
+            <w:tcMar>
+              <w:top w:type="dxa" w:w="60"/>
+              <w:left w:type="dxa" w:w="100"/>
+              <w:bottom w:type="dxa" w:w="60"/>
+              <w:right w:type="dxa" w:w="100"/>
+            </w:tcMar>
+            <w:vAlign w:val="center"/>
+          </w:tcPr>
+          <w:p>
+            <w:pPr>
+              <w:jc w:val="left"/>
+            </w:pPr>
+            <w:r>
+              <w:rPr>
+                <w:sz w:val="19"/>
+                <w:szCs w:val="19"/>
+              </w:rPr>
+              <w:t xml:space="preserve">Current date, previous and next date, status, whether it is a working day, the system date, who last changed it and when.</w:t>
+            </w:r>
+          </w:p>
+        </w:tc>
+      </w:tr>
+      <w:tr>
+        <w:trPr>
+          <w:cantSplit/>
+        </w:trPr>
+        <w:tc>
+          <w:tcPr>
+            <w:tcW w:type="dxa" w:w="3700"/>
+            <w:shd w:fill="F5F8FC" w:val="clear"/>
+            <w:tcMar>
+              <w:top w:type="dxa" w:w="60"/>
+              <w:left w:type="dxa" w:w="100"/>
+              <w:bottom w:type="dxa" w:w="60"/>
+              <w:right w:type="dxa" w:w="100"/>
+            </w:tcMar>
+            <w:vAlign w:val="center"/>
+          </w:tcPr>
+          <w:p>
+            <w:pPr>
+              <w:jc w:val="left"/>
+            </w:pPr>
+            <w:r>
+              <w:rPr>
+                <w:rFonts w:ascii="Consolas" w:hAnsi="Consolas" w:cs="Consolas"/>
+                <w:color w:val="1F3864"/>
+                <w:sz w:val="17"/>
+                <w:szCs w:val="17"/>
+              </w:rPr>
+              <w:t xml:space="preserve">GET /api/v1/business-date/history</w:t>
+            </w:r>
+          </w:p>
+        </w:tc>
+        <w:tc>
+          <w:tcPr>
+            <w:tcW w:type="dxa" w:w="5800"/>
+            <w:shd w:fill="F5F8FC" w:val="clear"/>
+            <w:tcMar>
+              <w:top w:type="dxa" w:w="60"/>
+              <w:left w:type="dxa" w:w="100"/>
+              <w:bottom w:type="dxa" w:w="60"/>
+              <w:right w:type="dxa" w:w="100"/>
+            </w:tcMar>
+            <w:vAlign w:val="center"/>
+          </w:tcPr>
+          <w:p>
+            <w:pPr>
+              <w:jc w:val="left"/>
+            </w:pPr>
+            <w:r>
+              <w:rPr>
+                <w:sz w:val="19"/>
+                <w:szCs w:val="19"/>
+              </w:rPr>
+              <w:t xml:space="preserve">The last 30 business dates with open, end-of-day-start and close times.</w:t>
+            </w:r>
+          </w:p>
+        </w:tc>
+      </w:tr>
+      <w:tr>
+        <w:trPr>
+          <w:cantSplit/>
+        </w:trPr>
+        <w:tc>
+          <w:tcPr>
+            <w:tcW w:type="dxa" w:w="3700"/>
+            <w:tcMar>
+              <w:top w:type="dxa" w:w="60"/>
+              <w:left w:type="dxa" w:w="100"/>
+              <w:bottom w:type="dxa" w:w="60"/>
+              <w:right w:type="dxa" w:w="100"/>
+            </w:tcMar>
+            <w:vAlign w:val="center"/>
+          </w:tcPr>
+          <w:p>
+            <w:pPr>
+              <w:jc w:val="left"/>
+            </w:pPr>
+            <w:r>
+              <w:rPr>
+                <w:rFonts w:ascii="Consolas" w:hAnsi="Consolas" w:cs="Consolas"/>
+                <w:color w:val="1F3864"/>
+                <w:sz w:val="17"/>
+                <w:szCs w:val="17"/>
+              </w:rPr>
+              <w:t xml:space="preserve">POST /api/v1/business-date/eod/start</w:t>
+            </w:r>
+          </w:p>
+        </w:tc>
+        <w:tc>
+          <w:tcPr>
+            <w:tcW w:type="dxa" w:w="5800"/>
+            <w:tcMar>
+              <w:top w:type="dxa" w:w="60"/>
+              <w:left w:type="dxa" w:w="100"/>
+              <w:bottom w:type="dxa" w:w="60"/>
+              <w:right w:type="dxa" w:w="100"/>
+            </w:tcMar>
+            <w:vAlign w:val="center"/>
+          </w:tcPr>
+          <w:p>
+            <w:pPr>
+              <w:jc w:val="left"/>
+            </w:pPr>
+            <w:r>
+              <w:rPr>
+                <w:sz w:val="19"/>
+                <w:szCs w:val="19"/>
+              </w:rPr>
+              <w:t xml:space="preserve">OPEN to EOD_RUNNING. Refused with 409 if end of day is already running.</w:t>
+            </w:r>
+          </w:p>
+        </w:tc>
+      </w:tr>
+      <w:tr>
+        <w:trPr>
+          <w:cantSplit/>
+        </w:trPr>
+        <w:tc>
+          <w:tcPr>
+            <w:tcW w:type="dxa" w:w="3700"/>
+            <w:shd w:fill="F5F8FC" w:val="clear"/>
+            <w:tcMar>
+              <w:top w:type="dxa" w:w="60"/>
+              <w:left w:type="dxa" w:w="100"/>
+              <w:bottom w:type="dxa" w:w="60"/>
+              <w:right w:type="dxa" w:w="100"/>
+            </w:tcMar>
+            <w:vAlign w:val="center"/>
+          </w:tcPr>
+          <w:p>
+            <w:pPr>
+              <w:jc w:val="left"/>
+            </w:pPr>
+            <w:r>
+              <w:rPr>
+                <w:rFonts w:ascii="Consolas" w:hAnsi="Consolas" w:cs="Consolas"/>
+                <w:color w:val="1F3864"/>
+                <w:sz w:val="17"/>
+                <w:szCs w:val="17"/>
+              </w:rPr>
+              <w:t xml:space="preserve">POST /api/v1/business-date/advance</w:t>
+            </w:r>
+          </w:p>
+        </w:tc>
+        <w:tc>
+          <w:tcPr>
+            <w:tcW w:type="dxa" w:w="5800"/>
+            <w:shd w:fill="F5F8FC" w:val="clear"/>
+            <w:tcMar>
+              <w:top w:type="dxa" w:w="60"/>
+              <w:left w:type="dxa" w:w="100"/>
+              <w:bottom w:type="dxa" w:w="60"/>
+              <w:right w:type="dxa" w:w="100"/>
+            </w:tcMar>
+            <w:vAlign w:val="center"/>
+          </w:tcPr>
+          <w:p>
+            <w:pPr>
+              <w:jc w:val="left"/>
+            </w:pPr>
+            <w:r>
+              <w:rPr>
+                <w:sz w:val="19"/>
+                <w:szCs w:val="19"/>
+              </w:rPr>
+              <w:t xml:space="preserve">Body </w:t>
+            </w:r>
+            <w:r>
+              <w:rPr>
+                <w:rFonts w:ascii="Consolas" w:hAnsi="Consolas" w:cs="Consolas"/>
+                <w:color w:val="1F3864"/>
+                <w:sz w:val="17"/>
+                <w:szCs w:val="17"/>
+              </w:rPr>
+              <w:t xml:space="preserve">{"expectedBusinessDate": "yyyy-mm-dd"}</w:t>
+            </w:r>
+            <w:r>
+              <w:rPr>
+                <w:sz w:val="19"/>
+                <w:szCs w:val="19"/>
+              </w:rPr>
+              <w:t xml:space="preserve">. Closes that date and opens the next. 409 if end of day has not been started or the date is not the current one; repeating it for a date already closed is acknowledged without moving again.</w:t>
+            </w:r>
+          </w:p>
+        </w:tc>
+      </w:tr>
+      <w:tr>
+        <w:trPr>
+          <w:cantSplit/>
+        </w:trPr>
+        <w:tc>
+          <w:tcPr>
+            <w:tcW w:type="dxa" w:w="3700"/>
+            <w:tcMar>
+              <w:top w:type="dxa" w:w="60"/>
+              <w:left w:type="dxa" w:w="100"/>
+              <w:bottom w:type="dxa" w:w="60"/>
+              <w:right w:type="dxa" w:w="100"/>
+            </w:tcMar>
+            <w:vAlign w:val="center"/>
+          </w:tcPr>
+          <w:p>
+            <w:pPr>
+              <w:jc w:val="left"/>
+            </w:pPr>
+            <w:r>
+              <w:rPr>
+                <w:rFonts w:ascii="Consolas" w:hAnsi="Consolas" w:cs="Consolas"/>
+                <w:color w:val="1F3864"/>
+                <w:sz w:val="17"/>
+                <w:szCs w:val="17"/>
+              </w:rPr>
+              <w:t xml:space="preserve">PUT /api/v1/business-date</w:t>
+            </w:r>
+          </w:p>
+        </w:tc>
+        <w:tc>
+          <w:tcPr>
+            <w:tcW w:type="dxa" w:w="5800"/>
+            <w:tcMar>
+              <w:top w:type="dxa" w:w="60"/>
+              <w:left w:type="dxa" w:w="100"/>
+              <w:bottom w:type="dxa" w:w="60"/>
+              <w:right w:type="dxa" w:w="100"/>
+            </w:tcMar>
+            <w:vAlign w:val="center"/>
+          </w:tcPr>
+          <w:p>
+            <w:pPr>
+              <w:jc w:val="left"/>
+            </w:pPr>
+            <w:r>
+              <w:rPr>
+                <w:sz w:val="19"/>
+                <w:szCs w:val="19"/>
+              </w:rPr>
+              <w:t xml:space="preserve">Body </w:t>
+            </w:r>
+            <w:r>
+              <w:rPr>
+                <w:rFonts w:ascii="Consolas" w:hAnsi="Consolas" w:cs="Consolas"/>
+                <w:color w:val="1F3864"/>
+                <w:sz w:val="17"/>
+                <w:szCs w:val="17"/>
+              </w:rPr>
+              <w:t xml:space="preserve">{"date": "yyyy-mm-dd", "reason": "..."}</w:t>
+            </w:r>
+            <w:r>
+              <w:rPr>
+                <w:sz w:val="19"/>
+                <w:szCs w:val="19"/>
+              </w:rPr>
+              <w:t xml:space="preserve">. Sets the date. Only while OPEN; forward only unless backward moves are allowed.</w:t>
+            </w:r>
+          </w:p>
+        </w:tc>
+      </w:tr>
+      <w:tr>
+        <w:trPr>
+          <w:cantSplit/>
+        </w:trPr>
+        <w:tc>
+          <w:tcPr>
+            <w:tcW w:type="dxa" w:w="3700"/>
+            <w:shd w:fill="F5F8FC" w:val="clear"/>
+            <w:tcMar>
+              <w:top w:type="dxa" w:w="60"/>
+              <w:left w:type="dxa" w:w="100"/>
+              <w:bottom w:type="dxa" w:w="60"/>
+              <w:right w:type="dxa" w:w="100"/>
+            </w:tcMar>
+            <w:vAlign w:val="center"/>
+          </w:tcPr>
+          <w:p>
+            <w:pPr>
+              <w:jc w:val="left"/>
+            </w:pPr>
+            <w:r>
+              <w:rPr>
+                <w:rFonts w:ascii="Consolas" w:hAnsi="Consolas" w:cs="Consolas"/>
+                <w:color w:val="1F3864"/>
+                <w:sz w:val="17"/>
+                <w:szCs w:val="17"/>
+              </w:rPr>
+              <w:t xml:space="preserve">GET /api/v1/business-date/working-day?date=</w:t>
+            </w:r>
+          </w:p>
+        </w:tc>
+        <w:tc>
+          <w:tcPr>
+            <w:tcW w:type="dxa" w:w="5800"/>
+            <w:shd w:fill="F5F8FC" w:val="clear"/>
+            <w:tcMar>
+              <w:top w:type="dxa" w:w="60"/>
+              <w:left w:type="dxa" w:w="100"/>
+              <w:bottom w:type="dxa" w:w="60"/>
+              <w:right w:type="dxa" w:w="100"/>
+            </w:tcMar>
+            <w:vAlign w:val="center"/>
+          </w:tcPr>
+          <w:p>
+            <w:pPr>
+              <w:jc w:val="left"/>
+            </w:pPr>
+            <w:r>
+              <w:rPr>
+                <w:sz w:val="19"/>
+                <w:szCs w:val="19"/>
+              </w:rPr>
+              <w:t xml:space="preserve">Is the date a working day?</w:t>
+            </w:r>
+          </w:p>
+        </w:tc>
+      </w:tr>
+      <w:tr>
+        <w:trPr>
+          <w:cantSplit/>
+        </w:trPr>
+        <w:tc>
+          <w:tcPr>
+            <w:tcW w:type="dxa" w:w="3700"/>
+            <w:tcMar>
+              <w:top w:type="dxa" w:w="60"/>
+              <w:left w:type="dxa" w:w="100"/>
+              <w:bottom w:type="dxa" w:w="60"/>
+              <w:right w:type="dxa" w:w="100"/>
+            </w:tcMar>
+            <w:vAlign w:val="center"/>
+          </w:tcPr>
+          <w:p>
+            <w:pPr>
+              <w:jc w:val="left"/>
+            </w:pPr>
+            <w:r>
+              <w:rPr>
+                <w:rFonts w:ascii="Consolas" w:hAnsi="Consolas" w:cs="Consolas"/>
+                <w:color w:val="1F3864"/>
+                <w:sz w:val="17"/>
+                <w:szCs w:val="17"/>
+              </w:rPr>
+              <w:t xml:space="preserve">GET /api/v1/business-date/holidays?from=&amp;to=</w:t>
+            </w:r>
+          </w:p>
+        </w:tc>
+        <w:tc>
+          <w:tcPr>
+            <w:tcW w:type="dxa" w:w="5800"/>
+            <w:tcMar>
+              <w:top w:type="dxa" w:w="60"/>
+              <w:left w:type="dxa" w:w="100"/>
+              <w:bottom w:type="dxa" w:w="60"/>
+              <w:right w:type="dxa" w:w="100"/>
+            </w:tcMar>
+            <w:vAlign w:val="center"/>
+          </w:tcPr>
+          <w:p>
+            <w:pPr>
+              <w:jc w:val="left"/>
+            </w:pPr>
+            <w:r>
+              <w:rPr>
+                <w:sz w:val="19"/>
+                <w:szCs w:val="19"/>
+              </w:rPr>
+              <w:t xml:space="preserve">List holidays in a range.</w:t>
+            </w:r>
+          </w:p>
+        </w:tc>
+      </w:tr>
+      <w:tr>
+        <w:trPr>
+          <w:cantSplit/>
+        </w:trPr>
+        <w:tc>
+          <w:tcPr>
+            <w:tcW w:type="dxa" w:w="3700"/>
+            <w:shd w:fill="F5F8FC" w:val="clear"/>
+            <w:tcMar>
+              <w:top w:type="dxa" w:w="60"/>
+              <w:left w:type="dxa" w:w="100"/>
+              <w:bottom w:type="dxa" w:w="60"/>
+              <w:right w:type="dxa" w:w="100"/>
+            </w:tcMar>
+            <w:vAlign w:val="center"/>
+          </w:tcPr>
+          <w:p>
+            <w:pPr>
+              <w:jc w:val="left"/>
+            </w:pPr>
+            <w:r>
+              <w:rPr>
+                <w:rFonts w:ascii="Consolas" w:hAnsi="Consolas" w:cs="Consolas"/>
+                <w:color w:val="1F3864"/>
+                <w:sz w:val="17"/>
+                <w:szCs w:val="17"/>
+              </w:rPr>
+              <w:t xml:space="preserve">PUT</w:t>
+            </w:r>
+            <w:r>
+              <w:rPr>
+                <w:sz w:val="19"/>
+                <w:szCs w:val="19"/>
+              </w:rPr>
+              <w:t xml:space="preserve"> / </w:t>
+            </w:r>
+            <w:r>
+              <w:rPr>
+                <w:rFonts w:ascii="Consolas" w:hAnsi="Consolas" w:cs="Consolas"/>
+                <w:color w:val="1F3864"/>
+                <w:sz w:val="17"/>
+                <w:szCs w:val="17"/>
+              </w:rPr>
+              <w:t xml:space="preserve">DELETE /api/v1/business-date/holidays/{date}</w:t>
+            </w:r>
+          </w:p>
+        </w:tc>
+        <w:tc>
+          <w:tcPr>
+            <w:tcW w:type="dxa" w:w="5800"/>
+            <w:shd w:fill="F5F8FC" w:val="clear"/>
+            <w:tcMar>
+              <w:top w:type="dxa" w:w="60"/>
+              <w:left w:type="dxa" w:w="100"/>
+              <w:bottom w:type="dxa" w:w="60"/>
+              <w:right w:type="dxa" w:w="100"/>
+            </w:tcMar>
+            <w:vAlign w:val="center"/>
+          </w:tcPr>
+          <w:p>
+            <w:pPr>
+              <w:jc w:val="left"/>
+            </w:pPr>
+            <w:r>
+              <w:rPr>
+                <w:sz w:val="19"/>
+                <w:szCs w:val="19"/>
+              </w:rPr>
+              <w:t xml:space="preserve">Add (body </w:t>
+            </w:r>
+            <w:r>
+              <w:rPr>
+                <w:rFonts w:ascii="Consolas" w:hAnsi="Consolas" w:cs="Consolas"/>
+                <w:color w:val="1F3864"/>
+                <w:sz w:val="17"/>
+                <w:szCs w:val="17"/>
+              </w:rPr>
+              <w:t xml:space="preserve">{"description": "..."}</w:t>
+            </w:r>
+            <w:r>
+              <w:rPr>
+                <w:sz w:val="19"/>
+                <w:szCs w:val="19"/>
+              </w:rPr>
+              <w:t xml:space="preserve">) or remove a holiday.</w:t>
+            </w:r>
+          </w:p>
+        </w:tc>
+      </w:tr>
+    </w:tbl>
+    <w:p>
+      <w:pPr>
+        <w:spacing w:after="60"/>
+      </w:pPr>
+    </w:p>
+    <w:p>
+      <w:pPr>
+        <w:spacing w:after="140" w:line="276"/>
+      </w:pPr>
+      <w:r>
+        <w:rPr>
+          <w:sz w:val="21"/>
+          <w:szCs w:val="21"/>
+        </w:rPr>
+        <w:t xml:space="preserve">An optional </w:t>
+      </w:r>
+      <w:r>
+        <w:rPr>
+          <w:rFonts w:ascii="Consolas" w:hAnsi="Consolas" w:cs="Consolas"/>
+          <w:color w:val="1F3864"/>
+          <w:sz w:val="19"/>
+          <w:szCs w:val="19"/>
+        </w:rPr>
+        <w:t xml:space="preserve">X-Actor</w:t>
+      </w:r>
+      <w:r>
+        <w:rPr>
+          <w:sz w:val="21"/>
+          <w:szCs w:val="21"/>
+        </w:rPr>
+        <w:t xml:space="preserve"> header on the changing calls is stored as the user who made the change. Errors follow the standard shape in Chapter 11: 400 for a date after the business date, 404 for an unknown holiday, 409 for a wrong status or date.</w:t>
+      </w:r>
+    </w:p>
+    <w:p>
+      <w:pPr>
+        <w:pStyle w:val="Heading3"/>
+        <w:spacing w:after="100" w:before="200"/>
+      </w:pPr>
+      <w:r>
+        <w:rPr>
+          <w:b/>
+          <w:bCs/>
+          <w:color w:val="2E5AA8"/>
+          <w:sz w:val="22"/>
+          <w:szCs w:val="22"/>
+        </w:rPr>
+        <w:t xml:space="preserve">Setting up and operating</w:t>
+      </w:r>
+    </w:p>
+    <w:p>
+      <w:pPr>
+        <w:pStyle w:val="ListParagraph"/>
+        <w:numPr>
+          <w:ilvl w:val="0"/>
+          <w:numId w:val="1"/>
+        </w:numPr>
+        <w:spacing w:after="80" w:line="264"/>
+      </w:pPr>
+      <w:r>
+        <w:rPr>
+          <w:sz w:val="21"/>
+          <w:szCs w:val="21"/>
+        </w:rPr>
+        <w:t xml:space="preserve">On a new environment the date starts at today (India). To begin at another date, call </w:t>
+      </w:r>
+      <w:r>
+        <w:rPr>
+          <w:rFonts w:ascii="Consolas" w:hAnsi="Consolas" w:cs="Consolas"/>
+          <w:color w:val="1F3864"/>
+          <w:sz w:val="19"/>
+          <w:szCs w:val="19"/>
+        </w:rPr>
+        <w:t xml:space="preserve">PUT /api/v1/business-date</w:t>
+      </w:r>
+      <w:r>
+        <w:rPr>
+          <w:sz w:val="21"/>
+          <w:szCs w:val="21"/>
+        </w:rPr>
+        <w:t xml:space="preserve"> before any accounts are processed.</w:t>
+      </w:r>
+    </w:p>
+    <w:p>
+      <w:pPr>
+        <w:pStyle w:val="ListParagraph"/>
+        <w:numPr>
+          <w:ilvl w:val="0"/>
+          <w:numId w:val="1"/>
+        </w:numPr>
+        <w:spacing w:after="80" w:line="264"/>
+      </w:pPr>
+      <w:r>
+        <w:rPr>
+          <w:sz w:val="21"/>
+          <w:szCs w:val="21"/>
+        </w:rPr>
+        <w:t xml:space="preserve">Check the date at any time with </w:t>
+      </w:r>
+      <w:r>
+        <w:rPr>
+          <w:rFonts w:ascii="Consolas" w:hAnsi="Consolas" w:cs="Consolas"/>
+          <w:color w:val="1F3864"/>
+          <w:sz w:val="19"/>
+          <w:szCs w:val="19"/>
+        </w:rPr>
+        <w:t xml:space="preserve">GET /api/v1/business-date</w:t>
+      </w:r>
+      <w:r>
+        <w:rPr>
+          <w:sz w:val="21"/>
+          <w:szCs w:val="21"/>
+        </w:rPr>
+        <w:t xml:space="preserve">; the admin portal also shows it in the side bar.</w:t>
+      </w:r>
+    </w:p>
+    <w:p>
+      <w:pPr>
+        <w:pStyle w:val="ListParagraph"/>
+        <w:numPr>
+          <w:ilvl w:val="0"/>
+          <w:numId w:val="1"/>
+        </w:numPr>
+        <w:spacing w:after="80" w:line="264"/>
+      </w:pPr>
+      <w:r>
+        <w:rPr>
+          <w:sz w:val="21"/>
+          <w:szCs w:val="21"/>
+        </w:rPr>
+        <w:t xml:space="preserve">Add bank holidays ahead of time with </w:t>
+      </w:r>
+      <w:r>
+        <w:rPr>
+          <w:rFonts w:ascii="Consolas" w:hAnsi="Consolas" w:cs="Consolas"/>
+          <w:color w:val="1F3864"/>
+          <w:sz w:val="19"/>
+          <w:szCs w:val="19"/>
+        </w:rPr>
+        <w:t xml:space="preserve">PUT /api/v1/business-date/holidays/{date}</w:t>
+      </w:r>
+      <w:r>
+        <w:rPr>
+          <w:sz w:val="21"/>
+          <w:szCs w:val="21"/>
+        </w:rPr>
+        <w:t xml:space="preserve">.</w:t>
+      </w:r>
+    </w:p>
+    <w:p>
+      <w:pPr>
+        <w:pStyle w:val="ListParagraph"/>
+        <w:numPr>
+          <w:ilvl w:val="0"/>
+          <w:numId w:val="1"/>
+        </w:numPr>
+        <w:spacing w:after="80" w:line="264"/>
+      </w:pPr>
+      <w:r>
+        <w:rPr>
+          <w:sz w:val="21"/>
+          <w:szCs w:val="21"/>
+        </w:rPr>
+        <w:t xml:space="preserve">Do not set the date while end of day is running; finish or re-run end of day first (13.14).</w:t>
+      </w:r>
+    </w:p>
+    <w:p>
+      <w:pPr>
+        <w:pStyle w:val="Heading2"/>
+        <w:spacing w:after="120" w:before="280"/>
+      </w:pPr>
+      <w:r>
+        <w:rPr>
+          <w:b/>
+          <w:bCs/>
+          <w:color w:val="2E5AA8"/>
+          <w:sz w:val="25"/>
+          <w:szCs w:val="25"/>
+        </w:rPr>
+        <w:t xml:space="preserve">13.14 End of Day</w:t>
+      </w:r>
+    </w:p>
+    <w:p>
+      <w:pPr>
+        <w:spacing w:after="140" w:line="276"/>
+      </w:pPr>
+      <w:r>
+        <w:rPr>
+          <w:sz w:val="21"/>
+          <w:szCs w:val="21"/>
+        </w:rPr>
+        <w:t xml:space="preserve">End of day closes the current business date and opens the next. It is run by the batch service, once a night and on demand, and it is the only normal way the business date moves.</w:t>
+      </w:r>
+    </w:p>
+    <w:p>
+      <w:pPr>
+        <w:pStyle w:val="Heading3"/>
+        <w:spacing w:after="100" w:before="200"/>
+      </w:pPr>
+      <w:r>
+        <w:rPr>
+          <w:b/>
+          <w:bCs/>
+          <w:color w:val="2E5AA8"/>
+          <w:sz w:val="22"/>
+          <w:szCs w:val="22"/>
+        </w:rPr>
+        <w:t xml:space="preserve">What one run does</w:t>
+      </w:r>
+    </w:p>
+    <w:p>
+      <w:pPr>
+        <w:pStyle w:val="ListParagraph"/>
+        <w:numPr>
+          <w:ilvl w:val="0"/>
+          <w:numId w:val="1"/>
+        </w:numPr>
+        <w:spacing w:after="80" w:line="264"/>
+      </w:pPr>
+      <w:r>
+        <w:rPr>
+          <w:b/>
+          <w:bCs/>
+          <w:sz w:val="21"/>
+          <w:szCs w:val="21"/>
+        </w:rPr>
+        <w:t xml:space="preserve">Start.</w:t>
+      </w:r>
+      <w:r>
+        <w:rPr>
+          <w:sz w:val="21"/>
+          <w:szCs w:val="21"/>
+        </w:rPr>
+        <w:t xml:space="preserve"> The batch service tells lending-service that end of day has started for the current date (OPEN to EOD_RUNNING). If the date is already EOD_RUNNING because an earlier run failed, this run resumes it.</w:t>
+      </w:r>
+    </w:p>
+    <w:p>
+      <w:pPr>
+        <w:pStyle w:val="ListParagraph"/>
+        <w:numPr>
+          <w:ilvl w:val="0"/>
+          <w:numId w:val="1"/>
+        </w:numPr>
+        <w:spacing w:after="80" w:line="264"/>
+      </w:pPr>
+      <w:r>
+        <w:rPr>
+          <w:b/>
+          <w:bCs/>
+          <w:sz w:val="21"/>
+          <w:szCs w:val="21"/>
+        </w:rPr>
+        <w:t xml:space="preserve">Daily jobs.</w:t>
+      </w:r>
+      <w:r>
+        <w:rPr>
+          <w:sz w:val="21"/>
+          <w:szCs w:val="21"/>
+        </w:rPr>
+        <w:t xml:space="preserve"> It runs every enabled DAILY job for that business date, in job-priority order. A job that already completed for that date in an earlier attempt is skipped, not repeated.</w:t>
+      </w:r>
+    </w:p>
+    <w:p>
+      <w:pPr>
+        <w:pStyle w:val="ListParagraph"/>
+        <w:numPr>
+          <w:ilvl w:val="0"/>
+          <w:numId w:val="1"/>
+        </w:numPr>
+        <w:spacing w:after="80" w:line="264"/>
+      </w:pPr>
+      <w:r>
+        <w:rPr>
+          <w:b/>
+          <w:bCs/>
+          <w:sz w:val="21"/>
+          <w:szCs w:val="21"/>
+        </w:rPr>
+        <w:t xml:space="preserve">Stop on failure.</w:t>
+      </w:r>
+      <w:r>
+        <w:rPr>
+          <w:sz w:val="21"/>
+          <w:szCs w:val="21"/>
+        </w:rPr>
+        <w:t xml:space="preserve"> The first job that does not complete ends the run. The business date stays where it is, in EOD_RUNNING, and the run reports which job failed.</w:t>
+      </w:r>
+    </w:p>
+    <w:p>
+      <w:pPr>
+        <w:pStyle w:val="ListParagraph"/>
+        <w:numPr>
+          <w:ilvl w:val="0"/>
+          <w:numId w:val="1"/>
+        </w:numPr>
+        <w:spacing w:after="80" w:line="264"/>
+      </w:pPr>
+      <w:r>
+        <w:rPr>
+          <w:b/>
+          <w:bCs/>
+          <w:sz w:val="21"/>
+          <w:szCs w:val="21"/>
+        </w:rPr>
+        <w:t xml:space="preserve">Advance.</w:t>
+      </w:r>
+      <w:r>
+        <w:rPr>
+          <w:sz w:val="21"/>
+          <w:szCs w:val="21"/>
+        </w:rPr>
+        <w:t xml:space="preserve"> Only when every job completed, the batch service asks lending-service to advance. The date moves to the next day and the status returns to OPEN.</w:t>
+      </w:r>
+    </w:p>
+    <w:p>
+      <w:pPr>
+        <w:spacing w:after="140" w:line="276"/>
+      </w:pPr>
+      <w:r>
+        <w:rPr>
+          <w:sz w:val="21"/>
+          <w:szCs w:val="21"/>
+        </w:rPr>
+        <w:t xml:space="preserve">Because the date moves only after the jobs succeed, a failed night never posts anything for the next day. Fix the cause (the job's error records are listed under the batch job screens) and run end of day again; it continues from the failed job.</w:t>
+      </w:r>
+    </w:p>
+    <w:p>
+      <w:pPr>
+        <w:pStyle w:val="Heading3"/>
+        <w:spacing w:after="100" w:before="200"/>
+      </w:pPr>
+      <w:r>
+        <w:rPr>
+          <w:b/>
+          <w:bCs/>
+          <w:color w:val="2E5AA8"/>
+          <w:sz w:val="22"/>
+          <w:szCs w:val="22"/>
+        </w:rPr>
+        <w:t xml:space="preserve">When it runs</w:t>
+      </w:r>
+    </w:p>
+    <w:tbl>
+      <w:tblPr>
+        <w:tblW w:type="dxa" w:w="9500"/>
+        <w:tblBorders>
+          <w:top w:val="single" w:color="auto" w:sz="4"/>
+          <w:left w:val="single" w:color="auto" w:sz="4"/>
+          <w:bottom w:val="single" w:color="auto" w:sz="4"/>
+          <w:right w:val="single" w:color="auto" w:sz="4"/>
+          <w:insideH w:val="single" w:color="auto" w:sz="4"/>
+          <w:insideV w:val="single" w:color="auto" w:sz="4"/>
+        </w:tblBorders>
+      </w:tblPr>
+      <w:tblGrid>
+        <w:gridCol w:w="2600"/>
+        <w:gridCol w:w="1900"/>
+        <w:gridCol w:w="5000"/>
+      </w:tblGrid>
+      <w:tr>
+        <w:trPr>
+          <w:tblHeader/>
+        </w:trPr>
+        <w:tc>
+          <w:tcPr>
+            <w:tcW w:type="dxa" w:w="2600"/>
+            <w:shd w:fill="1F3864" w:val="clear"/>
+            <w:tcMar>
+              <w:top w:type="dxa" w:w="60"/>
+              <w:left w:type="dxa" w:w="100"/>
+              <w:bottom w:type="dxa" w:w="60"/>
+              <w:right w:type="dxa" w:w="100"/>
+            </w:tcMar>
+            <w:vAlign w:val="center"/>
+          </w:tcPr>
+          <w:p>
+            <w:pPr>
+              <w:jc w:val="left"/>
+            </w:pPr>
+            <w:r>
+              <w:rPr>
+                <w:b/>
+                <w:bCs/>
+                <w:color w:val="FFFFFF"/>
+                <w:sz w:val="19"/>
+                <w:szCs w:val="19"/>
+              </w:rPr>
+              <w:t xml:space="preserve">Setting</w:t>
+            </w:r>
+          </w:p>
+        </w:tc>
+        <w:tc>
+          <w:tcPr>
+            <w:tcW w:type="dxa" w:w="1900"/>
+            <w:shd w:fill="1F3864" w:val="clear"/>
+            <w:tcMar>
+              <w:top w:type="dxa" w:w="60"/>
+              <w:left w:type="dxa" w:w="100"/>
+              <w:bottom w:type="dxa" w:w="60"/>
+              <w:right w:type="dxa" w:w="100"/>
+            </w:tcMar>
+            <w:vAlign w:val="center"/>
+          </w:tcPr>
+          <w:p>
+            <w:pPr>
+              <w:jc w:val="left"/>
+            </w:pPr>
+            <w:r>
+              <w:rPr>
+                <w:b/>
+                <w:bCs/>
+                <w:color w:val="FFFFFF"/>
+                <w:sz w:val="19"/>
+                <w:szCs w:val="19"/>
+              </w:rPr>
+              <w:t xml:space="preserve">Default</w:t>
+            </w:r>
+          </w:p>
+        </w:tc>
+        <w:tc>
+          <w:tcPr>
+            <w:tcW w:type="dxa" w:w="5000"/>
+            <w:shd w:fill="1F3864" w:val="clear"/>
+            <w:tcMar>
+              <w:top w:type="dxa" w:w="60"/>
+              <w:left w:type="dxa" w:w="100"/>
+              <w:bottom w:type="dxa" w:w="60"/>
+              <w:right w:type="dxa" w:w="100"/>
+            </w:tcMar>
+            <w:vAlign w:val="center"/>
+          </w:tcPr>
+          <w:p>
+            <w:pPr>
+              <w:jc w:val="left"/>
+            </w:pPr>
+            <w:r>
+              <w:rPr>
+                <w:b/>
+                <w:bCs/>
+                <w:color w:val="FFFFFF"/>
+                <w:sz w:val="19"/>
+                <w:szCs w:val="19"/>
+              </w:rPr>
+              <w:t xml:space="preserve">Meaning</w:t>
+            </w:r>
+          </w:p>
+        </w:tc>
+      </w:tr>
+      <w:tr>
+        <w:trPr>
+          <w:cantSplit/>
+        </w:trPr>
+        <w:tc>
+          <w:tcPr>
+            <w:tcW w:type="dxa" w:w="2600"/>
+            <w:tcMar>
+              <w:top w:type="dxa" w:w="60"/>
+              <w:left w:type="dxa" w:w="100"/>
+              <w:bottom w:type="dxa" w:w="60"/>
+              <w:right w:type="dxa" w:w="100"/>
+            </w:tcMar>
+            <w:vAlign w:val="center"/>
+          </w:tcPr>
+          <w:p>
+            <w:pPr>
+              <w:jc w:val="left"/>
+            </w:pPr>
+            <w:r>
+              <w:rPr>
+                <w:rFonts w:ascii="Consolas" w:hAnsi="Consolas" w:cs="Consolas"/>
+                <w:color w:val="1F3864"/>
+                <w:sz w:val="17"/>
+                <w:szCs w:val="17"/>
+              </w:rPr>
+              <w:t xml:space="preserve">BATCH_EOD_ENABLED</w:t>
+            </w:r>
+          </w:p>
+        </w:tc>
+        <w:tc>
+          <w:tcPr>
+            <w:tcW w:type="dxa" w:w="1900"/>
+            <w:tcMar>
+              <w:top w:type="dxa" w:w="60"/>
+              <w:left w:type="dxa" w:w="100"/>
+              <w:bottom w:type="dxa" w:w="60"/>
+              <w:right w:type="dxa" w:w="100"/>
+            </w:tcMar>
+            <w:vAlign w:val="center"/>
+          </w:tcPr>
+          <w:p>
+            <w:pPr>
+              <w:jc w:val="left"/>
+            </w:pPr>
+            <w:r>
+              <w:rPr>
+                <w:sz w:val="19"/>
+                <w:szCs w:val="19"/>
+              </w:rPr>
+              <w:t xml:space="preserve">true</w:t>
+            </w:r>
+          </w:p>
+        </w:tc>
+        <w:tc>
+          <w:tcPr>
+            <w:tcW w:type="dxa" w:w="5000"/>
+            <w:tcMar>
+              <w:top w:type="dxa" w:w="60"/>
+              <w:left w:type="dxa" w:w="100"/>
+              <w:bottom w:type="dxa" w:w="60"/>
+              <w:right w:type="dxa" w:w="100"/>
+            </w:tcMar>
+            <w:vAlign w:val="center"/>
+          </w:tcPr>
+          <w:p>
+            <w:pPr>
+              <w:jc w:val="left"/>
+            </w:pPr>
+            <w:r>
+              <w:rPr>
+                <w:sz w:val="19"/>
+                <w:szCs w:val="19"/>
+              </w:rPr>
+              <w:t xml:space="preserve">Nightly end of day replaces the individual schedules of the DAILY jobs. If false, each DAILY job runs from its own schedule and takes the business date at that moment.</w:t>
+            </w:r>
+          </w:p>
+        </w:tc>
+      </w:tr>
+      <w:tr>
+        <w:trPr>
+          <w:cantSplit/>
+        </w:trPr>
+        <w:tc>
+          <w:tcPr>
+            <w:tcW w:type="dxa" w:w="2600"/>
+            <w:shd w:fill="F5F8FC" w:val="clear"/>
+            <w:tcMar>
+              <w:top w:type="dxa" w:w="60"/>
+              <w:left w:type="dxa" w:w="100"/>
+              <w:bottom w:type="dxa" w:w="60"/>
+              <w:right w:type="dxa" w:w="100"/>
+            </w:tcMar>
+            <w:vAlign w:val="center"/>
+          </w:tcPr>
+          <w:p>
+            <w:pPr>
+              <w:jc w:val="left"/>
+            </w:pPr>
+            <w:r>
+              <w:rPr>
+                <w:rFonts w:ascii="Consolas" w:hAnsi="Consolas" w:cs="Consolas"/>
+                <w:color w:val="1F3864"/>
+                <w:sz w:val="17"/>
+                <w:szCs w:val="17"/>
+              </w:rPr>
+              <w:t xml:space="preserve">BATCH_EOD_CRON</w:t>
+            </w:r>
+          </w:p>
+        </w:tc>
+        <w:tc>
+          <w:tcPr>
+            <w:tcW w:type="dxa" w:w="1900"/>
+            <w:shd w:fill="F5F8FC" w:val="clear"/>
+            <w:tcMar>
+              <w:top w:type="dxa" w:w="60"/>
+              <w:left w:type="dxa" w:w="100"/>
+              <w:bottom w:type="dxa" w:w="60"/>
+              <w:right w:type="dxa" w:w="100"/>
+            </w:tcMar>
+            <w:vAlign w:val="center"/>
+          </w:tcPr>
+          <w:p>
+            <w:pPr>
+              <w:jc w:val="left"/>
+            </w:pPr>
+            <w:r>
+              <w:rPr>
+                <w:rFonts w:ascii="Consolas" w:hAnsi="Consolas" w:cs="Consolas"/>
+                <w:color w:val="1F3864"/>
+                <w:sz w:val="17"/>
+                <w:szCs w:val="17"/>
+              </w:rPr>
+              <w:t xml:space="preserve">0 0 1 * * ?</w:t>
+            </w:r>
+          </w:p>
+        </w:tc>
+        <w:tc>
+          <w:tcPr>
+            <w:tcW w:type="dxa" w:w="5000"/>
+            <w:shd w:fill="F5F8FC" w:val="clear"/>
+            <w:tcMar>
+              <w:top w:type="dxa" w:w="60"/>
+              <w:left w:type="dxa" w:w="100"/>
+              <w:bottom w:type="dxa" w:w="60"/>
+              <w:right w:type="dxa" w:w="100"/>
+            </w:tcMar>
+            <w:vAlign w:val="center"/>
+          </w:tcPr>
+          <w:p>
+            <w:pPr>
+              <w:jc w:val="left"/>
+            </w:pPr>
+            <w:r>
+              <w:rPr>
+                <w:sz w:val="19"/>
+                <w:szCs w:val="19"/>
+              </w:rPr>
+              <w:t xml:space="preserve">Start time of the nightly run (01:00).</w:t>
+            </w:r>
+          </w:p>
+        </w:tc>
+      </w:tr>
+      <w:tr>
+        <w:trPr>
+          <w:cantSplit/>
+        </w:trPr>
+        <w:tc>
+          <w:tcPr>
+            <w:tcW w:type="dxa" w:w="2600"/>
+            <w:tcMar>
+              <w:top w:type="dxa" w:w="60"/>
+              <w:left w:type="dxa" w:w="100"/>
+              <w:bottom w:type="dxa" w:w="60"/>
+              <w:right w:type="dxa" w:w="100"/>
+            </w:tcMar>
+            <w:vAlign w:val="center"/>
+          </w:tcPr>
+          <w:p>
+            <w:pPr>
+              <w:jc w:val="left"/>
+            </w:pPr>
+            <w:r>
+              <w:rPr>
+                <w:rFonts w:ascii="Consolas" w:hAnsi="Consolas" w:cs="Consolas"/>
+                <w:color w:val="1F3864"/>
+                <w:sz w:val="17"/>
+                <w:szCs w:val="17"/>
+              </w:rPr>
+              <w:t xml:space="preserve">BATCH_EOD_ZONE</w:t>
+            </w:r>
+          </w:p>
+        </w:tc>
+        <w:tc>
+          <w:tcPr>
+            <w:tcW w:type="dxa" w:w="1900"/>
+            <w:tcMar>
+              <w:top w:type="dxa" w:w="60"/>
+              <w:left w:type="dxa" w:w="100"/>
+              <w:bottom w:type="dxa" w:w="60"/>
+              <w:right w:type="dxa" w:w="100"/>
+            </w:tcMar>
+            <w:vAlign w:val="center"/>
+          </w:tcPr>
+          <w:p>
+            <w:pPr>
+              <w:jc w:val="left"/>
+            </w:pPr>
+            <w:r>
+              <w:rPr>
+                <w:sz w:val="19"/>
+                <w:szCs w:val="19"/>
+              </w:rPr>
+              <w:t xml:space="preserve">Asia/Kolkata</w:t>
+            </w:r>
+          </w:p>
+        </w:tc>
+        <w:tc>
+          <w:tcPr>
+            <w:tcW w:type="dxa" w:w="5000"/>
+            <w:tcMar>
+              <w:top w:type="dxa" w:w="60"/>
+              <w:left w:type="dxa" w:w="100"/>
+              <w:bottom w:type="dxa" w:w="60"/>
+              <w:right w:type="dxa" w:w="100"/>
+            </w:tcMar>
+            <w:vAlign w:val="center"/>
+          </w:tcPr>
+          <w:p>
+            <w:pPr>
+              <w:jc w:val="left"/>
+            </w:pPr>
+            <w:r>
+              <w:rPr>
+                <w:sz w:val="19"/>
+                <w:szCs w:val="19"/>
+              </w:rPr>
+              <w:t xml:space="preserve">Time zone of that schedule.</w:t>
+            </w:r>
+          </w:p>
+        </w:tc>
+      </w:tr>
+    </w:tbl>
+    <w:p>
+      <w:pPr>
+        <w:spacing w:after="60"/>
+      </w:pPr>
+    </w:p>
+    <w:p>
+      <w:pPr>
+        <w:spacing w:after="140" w:line="276"/>
+      </w:pPr>
+      <w:r>
+        <w:rPr>
+          <w:sz w:val="21"/>
+          <w:szCs w:val="21"/>
+        </w:rPr>
+        <w:t xml:space="preserve">MONTHLY and PERIODIC jobs are </w:t>
+      </w:r>
+      <w:r>
+        <w:rPr>
+          <w:b/>
+          <w:bCs/>
+          <w:sz w:val="21"/>
+          <w:szCs w:val="21"/>
+        </w:rPr>
+        <w:t xml:space="preserve">not</w:t>
+      </w:r>
+      <w:r>
+        <w:rPr>
+          <w:sz w:val="21"/>
+          <w:szCs w:val="21"/>
+        </w:rPr>
+        <w:t xml:space="preserve"> part of end of day. They start from their own schedules, and event-triggered jobs run only when triggered.</w:t>
+      </w:r>
+    </w:p>
+    <w:p>
+      <w:pPr>
+        <w:pStyle w:val="Heading3"/>
+        <w:spacing w:after="100" w:before="200"/>
+      </w:pPr>
+      <w:r>
+        <w:rPr>
+          <w:b/>
+          <w:bCs/>
+          <w:color w:val="2E5AA8"/>
+          <w:sz w:val="22"/>
+          <w:szCs w:val="22"/>
+        </w:rPr>
+        <w:t xml:space="preserve">Operator endpoints (batch service, HTTP Basic, role BATCH_ADMIN)</w:t>
+      </w:r>
+    </w:p>
+    <w:tbl>
+      <w:tblPr>
+        <w:tblW w:type="dxa" w:w="9500"/>
+        <w:tblBorders>
+          <w:top w:val="single" w:color="auto" w:sz="4"/>
+          <w:left w:val="single" w:color="auto" w:sz="4"/>
+          <w:bottom w:val="single" w:color="auto" w:sz="4"/>
+          <w:right w:val="single" w:color="auto" w:sz="4"/>
+          <w:insideH w:val="single" w:color="auto" w:sz="4"/>
+          <w:insideV w:val="single" w:color="auto" w:sz="4"/>
+        </w:tblBorders>
+      </w:tblPr>
+      <w:tblGrid>
+        <w:gridCol w:w="3700"/>
+        <w:gridCol w:w="5800"/>
+      </w:tblGrid>
+      <w:tr>
+        <w:trPr>
+          <w:tblHeader/>
+        </w:trPr>
+        <w:tc>
+          <w:tcPr>
+            <w:tcW w:type="dxa" w:w="3700"/>
+            <w:shd w:fill="1F3864" w:val="clear"/>
+            <w:tcMar>
+              <w:top w:type="dxa" w:w="60"/>
+              <w:left w:type="dxa" w:w="100"/>
+              <w:bottom w:type="dxa" w:w="60"/>
+              <w:right w:type="dxa" w:w="100"/>
+            </w:tcMar>
+            <w:vAlign w:val="center"/>
+          </w:tcPr>
+          <w:p>
+            <w:pPr>
+              <w:jc w:val="left"/>
+            </w:pPr>
+            <w:r>
+              <w:rPr>
+                <w:b/>
+                <w:bCs/>
+                <w:color w:val="FFFFFF"/>
+                <w:sz w:val="19"/>
+                <w:szCs w:val="19"/>
+              </w:rPr>
+              <w:t xml:space="preserve">Method and path</w:t>
+            </w:r>
+          </w:p>
+        </w:tc>
+        <w:tc>
+          <w:tcPr>
+            <w:tcW w:type="dxa" w:w="5800"/>
+            <w:shd w:fill="1F3864" w:val="clear"/>
+            <w:tcMar>
+              <w:top w:type="dxa" w:w="60"/>
+              <w:left w:type="dxa" w:w="100"/>
+              <w:bottom w:type="dxa" w:w="60"/>
+              <w:right w:type="dxa" w:w="100"/>
+            </w:tcMar>
+            <w:vAlign w:val="center"/>
+          </w:tcPr>
+          <w:p>
+            <w:pPr>
+              <w:jc w:val="left"/>
+            </w:pPr>
+            <w:r>
+              <w:rPr>
+                <w:b/>
+                <w:bCs/>
+                <w:color w:val="FFFFFF"/>
+                <w:sz w:val="19"/>
+                <w:szCs w:val="19"/>
+              </w:rPr>
+              <w:t xml:space="preserve">Purpose</w:t>
+            </w:r>
+          </w:p>
+        </w:tc>
+      </w:tr>
+      <w:tr>
+        <w:trPr>
+          <w:cantSplit/>
+        </w:trPr>
+        <w:tc>
+          <w:tcPr>
+            <w:tcW w:type="dxa" w:w="3700"/>
+            <w:tcMar>
+              <w:top w:type="dxa" w:w="60"/>
+              <w:left w:type="dxa" w:w="100"/>
+              <w:bottom w:type="dxa" w:w="60"/>
+              <w:right w:type="dxa" w:w="100"/>
+            </w:tcMar>
+            <w:vAlign w:val="center"/>
+          </w:tcPr>
+          <w:p>
+            <w:pPr>
+              <w:jc w:val="left"/>
+            </w:pPr>
+            <w:r>
+              <w:rPr>
+                <w:rFonts w:ascii="Consolas" w:hAnsi="Consolas" w:cs="Consolas"/>
+                <w:color w:val="1F3864"/>
+                <w:sz w:val="17"/>
+                <w:szCs w:val="17"/>
+              </w:rPr>
+              <w:t xml:space="preserve">POST /api/v1/batch-admin/eod/run</w:t>
+            </w:r>
+          </w:p>
+        </w:tc>
+        <w:tc>
+          <w:tcPr>
+            <w:tcW w:type="dxa" w:w="5800"/>
+            <w:tcMar>
+              <w:top w:type="dxa" w:w="60"/>
+              <w:left w:type="dxa" w:w="100"/>
+              <w:bottom w:type="dxa" w:w="60"/>
+              <w:right w:type="dxa" w:w="100"/>
+            </w:tcMar>
+            <w:vAlign w:val="center"/>
+          </w:tcPr>
+          <w:p>
+            <w:pPr>
+              <w:jc w:val="left"/>
+            </w:pPr>
+            <w:r>
+              <w:rPr>
+                <w:sz w:val="19"/>
+                <w:szCs w:val="19"/>
+              </w:rPr>
+              <w:t xml:space="preserve">Start end of day for the current business date, or resume a failed one. 202 when started; 409 if a run is already in progress. The run continues in the background.</w:t>
+            </w:r>
+          </w:p>
+        </w:tc>
+      </w:tr>
+      <w:tr>
+        <w:trPr>
+          <w:cantSplit/>
+        </w:trPr>
+        <w:tc>
+          <w:tcPr>
+            <w:tcW w:type="dxa" w:w="3700"/>
+            <w:shd w:fill="F5F8FC" w:val="clear"/>
+            <w:tcMar>
+              <w:top w:type="dxa" w:w="60"/>
+              <w:left w:type="dxa" w:w="100"/>
+              <w:bottom w:type="dxa" w:w="60"/>
+              <w:right w:type="dxa" w:w="100"/>
+            </w:tcMar>
+            <w:vAlign w:val="center"/>
+          </w:tcPr>
+          <w:p>
+            <w:pPr>
+              <w:jc w:val="left"/>
+            </w:pPr>
+            <w:r>
+              <w:rPr>
+                <w:rFonts w:ascii="Consolas" w:hAnsi="Consolas" w:cs="Consolas"/>
+                <w:color w:val="1F3864"/>
+                <w:sz w:val="17"/>
+                <w:szCs w:val="17"/>
+              </w:rPr>
+              <w:t xml:space="preserve">GET /api/v1/batch-admin/eod/status</w:t>
+            </w:r>
+          </w:p>
+        </w:tc>
+        <w:tc>
+          <w:tcPr>
+            <w:tcW w:type="dxa" w:w="5800"/>
+            <w:shd w:fill="F5F8FC" w:val="clear"/>
+            <w:tcMar>
+              <w:top w:type="dxa" w:w="60"/>
+              <w:left w:type="dxa" w:w="100"/>
+              <w:bottom w:type="dxa" w:w="60"/>
+              <w:right w:type="dxa" w:w="100"/>
+            </w:tcMar>
+            <w:vAlign w:val="center"/>
+          </w:tcPr>
+          <w:p>
+            <w:pPr>
+              <w:jc w:val="left"/>
+            </w:pPr>
+            <w:r>
+              <w:rPr>
+                <w:sz w:val="19"/>
+                <w:szCs w:val="19"/>
+              </w:rPr>
+              <w:t xml:space="preserve">Whether a run is in progress, the current business date and status, and the last run: the date, start and finish times, the result of each job (COMPLETED, SKIPPED or the failing status), whether the date advanced and any error.</w:t>
+            </w:r>
+          </w:p>
+        </w:tc>
+      </w:tr>
+    </w:tbl>
+    <w:p>
+      <w:pPr>
+        <w:spacing w:after="60"/>
+      </w:pPr>
+    </w:p>
+    <w:p>
+      <w:pPr>
+        <w:spacing w:after="140" w:line="276"/>
+      </w:pPr>
+      <w:r>
+        <w:rPr>
+          <w:sz w:val="21"/>
+          <w:szCs w:val="21"/>
+        </w:rPr>
+        <w:t xml:space="preserve">On the Render sandbox the batch service sleeps when idle, so the nightly run may be missed; run end of day on demand and check the business date.</w:t>
+      </w:r>
+    </w:p>
+    <w:p>
+      <w:pPr>
+        <w:pStyle w:val="Heading2"/>
+        <w:spacing w:after="120" w:before="280"/>
+      </w:pPr>
+      <w:r>
+        <w:rPr>
+          <w:b/>
+          <w:bCs/>
+          <w:color w:val="2E5AA8"/>
+          <w:sz w:val="25"/>
+          <w:szCs w:val="25"/>
+        </w:rPr>
+        <w:t xml:space="preserve">13.15 Batch Jobs That Call lending-service</w:t>
+      </w:r>
+    </w:p>
+    <w:p>
+      <w:pPr>
+        <w:spacing w:after="140" w:line="276"/>
+      </w:pPr>
+      <w:r>
+        <w:rPr>
+          <w:sz w:val="21"/>
+          <w:szCs w:val="21"/>
+        </w:rPr>
+        <w:t xml:space="preserve">Until now every batch job was a framework with an empty body. Nine jobs now do real work by calling lending-service one account at a time, so the batch service no longer writes loan data itself. If one account fails, that account is skipped and written to the dead-letter records and the run carries on with the others; transient failures (connection errors, HTTP 429, 502, 503, 504) are retried first.</w:t>
+      </w:r>
+    </w:p>
+    <w:tbl>
+      <w:tblPr>
+        <w:tblW w:type="dxa" w:w="9500"/>
+        <w:tblBorders>
+          <w:top w:val="single" w:color="auto" w:sz="4"/>
+          <w:left w:val="single" w:color="auto" w:sz="4"/>
+          <w:bottom w:val="single" w:color="auto" w:sz="4"/>
+          <w:right w:val="single" w:color="auto" w:sz="4"/>
+          <w:insideH w:val="single" w:color="auto" w:sz="4"/>
+          <w:insideV w:val="single" w:color="auto" w:sz="4"/>
+        </w:tblBorders>
+      </w:tblPr>
+      <w:tblGrid>
+        <w:gridCol w:w="3300"/>
+        <w:gridCol w:w="6200"/>
+      </w:tblGrid>
+      <w:tr>
+        <w:trPr>
+          <w:tblHeader/>
+        </w:trPr>
+        <w:tc>
+          <w:tcPr>
+            <w:tcW w:type="dxa" w:w="3300"/>
+            <w:shd w:fill="1F3864" w:val="clear"/>
+            <w:tcMar>
+              <w:top w:type="dxa" w:w="60"/>
+              <w:left w:type="dxa" w:w="100"/>
+              <w:bottom w:type="dxa" w:w="60"/>
+              <w:right w:type="dxa" w:w="100"/>
+            </w:tcMar>
+            <w:vAlign w:val="center"/>
+          </w:tcPr>
+          <w:p>
+            <w:pPr>
+              <w:jc w:val="left"/>
+            </w:pPr>
+            <w:r>
+              <w:rPr>
+                <w:b/>
+                <w:bCs/>
+                <w:color w:val="FFFFFF"/>
+                <w:sz w:val="19"/>
+                <w:szCs w:val="19"/>
+              </w:rPr>
+              <w:t xml:space="preserve">Job</w:t>
+            </w:r>
+          </w:p>
+        </w:tc>
+        <w:tc>
+          <w:tcPr>
+            <w:tcW w:type="dxa" w:w="6200"/>
+            <w:shd w:fill="1F3864" w:val="clear"/>
+            <w:tcMar>
+              <w:top w:type="dxa" w:w="60"/>
+              <w:left w:type="dxa" w:w="100"/>
+              <w:bottom w:type="dxa" w:w="60"/>
+              <w:right w:type="dxa" w:w="100"/>
+            </w:tcMar>
+            <w:vAlign w:val="center"/>
+          </w:tcPr>
+          <w:p>
+            <w:pPr>
+              <w:jc w:val="left"/>
+            </w:pPr>
+            <w:r>
+              <w:rPr>
+                <w:b/>
+                <w:bCs/>
+                <w:color w:val="FFFFFF"/>
+                <w:sz w:val="19"/>
+                <w:szCs w:val="19"/>
+              </w:rPr>
+              <w:t xml:space="preserve">What it now does</w:t>
+            </w:r>
+          </w:p>
+        </w:tc>
+      </w:tr>
+      <w:tr>
+        <w:trPr>
+          <w:cantSplit/>
+        </w:trPr>
+        <w:tc>
+          <w:tcPr>
+            <w:tcW w:type="dxa" w:w="3300"/>
+            <w:tcMar>
+              <w:top w:type="dxa" w:w="60"/>
+              <w:left w:type="dxa" w:w="100"/>
+              <w:bottom w:type="dxa" w:w="60"/>
+              <w:right w:type="dxa" w:w="100"/>
+            </w:tcMar>
+            <w:vAlign w:val="center"/>
+          </w:tcPr>
+          <w:p>
+            <w:pPr>
+              <w:jc w:val="left"/>
+            </w:pPr>
+            <w:r>
+              <w:rPr>
+                <w:rFonts w:ascii="Consolas" w:hAnsi="Consolas" w:cs="Consolas"/>
+                <w:color w:val="1F3864"/>
+                <w:sz w:val="17"/>
+                <w:szCs w:val="17"/>
+              </w:rPr>
+              <w:t xml:space="preserve">INTEREST_ACCRUAL_DAILY</w:t>
+            </w:r>
+          </w:p>
+        </w:tc>
+        <w:tc>
+          <w:tcPr>
+            <w:tcW w:type="dxa" w:w="6200"/>
+            <w:tcMar>
+              <w:top w:type="dxa" w:w="60"/>
+              <w:left w:type="dxa" w:w="100"/>
+              <w:bottom w:type="dxa" w:w="60"/>
+              <w:right w:type="dxa" w:w="100"/>
+            </w:tcMar>
+            <w:vAlign w:val="center"/>
+          </w:tcPr>
+          <w:p>
+            <w:pPr>
+              <w:jc w:val="left"/>
+            </w:pPr>
+            <w:r>
+              <w:rPr>
+                <w:sz w:val="19"/>
+                <w:szCs w:val="19"/>
+              </w:rPr>
+              <w:t xml:space="preserve">Accrues one day of interest for each active account for the business date. Repeating it for the same date adds nothing.</w:t>
+            </w:r>
+          </w:p>
+        </w:tc>
+      </w:tr>
+      <w:tr>
+        <w:trPr>
+          <w:cantSplit/>
+        </w:trPr>
+        <w:tc>
+          <w:tcPr>
+            <w:tcW w:type="dxa" w:w="3300"/>
+            <w:shd w:fill="F5F8FC" w:val="clear"/>
+            <w:tcMar>
+              <w:top w:type="dxa" w:w="60"/>
+              <w:left w:type="dxa" w:w="100"/>
+              <w:bottom w:type="dxa" w:w="60"/>
+              <w:right w:type="dxa" w:w="100"/>
+            </w:tcMar>
+            <w:vAlign w:val="center"/>
+          </w:tcPr>
+          <w:p>
+            <w:pPr>
+              <w:jc w:val="left"/>
+            </w:pPr>
+            <w:r>
+              <w:rPr>
+                <w:rFonts w:ascii="Consolas" w:hAnsi="Consolas" w:cs="Consolas"/>
+                <w:color w:val="1F3864"/>
+                <w:sz w:val="17"/>
+                <w:szCs w:val="17"/>
+              </w:rPr>
+              <w:t xml:space="preserve">DPD_UPDATE_DAILY</w:t>
+            </w:r>
+          </w:p>
+        </w:tc>
+        <w:tc>
+          <w:tcPr>
+            <w:tcW w:type="dxa" w:w="6200"/>
+            <w:shd w:fill="F5F8FC" w:val="clear"/>
+            <w:tcMar>
+              <w:top w:type="dxa" w:w="60"/>
+              <w:left w:type="dxa" w:w="100"/>
+              <w:bottom w:type="dxa" w:w="60"/>
+              <w:right w:type="dxa" w:w="100"/>
+            </w:tcMar>
+            <w:vAlign w:val="center"/>
+          </w:tcPr>
+          <w:p>
+            <w:pPr>
+              <w:jc w:val="left"/>
+            </w:pPr>
+            <w:r>
+              <w:rPr>
+                <w:sz w:val="19"/>
+                <w:szCs w:val="19"/>
+              </w:rPr>
+              <w:t xml:space="preserve">Re-derives each active account's status from its days past due as of the business date.</w:t>
+            </w:r>
+          </w:p>
+        </w:tc>
+      </w:tr>
+      <w:tr>
+        <w:trPr>
+          <w:cantSplit/>
+        </w:trPr>
+        <w:tc>
+          <w:tcPr>
+            <w:tcW w:type="dxa" w:w="3300"/>
+            <w:tcMar>
+              <w:top w:type="dxa" w:w="60"/>
+              <w:left w:type="dxa" w:w="100"/>
+              <w:bottom w:type="dxa" w:w="60"/>
+              <w:right w:type="dxa" w:w="100"/>
+            </w:tcMar>
+            <w:vAlign w:val="center"/>
+          </w:tcPr>
+          <w:p>
+            <w:pPr>
+              <w:jc w:val="left"/>
+            </w:pPr>
+            <w:r>
+              <w:rPr>
+                <w:rFonts w:ascii="Consolas" w:hAnsi="Consolas" w:cs="Consolas"/>
+                <w:color w:val="1F3864"/>
+                <w:sz w:val="17"/>
+                <w:szCs w:val="17"/>
+              </w:rPr>
+              <w:t xml:space="preserve">NPA_CLASSIFICATION_CHECK_DAILY</w:t>
+            </w:r>
+          </w:p>
+        </w:tc>
+        <w:tc>
+          <w:tcPr>
+            <w:tcW w:type="dxa" w:w="6200"/>
+            <w:tcMar>
+              <w:top w:type="dxa" w:w="60"/>
+              <w:left w:type="dxa" w:w="100"/>
+              <w:bottom w:type="dxa" w:w="60"/>
+              <w:right w:type="dxa" w:w="100"/>
+            </w:tcMar>
+            <w:vAlign w:val="center"/>
+          </w:tcPr>
+          <w:p>
+            <w:pPr>
+              <w:jc w:val="left"/>
+            </w:pPr>
+            <w:r>
+              <w:rPr>
+                <w:sz w:val="19"/>
+                <w:szCs w:val="19"/>
+              </w:rPr>
+              <w:t xml:space="preserve">Does the same classification as the DPD job (days past due is not stored, so both call the same function).</w:t>
+            </w:r>
+          </w:p>
+        </w:tc>
+      </w:tr>
+      <w:tr>
+        <w:trPr>
+          <w:cantSplit/>
+        </w:trPr>
+        <w:tc>
+          <w:tcPr>
+            <w:tcW w:type="dxa" w:w="3300"/>
+            <w:shd w:fill="F5F8FC" w:val="clear"/>
+            <w:tcMar>
+              <w:top w:type="dxa" w:w="60"/>
+              <w:left w:type="dxa" w:w="100"/>
+              <w:bottom w:type="dxa" w:w="60"/>
+              <w:right w:type="dxa" w:w="100"/>
+            </w:tcMar>
+            <w:vAlign w:val="center"/>
+          </w:tcPr>
+          <w:p>
+            <w:pPr>
+              <w:jc w:val="left"/>
+            </w:pPr>
+            <w:r>
+              <w:rPr>
+                <w:rFonts w:ascii="Consolas" w:hAnsi="Consolas" w:cs="Consolas"/>
+                <w:color w:val="1F3864"/>
+                <w:sz w:val="17"/>
+                <w:szCs w:val="17"/>
+              </w:rPr>
+              <w:t xml:space="preserve">RATE_RESET_CHECK_DAILY</w:t>
+            </w:r>
+            <w:r>
+              <w:rPr>
+                <w:sz w:val="19"/>
+                <w:szCs w:val="19"/>
+              </w:rPr>
+              <w:t xml:space="preserve">, </w:t>
+            </w:r>
+            <w:r>
+              <w:rPr>
+                <w:rFonts w:ascii="Consolas" w:hAnsi="Consolas" w:cs="Consolas"/>
+                <w:color w:val="1F3864"/>
+                <w:sz w:val="17"/>
+                <w:szCs w:val="17"/>
+              </w:rPr>
+              <w:t xml:space="preserve">RATE_RESET_MONTHLY</w:t>
+            </w:r>
+            <w:r>
+              <w:rPr>
+                <w:sz w:val="19"/>
+                <w:szCs w:val="19"/>
+              </w:rPr>
+              <w:t xml:space="preserve">, </w:t>
+            </w:r>
+            <w:r>
+              <w:rPr>
+                <w:rFonts w:ascii="Consolas" w:hAnsi="Consolas" w:cs="Consolas"/>
+                <w:color w:val="1F3864"/>
+                <w:sz w:val="17"/>
+                <w:szCs w:val="17"/>
+              </w:rPr>
+              <w:t xml:space="preserve">QUARTERLY_RATE_RESET</w:t>
+            </w:r>
+          </w:p>
+        </w:tc>
+        <w:tc>
+          <w:tcPr>
+            <w:tcW w:type="dxa" w:w="6200"/>
+            <w:shd w:fill="F5F8FC" w:val="clear"/>
+            <w:tcMar>
+              <w:top w:type="dxa" w:w="60"/>
+              <w:left w:type="dxa" w:w="100"/>
+              <w:bottom w:type="dxa" w:w="60"/>
+              <w:right w:type="dxa" w:w="100"/>
+            </w:tcMar>
+            <w:vAlign w:val="center"/>
+          </w:tcPr>
+          <w:p>
+            <w:pPr>
+              <w:jc w:val="left"/>
+            </w:pPr>
+            <w:r>
+              <w:rPr>
+                <w:sz w:val="19"/>
+                <w:szCs w:val="19"/>
+              </w:rPr>
+              <w:t xml:space="preserve">Reset the rate of floating-rate accounts from the benchmark rate in force on the business date and rebuild the remaining instalments. The job parameters must name the benchmark (</w:t>
+            </w:r>
+            <w:r>
+              <w:rPr>
+                <w:rFonts w:ascii="Consolas" w:hAnsi="Consolas" w:cs="Consolas"/>
+                <w:color w:val="1F3864"/>
+                <w:sz w:val="17"/>
+                <w:szCs w:val="17"/>
+              </w:rPr>
+              <w:t xml:space="preserve">benchmarkRateRef</w:t>
+            </w:r>
+            <w:r>
+              <w:rPr>
+                <w:sz w:val="19"/>
+                <w:szCs w:val="19"/>
+              </w:rPr>
+              <w:t xml:space="preserve">); the seeded daily job uses </w:t>
+            </w:r>
+            <w:r>
+              <w:rPr>
+                <w:rFonts w:ascii="Consolas" w:hAnsi="Consolas" w:cs="Consolas"/>
+                <w:color w:val="1F3864"/>
+                <w:sz w:val="17"/>
+                <w:szCs w:val="17"/>
+              </w:rPr>
+              <w:t xml:space="preserve">OVERNIGHT_MIBOR</w:t>
+            </w:r>
+            <w:r>
+              <w:rPr>
+                <w:sz w:val="19"/>
+                <w:szCs w:val="19"/>
+              </w:rPr>
+              <w:t xml:space="preserve">.</w:t>
+            </w:r>
+          </w:p>
+        </w:tc>
+      </w:tr>
+      <w:tr>
+        <w:trPr>
+          <w:cantSplit/>
+        </w:trPr>
+        <w:tc>
+          <w:tcPr>
+            <w:tcW w:type="dxa" w:w="3300"/>
+            <w:tcMar>
+              <w:top w:type="dxa" w:w="60"/>
+              <w:left w:type="dxa" w:w="100"/>
+              <w:bottom w:type="dxa" w:w="60"/>
+              <w:right w:type="dxa" w:w="100"/>
+            </w:tcMar>
+            <w:vAlign w:val="center"/>
+          </w:tcPr>
+          <w:p>
+            <w:pPr>
+              <w:jc w:val="left"/>
+            </w:pPr>
+            <w:r>
+              <w:rPr>
+                <w:rFonts w:ascii="Consolas" w:hAnsi="Consolas" w:cs="Consolas"/>
+                <w:color w:val="1F3864"/>
+                <w:sz w:val="17"/>
+                <w:szCs w:val="17"/>
+              </w:rPr>
+              <w:t xml:space="preserve">GL_POSTING_RECONCILIATION_DAILY</w:t>
+            </w:r>
+          </w:p>
+        </w:tc>
+        <w:tc>
+          <w:tcPr>
+            <w:tcW w:type="dxa" w:w="6200"/>
+            <w:tcMar>
+              <w:top w:type="dxa" w:w="60"/>
+              <w:left w:type="dxa" w:w="100"/>
+              <w:bottom w:type="dxa" w:w="60"/>
+              <w:right w:type="dxa" w:w="100"/>
+            </w:tcMar>
+            <w:vAlign w:val="center"/>
+          </w:tcPr>
+          <w:p>
+            <w:pPr>
+              <w:jc w:val="left"/>
+            </w:pPr>
+            <w:r>
+              <w:rPr>
+                <w:sz w:val="19"/>
+                <w:szCs w:val="19"/>
+              </w:rPr>
+              <w:t xml:space="preserve">Pushes pending ledger outbox entries and fails if any are still pending. The comparison with a general-ledger trial balance is not done, because the ledger client is a stub.</w:t>
+            </w:r>
+          </w:p>
+        </w:tc>
+      </w:tr>
+      <w:tr>
+        <w:trPr>
+          <w:cantSplit/>
+        </w:trPr>
+        <w:tc>
+          <w:tcPr>
+            <w:tcW w:type="dxa" w:w="3300"/>
+            <w:shd w:fill="F5F8FC" w:val="clear"/>
+            <w:tcMar>
+              <w:top w:type="dxa" w:w="60"/>
+              <w:left w:type="dxa" w:w="100"/>
+              <w:bottom w:type="dxa" w:w="60"/>
+              <w:right w:type="dxa" w:w="100"/>
+            </w:tcMar>
+            <w:vAlign w:val="center"/>
+          </w:tcPr>
+          <w:p>
+            <w:pPr>
+              <w:jc w:val="left"/>
+            </w:pPr>
+            <w:r>
+              <w:rPr>
+                <w:rFonts w:ascii="Consolas" w:hAnsi="Consolas" w:cs="Consolas"/>
+                <w:color w:val="1F3864"/>
+                <w:sz w:val="17"/>
+                <w:szCs w:val="17"/>
+              </w:rPr>
+              <w:t xml:space="preserve">MONTH_END_GL_CLOSE_MONTHLY</w:t>
+            </w:r>
+          </w:p>
+        </w:tc>
+        <w:tc>
+          <w:tcPr>
+            <w:tcW w:type="dxa" w:w="6200"/>
+            <w:shd w:fill="F5F8FC" w:val="clear"/>
+            <w:tcMar>
+              <w:top w:type="dxa" w:w="60"/>
+              <w:left w:type="dxa" w:w="100"/>
+              <w:bottom w:type="dxa" w:w="60"/>
+              <w:right w:type="dxa" w:w="100"/>
+            </w:tcMar>
+            <w:vAlign w:val="center"/>
+          </w:tcPr>
+          <w:p>
+            <w:pPr>
+              <w:jc w:val="left"/>
+            </w:pPr>
+            <w:r>
+              <w:rPr>
+                <w:sz w:val="19"/>
+                <w:szCs w:val="19"/>
+              </w:rPr>
+              <w:t xml:space="preserve">Fails if any ledger outbox entry is still pending. Sub-ledger reconciliation and period locking are not built.</w:t>
+            </w:r>
+          </w:p>
+        </w:tc>
+      </w:tr>
+      <w:tr>
+        <w:trPr>
+          <w:cantSplit/>
+        </w:trPr>
+        <w:tc>
+          <w:tcPr>
+            <w:tcW w:type="dxa" w:w="3300"/>
+            <w:tcMar>
+              <w:top w:type="dxa" w:w="60"/>
+              <w:left w:type="dxa" w:w="100"/>
+              <w:bottom w:type="dxa" w:w="60"/>
+              <w:right w:type="dxa" w:w="100"/>
+            </w:tcMar>
+            <w:vAlign w:val="center"/>
+          </w:tcPr>
+          <w:p>
+            <w:pPr>
+              <w:jc w:val="left"/>
+            </w:pPr>
+            <w:r>
+              <w:rPr>
+                <w:rFonts w:ascii="Consolas" w:hAnsi="Consolas" w:cs="Consolas"/>
+                <w:color w:val="1F3864"/>
+                <w:sz w:val="17"/>
+                <w:szCs w:val="17"/>
+              </w:rPr>
+              <w:t xml:space="preserve">FORECLOSURE_PREPAYMENT_PROCESSING</w:t>
+            </w:r>
+          </w:p>
+        </w:tc>
+        <w:tc>
+          <w:tcPr>
+            <w:tcW w:type="dxa" w:w="6200"/>
+            <w:tcMar>
+              <w:top w:type="dxa" w:w="60"/>
+              <w:left w:type="dxa" w:w="100"/>
+              <w:bottom w:type="dxa" w:w="60"/>
+              <w:right w:type="dxa" w:w="100"/>
+            </w:tcMar>
+            <w:vAlign w:val="center"/>
+          </w:tcPr>
+          <w:p>
+            <w:pPr>
+              <w:jc w:val="left"/>
+            </w:pPr>
+            <w:r>
+              <w:rPr>
+                <w:sz w:val="19"/>
+                <w:szCs w:val="19"/>
+              </w:rPr>
+              <w:t xml:space="preserve">Forecloses one account (parameters </w:t>
+            </w:r>
+            <w:r>
+              <w:rPr>
+                <w:rFonts w:ascii="Consolas" w:hAnsi="Consolas" w:cs="Consolas"/>
+                <w:color w:val="1F3864"/>
+                <w:sz w:val="17"/>
+                <w:szCs w:val="17"/>
+              </w:rPr>
+              <w:t xml:space="preserve">accountId</w:t>
+            </w:r>
+            <w:r>
+              <w:rPr>
+                <w:sz w:val="19"/>
+                <w:szCs w:val="19"/>
+              </w:rPr>
+              <w:t xml:space="preserve">, optional </w:t>
+            </w:r>
+            <w:r>
+              <w:rPr>
+                <w:rFonts w:ascii="Consolas" w:hAnsi="Consolas" w:cs="Consolas"/>
+                <w:color w:val="1F3864"/>
+                <w:sz w:val="17"/>
+                <w:szCs w:val="17"/>
+              </w:rPr>
+              <w:t xml:space="preserve">foreclosureDate</w:t>
+            </w:r>
+            <w:r>
+              <w:rPr>
+                <w:sz w:val="19"/>
+                <w:szCs w:val="19"/>
+              </w:rPr>
+              <w:t xml:space="preserve"> and </w:t>
+            </w:r>
+            <w:r>
+              <w:rPr>
+                <w:rFonts w:ascii="Consolas" w:hAnsi="Consolas" w:cs="Consolas"/>
+                <w:color w:val="1F3864"/>
+                <w:sz w:val="17"/>
+                <w:szCs w:val="17"/>
+              </w:rPr>
+              <w:t xml:space="preserve">channel</w:t>
+            </w:r>
+            <w:r>
+              <w:rPr>
+                <w:sz w:val="19"/>
+                <w:szCs w:val="19"/>
+              </w:rPr>
+              <w:t xml:space="preserve">). Repeating it for the same account and date does not post twice.</w:t>
+            </w:r>
+          </w:p>
+        </w:tc>
+      </w:tr>
+    </w:tbl>
+    <w:p>
+      <w:pPr>
+        <w:spacing w:after="60"/>
+      </w:pPr>
+    </w:p>
+    <w:p>
+      <w:pPr>
+        <w:pStyle w:val="Heading3"/>
+        <w:spacing w:after="100" w:before="200"/>
+      </w:pPr>
+      <w:r>
+        <w:rPr>
+          <w:b/>
+          <w:bCs/>
+          <w:color w:val="2E5AA8"/>
+          <w:sz w:val="22"/>
+          <w:szCs w:val="22"/>
+        </w:rPr>
+        <w:t xml:space="preserve">Benchmark rates</w:t>
+      </w:r>
+    </w:p>
+    <w:p>
+      <w:pPr>
+        <w:spacing w:after="140" w:line="276"/>
+      </w:pPr>
+      <w:r>
+        <w:rPr>
+          <w:sz w:val="21"/>
+          <w:szCs w:val="21"/>
+        </w:rPr>
+        <w:t xml:space="preserve">Floating-rate resets read the new rate from a </w:t>
+      </w:r>
+      <w:r>
+        <w:rPr>
+          <w:b/>
+          <w:bCs/>
+          <w:sz w:val="21"/>
+          <w:szCs w:val="21"/>
+        </w:rPr>
+        <w:t xml:space="preserve">benchmark rate table</w:t>
+      </w:r>
+      <w:r>
+        <w:rPr>
+          <w:sz w:val="21"/>
+          <w:szCs w:val="21"/>
+        </w:rPr>
+        <w:t xml:space="preserve">: each benchmark (for example </w:t>
+      </w:r>
+      <w:r>
+        <w:rPr>
+          <w:rFonts w:ascii="Consolas" w:hAnsi="Consolas" w:cs="Consolas"/>
+          <w:color w:val="1F3864"/>
+          <w:sz w:val="19"/>
+          <w:szCs w:val="19"/>
+        </w:rPr>
+        <w:t xml:space="preserve">OVERNIGHT_MIBOR</w:t>
+      </w:r>
+      <w:r>
+        <w:rPr>
+          <w:sz w:val="21"/>
+          <w:szCs w:val="21"/>
+        </w:rPr>
+        <w:t xml:space="preserve">) has rates with an effective date, and the rate in force on a date is the latest one effective on or before it. A product's rate band still floors and caps the rate an account receives.</w:t>
+      </w:r>
+    </w:p>
+    <w:tbl>
+      <w:tblPr>
+        <w:tblW w:type="dxa" w:w="9500"/>
+        <w:tblBorders>
+          <w:top w:val="single" w:color="auto" w:sz="4"/>
+          <w:left w:val="single" w:color="auto" w:sz="4"/>
+          <w:bottom w:val="single" w:color="auto" w:sz="4"/>
+          <w:right w:val="single" w:color="auto" w:sz="4"/>
+          <w:insideH w:val="single" w:color="auto" w:sz="4"/>
+          <w:insideV w:val="single" w:color="auto" w:sz="4"/>
+        </w:tblBorders>
+      </w:tblPr>
+      <w:tblGrid>
+        <w:gridCol w:w="4300"/>
+        <w:gridCol w:w="5200"/>
+      </w:tblGrid>
+      <w:tr>
+        <w:trPr>
+          <w:tblHeader/>
+        </w:trPr>
+        <w:tc>
+          <w:tcPr>
+            <w:tcW w:type="dxa" w:w="4300"/>
+            <w:shd w:fill="1F3864" w:val="clear"/>
+            <w:tcMar>
+              <w:top w:type="dxa" w:w="60"/>
+              <w:left w:type="dxa" w:w="100"/>
+              <w:bottom w:type="dxa" w:w="60"/>
+              <w:right w:type="dxa" w:w="100"/>
+            </w:tcMar>
+            <w:vAlign w:val="center"/>
+          </w:tcPr>
+          <w:p>
+            <w:pPr>
+              <w:jc w:val="left"/>
+            </w:pPr>
+            <w:r>
+              <w:rPr>
+                <w:b/>
+                <w:bCs/>
+                <w:color w:val="FFFFFF"/>
+                <w:sz w:val="19"/>
+                <w:szCs w:val="19"/>
+              </w:rPr>
+              <w:t xml:space="preserve">Method and path</w:t>
+            </w:r>
+          </w:p>
+        </w:tc>
+        <w:tc>
+          <w:tcPr>
+            <w:tcW w:type="dxa" w:w="5200"/>
+            <w:shd w:fill="1F3864" w:val="clear"/>
+            <w:tcMar>
+              <w:top w:type="dxa" w:w="60"/>
+              <w:left w:type="dxa" w:w="100"/>
+              <w:bottom w:type="dxa" w:w="60"/>
+              <w:right w:type="dxa" w:w="100"/>
+            </w:tcMar>
+            <w:vAlign w:val="center"/>
+          </w:tcPr>
+          <w:p>
+            <w:pPr>
+              <w:jc w:val="left"/>
+            </w:pPr>
+            <w:r>
+              <w:rPr>
+                <w:b/>
+                <w:bCs/>
+                <w:color w:val="FFFFFF"/>
+                <w:sz w:val="19"/>
+                <w:szCs w:val="19"/>
+              </w:rPr>
+              <w:t xml:space="preserve">Purpose</w:t>
+            </w:r>
+          </w:p>
+        </w:tc>
+      </w:tr>
+      <w:tr>
+        <w:trPr>
+          <w:cantSplit/>
+        </w:trPr>
+        <w:tc>
+          <w:tcPr>
+            <w:tcW w:type="dxa" w:w="4300"/>
+            <w:tcMar>
+              <w:top w:type="dxa" w:w="60"/>
+              <w:left w:type="dxa" w:w="100"/>
+              <w:bottom w:type="dxa" w:w="60"/>
+              <w:right w:type="dxa" w:w="100"/>
+            </w:tcMar>
+            <w:vAlign w:val="center"/>
+          </w:tcPr>
+          <w:p>
+            <w:pPr>
+              <w:jc w:val="left"/>
+            </w:pPr>
+            <w:r>
+              <w:rPr>
+                <w:rFonts w:ascii="Consolas" w:hAnsi="Consolas" w:cs="Consolas"/>
+                <w:color w:val="1F3864"/>
+                <w:sz w:val="17"/>
+                <w:szCs w:val="17"/>
+              </w:rPr>
+              <w:t xml:space="preserve">PUT /api/v1/benchmark-rates/{ref}/{effectiveDate}</w:t>
+            </w:r>
+          </w:p>
+        </w:tc>
+        <w:tc>
+          <w:tcPr>
+            <w:tcW w:type="dxa" w:w="5200"/>
+            <w:tcMar>
+              <w:top w:type="dxa" w:w="60"/>
+              <w:left w:type="dxa" w:w="100"/>
+              <w:bottom w:type="dxa" w:w="60"/>
+              <w:right w:type="dxa" w:w="100"/>
+            </w:tcMar>
+            <w:vAlign w:val="center"/>
+          </w:tcPr>
+          <w:p>
+            <w:pPr>
+              <w:jc w:val="left"/>
+            </w:pPr>
+            <w:r>
+              <w:rPr>
+                <w:sz w:val="19"/>
+                <w:szCs w:val="19"/>
+              </w:rPr>
+              <w:t xml:space="preserve">Record (or correct) the rate that takes effect on a date.</w:t>
+            </w:r>
+          </w:p>
+        </w:tc>
+      </w:tr>
+      <w:tr>
+        <w:trPr>
+          <w:cantSplit/>
+        </w:trPr>
+        <w:tc>
+          <w:tcPr>
+            <w:tcW w:type="dxa" w:w="4300"/>
+            <w:shd w:fill="F5F8FC" w:val="clear"/>
+            <w:tcMar>
+              <w:top w:type="dxa" w:w="60"/>
+              <w:left w:type="dxa" w:w="100"/>
+              <w:bottom w:type="dxa" w:w="60"/>
+              <w:right w:type="dxa" w:w="100"/>
+            </w:tcMar>
+            <w:vAlign w:val="center"/>
+          </w:tcPr>
+          <w:p>
+            <w:pPr>
+              <w:jc w:val="left"/>
+            </w:pPr>
+            <w:r>
+              <w:rPr>
+                <w:rFonts w:ascii="Consolas" w:hAnsi="Consolas" w:cs="Consolas"/>
+                <w:color w:val="1F3864"/>
+                <w:sz w:val="17"/>
+                <w:szCs w:val="17"/>
+              </w:rPr>
+              <w:t xml:space="preserve">GET /api/v1/benchmark-rates/{ref}?asOf=</w:t>
+            </w:r>
+          </w:p>
+        </w:tc>
+        <w:tc>
+          <w:tcPr>
+            <w:tcW w:type="dxa" w:w="5200"/>
+            <w:shd w:fill="F5F8FC" w:val="clear"/>
+            <w:tcMar>
+              <w:top w:type="dxa" w:w="60"/>
+              <w:left w:type="dxa" w:w="100"/>
+              <w:bottom w:type="dxa" w:w="60"/>
+              <w:right w:type="dxa" w:w="100"/>
+            </w:tcMar>
+            <w:vAlign w:val="center"/>
+          </w:tcPr>
+          <w:p>
+            <w:pPr>
+              <w:jc w:val="left"/>
+            </w:pPr>
+            <w:r>
+              <w:rPr>
+                <w:sz w:val="19"/>
+                <w:szCs w:val="19"/>
+              </w:rPr>
+              <w:t xml:space="preserve">The rate in force on a date.</w:t>
+            </w:r>
+          </w:p>
+        </w:tc>
+      </w:tr>
+      <w:tr>
+        <w:trPr>
+          <w:cantSplit/>
+        </w:trPr>
+        <w:tc>
+          <w:tcPr>
+            <w:tcW w:type="dxa" w:w="4300"/>
+            <w:tcMar>
+              <w:top w:type="dxa" w:w="60"/>
+              <w:left w:type="dxa" w:w="100"/>
+              <w:bottom w:type="dxa" w:w="60"/>
+              <w:right w:type="dxa" w:w="100"/>
+            </w:tcMar>
+            <w:vAlign w:val="center"/>
+          </w:tcPr>
+          <w:p>
+            <w:pPr>
+              <w:jc w:val="left"/>
+            </w:pPr>
+            <w:r>
+              <w:rPr>
+                <w:rFonts w:ascii="Consolas" w:hAnsi="Consolas" w:cs="Consolas"/>
+                <w:color w:val="1F3864"/>
+                <w:sz w:val="17"/>
+                <w:szCs w:val="17"/>
+              </w:rPr>
+              <w:t xml:space="preserve">GET /api/v1/benchmark-rates/{ref}/history</w:t>
+            </w:r>
+          </w:p>
+        </w:tc>
+        <w:tc>
+          <w:tcPr>
+            <w:tcW w:type="dxa" w:w="5200"/>
+            <w:tcMar>
+              <w:top w:type="dxa" w:w="60"/>
+              <w:left w:type="dxa" w:w="100"/>
+              <w:bottom w:type="dxa" w:w="60"/>
+              <w:right w:type="dxa" w:w="100"/>
+            </w:tcMar>
+            <w:vAlign w:val="center"/>
+          </w:tcPr>
+          <w:p>
+            <w:pPr>
+              <w:jc w:val="left"/>
+            </w:pPr>
+            <w:r>
+              <w:rPr>
+                <w:sz w:val="19"/>
+                <w:szCs w:val="19"/>
+              </w:rPr>
+              <w:t xml:space="preserve">All recorded rates for a benchmark.</w:t>
+            </w:r>
+          </w:p>
+        </w:tc>
+      </w:tr>
+    </w:tbl>
+    <w:p>
+      <w:pPr>
+        <w:spacing w:after="60"/>
+      </w:pPr>
+    </w:p>
+    <w:p>
+      <w:pPr>
+        <w:pStyle w:val="Heading3"/>
+        <w:spacing w:after="100" w:before="200"/>
+      </w:pPr>
+      <w:r>
+        <w:rPr>
+          <w:b/>
+          <w:bCs/>
+          <w:color w:val="2E5AA8"/>
+          <w:sz w:val="22"/>
+          <w:szCs w:val="22"/>
+        </w:rPr>
+        <w:t xml:space="preserve">Per-account functions added to the Lending API</w:t>
+      </w:r>
+    </w:p>
+    <w:tbl>
+      <w:tblPr>
+        <w:tblW w:type="dxa" w:w="9500"/>
+        <w:tblBorders>
+          <w:top w:val="single" w:color="auto" w:sz="4"/>
+          <w:left w:val="single" w:color="auto" w:sz="4"/>
+          <w:bottom w:val="single" w:color="auto" w:sz="4"/>
+          <w:right w:val="single" w:color="auto" w:sz="4"/>
+          <w:insideH w:val="single" w:color="auto" w:sz="4"/>
+          <w:insideV w:val="single" w:color="auto" w:sz="4"/>
+        </w:tblBorders>
+      </w:tblPr>
+      <w:tblGrid>
+        <w:gridCol w:w="4300"/>
+        <w:gridCol w:w="5200"/>
+      </w:tblGrid>
+      <w:tr>
+        <w:trPr>
+          <w:tblHeader/>
+        </w:trPr>
+        <w:tc>
+          <w:tcPr>
+            <w:tcW w:type="dxa" w:w="4300"/>
+            <w:shd w:fill="1F3864" w:val="clear"/>
+            <w:tcMar>
+              <w:top w:type="dxa" w:w="60"/>
+              <w:left w:type="dxa" w:w="100"/>
+              <w:bottom w:type="dxa" w:w="60"/>
+              <w:right w:type="dxa" w:w="100"/>
+            </w:tcMar>
+            <w:vAlign w:val="center"/>
+          </w:tcPr>
+          <w:p>
+            <w:pPr>
+              <w:jc w:val="left"/>
+            </w:pPr>
+            <w:r>
+              <w:rPr>
+                <w:b/>
+                <w:bCs/>
+                <w:color w:val="FFFFFF"/>
+                <w:sz w:val="19"/>
+                <w:szCs w:val="19"/>
+              </w:rPr>
+              <w:t xml:space="preserve">Method and path</w:t>
+            </w:r>
+          </w:p>
+        </w:tc>
+        <w:tc>
+          <w:tcPr>
+            <w:tcW w:type="dxa" w:w="5200"/>
+            <w:shd w:fill="1F3864" w:val="clear"/>
+            <w:tcMar>
+              <w:top w:type="dxa" w:w="60"/>
+              <w:left w:type="dxa" w:w="100"/>
+              <w:bottom w:type="dxa" w:w="60"/>
+              <w:right w:type="dxa" w:w="100"/>
+            </w:tcMar>
+            <w:vAlign w:val="center"/>
+          </w:tcPr>
+          <w:p>
+            <w:pPr>
+              <w:jc w:val="left"/>
+            </w:pPr>
+            <w:r>
+              <w:rPr>
+                <w:b/>
+                <w:bCs/>
+                <w:color w:val="FFFFFF"/>
+                <w:sz w:val="19"/>
+                <w:szCs w:val="19"/>
+              </w:rPr>
+              <w:t xml:space="preserve">Purpose</w:t>
+            </w:r>
+          </w:p>
+        </w:tc>
+      </w:tr>
+      <w:tr>
+        <w:trPr>
+          <w:cantSplit/>
+        </w:trPr>
+        <w:tc>
+          <w:tcPr>
+            <w:tcW w:type="dxa" w:w="4300"/>
+            <w:tcMar>
+              <w:top w:type="dxa" w:w="60"/>
+              <w:left w:type="dxa" w:w="100"/>
+              <w:bottom w:type="dxa" w:w="60"/>
+              <w:right w:type="dxa" w:w="100"/>
+            </w:tcMar>
+            <w:vAlign w:val="center"/>
+          </w:tcPr>
+          <w:p>
+            <w:pPr>
+              <w:jc w:val="left"/>
+            </w:pPr>
+            <w:r>
+              <w:rPr>
+                <w:rFonts w:ascii="Consolas" w:hAnsi="Consolas" w:cs="Consolas"/>
+                <w:color w:val="1F3864"/>
+                <w:sz w:val="17"/>
+                <w:szCs w:val="17"/>
+              </w:rPr>
+              <w:t xml:space="preserve">POST /api/v1/loan-accounts/{id}/interest-accruals?businessDate=</w:t>
+            </w:r>
+          </w:p>
+        </w:tc>
+        <w:tc>
+          <w:tcPr>
+            <w:tcW w:type="dxa" w:w="5200"/>
+            <w:tcMar>
+              <w:top w:type="dxa" w:w="60"/>
+              <w:left w:type="dxa" w:w="100"/>
+              <w:bottom w:type="dxa" w:w="60"/>
+              <w:right w:type="dxa" w:w="100"/>
+            </w:tcMar>
+            <w:vAlign w:val="center"/>
+          </w:tcPr>
+          <w:p>
+            <w:pPr>
+              <w:jc w:val="left"/>
+            </w:pPr>
+            <w:r>
+              <w:rPr>
+                <w:sz w:val="19"/>
+                <w:szCs w:val="19"/>
+              </w:rPr>
+              <w:t xml:space="preserve">Accrue interest for one account and date; returns POSTED (with the amount and the principal it was based on), ALREADY_POSTED or SKIPPED.</w:t>
+            </w:r>
+          </w:p>
+        </w:tc>
+      </w:tr>
+      <w:tr>
+        <w:trPr>
+          <w:cantSplit/>
+        </w:trPr>
+        <w:tc>
+          <w:tcPr>
+            <w:tcW w:type="dxa" w:w="4300"/>
+            <w:shd w:fill="F5F8FC" w:val="clear"/>
+            <w:tcMar>
+              <w:top w:type="dxa" w:w="60"/>
+              <w:left w:type="dxa" w:w="100"/>
+              <w:bottom w:type="dxa" w:w="60"/>
+              <w:right w:type="dxa" w:w="100"/>
+            </w:tcMar>
+            <w:vAlign w:val="center"/>
+          </w:tcPr>
+          <w:p>
+            <w:pPr>
+              <w:jc w:val="left"/>
+            </w:pPr>
+            <w:r>
+              <w:rPr>
+                <w:rFonts w:ascii="Consolas" w:hAnsi="Consolas" w:cs="Consolas"/>
+                <w:color w:val="1F3864"/>
+                <w:sz w:val="17"/>
+                <w:szCs w:val="17"/>
+              </w:rPr>
+              <w:t xml:space="preserve">POST /api/v1/loan-accounts/{id}/delinquency-classification</w:t>
+            </w:r>
+          </w:p>
+        </w:tc>
+        <w:tc>
+          <w:tcPr>
+            <w:tcW w:type="dxa" w:w="5200"/>
+            <w:shd w:fill="F5F8FC" w:val="clear"/>
+            <w:tcMar>
+              <w:top w:type="dxa" w:w="60"/>
+              <w:left w:type="dxa" w:w="100"/>
+              <w:bottom w:type="dxa" w:w="60"/>
+              <w:right w:type="dxa" w:w="100"/>
+            </w:tcMar>
+            <w:vAlign w:val="center"/>
+          </w:tcPr>
+          <w:p>
+            <w:pPr>
+              <w:jc w:val="left"/>
+            </w:pPr>
+            <w:r>
+              <w:rPr>
+                <w:sz w:val="19"/>
+                <w:szCs w:val="19"/>
+              </w:rPr>
+              <w:t xml:space="preserve">Body </w:t>
+            </w:r>
+            <w:r>
+              <w:rPr>
+                <w:rFonts w:ascii="Consolas" w:hAnsi="Consolas" w:cs="Consolas"/>
+                <w:color w:val="1F3864"/>
+                <w:sz w:val="17"/>
+                <w:szCs w:val="17"/>
+              </w:rPr>
+              <w:t xml:space="preserve">{"asOfDate": "..."}</w:t>
+            </w:r>
+            <w:r>
+              <w:rPr>
+                <w:sz w:val="19"/>
+                <w:szCs w:val="19"/>
+              </w:rPr>
+              <w:t xml:space="preserve">. Classify one account; returns the days past due, the previous and new status, and whether it changed or was skipped.</w:t>
+            </w:r>
+          </w:p>
+        </w:tc>
+      </w:tr>
+      <w:tr>
+        <w:trPr>
+          <w:cantSplit/>
+        </w:trPr>
+        <w:tc>
+          <w:tcPr>
+            <w:tcW w:type="dxa" w:w="4300"/>
+            <w:tcMar>
+              <w:top w:type="dxa" w:w="60"/>
+              <w:left w:type="dxa" w:w="100"/>
+              <w:bottom w:type="dxa" w:w="60"/>
+              <w:right w:type="dxa" w:w="100"/>
+            </w:tcMar>
+            <w:vAlign w:val="center"/>
+          </w:tcPr>
+          <w:p>
+            <w:pPr>
+              <w:jc w:val="left"/>
+            </w:pPr>
+            <w:r>
+              <w:rPr>
+                <w:rFonts w:ascii="Consolas" w:hAnsi="Consolas" w:cs="Consolas"/>
+                <w:color w:val="1F3864"/>
+                <w:sz w:val="17"/>
+                <w:szCs w:val="17"/>
+              </w:rPr>
+              <w:t xml:space="preserve">POST /api/v1/loan-accounts/{id}/rate-reset</w:t>
+            </w:r>
+          </w:p>
+        </w:tc>
+        <w:tc>
+          <w:tcPr>
+            <w:tcW w:type="dxa" w:w="5200"/>
+            <w:tcMar>
+              <w:top w:type="dxa" w:w="60"/>
+              <w:left w:type="dxa" w:w="100"/>
+              <w:bottom w:type="dxa" w:w="60"/>
+              <w:right w:type="dxa" w:w="100"/>
+            </w:tcMar>
+            <w:vAlign w:val="center"/>
+          </w:tcPr>
+          <w:p>
+            <w:pPr>
+              <w:jc w:val="left"/>
+            </w:pPr>
+            <w:r>
+              <w:rPr>
+                <w:sz w:val="19"/>
+                <w:szCs w:val="19"/>
+              </w:rPr>
+              <w:t xml:space="preserve">Body </w:t>
+            </w:r>
+            <w:r>
+              <w:rPr>
+                <w:rFonts w:ascii="Consolas" w:hAnsi="Consolas" w:cs="Consolas"/>
+                <w:color w:val="1F3864"/>
+                <w:sz w:val="17"/>
+                <w:szCs w:val="17"/>
+              </w:rPr>
+              <w:t xml:space="preserve">{"businessDate": "...", "benchmarkRateRef": "..."}</w:t>
+            </w:r>
+            <w:r>
+              <w:rPr>
+                <w:sz w:val="19"/>
+                <w:szCs w:val="19"/>
+              </w:rPr>
+              <w:t xml:space="preserve">. Reset one account; returns RESET (previous and new rate), UNCHANGED or SKIPPED.</w:t>
+            </w:r>
+          </w:p>
+        </w:tc>
+      </w:tr>
+    </w:tbl>
+    <w:p>
+      <w:pPr>
+        <w:spacing w:after="60"/>
+      </w:pPr>
+    </w:p>
+    <w:p>
+      <w:pPr>
+        <w:spacing w:after="140" w:line="276"/>
+      </w:pPr>
+      <w:r>
+        <w:rPr>
+          <w:sz w:val="21"/>
+          <w:szCs w:val="21"/>
+        </w:rPr>
+        <w:t xml:space="preserve">The all-accounts versions (</w:t>
+      </w:r>
+      <w:r>
+        <w:rPr>
+          <w:rFonts w:ascii="Consolas" w:hAnsi="Consolas" w:cs="Consolas"/>
+          <w:color w:val="1F3864"/>
+          <w:sz w:val="19"/>
+          <w:szCs w:val="19"/>
+        </w:rPr>
+        <w:t xml:space="preserve">/interest-accruals/run</w:t>
+      </w:r>
+      <w:r>
+        <w:rPr>
+          <w:sz w:val="21"/>
+          <w:szCs w:val="21"/>
+        </w:rPr>
+        <w:t xml:space="preserve">, </w:t>
+      </w:r>
+      <w:r>
+        <w:rPr>
+          <w:rFonts w:ascii="Consolas" w:hAnsi="Consolas" w:cs="Consolas"/>
+          <w:color w:val="1F3864"/>
+          <w:sz w:val="19"/>
+          <w:szCs w:val="19"/>
+        </w:rPr>
+        <w:t xml:space="preserve">/delinquency-classifications</w:t>
+      </w:r>
+      <w:r>
+        <w:rPr>
+          <w:sz w:val="21"/>
+          <w:szCs w:val="21"/>
+        </w:rPr>
+        <w:t xml:space="preserve">, </w:t>
+      </w:r>
+      <w:r>
+        <w:rPr>
+          <w:rFonts w:ascii="Consolas" w:hAnsi="Consolas" w:cs="Consolas"/>
+          <w:color w:val="1F3864"/>
+          <w:sz w:val="19"/>
+          <w:szCs w:val="19"/>
+        </w:rPr>
+        <w:t xml:space="preserve">/rate-resets</w:t>
+      </w:r>
+      <w:r>
+        <w:rPr>
+          <w:sz w:val="21"/>
+          <w:szCs w:val="21"/>
+        </w:rPr>
+        <w:t xml:space="preserve">) are unchanged. The other 27 jobs remain stubs; Chapter 10 describes what each is meant to do.</w:t>
+      </w:r>
+    </w:p>
+    <w:p>
+      <w:pPr>
+        <w:pStyle w:val="Heading2"/>
+        <w:spacing w:after="120" w:before="280"/>
+      </w:pPr>
+      <w:r>
+        <w:rPr>
+          <w:b/>
+          <w:bCs/>
+          <w:color w:val="2E5AA8"/>
+          <w:sz w:val="25"/>
+          <w:szCs w:val="25"/>
+        </w:rPr>
+        <w:t xml:space="preserve">13.16 Admin Portal and Test Suite on the Business Date</w:t>
+      </w:r>
+    </w:p>
+    <w:p>
+      <w:pPr>
+        <w:pStyle w:val="Heading3"/>
+        <w:spacing w:after="100" w:before="200"/>
+      </w:pPr>
+      <w:r>
+        <w:rPr>
+          <w:b/>
+          <w:bCs/>
+          <w:color w:val="2E5AA8"/>
+          <w:sz w:val="22"/>
+          <w:szCs w:val="22"/>
+        </w:rPr>
+        <w:t xml:space="preserve">Admin portal</w:t>
+      </w:r>
+    </w:p>
+    <w:p>
+      <w:pPr>
+        <w:pStyle w:val="ListParagraph"/>
+        <w:numPr>
+          <w:ilvl w:val="0"/>
+          <w:numId w:val="1"/>
+        </w:numPr>
+        <w:spacing w:after="80" w:line="264"/>
+      </w:pPr>
+      <w:r>
+        <w:rPr>
+          <w:sz w:val="21"/>
+          <w:szCs w:val="21"/>
+        </w:rPr>
+        <w:t xml:space="preserve">Days past due on the schedule and account figures, the overdue and upcoming lists, the dashboard and the default end of the accrual summary are all measured at the </w:t>
+      </w:r>
+      <w:r>
+        <w:rPr>
+          <w:b/>
+          <w:bCs/>
+          <w:sz w:val="21"/>
+          <w:szCs w:val="21"/>
+        </w:rPr>
+        <w:t xml:space="preserve">business date</w:t>
+      </w:r>
+      <w:r>
+        <w:rPr>
+          <w:sz w:val="21"/>
+          <w:szCs w:val="21"/>
+        </w:rPr>
+        <w:t xml:space="preserve">, not the calendar date.</w:t>
+      </w:r>
+    </w:p>
+    <w:p>
+      <w:pPr>
+        <w:pStyle w:val="ListParagraph"/>
+        <w:numPr>
+          <w:ilvl w:val="0"/>
+          <w:numId w:val="1"/>
+        </w:numPr>
+        <w:spacing w:after="80" w:line="264"/>
+      </w:pPr>
+      <w:r>
+        <w:rPr>
+          <w:sz w:val="21"/>
+          <w:szCs w:val="21"/>
+        </w:rPr>
+        <w:t xml:space="preserve">The side bar shows the business date and whether end of day is running; </w:t>
+      </w:r>
+      <w:r>
+        <w:rPr>
+          <w:rFonts w:ascii="Consolas" w:hAnsi="Consolas" w:cs="Consolas"/>
+          <w:color w:val="1F3864"/>
+          <w:sz w:val="19"/>
+          <w:szCs w:val="19"/>
+        </w:rPr>
+        <w:t xml:space="preserve">GET /api/admin/business-date</w:t>
+      </w:r>
+      <w:r>
+        <w:rPr>
+          <w:sz w:val="21"/>
+          <w:szCs w:val="21"/>
+        </w:rPr>
+        <w:t xml:space="preserve"> returns the same.</w:t>
+      </w:r>
+    </w:p>
+    <w:p>
+      <w:pPr>
+        <w:pStyle w:val="ListParagraph"/>
+        <w:numPr>
+          <w:ilvl w:val="0"/>
+          <w:numId w:val="1"/>
+        </w:numPr>
+        <w:spacing w:after="80" w:line="264"/>
+      </w:pPr>
+      <w:r>
+        <w:rPr>
+          <w:sz w:val="21"/>
+          <w:szCs w:val="21"/>
+        </w:rPr>
+        <w:t xml:space="preserve">The portal stays read-only: it reads the business date from the shared database. If the business date has not been created yet (an older database), it shows the calendar date and says so.</w:t>
+      </w:r>
+    </w:p>
+    <w:p>
+      <w:pPr>
+        <w:pStyle w:val="Heading3"/>
+        <w:spacing w:after="100" w:before="200"/>
+      </w:pPr>
+      <w:r>
+        <w:rPr>
+          <w:b/>
+          <w:bCs/>
+          <w:color w:val="2E5AA8"/>
+          <w:sz w:val="22"/>
+          <w:szCs w:val="22"/>
+        </w:rPr>
+        <w:t xml:space="preserve">End-to-end test suite</w:t>
+      </w:r>
+    </w:p>
+    <w:p>
+      <w:pPr>
+        <w:spacing w:after="140" w:line="276"/>
+      </w:pPr>
+      <w:r>
+        <w:rPr>
+          <w:sz w:val="21"/>
+          <w:szCs w:val="21"/>
+        </w:rPr>
+        <w:t xml:space="preserve">The end-to-end test suite (a separate project that simulates loans over many days and checks every figure) now drives the platform's own business date instead of only passing dates around:</w:t>
+      </w:r>
+    </w:p>
+    <w:p>
+      <w:pPr>
+        <w:pStyle w:val="ListParagraph"/>
+        <w:numPr>
+          <w:ilvl w:val="0"/>
+          <w:numId w:val="1"/>
+        </w:numPr>
+        <w:spacing w:after="80" w:line="264"/>
+      </w:pPr>
+      <w:r>
+        <w:rPr>
+          <w:sz w:val="21"/>
+          <w:szCs w:val="21"/>
+        </w:rPr>
+        <w:t xml:space="preserve">Before the run it sets the business date to the simulated start date. The date only moves forward, so the start date must not be earlier than the platform's current business date; the suite's pre-run check says so.</w:t>
+      </w:r>
+    </w:p>
+    <w:p>
+      <w:pPr>
+        <w:pStyle w:val="ListParagraph"/>
+        <w:numPr>
+          <w:ilvl w:val="0"/>
+          <w:numId w:val="1"/>
+        </w:numPr>
+        <w:spacing w:after="80" w:line="264"/>
+      </w:pPr>
+      <w:r>
+        <w:rPr>
+          <w:sz w:val="21"/>
+          <w:szCs w:val="21"/>
+        </w:rPr>
+        <w:t xml:space="preserve">Each simulated day it pays against the business date, runs the real end of day through the batch service, and checks that the platform moved to the next day and that the admin portal shows the same date.</w:t>
+      </w:r>
+    </w:p>
+    <w:p>
+      <w:pPr>
+        <w:pStyle w:val="ListParagraph"/>
+        <w:numPr>
+          <w:ilvl w:val="0"/>
+          <w:numId w:val="1"/>
+        </w:numPr>
+        <w:spacing w:after="80" w:line="264"/>
+      </w:pPr>
+      <w:r>
+        <w:rPr>
+          <w:sz w:val="21"/>
+          <w:szCs w:val="21"/>
+        </w:rPr>
+        <w:t xml:space="preserve">Days past due shown by the admin portal are compared with the suite's own figure at the business date. This replaces the earlier finding that the portal used the calendar date.</w:t>
+      </w:r>
+    </w:p>
+    <w:p>
+      <w:pPr>
+        <w:pStyle w:val="ListParagraph"/>
+        <w:numPr>
+          <w:ilvl w:val="0"/>
+          <w:numId w:val="1"/>
+        </w:numPr>
+        <w:spacing w:after="80" w:line="264"/>
+      </w:pPr>
+      <w:r>
+        <w:rPr>
+          <w:sz w:val="21"/>
+          <w:szCs w:val="21"/>
+        </w:rPr>
+        <w:t xml:space="preserve">It should be run on a dedicated environment: the run moves the shared business date by hundreds of days, and the nightly end of day should be switched off for its duration.</w:t>
+      </w:r>
+    </w:p>
+    <w:p>
+      <w:pPr>
+        <w:pStyle w:val="Heading3"/>
+        <w:spacing w:after="100" w:before="200"/>
+      </w:pPr>
+      <w:r>
+        <w:rPr>
+          <w:b/>
+          <w:bCs/>
+          <w:color w:val="2E5AA8"/>
+          <w:sz w:val="22"/>
+          <w:szCs w:val="22"/>
+        </w:rPr>
+        <w:t xml:space="preserve">What has been checked</w:t>
+      </w:r>
+    </w:p>
+    <w:p>
+      <w:pPr>
+        <w:pStyle w:val="ListParagraph"/>
+        <w:numPr>
+          <w:ilvl w:val="0"/>
+          <w:numId w:val="1"/>
+        </w:numPr>
+        <w:spacing w:after="80" w:line="264"/>
+      </w:pPr>
+      <w:r>
+        <w:rPr>
+          <w:sz w:val="21"/>
+          <w:szCs w:val="21"/>
+        </w:rPr>
+        <w:t xml:space="preserve">The business-date rules, the end-of-day run, the business date provider and the lending client were compiled and their unit tests run outside Maven. The end-to-end suite was compiled and run end to end against a simulated platform in each of its modes.</w:t>
+      </w:r>
+    </w:p>
+    <w:p>
+      <w:pPr>
+        <w:pStyle w:val="ListParagraph"/>
+        <w:numPr>
+          <w:ilvl w:val="0"/>
+          <w:numId w:val="1"/>
+        </w:numPr>
+        <w:spacing w:after="80" w:line="264"/>
+      </w:pPr>
+      <w:r>
+        <w:rPr>
+          <w:sz w:val="21"/>
+          <w:szCs w:val="21"/>
+        </w:rPr>
+        <w:t xml:space="preserve">The new lending-service, batch-service and admin-service Spring code, the migrations V12 and V13, the React change and the integration tests have been reviewed but </w:t>
+      </w:r>
+      <w:r>
+        <w:rPr>
+          <w:b/>
+          <w:bCs/>
+          <w:sz w:val="21"/>
+          <w:szCs w:val="21"/>
+        </w:rPr>
+        <w:t xml:space="preserve">not built or run with Maven</w:t>
+      </w:r>
+      <w:r>
+        <w:rPr>
+          <w:sz w:val="21"/>
+          <w:szCs w:val="21"/>
+        </w:rPr>
+        <w:t xml:space="preserve"> in this environment. Run the full build and the Testcontainers tests before relying on them.</w:t>
       </w:r>
     </w:p>
     <w:sectPr>

</xml_diff>

<commit_message>
docs: point the main spec and design documents at v1.5; update README and CHANGELOG
Co-Authored-By: Claude Sonnet 5.5 <noreply@anthropic.com>
Claude-Session: https://claude.ai/code/session_011Ly3TH5YUMArmTYksVUGUE
</commit_message>
<xml_diff>
--- a/docs/Lending_Platform_Functional_Specification.docx
+++ b/docs/Lending_Platform_Functional_Specification.docx
@@ -79,7 +79,7 @@
           <w:sz w:val="20"/>
           <w:szCs w:val="20"/>
         </w:rPr>
-        <w:t xml:space="preserve">Document version 1.4 — updated 12 October 2026 (adds business date and end of day, batch jobs that call lending-service, and an admin portal and test suite that follow the business date)</w:t>
+        <w:t xml:space="preserve">Document version 1.5 — updated 13 October 2026 (adds the Maintenance screen with eleven base products, a test suite that works with the products that exist, and batch fixes: two streams per job, end of day that waits for each job, safer retries)</w:t>
       </w:r>
     </w:p>
     <w:p>
@@ -265,6 +265,27 @@
           <w:szCs w:val="21"/>
         </w:rPr>
         <w:t xml:space="preserve"> adds one platform business date with a nightly end of day (13.13, 13.14), nine batch jobs that now call lending-service (13.15), and the admin portal and end-to-end test suite working on the business date (13.16).</w:t>
+      </w:r>
+    </w:p>
+    <w:p>
+      <w:pPr>
+        <w:spacing w:after="140" w:line="276"/>
+      </w:pPr>
+      <w:r>
+        <w:rPr>
+          <w:b/>
+          <w:bCs/>
+          <w:sz w:val="21"/>
+          <w:szCs w:val="21"/>
+        </w:rPr>
+        <w:t xml:space="preserve">Version 1.5 (13 October 2026):</w:t>
+      </w:r>
+      <w:r>
+        <w:rPr>
+          <w:sz w:val="21"/>
+          <w:szCs w:val="21"/>
+        </w:rPr>
+        <w:t xml:space="preserve"> adds the Maintenance screen to start again from scratch and a set of eleven base products (13.17), batch processing changes and fixes found while running end of day on the sandbox (13.18), and an end-to-end test suite that uses the products that exist and carries on when an account fails (13.19).</w:t>
       </w:r>
     </w:p>
     <w:p>
@@ -33234,6 +33255,3719 @@
           <w:szCs w:val="21"/>
         </w:rPr>
         <w:t xml:space="preserve"> in this environment. Run the full build and the Testcontainers tests before relying on them.</w:t>
+      </w:r>
+    </w:p>
+    <w:p>
+      <w:pPr>
+        <w:pStyle w:val="Heading2"/>
+        <w:spacing w:after="120" w:before="280"/>
+      </w:pPr>
+      <w:r>
+        <w:rPr>
+          <w:b/>
+          <w:bCs/>
+          <w:color w:val="2E5AA8"/>
+          <w:sz w:val="25"/>
+          <w:szCs w:val="25"/>
+        </w:rPr>
+        <w:t xml:space="preserve">13.17 Start From Scratch: the Maintenance Screen</w:t>
+      </w:r>
+    </w:p>
+    <w:p>
+      <w:pPr>
+        <w:spacing w:after="140" w:line="276"/>
+      </w:pPr>
+      <w:r>
+        <w:rPr>
+          <w:sz w:val="21"/>
+          <w:szCs w:val="21"/>
+        </w:rPr>
+        <w:t xml:space="preserve">A test or sandbox environment fills up with accounts and products from earlier trials. The admin portal now has a </w:t>
+      </w:r>
+      <w:r>
+        <w:rPr>
+          <w:b/>
+          <w:bCs/>
+          <w:sz w:val="21"/>
+          <w:szCs w:val="21"/>
+        </w:rPr>
+        <w:t xml:space="preserve">Maintenance</w:t>
+      </w:r>
+      <w:r>
+        <w:rPr>
+          <w:sz w:val="21"/>
+          <w:szCs w:val="21"/>
+        </w:rPr>
+        <w:t xml:space="preserve"> screen with two actions that let an operator wipe the lending data and begin again. It is meant for sandbox and test environments only and is switched off by default.</w:t>
+      </w:r>
+    </w:p>
+    <w:p>
+      <w:pPr>
+        <w:pStyle w:val="Heading3"/>
+        <w:spacing w:after="100" w:before="200"/>
+      </w:pPr>
+      <w:r>
+        <w:rPr>
+          <w:b/>
+          <w:bCs/>
+          <w:color w:val="2E5AA8"/>
+          <w:sz w:val="22"/>
+          <w:szCs w:val="22"/>
+        </w:rPr>
+        <w:t xml:space="preserve">The two actions</w:t>
+      </w:r>
+    </w:p>
+    <w:tbl>
+      <w:tblPr>
+        <w:tblW w:type="dxa" w:w="9500"/>
+        <w:tblBorders>
+          <w:top w:val="single" w:color="auto" w:sz="4"/>
+          <w:left w:val="single" w:color="auto" w:sz="4"/>
+          <w:bottom w:val="single" w:color="auto" w:sz="4"/>
+          <w:right w:val="single" w:color="auto" w:sz="4"/>
+          <w:insideH w:val="single" w:color="auto" w:sz="4"/>
+          <w:insideV w:val="single" w:color="auto" w:sz="4"/>
+        </w:tblBorders>
+      </w:tblPr>
+      <w:tblGrid>
+        <w:gridCol w:w="2300"/>
+        <w:gridCol w:w="7200"/>
+      </w:tblGrid>
+      <w:tr>
+        <w:trPr>
+          <w:tblHeader/>
+        </w:trPr>
+        <w:tc>
+          <w:tcPr>
+            <w:tcW w:type="dxa" w:w="2300"/>
+            <w:shd w:fill="1F3864" w:val="clear"/>
+            <w:tcMar>
+              <w:top w:type="dxa" w:w="60"/>
+              <w:left w:type="dxa" w:w="100"/>
+              <w:bottom w:type="dxa" w:w="60"/>
+              <w:right w:type="dxa" w:w="100"/>
+            </w:tcMar>
+            <w:vAlign w:val="center"/>
+          </w:tcPr>
+          <w:p>
+            <w:pPr>
+              <w:jc w:val="left"/>
+            </w:pPr>
+            <w:r>
+              <w:rPr>
+                <w:b/>
+                <w:bCs/>
+                <w:color w:val="FFFFFF"/>
+                <w:sz w:val="19"/>
+                <w:szCs w:val="19"/>
+              </w:rPr>
+              <w:t xml:space="preserve">Action</w:t>
+            </w:r>
+          </w:p>
+        </w:tc>
+        <w:tc>
+          <w:tcPr>
+            <w:tcW w:type="dxa" w:w="7200"/>
+            <w:shd w:fill="1F3864" w:val="clear"/>
+            <w:tcMar>
+              <w:top w:type="dxa" w:w="60"/>
+              <w:left w:type="dxa" w:w="100"/>
+              <w:bottom w:type="dxa" w:w="60"/>
+              <w:right w:type="dxa" w:w="100"/>
+            </w:tcMar>
+            <w:vAlign w:val="center"/>
+          </w:tcPr>
+          <w:p>
+            <w:pPr>
+              <w:jc w:val="left"/>
+            </w:pPr>
+            <w:r>
+              <w:rPr>
+                <w:b/>
+                <w:bCs/>
+                <w:color w:val="FFFFFF"/>
+                <w:sz w:val="19"/>
+                <w:szCs w:val="19"/>
+              </w:rPr>
+              <w:t xml:space="preserve">What it does</w:t>
+            </w:r>
+          </w:p>
+        </w:tc>
+      </w:tr>
+      <w:tr>
+        <w:trPr>
+          <w:cantSplit/>
+        </w:trPr>
+        <w:tc>
+          <w:tcPr>
+            <w:tcW w:type="dxa" w:w="2300"/>
+            <w:tcMar>
+              <w:top w:type="dxa" w:w="60"/>
+              <w:left w:type="dxa" w:w="100"/>
+              <w:bottom w:type="dxa" w:w="60"/>
+              <w:right w:type="dxa" w:w="100"/>
+            </w:tcMar>
+            <w:vAlign w:val="center"/>
+          </w:tcPr>
+          <w:p>
+            <w:pPr>
+              <w:jc w:val="left"/>
+            </w:pPr>
+            <w:r>
+              <w:rPr>
+                <w:sz w:val="19"/>
+                <w:szCs w:val="19"/>
+              </w:rPr>
+              <w:t xml:space="preserve">Create base products</w:t>
+            </w:r>
+          </w:p>
+        </w:tc>
+        <w:tc>
+          <w:tcPr>
+            <w:tcW w:type="dxa" w:w="7200"/>
+            <w:tcMar>
+              <w:top w:type="dxa" w:w="60"/>
+              <w:left w:type="dxa" w:w="100"/>
+              <w:bottom w:type="dxa" w:w="60"/>
+              <w:right w:type="dxa" w:w="100"/>
+            </w:tcMar>
+            <w:vAlign w:val="center"/>
+          </w:tcPr>
+          <w:p>
+            <w:pPr>
+              <w:jc w:val="left"/>
+            </w:pPr>
+            <w:r>
+              <w:rPr>
+                <w:sz w:val="19"/>
+                <w:szCs w:val="19"/>
+              </w:rPr>
+              <w:t xml:space="preserve">Creates the eleven standard and sample loan products listed below. A product whose code already exists is left exactly as it is, so the action is safe to run at any time. It is always available, including where clearing is switched off.</w:t>
+            </w:r>
+          </w:p>
+        </w:tc>
+      </w:tr>
+      <w:tr>
+        <w:trPr>
+          <w:cantSplit/>
+        </w:trPr>
+        <w:tc>
+          <w:tcPr>
+            <w:tcW w:type="dxa" w:w="2300"/>
+            <w:shd w:fill="F5F8FC" w:val="clear"/>
+            <w:tcMar>
+              <w:top w:type="dxa" w:w="60"/>
+              <w:left w:type="dxa" w:w="100"/>
+              <w:bottom w:type="dxa" w:w="60"/>
+              <w:right w:type="dxa" w:w="100"/>
+            </w:tcMar>
+            <w:vAlign w:val="center"/>
+          </w:tcPr>
+          <w:p>
+            <w:pPr>
+              <w:jc w:val="left"/>
+            </w:pPr>
+            <w:r>
+              <w:rPr>
+                <w:sz w:val="19"/>
+                <w:szCs w:val="19"/>
+              </w:rPr>
+              <w:t xml:space="preserve">Clear all data</w:t>
+            </w:r>
+          </w:p>
+        </w:tc>
+        <w:tc>
+          <w:tcPr>
+            <w:tcW w:type="dxa" w:w="7200"/>
+            <w:shd w:fill="F5F8FC" w:val="clear"/>
+            <w:tcMar>
+              <w:top w:type="dxa" w:w="60"/>
+              <w:left w:type="dxa" w:w="100"/>
+              <w:bottom w:type="dxa" w:w="60"/>
+              <w:right w:type="dxa" w:w="100"/>
+            </w:tcMar>
+            <w:vAlign w:val="center"/>
+          </w:tcPr>
+          <w:p>
+            <w:pPr>
+              <w:jc w:val="left"/>
+            </w:pPr>
+            <w:r>
+              <w:rPr>
+                <w:sz w:val="19"/>
+                <w:szCs w:val="19"/>
+              </w:rPr>
+              <w:t xml:space="preserve">Deletes every loan account and everything that belongs to it (repayment schedules, interest accruals, EMI and payment records, mortgages and valuation history, the ledger outbox and the log of repeated-request keys) </w:t>
+            </w:r>
+            <w:r>
+              <w:rPr>
+                <w:b/>
+                <w:bCs/>
+                <w:sz w:val="19"/>
+                <w:szCs w:val="19"/>
+              </w:rPr>
+              <w:t xml:space="preserve">and every loan product</w:t>
+            </w:r>
+            <w:r>
+              <w:rPr>
+                <w:sz w:val="19"/>
+                <w:szCs w:val="19"/>
+              </w:rPr>
+              <w:t xml:space="preserve">. Numbering starts again from 1.</w:t>
+            </w:r>
+          </w:p>
+        </w:tc>
+      </w:tr>
+    </w:tbl>
+    <w:p>
+      <w:pPr>
+        <w:spacing w:after="60"/>
+      </w:pPr>
+    </w:p>
+    <w:p>
+      <w:pPr>
+        <w:pStyle w:val="Heading3"/>
+        <w:spacing w:after="100" w:before="200"/>
+      </w:pPr>
+      <w:r>
+        <w:rPr>
+          <w:b/>
+          <w:bCs/>
+          <w:color w:val="2E5AA8"/>
+          <w:sz w:val="22"/>
+          <w:szCs w:val="22"/>
+        </w:rPr>
+        <w:t xml:space="preserve">What is kept</w:t>
+      </w:r>
+    </w:p>
+    <w:p>
+      <w:pPr>
+        <w:spacing w:after="140" w:line="276"/>
+      </w:pPr>
+      <w:r>
+        <w:rPr>
+          <w:sz w:val="21"/>
+          <w:szCs w:val="21"/>
+        </w:rPr>
+        <w:t xml:space="preserve">The business date and its history, the holiday calendar, the benchmark rates (for example the REPO rate that floating products use), and all batch-service tables (job settings, run history, schedules). Because the date and rates are kept, a cleared environment can take new accounts straight away once the base products are created; a floating product still needs a REPO rate to be published.</w:t>
+      </w:r>
+    </w:p>
+    <w:p>
+      <w:pPr>
+        <w:pStyle w:val="Heading3"/>
+        <w:spacing w:after="100" w:before="200"/>
+      </w:pPr>
+      <w:r>
+        <w:rPr>
+          <w:b/>
+          <w:bCs/>
+          <w:color w:val="2E5AA8"/>
+          <w:sz w:val="22"/>
+          <w:szCs w:val="22"/>
+        </w:rPr>
+        <w:t xml:space="preserve">Safeguards</w:t>
+      </w:r>
+    </w:p>
+    <w:p>
+      <w:pPr>
+        <w:pStyle w:val="ListParagraph"/>
+        <w:numPr>
+          <w:ilvl w:val="0"/>
+          <w:numId w:val="1"/>
+        </w:numPr>
+        <w:spacing w:after="80" w:line="264"/>
+      </w:pPr>
+      <w:r>
+        <w:rPr>
+          <w:b/>
+          <w:bCs/>
+          <w:sz w:val="21"/>
+          <w:szCs w:val="21"/>
+        </w:rPr>
+        <w:t xml:space="preserve">Off by default.</w:t>
+      </w:r>
+      <w:r>
+        <w:rPr>
+          <w:sz w:val="21"/>
+          <w:szCs w:val="21"/>
+        </w:rPr>
+        <w:t xml:space="preserve"> The lending service refuses to clear anything unless it is started with </w:t>
+      </w:r>
+      <w:r>
+        <w:rPr>
+          <w:rFonts w:ascii="Consolas" w:hAnsi="Consolas" w:cs="Consolas"/>
+          <w:color w:val="1F3864"/>
+          <w:sz w:val="19"/>
+          <w:szCs w:val="19"/>
+        </w:rPr>
+        <w:t xml:space="preserve">LENDING_RESET_ENABLED=true</w:t>
+      </w:r>
+      <w:r>
+        <w:rPr>
+          <w:sz w:val="21"/>
+          <w:szCs w:val="21"/>
+        </w:rPr>
+        <w:t xml:space="preserve"> (HTTP 403 otherwise). The Render sandbox blueprint and the docker-compose set-up switch it on; leave it off anywhere whose data matters.</w:t>
+      </w:r>
+    </w:p>
+    <w:p>
+      <w:pPr>
+        <w:pStyle w:val="ListParagraph"/>
+        <w:numPr>
+          <w:ilvl w:val="0"/>
+          <w:numId w:val="1"/>
+        </w:numPr>
+        <w:spacing w:after="80" w:line="264"/>
+      </w:pPr>
+      <w:r>
+        <w:rPr>
+          <w:b/>
+          <w:bCs/>
+          <w:sz w:val="21"/>
+          <w:szCs w:val="21"/>
+        </w:rPr>
+        <w:t xml:space="preserve">Typed confirmation.</w:t>
+      </w:r>
+      <w:r>
+        <w:rPr>
+          <w:sz w:val="21"/>
+          <w:szCs w:val="21"/>
+        </w:rPr>
+        <w:t xml:space="preserve"> The screen asks the operator to type the word RESET; the request is refused (HTTP 400) without it.</w:t>
+      </w:r>
+    </w:p>
+    <w:p>
+      <w:pPr>
+        <w:pStyle w:val="ListParagraph"/>
+        <w:numPr>
+          <w:ilvl w:val="0"/>
+          <w:numId w:val="1"/>
+        </w:numPr>
+        <w:spacing w:after="80" w:line="264"/>
+      </w:pPr>
+      <w:r>
+        <w:rPr>
+          <w:b/>
+          <w:bCs/>
+          <w:sz w:val="21"/>
+          <w:szCs w:val="21"/>
+        </w:rPr>
+        <w:t xml:space="preserve">Not during end of day.</w:t>
+      </w:r>
+      <w:r>
+        <w:rPr>
+          <w:sz w:val="21"/>
+          <w:szCs w:val="21"/>
+        </w:rPr>
+        <w:t xml:space="preserve"> Clearing is refused (HTTP 409) while end of day is running.</w:t>
+      </w:r>
+    </w:p>
+    <w:p>
+      <w:pPr>
+        <w:pStyle w:val="ListParagraph"/>
+        <w:numPr>
+          <w:ilvl w:val="0"/>
+          <w:numId w:val="1"/>
+        </w:numPr>
+        <w:spacing w:after="80" w:line="264"/>
+      </w:pPr>
+      <w:r>
+        <w:rPr>
+          <w:b/>
+          <w:bCs/>
+          <w:sz w:val="21"/>
+          <w:szCs w:val="21"/>
+        </w:rPr>
+        <w:t xml:space="preserve">One step.</w:t>
+      </w:r>
+      <w:r>
+        <w:rPr>
+          <w:sz w:val="21"/>
+          <w:szCs w:val="21"/>
+        </w:rPr>
+        <w:t xml:space="preserve"> All tables are emptied in a single database statement, so a failure leaves the data as it was. The action is logged as a warning with the user who ran it.</w:t>
+      </w:r>
+    </w:p>
+    <w:p>
+      <w:pPr>
+        <w:pStyle w:val="ListParagraph"/>
+        <w:numPr>
+          <w:ilvl w:val="0"/>
+          <w:numId w:val="1"/>
+        </w:numPr>
+        <w:spacing w:after="80" w:line="264"/>
+      </w:pPr>
+      <w:r>
+        <w:rPr>
+          <w:sz w:val="21"/>
+          <w:szCs w:val="21"/>
+        </w:rPr>
+        <w:t xml:space="preserve">The portal itself still never writes to the database: it asks the lending service, which does the work.</w:t>
+      </w:r>
+    </w:p>
+    <w:p>
+      <w:pPr>
+        <w:pStyle w:val="Heading3"/>
+        <w:spacing w:after="100" w:before="200"/>
+      </w:pPr>
+      <w:r>
+        <w:rPr>
+          <w:b/>
+          <w:bCs/>
+          <w:color w:val="2E5AA8"/>
+          <w:sz w:val="22"/>
+          <w:szCs w:val="22"/>
+        </w:rPr>
+        <w:t xml:space="preserve">The eleven base products</w:t>
+      </w:r>
+    </w:p>
+    <w:tbl>
+      <w:tblPr>
+        <w:tblW w:type="dxa" w:w="9500"/>
+        <w:tblBorders>
+          <w:top w:val="single" w:color="auto" w:sz="4"/>
+          <w:left w:val="single" w:color="auto" w:sz="4"/>
+          <w:bottom w:val="single" w:color="auto" w:sz="4"/>
+          <w:right w:val="single" w:color="auto" w:sz="4"/>
+          <w:insideH w:val="single" w:color="auto" w:sz="4"/>
+          <w:insideV w:val="single" w:color="auto" w:sz="4"/>
+        </w:tblBorders>
+      </w:tblPr>
+      <w:tblGrid>
+        <w:gridCol w:w="700"/>
+        <w:gridCol w:w="1700"/>
+        <w:gridCol w:w="3000"/>
+        <w:gridCol w:w="1300"/>
+        <w:gridCol w:w="1700"/>
+        <w:gridCol w:w="1100"/>
+      </w:tblGrid>
+      <w:tr>
+        <w:trPr>
+          <w:tblHeader/>
+        </w:trPr>
+        <w:tc>
+          <w:tcPr>
+            <w:tcW w:type="dxa" w:w="700"/>
+            <w:shd w:fill="1F3864" w:val="clear"/>
+            <w:tcMar>
+              <w:top w:type="dxa" w:w="60"/>
+              <w:left w:type="dxa" w:w="100"/>
+              <w:bottom w:type="dxa" w:w="60"/>
+              <w:right w:type="dxa" w:w="100"/>
+            </w:tcMar>
+            <w:vAlign w:val="center"/>
+          </w:tcPr>
+          <w:p>
+            <w:pPr>
+              <w:jc w:val="left"/>
+            </w:pPr>
+            <w:r>
+              <w:rPr>
+                <w:b/>
+                <w:bCs/>
+                <w:color w:val="FFFFFF"/>
+                <w:sz w:val="19"/>
+                <w:szCs w:val="19"/>
+              </w:rPr>
+              <w:t xml:space="preserve">Code</w:t>
+            </w:r>
+          </w:p>
+        </w:tc>
+        <w:tc>
+          <w:tcPr>
+            <w:tcW w:type="dxa" w:w="1700"/>
+            <w:shd w:fill="1F3864" w:val="clear"/>
+            <w:tcMar>
+              <w:top w:type="dxa" w:w="60"/>
+              <w:left w:type="dxa" w:w="100"/>
+              <w:bottom w:type="dxa" w:w="60"/>
+              <w:right w:type="dxa" w:w="100"/>
+            </w:tcMar>
+            <w:vAlign w:val="center"/>
+          </w:tcPr>
+          <w:p>
+            <w:pPr>
+              <w:jc w:val="left"/>
+            </w:pPr>
+            <w:r>
+              <w:rPr>
+                <w:b/>
+                <w:bCs/>
+                <w:color w:val="FFFFFF"/>
+                <w:sz w:val="19"/>
+                <w:szCs w:val="19"/>
+              </w:rPr>
+              <w:t xml:space="preserve">Product</w:t>
+            </w:r>
+          </w:p>
+        </w:tc>
+        <w:tc>
+          <w:tcPr>
+            <w:tcW w:type="dxa" w:w="3000"/>
+            <w:shd w:fill="1F3864" w:val="clear"/>
+            <w:tcMar>
+              <w:top w:type="dxa" w:w="60"/>
+              <w:left w:type="dxa" w:w="100"/>
+              <w:bottom w:type="dxa" w:w="60"/>
+              <w:right w:type="dxa" w:w="100"/>
+            </w:tcMar>
+            <w:vAlign w:val="center"/>
+          </w:tcPr>
+          <w:p>
+            <w:pPr>
+              <w:jc w:val="left"/>
+            </w:pPr>
+            <w:r>
+              <w:rPr>
+                <w:b/>
+                <w:bCs/>
+                <w:color w:val="FFFFFF"/>
+                <w:sz w:val="19"/>
+                <w:szCs w:val="19"/>
+              </w:rPr>
+              <w:t xml:space="preserve">Type and schedule</w:t>
+            </w:r>
+          </w:p>
+        </w:tc>
+        <w:tc>
+          <w:tcPr>
+            <w:tcW w:type="dxa" w:w="1300"/>
+            <w:shd w:fill="1F3864" w:val="clear"/>
+            <w:tcMar>
+              <w:top w:type="dxa" w:w="60"/>
+              <w:left w:type="dxa" w:w="100"/>
+              <w:bottom w:type="dxa" w:w="60"/>
+              <w:right w:type="dxa" w:w="100"/>
+            </w:tcMar>
+            <w:vAlign w:val="center"/>
+          </w:tcPr>
+          <w:p>
+            <w:pPr>
+              <w:jc w:val="left"/>
+            </w:pPr>
+            <w:r>
+              <w:rPr>
+                <w:b/>
+                <w:bCs/>
+                <w:color w:val="FFFFFF"/>
+                <w:sz w:val="19"/>
+                <w:szCs w:val="19"/>
+              </w:rPr>
+              <w:t xml:space="preserve">Rate (default, band)</w:t>
+            </w:r>
+          </w:p>
+        </w:tc>
+        <w:tc>
+          <w:tcPr>
+            <w:tcW w:type="dxa" w:w="1700"/>
+            <w:shd w:fill="1F3864" w:val="clear"/>
+            <w:tcMar>
+              <w:top w:type="dxa" w:w="60"/>
+              <w:left w:type="dxa" w:w="100"/>
+              <w:bottom w:type="dxa" w:w="60"/>
+              <w:right w:type="dxa" w:w="100"/>
+            </w:tcMar>
+            <w:vAlign w:val="center"/>
+          </w:tcPr>
+          <w:p>
+            <w:pPr>
+              <w:jc w:val="left"/>
+            </w:pPr>
+            <w:r>
+              <w:rPr>
+                <w:b/>
+                <w:bCs/>
+                <w:color w:val="FFFFFF"/>
+                <w:sz w:val="19"/>
+                <w:szCs w:val="19"/>
+              </w:rPr>
+              <w:t xml:space="preserve">Amount</w:t>
+            </w:r>
+          </w:p>
+        </w:tc>
+        <w:tc>
+          <w:tcPr>
+            <w:tcW w:type="dxa" w:w="1100"/>
+            <w:shd w:fill="1F3864" w:val="clear"/>
+            <w:tcMar>
+              <w:top w:type="dxa" w:w="60"/>
+              <w:left w:type="dxa" w:w="100"/>
+              <w:bottom w:type="dxa" w:w="60"/>
+              <w:right w:type="dxa" w:w="100"/>
+            </w:tcMar>
+            <w:vAlign w:val="center"/>
+          </w:tcPr>
+          <w:p>
+            <w:pPr>
+              <w:jc w:val="left"/>
+            </w:pPr>
+            <w:r>
+              <w:rPr>
+                <w:b/>
+                <w:bCs/>
+                <w:color w:val="FFFFFF"/>
+                <w:sz w:val="19"/>
+                <w:szCs w:val="19"/>
+              </w:rPr>
+              <w:t xml:space="preserve">Tenure (months)</w:t>
+            </w:r>
+          </w:p>
+        </w:tc>
+      </w:tr>
+      <w:tr>
+        <w:trPr>
+          <w:cantSplit/>
+        </w:trPr>
+        <w:tc>
+          <w:tcPr>
+            <w:tcW w:type="dxa" w:w="700"/>
+            <w:tcMar>
+              <w:top w:type="dxa" w:w="60"/>
+              <w:left w:type="dxa" w:w="100"/>
+              <w:bottom w:type="dxa" w:w="60"/>
+              <w:right w:type="dxa" w:w="100"/>
+            </w:tcMar>
+            <w:vAlign w:val="center"/>
+          </w:tcPr>
+          <w:p>
+            <w:pPr>
+              <w:jc w:val="left"/>
+            </w:pPr>
+            <w:r>
+              <w:rPr>
+                <w:sz w:val="19"/>
+                <w:szCs w:val="19"/>
+              </w:rPr>
+              <w:t xml:space="preserve">PL01</w:t>
+            </w:r>
+          </w:p>
+        </w:tc>
+        <w:tc>
+          <w:tcPr>
+            <w:tcW w:type="dxa" w:w="1700"/>
+            <w:tcMar>
+              <w:top w:type="dxa" w:w="60"/>
+              <w:left w:type="dxa" w:w="100"/>
+              <w:bottom w:type="dxa" w:w="60"/>
+              <w:right w:type="dxa" w:w="100"/>
+            </w:tcMar>
+            <w:vAlign w:val="center"/>
+          </w:tcPr>
+          <w:p>
+            <w:pPr>
+              <w:jc w:val="left"/>
+            </w:pPr>
+            <w:r>
+              <w:rPr>
+                <w:sz w:val="19"/>
+                <w:szCs w:val="19"/>
+              </w:rPr>
+              <w:t xml:space="preserve">Personal Loan</w:t>
+            </w:r>
+          </w:p>
+        </w:tc>
+        <w:tc>
+          <w:tcPr>
+            <w:tcW w:type="dxa" w:w="3000"/>
+            <w:tcMar>
+              <w:top w:type="dxa" w:w="60"/>
+              <w:left w:type="dxa" w:w="100"/>
+              <w:bottom w:type="dxa" w:w="60"/>
+              <w:right w:type="dxa" w:w="100"/>
+            </w:tcMar>
+            <w:vAlign w:val="center"/>
+          </w:tcPr>
+          <w:p>
+            <w:pPr>
+              <w:jc w:val="left"/>
+            </w:pPr>
+            <w:r>
+              <w:rPr>
+                <w:sz w:val="19"/>
+                <w:szCs w:val="19"/>
+              </w:rPr>
+              <w:t xml:space="preserve">Unsecured, fixed; EMI</w:t>
+            </w:r>
+          </w:p>
+        </w:tc>
+        <w:tc>
+          <w:tcPr>
+            <w:tcW w:type="dxa" w:w="1300"/>
+            <w:tcMar>
+              <w:top w:type="dxa" w:w="60"/>
+              <w:left w:type="dxa" w:w="100"/>
+              <w:bottom w:type="dxa" w:w="60"/>
+              <w:right w:type="dxa" w:w="100"/>
+            </w:tcMar>
+            <w:vAlign w:val="center"/>
+          </w:tcPr>
+          <w:p>
+            <w:pPr>
+              <w:jc w:val="left"/>
+            </w:pPr>
+            <w:r>
+              <w:rPr>
+                <w:sz w:val="19"/>
+                <w:szCs w:val="19"/>
+              </w:rPr>
+              <w:t xml:space="preserve">10.5% (8-17)</w:t>
+            </w:r>
+          </w:p>
+        </w:tc>
+        <w:tc>
+          <w:tcPr>
+            <w:tcW w:type="dxa" w:w="1700"/>
+            <w:tcMar>
+              <w:top w:type="dxa" w:w="60"/>
+              <w:left w:type="dxa" w:w="100"/>
+              <w:bottom w:type="dxa" w:w="60"/>
+              <w:right w:type="dxa" w:w="100"/>
+            </w:tcMar>
+            <w:vAlign w:val="center"/>
+          </w:tcPr>
+          <w:p>
+            <w:pPr>
+              <w:jc w:val="left"/>
+            </w:pPr>
+            <w:r>
+              <w:rPr>
+                <w:sz w:val="19"/>
+                <w:szCs w:val="19"/>
+              </w:rPr>
+              <w:t xml:space="preserve">50,000 - 5,000,000</w:t>
+            </w:r>
+          </w:p>
+        </w:tc>
+        <w:tc>
+          <w:tcPr>
+            <w:tcW w:type="dxa" w:w="1100"/>
+            <w:tcMar>
+              <w:top w:type="dxa" w:w="60"/>
+              <w:left w:type="dxa" w:w="100"/>
+              <w:bottom w:type="dxa" w:w="60"/>
+              <w:right w:type="dxa" w:w="100"/>
+            </w:tcMar>
+            <w:vAlign w:val="center"/>
+          </w:tcPr>
+          <w:p>
+            <w:pPr>
+              <w:jc w:val="left"/>
+            </w:pPr>
+            <w:r>
+              <w:rPr>
+                <w:sz w:val="19"/>
+                <w:szCs w:val="19"/>
+              </w:rPr>
+              <w:t xml:space="preserve">6 - 84</w:t>
+            </w:r>
+          </w:p>
+        </w:tc>
+      </w:tr>
+      <w:tr>
+        <w:trPr>
+          <w:cantSplit/>
+        </w:trPr>
+        <w:tc>
+          <w:tcPr>
+            <w:tcW w:type="dxa" w:w="700"/>
+            <w:shd w:fill="F5F8FC" w:val="clear"/>
+            <w:tcMar>
+              <w:top w:type="dxa" w:w="60"/>
+              <w:left w:type="dxa" w:w="100"/>
+              <w:bottom w:type="dxa" w:w="60"/>
+              <w:right w:type="dxa" w:w="100"/>
+            </w:tcMar>
+            <w:vAlign w:val="center"/>
+          </w:tcPr>
+          <w:p>
+            <w:pPr>
+              <w:jc w:val="left"/>
+            </w:pPr>
+            <w:r>
+              <w:rPr>
+                <w:sz w:val="19"/>
+                <w:szCs w:val="19"/>
+              </w:rPr>
+              <w:t xml:space="preserve">BL01</w:t>
+            </w:r>
+          </w:p>
+        </w:tc>
+        <w:tc>
+          <w:tcPr>
+            <w:tcW w:type="dxa" w:w="1700"/>
+            <w:shd w:fill="F5F8FC" w:val="clear"/>
+            <w:tcMar>
+              <w:top w:type="dxa" w:w="60"/>
+              <w:left w:type="dxa" w:w="100"/>
+              <w:bottom w:type="dxa" w:w="60"/>
+              <w:right w:type="dxa" w:w="100"/>
+            </w:tcMar>
+            <w:vAlign w:val="center"/>
+          </w:tcPr>
+          <w:p>
+            <w:pPr>
+              <w:jc w:val="left"/>
+            </w:pPr>
+            <w:r>
+              <w:rPr>
+                <w:sz w:val="19"/>
+                <w:szCs w:val="19"/>
+              </w:rPr>
+              <w:t xml:space="preserve">Business Loan</w:t>
+            </w:r>
+          </w:p>
+        </w:tc>
+        <w:tc>
+          <w:tcPr>
+            <w:tcW w:type="dxa" w:w="3000"/>
+            <w:shd w:fill="F5F8FC" w:val="clear"/>
+            <w:tcMar>
+              <w:top w:type="dxa" w:w="60"/>
+              <w:left w:type="dxa" w:w="100"/>
+              <w:bottom w:type="dxa" w:w="60"/>
+              <w:right w:type="dxa" w:w="100"/>
+            </w:tcMar>
+            <w:vAlign w:val="center"/>
+          </w:tcPr>
+          <w:p>
+            <w:pPr>
+              <w:jc w:val="left"/>
+            </w:pPr>
+            <w:r>
+              <w:rPr>
+                <w:sz w:val="19"/>
+                <w:szCs w:val="19"/>
+              </w:rPr>
+              <w:t xml:space="preserve">Unsecured, fixed; EMI</w:t>
+            </w:r>
+          </w:p>
+        </w:tc>
+        <w:tc>
+          <w:tcPr>
+            <w:tcW w:type="dxa" w:w="1300"/>
+            <w:shd w:fill="F5F8FC" w:val="clear"/>
+            <w:tcMar>
+              <w:top w:type="dxa" w:w="60"/>
+              <w:left w:type="dxa" w:w="100"/>
+              <w:bottom w:type="dxa" w:w="60"/>
+              <w:right w:type="dxa" w:w="100"/>
+            </w:tcMar>
+            <w:vAlign w:val="center"/>
+          </w:tcPr>
+          <w:p>
+            <w:pPr>
+              <w:jc w:val="left"/>
+            </w:pPr>
+            <w:r>
+              <w:rPr>
+                <w:sz w:val="19"/>
+                <w:szCs w:val="19"/>
+              </w:rPr>
+              <w:t xml:space="preserve">11.5% (9-17)</w:t>
+            </w:r>
+          </w:p>
+        </w:tc>
+        <w:tc>
+          <w:tcPr>
+            <w:tcW w:type="dxa" w:w="1700"/>
+            <w:shd w:fill="F5F8FC" w:val="clear"/>
+            <w:tcMar>
+              <w:top w:type="dxa" w:w="60"/>
+              <w:left w:type="dxa" w:w="100"/>
+              <w:bottom w:type="dxa" w:w="60"/>
+              <w:right w:type="dxa" w:w="100"/>
+            </w:tcMar>
+            <w:vAlign w:val="center"/>
+          </w:tcPr>
+          <w:p>
+            <w:pPr>
+              <w:jc w:val="left"/>
+            </w:pPr>
+            <w:r>
+              <w:rPr>
+                <w:sz w:val="19"/>
+                <w:szCs w:val="19"/>
+              </w:rPr>
+              <w:t xml:space="preserve">100,000 - 10,000,000</w:t>
+            </w:r>
+          </w:p>
+        </w:tc>
+        <w:tc>
+          <w:tcPr>
+            <w:tcW w:type="dxa" w:w="1100"/>
+            <w:shd w:fill="F5F8FC" w:val="clear"/>
+            <w:tcMar>
+              <w:top w:type="dxa" w:w="60"/>
+              <w:left w:type="dxa" w:w="100"/>
+              <w:bottom w:type="dxa" w:w="60"/>
+              <w:right w:type="dxa" w:w="100"/>
+            </w:tcMar>
+            <w:vAlign w:val="center"/>
+          </w:tcPr>
+          <w:p>
+            <w:pPr>
+              <w:jc w:val="left"/>
+            </w:pPr>
+            <w:r>
+              <w:rPr>
+                <w:sz w:val="19"/>
+                <w:szCs w:val="19"/>
+              </w:rPr>
+              <w:t xml:space="preserve">12 - 120</w:t>
+            </w:r>
+          </w:p>
+        </w:tc>
+      </w:tr>
+      <w:tr>
+        <w:trPr>
+          <w:cantSplit/>
+        </w:trPr>
+        <w:tc>
+          <w:tcPr>
+            <w:tcW w:type="dxa" w:w="700"/>
+            <w:tcMar>
+              <w:top w:type="dxa" w:w="60"/>
+              <w:left w:type="dxa" w:w="100"/>
+              <w:bottom w:type="dxa" w:w="60"/>
+              <w:right w:type="dxa" w:w="100"/>
+            </w:tcMar>
+            <w:vAlign w:val="center"/>
+          </w:tcPr>
+          <w:p>
+            <w:pPr>
+              <w:jc w:val="left"/>
+            </w:pPr>
+            <w:r>
+              <w:rPr>
+                <w:sz w:val="19"/>
+                <w:szCs w:val="19"/>
+              </w:rPr>
+              <w:t xml:space="preserve">EL01</w:t>
+            </w:r>
+          </w:p>
+        </w:tc>
+        <w:tc>
+          <w:tcPr>
+            <w:tcW w:type="dxa" w:w="1700"/>
+            <w:tcMar>
+              <w:top w:type="dxa" w:w="60"/>
+              <w:left w:type="dxa" w:w="100"/>
+              <w:bottom w:type="dxa" w:w="60"/>
+              <w:right w:type="dxa" w:w="100"/>
+            </w:tcMar>
+            <w:vAlign w:val="center"/>
+          </w:tcPr>
+          <w:p>
+            <w:pPr>
+              <w:jc w:val="left"/>
+            </w:pPr>
+            <w:r>
+              <w:rPr>
+                <w:sz w:val="19"/>
+                <w:szCs w:val="19"/>
+              </w:rPr>
+              <w:t xml:space="preserve">Education Loan</w:t>
+            </w:r>
+          </w:p>
+        </w:tc>
+        <w:tc>
+          <w:tcPr>
+            <w:tcW w:type="dxa" w:w="3000"/>
+            <w:tcMar>
+              <w:top w:type="dxa" w:w="60"/>
+              <w:left w:type="dxa" w:w="100"/>
+              <w:bottom w:type="dxa" w:w="60"/>
+              <w:right w:type="dxa" w:w="100"/>
+            </w:tcMar>
+            <w:vAlign w:val="center"/>
+          </w:tcPr>
+          <w:p>
+            <w:pPr>
+              <w:jc w:val="left"/>
+            </w:pPr>
+            <w:r>
+              <w:rPr>
+                <w:sz w:val="19"/>
+                <w:szCs w:val="19"/>
+              </w:rPr>
+              <w:t xml:space="preserve">Unsecured, fixed; EMI</w:t>
+            </w:r>
+          </w:p>
+        </w:tc>
+        <w:tc>
+          <w:tcPr>
+            <w:tcW w:type="dxa" w:w="1300"/>
+            <w:tcMar>
+              <w:top w:type="dxa" w:w="60"/>
+              <w:left w:type="dxa" w:w="100"/>
+              <w:bottom w:type="dxa" w:w="60"/>
+              <w:right w:type="dxa" w:w="100"/>
+            </w:tcMar>
+            <w:vAlign w:val="center"/>
+          </w:tcPr>
+          <w:p>
+            <w:pPr>
+              <w:jc w:val="left"/>
+            </w:pPr>
+            <w:r>
+              <w:rPr>
+                <w:sz w:val="19"/>
+                <w:szCs w:val="19"/>
+              </w:rPr>
+              <w:t xml:space="preserve">9.5% (8-13)</w:t>
+            </w:r>
+          </w:p>
+        </w:tc>
+        <w:tc>
+          <w:tcPr>
+            <w:tcW w:type="dxa" w:w="1700"/>
+            <w:tcMar>
+              <w:top w:type="dxa" w:w="60"/>
+              <w:left w:type="dxa" w:w="100"/>
+              <w:bottom w:type="dxa" w:w="60"/>
+              <w:right w:type="dxa" w:w="100"/>
+            </w:tcMar>
+            <w:vAlign w:val="center"/>
+          </w:tcPr>
+          <w:p>
+            <w:pPr>
+              <w:jc w:val="left"/>
+            </w:pPr>
+            <w:r>
+              <w:rPr>
+                <w:sz w:val="19"/>
+                <w:szCs w:val="19"/>
+              </w:rPr>
+              <w:t xml:space="preserve">100,000 - 5,000,000</w:t>
+            </w:r>
+          </w:p>
+        </w:tc>
+        <w:tc>
+          <w:tcPr>
+            <w:tcW w:type="dxa" w:w="1100"/>
+            <w:tcMar>
+              <w:top w:type="dxa" w:w="60"/>
+              <w:left w:type="dxa" w:w="100"/>
+              <w:bottom w:type="dxa" w:w="60"/>
+              <w:right w:type="dxa" w:w="100"/>
+            </w:tcMar>
+            <w:vAlign w:val="center"/>
+          </w:tcPr>
+          <w:p>
+            <w:pPr>
+              <w:jc w:val="left"/>
+            </w:pPr>
+            <w:r>
+              <w:rPr>
+                <w:sz w:val="19"/>
+                <w:szCs w:val="19"/>
+              </w:rPr>
+              <w:t xml:space="preserve">12 - 120</w:t>
+            </w:r>
+          </w:p>
+        </w:tc>
+      </w:tr>
+      <w:tr>
+        <w:trPr>
+          <w:cantSplit/>
+        </w:trPr>
+        <w:tc>
+          <w:tcPr>
+            <w:tcW w:type="dxa" w:w="700"/>
+            <w:shd w:fill="F5F8FC" w:val="clear"/>
+            <w:tcMar>
+              <w:top w:type="dxa" w:w="60"/>
+              <w:left w:type="dxa" w:w="100"/>
+              <w:bottom w:type="dxa" w:w="60"/>
+              <w:right w:type="dxa" w:w="100"/>
+            </w:tcMar>
+            <w:vAlign w:val="center"/>
+          </w:tcPr>
+          <w:p>
+            <w:pPr>
+              <w:jc w:val="left"/>
+            </w:pPr>
+            <w:r>
+              <w:rPr>
+                <w:sz w:val="19"/>
+                <w:szCs w:val="19"/>
+              </w:rPr>
+              <w:t xml:space="preserve">GL01</w:t>
+            </w:r>
+          </w:p>
+        </w:tc>
+        <w:tc>
+          <w:tcPr>
+            <w:tcW w:type="dxa" w:w="1700"/>
+            <w:shd w:fill="F5F8FC" w:val="clear"/>
+            <w:tcMar>
+              <w:top w:type="dxa" w:w="60"/>
+              <w:left w:type="dxa" w:w="100"/>
+              <w:bottom w:type="dxa" w:w="60"/>
+              <w:right w:type="dxa" w:w="100"/>
+            </w:tcMar>
+            <w:vAlign w:val="center"/>
+          </w:tcPr>
+          <w:p>
+            <w:pPr>
+              <w:jc w:val="left"/>
+            </w:pPr>
+            <w:r>
+              <w:rPr>
+                <w:sz w:val="19"/>
+                <w:szCs w:val="19"/>
+              </w:rPr>
+              <w:t xml:space="preserve">Gold Loan</w:t>
+            </w:r>
+          </w:p>
+        </w:tc>
+        <w:tc>
+          <w:tcPr>
+            <w:tcW w:type="dxa" w:w="3000"/>
+            <w:shd w:fill="F5F8FC" w:val="clear"/>
+            <w:tcMar>
+              <w:top w:type="dxa" w:w="60"/>
+              <w:left w:type="dxa" w:w="100"/>
+              <w:bottom w:type="dxa" w:w="60"/>
+              <w:right w:type="dxa" w:w="100"/>
+            </w:tcMar>
+            <w:vAlign w:val="center"/>
+          </w:tcPr>
+          <w:p>
+            <w:pPr>
+              <w:jc w:val="left"/>
+            </w:pPr>
+            <w:r>
+              <w:rPr>
+                <w:sz w:val="19"/>
+                <w:szCs w:val="19"/>
+              </w:rPr>
+              <w:t xml:space="preserve">Unsecured, fixed; EMI</w:t>
+            </w:r>
+          </w:p>
+        </w:tc>
+        <w:tc>
+          <w:tcPr>
+            <w:tcW w:type="dxa" w:w="1300"/>
+            <w:shd w:fill="F5F8FC" w:val="clear"/>
+            <w:tcMar>
+              <w:top w:type="dxa" w:w="60"/>
+              <w:left w:type="dxa" w:w="100"/>
+              <w:bottom w:type="dxa" w:w="60"/>
+              <w:right w:type="dxa" w:w="100"/>
+            </w:tcMar>
+            <w:vAlign w:val="center"/>
+          </w:tcPr>
+          <w:p>
+            <w:pPr>
+              <w:jc w:val="left"/>
+            </w:pPr>
+            <w:r>
+              <w:rPr>
+                <w:sz w:val="19"/>
+                <w:szCs w:val="19"/>
+              </w:rPr>
+              <w:t xml:space="preserve">9.0% (7-13)</w:t>
+            </w:r>
+          </w:p>
+        </w:tc>
+        <w:tc>
+          <w:tcPr>
+            <w:tcW w:type="dxa" w:w="1700"/>
+            <w:shd w:fill="F5F8FC" w:val="clear"/>
+            <w:tcMar>
+              <w:top w:type="dxa" w:w="60"/>
+              <w:left w:type="dxa" w:w="100"/>
+              <w:bottom w:type="dxa" w:w="60"/>
+              <w:right w:type="dxa" w:w="100"/>
+            </w:tcMar>
+            <w:vAlign w:val="center"/>
+          </w:tcPr>
+          <w:p>
+            <w:pPr>
+              <w:jc w:val="left"/>
+            </w:pPr>
+            <w:r>
+              <w:rPr>
+                <w:sz w:val="19"/>
+                <w:szCs w:val="19"/>
+              </w:rPr>
+              <w:t xml:space="preserve">10,000 - 1,000,000</w:t>
+            </w:r>
+          </w:p>
+        </w:tc>
+        <w:tc>
+          <w:tcPr>
+            <w:tcW w:type="dxa" w:w="1100"/>
+            <w:shd w:fill="F5F8FC" w:val="clear"/>
+            <w:tcMar>
+              <w:top w:type="dxa" w:w="60"/>
+              <w:left w:type="dxa" w:w="100"/>
+              <w:bottom w:type="dxa" w:w="60"/>
+              <w:right w:type="dxa" w:w="100"/>
+            </w:tcMar>
+            <w:vAlign w:val="center"/>
+          </w:tcPr>
+          <w:p>
+            <w:pPr>
+              <w:jc w:val="left"/>
+            </w:pPr>
+            <w:r>
+              <w:rPr>
+                <w:sz w:val="19"/>
+                <w:szCs w:val="19"/>
+              </w:rPr>
+              <w:t xml:space="preserve">3 - 36</w:t>
+            </w:r>
+          </w:p>
+        </w:tc>
+      </w:tr>
+      <w:tr>
+        <w:trPr>
+          <w:cantSplit/>
+        </w:trPr>
+        <w:tc>
+          <w:tcPr>
+            <w:tcW w:type="dxa" w:w="700"/>
+            <w:tcMar>
+              <w:top w:type="dxa" w:w="60"/>
+              <w:left w:type="dxa" w:w="100"/>
+              <w:bottom w:type="dxa" w:w="60"/>
+              <w:right w:type="dxa" w:w="100"/>
+            </w:tcMar>
+            <w:vAlign w:val="center"/>
+          </w:tcPr>
+          <w:p>
+            <w:pPr>
+              <w:jc w:val="left"/>
+            </w:pPr>
+            <w:r>
+              <w:rPr>
+                <w:sz w:val="19"/>
+                <w:szCs w:val="19"/>
+              </w:rPr>
+              <w:t xml:space="preserve">AL01</w:t>
+            </w:r>
+          </w:p>
+        </w:tc>
+        <w:tc>
+          <w:tcPr>
+            <w:tcW w:type="dxa" w:w="1700"/>
+            <w:tcMar>
+              <w:top w:type="dxa" w:w="60"/>
+              <w:left w:type="dxa" w:w="100"/>
+              <w:bottom w:type="dxa" w:w="60"/>
+              <w:right w:type="dxa" w:w="100"/>
+            </w:tcMar>
+            <w:vAlign w:val="center"/>
+          </w:tcPr>
+          <w:p>
+            <w:pPr>
+              <w:jc w:val="left"/>
+            </w:pPr>
+            <w:r>
+              <w:rPr>
+                <w:sz w:val="19"/>
+                <w:szCs w:val="19"/>
+              </w:rPr>
+              <w:t xml:space="preserve">Auto Loan</w:t>
+            </w:r>
+          </w:p>
+        </w:tc>
+        <w:tc>
+          <w:tcPr>
+            <w:tcW w:type="dxa" w:w="3000"/>
+            <w:tcMar>
+              <w:top w:type="dxa" w:w="60"/>
+              <w:left w:type="dxa" w:w="100"/>
+              <w:bottom w:type="dxa" w:w="60"/>
+              <w:right w:type="dxa" w:w="100"/>
+            </w:tcMar>
+            <w:vAlign w:val="center"/>
+          </w:tcPr>
+          <w:p>
+            <w:pPr>
+              <w:jc w:val="left"/>
+            </w:pPr>
+            <w:r>
+              <w:rPr>
+                <w:sz w:val="19"/>
+                <w:szCs w:val="19"/>
+              </w:rPr>
+              <w:t xml:space="preserve">Unsecured, floating on REPO, spread 3.0 (1-5); EMI</w:t>
+            </w:r>
+          </w:p>
+        </w:tc>
+        <w:tc>
+          <w:tcPr>
+            <w:tcW w:type="dxa" w:w="1300"/>
+            <w:tcMar>
+              <w:top w:type="dxa" w:w="60"/>
+              <w:left w:type="dxa" w:w="100"/>
+              <w:bottom w:type="dxa" w:w="60"/>
+              <w:right w:type="dxa" w:w="100"/>
+            </w:tcMar>
+            <w:vAlign w:val="center"/>
+          </w:tcPr>
+          <w:p>
+            <w:pPr>
+              <w:jc w:val="left"/>
+            </w:pPr>
+            <w:r>
+              <w:rPr>
+                <w:sz w:val="19"/>
+                <w:szCs w:val="19"/>
+              </w:rPr>
+              <w:t xml:space="preserve">9.75% (8-13)</w:t>
+            </w:r>
+          </w:p>
+        </w:tc>
+        <w:tc>
+          <w:tcPr>
+            <w:tcW w:type="dxa" w:w="1700"/>
+            <w:tcMar>
+              <w:top w:type="dxa" w:w="60"/>
+              <w:left w:type="dxa" w:w="100"/>
+              <w:bottom w:type="dxa" w:w="60"/>
+              <w:right w:type="dxa" w:w="100"/>
+            </w:tcMar>
+            <w:vAlign w:val="center"/>
+          </w:tcPr>
+          <w:p>
+            <w:pPr>
+              <w:jc w:val="left"/>
+            </w:pPr>
+            <w:r>
+              <w:rPr>
+                <w:sz w:val="19"/>
+                <w:szCs w:val="19"/>
+              </w:rPr>
+              <w:t xml:space="preserve">100,000 - 5,000,000</w:t>
+            </w:r>
+          </w:p>
+        </w:tc>
+        <w:tc>
+          <w:tcPr>
+            <w:tcW w:type="dxa" w:w="1100"/>
+            <w:tcMar>
+              <w:top w:type="dxa" w:w="60"/>
+              <w:left w:type="dxa" w:w="100"/>
+              <w:bottom w:type="dxa" w:w="60"/>
+              <w:right w:type="dxa" w:w="100"/>
+            </w:tcMar>
+            <w:vAlign w:val="center"/>
+          </w:tcPr>
+          <w:p>
+            <w:pPr>
+              <w:jc w:val="left"/>
+            </w:pPr>
+            <w:r>
+              <w:rPr>
+                <w:sz w:val="19"/>
+                <w:szCs w:val="19"/>
+              </w:rPr>
+              <w:t xml:space="preserve">12 - 84</w:t>
+            </w:r>
+          </w:p>
+        </w:tc>
+      </w:tr>
+      <w:tr>
+        <w:trPr>
+          <w:cantSplit/>
+        </w:trPr>
+        <w:tc>
+          <w:tcPr>
+            <w:tcW w:type="dxa" w:w="700"/>
+            <w:shd w:fill="F5F8FC" w:val="clear"/>
+            <w:tcMar>
+              <w:top w:type="dxa" w:w="60"/>
+              <w:left w:type="dxa" w:w="100"/>
+              <w:bottom w:type="dxa" w:w="60"/>
+              <w:right w:type="dxa" w:w="100"/>
+            </w:tcMar>
+            <w:vAlign w:val="center"/>
+          </w:tcPr>
+          <w:p>
+            <w:pPr>
+              <w:jc w:val="left"/>
+            </w:pPr>
+            <w:r>
+              <w:rPr>
+                <w:sz w:val="19"/>
+                <w:szCs w:val="19"/>
+              </w:rPr>
+              <w:t xml:space="preserve">HL01</w:t>
+            </w:r>
+          </w:p>
+        </w:tc>
+        <w:tc>
+          <w:tcPr>
+            <w:tcW w:type="dxa" w:w="1700"/>
+            <w:shd w:fill="F5F8FC" w:val="clear"/>
+            <w:tcMar>
+              <w:top w:type="dxa" w:w="60"/>
+              <w:left w:type="dxa" w:w="100"/>
+              <w:bottom w:type="dxa" w:w="60"/>
+              <w:right w:type="dxa" w:w="100"/>
+            </w:tcMar>
+            <w:vAlign w:val="center"/>
+          </w:tcPr>
+          <w:p>
+            <w:pPr>
+              <w:jc w:val="left"/>
+            </w:pPr>
+            <w:r>
+              <w:rPr>
+                <w:sz w:val="19"/>
+                <w:szCs w:val="19"/>
+              </w:rPr>
+              <w:t xml:space="preserve">Home Loan</w:t>
+            </w:r>
+          </w:p>
+        </w:tc>
+        <w:tc>
+          <w:tcPr>
+            <w:tcW w:type="dxa" w:w="3000"/>
+            <w:shd w:fill="F5F8FC" w:val="clear"/>
+            <w:tcMar>
+              <w:top w:type="dxa" w:w="60"/>
+              <w:left w:type="dxa" w:w="100"/>
+              <w:bottom w:type="dxa" w:w="60"/>
+              <w:right w:type="dxa" w:w="100"/>
+            </w:tcMar>
+            <w:vAlign w:val="center"/>
+          </w:tcPr>
+          <w:p>
+            <w:pPr>
+              <w:jc w:val="left"/>
+            </w:pPr>
+            <w:r>
+              <w:rPr>
+                <w:sz w:val="19"/>
+                <w:szCs w:val="19"/>
+              </w:rPr>
+              <w:t xml:space="preserve">Mortgage, floating on REPO, spread 2.5 (1-5); EMI</w:t>
+            </w:r>
+          </w:p>
+        </w:tc>
+        <w:tc>
+          <w:tcPr>
+            <w:tcW w:type="dxa" w:w="1300"/>
+            <w:shd w:fill="F5F8FC" w:val="clear"/>
+            <w:tcMar>
+              <w:top w:type="dxa" w:w="60"/>
+              <w:left w:type="dxa" w:w="100"/>
+              <w:bottom w:type="dxa" w:w="60"/>
+              <w:right w:type="dxa" w:w="100"/>
+            </w:tcMar>
+            <w:vAlign w:val="center"/>
+          </w:tcPr>
+          <w:p>
+            <w:pPr>
+              <w:jc w:val="left"/>
+            </w:pPr>
+            <w:r>
+              <w:rPr>
+                <w:sz w:val="19"/>
+                <w:szCs w:val="19"/>
+              </w:rPr>
+              <w:t xml:space="preserve">8.75% (8-13)</w:t>
+            </w:r>
+          </w:p>
+        </w:tc>
+        <w:tc>
+          <w:tcPr>
+            <w:tcW w:type="dxa" w:w="1700"/>
+            <w:shd w:fill="F5F8FC" w:val="clear"/>
+            <w:tcMar>
+              <w:top w:type="dxa" w:w="60"/>
+              <w:left w:type="dxa" w:w="100"/>
+              <w:bottom w:type="dxa" w:w="60"/>
+              <w:right w:type="dxa" w:w="100"/>
+            </w:tcMar>
+            <w:vAlign w:val="center"/>
+          </w:tcPr>
+          <w:p>
+            <w:pPr>
+              <w:jc w:val="left"/>
+            </w:pPr>
+            <w:r>
+              <w:rPr>
+                <w:sz w:val="19"/>
+                <w:szCs w:val="19"/>
+              </w:rPr>
+              <w:t xml:space="preserve">500,000 - 50,000,000</w:t>
+            </w:r>
+          </w:p>
+        </w:tc>
+        <w:tc>
+          <w:tcPr>
+            <w:tcW w:type="dxa" w:w="1100"/>
+            <w:shd w:fill="F5F8FC" w:val="clear"/>
+            <w:tcMar>
+              <w:top w:type="dxa" w:w="60"/>
+              <w:left w:type="dxa" w:w="100"/>
+              <w:bottom w:type="dxa" w:w="60"/>
+              <w:right w:type="dxa" w:w="100"/>
+            </w:tcMar>
+            <w:vAlign w:val="center"/>
+          </w:tcPr>
+          <w:p>
+            <w:pPr>
+              <w:jc w:val="left"/>
+            </w:pPr>
+            <w:r>
+              <w:rPr>
+                <w:sz w:val="19"/>
+                <w:szCs w:val="19"/>
+              </w:rPr>
+              <w:t xml:space="preserve">60 - 360</w:t>
+            </w:r>
+          </w:p>
+        </w:tc>
+      </w:tr>
+      <w:tr>
+        <w:trPr>
+          <w:cantSplit/>
+        </w:trPr>
+        <w:tc>
+          <w:tcPr>
+            <w:tcW w:type="dxa" w:w="700"/>
+            <w:tcMar>
+              <w:top w:type="dxa" w:w="60"/>
+              <w:left w:type="dxa" w:w="100"/>
+              <w:bottom w:type="dxa" w:w="60"/>
+              <w:right w:type="dxa" w:w="100"/>
+            </w:tcMar>
+            <w:vAlign w:val="center"/>
+          </w:tcPr>
+          <w:p>
+            <w:pPr>
+              <w:jc w:val="left"/>
+            </w:pPr>
+            <w:r>
+              <w:rPr>
+                <w:sz w:val="19"/>
+                <w:szCs w:val="19"/>
+              </w:rPr>
+              <w:t xml:space="preserve">TL01</w:t>
+            </w:r>
+          </w:p>
+        </w:tc>
+        <w:tc>
+          <w:tcPr>
+            <w:tcW w:type="dxa" w:w="1700"/>
+            <w:tcMar>
+              <w:top w:type="dxa" w:w="60"/>
+              <w:left w:type="dxa" w:w="100"/>
+              <w:bottom w:type="dxa" w:w="60"/>
+              <w:right w:type="dxa" w:w="100"/>
+            </w:tcMar>
+            <w:vAlign w:val="center"/>
+          </w:tcPr>
+          <w:p>
+            <w:pPr>
+              <w:jc w:val="left"/>
+            </w:pPr>
+            <w:r>
+              <w:rPr>
+                <w:sz w:val="19"/>
+                <w:szCs w:val="19"/>
+              </w:rPr>
+              <w:t xml:space="preserve">Term Loan - Equal Principal</w:t>
+            </w:r>
+          </w:p>
+        </w:tc>
+        <w:tc>
+          <w:tcPr>
+            <w:tcW w:type="dxa" w:w="3000"/>
+            <w:tcMar>
+              <w:top w:type="dxa" w:w="60"/>
+              <w:left w:type="dxa" w:w="100"/>
+              <w:bottom w:type="dxa" w:w="60"/>
+              <w:right w:type="dxa" w:w="100"/>
+            </w:tcMar>
+            <w:vAlign w:val="center"/>
+          </w:tcPr>
+          <w:p>
+            <w:pPr>
+              <w:jc w:val="left"/>
+            </w:pPr>
+            <w:r>
+              <w:rPr>
+                <w:sz w:val="19"/>
+                <w:szCs w:val="19"/>
+              </w:rPr>
+              <w:t xml:space="preserve">Unsecured, fixed; equal principal, 30E/360; monthly, quarterly or half-yearly</w:t>
+            </w:r>
+          </w:p>
+        </w:tc>
+        <w:tc>
+          <w:tcPr>
+            <w:tcW w:type="dxa" w:w="1300"/>
+            <w:tcMar>
+              <w:top w:type="dxa" w:w="60"/>
+              <w:left w:type="dxa" w:w="100"/>
+              <w:bottom w:type="dxa" w:w="60"/>
+              <w:right w:type="dxa" w:w="100"/>
+            </w:tcMar>
+            <w:vAlign w:val="center"/>
+          </w:tcPr>
+          <w:p>
+            <w:pPr>
+              <w:jc w:val="left"/>
+            </w:pPr>
+            <w:r>
+              <w:rPr>
+                <w:sz w:val="19"/>
+                <w:szCs w:val="19"/>
+              </w:rPr>
+              <w:t xml:space="preserve">11.0% (9-16)</w:t>
+            </w:r>
+          </w:p>
+        </w:tc>
+        <w:tc>
+          <w:tcPr>
+            <w:tcW w:type="dxa" w:w="1700"/>
+            <w:tcMar>
+              <w:top w:type="dxa" w:w="60"/>
+              <w:left w:type="dxa" w:w="100"/>
+              <w:bottom w:type="dxa" w:w="60"/>
+              <w:right w:type="dxa" w:w="100"/>
+            </w:tcMar>
+            <w:vAlign w:val="center"/>
+          </w:tcPr>
+          <w:p>
+            <w:pPr>
+              <w:jc w:val="left"/>
+            </w:pPr>
+            <w:r>
+              <w:rPr>
+                <w:sz w:val="19"/>
+                <w:szCs w:val="19"/>
+              </w:rPr>
+              <w:t xml:space="preserve">100,000 - 20,000,000</w:t>
+            </w:r>
+          </w:p>
+        </w:tc>
+        <w:tc>
+          <w:tcPr>
+            <w:tcW w:type="dxa" w:w="1100"/>
+            <w:tcMar>
+              <w:top w:type="dxa" w:w="60"/>
+              <w:left w:type="dxa" w:w="100"/>
+              <w:bottom w:type="dxa" w:w="60"/>
+              <w:right w:type="dxa" w:w="100"/>
+            </w:tcMar>
+            <w:vAlign w:val="center"/>
+          </w:tcPr>
+          <w:p>
+            <w:pPr>
+              <w:jc w:val="left"/>
+            </w:pPr>
+            <w:r>
+              <w:rPr>
+                <w:sz w:val="19"/>
+                <w:szCs w:val="19"/>
+              </w:rPr>
+              <w:t xml:space="preserve">12 - 120</w:t>
+            </w:r>
+          </w:p>
+        </w:tc>
+      </w:tr>
+      <w:tr>
+        <w:trPr>
+          <w:cantSplit/>
+        </w:trPr>
+        <w:tc>
+          <w:tcPr>
+            <w:tcW w:type="dxa" w:w="700"/>
+            <w:shd w:fill="F5F8FC" w:val="clear"/>
+            <w:tcMar>
+              <w:top w:type="dxa" w:w="60"/>
+              <w:left w:type="dxa" w:w="100"/>
+              <w:bottom w:type="dxa" w:w="60"/>
+              <w:right w:type="dxa" w:w="100"/>
+            </w:tcMar>
+            <w:vAlign w:val="center"/>
+          </w:tcPr>
+          <w:p>
+            <w:pPr>
+              <w:jc w:val="left"/>
+            </w:pPr>
+            <w:r>
+              <w:rPr>
+                <w:sz w:val="19"/>
+                <w:szCs w:val="19"/>
+              </w:rPr>
+              <w:t xml:space="preserve">BB01</w:t>
+            </w:r>
+          </w:p>
+        </w:tc>
+        <w:tc>
+          <w:tcPr>
+            <w:tcW w:type="dxa" w:w="1700"/>
+            <w:shd w:fill="F5F8FC" w:val="clear"/>
+            <w:tcMar>
+              <w:top w:type="dxa" w:w="60"/>
+              <w:left w:type="dxa" w:w="100"/>
+              <w:bottom w:type="dxa" w:w="60"/>
+              <w:right w:type="dxa" w:w="100"/>
+            </w:tcMar>
+            <w:vAlign w:val="center"/>
+          </w:tcPr>
+          <w:p>
+            <w:pPr>
+              <w:jc w:val="left"/>
+            </w:pPr>
+            <w:r>
+              <w:rPr>
+                <w:sz w:val="19"/>
+                <w:szCs w:val="19"/>
+              </w:rPr>
+              <w:t xml:space="preserve">Bridge Loan - Interest Only</w:t>
+            </w:r>
+          </w:p>
+        </w:tc>
+        <w:tc>
+          <w:tcPr>
+            <w:tcW w:type="dxa" w:w="3000"/>
+            <w:shd w:fill="F5F8FC" w:val="clear"/>
+            <w:tcMar>
+              <w:top w:type="dxa" w:w="60"/>
+              <w:left w:type="dxa" w:w="100"/>
+              <w:bottom w:type="dxa" w:w="60"/>
+              <w:right w:type="dxa" w:w="100"/>
+            </w:tcMar>
+            <w:vAlign w:val="center"/>
+          </w:tcPr>
+          <w:p>
+            <w:pPr>
+              <w:jc w:val="left"/>
+            </w:pPr>
+            <w:r>
+              <w:rPr>
+                <w:sz w:val="19"/>
+                <w:szCs w:val="19"/>
+              </w:rPr>
+              <w:t xml:space="preserve">Unsecured, fixed; interest only with the principal in the last instalment, ACT/360; monthly or quarterly</w:t>
+            </w:r>
+          </w:p>
+        </w:tc>
+        <w:tc>
+          <w:tcPr>
+            <w:tcW w:type="dxa" w:w="1300"/>
+            <w:shd w:fill="F5F8FC" w:val="clear"/>
+            <w:tcMar>
+              <w:top w:type="dxa" w:w="60"/>
+              <w:left w:type="dxa" w:w="100"/>
+              <w:bottom w:type="dxa" w:w="60"/>
+              <w:right w:type="dxa" w:w="100"/>
+            </w:tcMar>
+            <w:vAlign w:val="center"/>
+          </w:tcPr>
+          <w:p>
+            <w:pPr>
+              <w:jc w:val="left"/>
+            </w:pPr>
+            <w:r>
+              <w:rPr>
+                <w:sz w:val="19"/>
+                <w:szCs w:val="19"/>
+              </w:rPr>
+              <w:t xml:space="preserve">12.0% (10-18)</w:t>
+            </w:r>
+          </w:p>
+        </w:tc>
+        <w:tc>
+          <w:tcPr>
+            <w:tcW w:type="dxa" w:w="1700"/>
+            <w:shd w:fill="F5F8FC" w:val="clear"/>
+            <w:tcMar>
+              <w:top w:type="dxa" w:w="60"/>
+              <w:left w:type="dxa" w:w="100"/>
+              <w:bottom w:type="dxa" w:w="60"/>
+              <w:right w:type="dxa" w:w="100"/>
+            </w:tcMar>
+            <w:vAlign w:val="center"/>
+          </w:tcPr>
+          <w:p>
+            <w:pPr>
+              <w:jc w:val="left"/>
+            </w:pPr>
+            <w:r>
+              <w:rPr>
+                <w:sz w:val="19"/>
+                <w:szCs w:val="19"/>
+              </w:rPr>
+              <w:t xml:space="preserve">500,000 - 50,000,000</w:t>
+            </w:r>
+          </w:p>
+        </w:tc>
+        <w:tc>
+          <w:tcPr>
+            <w:tcW w:type="dxa" w:w="1100"/>
+            <w:shd w:fill="F5F8FC" w:val="clear"/>
+            <w:tcMar>
+              <w:top w:type="dxa" w:w="60"/>
+              <w:left w:type="dxa" w:w="100"/>
+              <w:bottom w:type="dxa" w:w="60"/>
+              <w:right w:type="dxa" w:w="100"/>
+            </w:tcMar>
+            <w:vAlign w:val="center"/>
+          </w:tcPr>
+          <w:p>
+            <w:pPr>
+              <w:jc w:val="left"/>
+            </w:pPr>
+            <w:r>
+              <w:rPr>
+                <w:sz w:val="19"/>
+                <w:szCs w:val="19"/>
+              </w:rPr>
+              <w:t xml:space="preserve">3 - 36</w:t>
+            </w:r>
+          </w:p>
+        </w:tc>
+      </w:tr>
+      <w:tr>
+        <w:trPr>
+          <w:cantSplit/>
+        </w:trPr>
+        <w:tc>
+          <w:tcPr>
+            <w:tcW w:type="dxa" w:w="700"/>
+            <w:tcMar>
+              <w:top w:type="dxa" w:w="60"/>
+              <w:left w:type="dxa" w:w="100"/>
+              <w:bottom w:type="dxa" w:w="60"/>
+              <w:right w:type="dxa" w:w="100"/>
+            </w:tcMar>
+            <w:vAlign w:val="center"/>
+          </w:tcPr>
+          <w:p>
+            <w:pPr>
+              <w:jc w:val="left"/>
+            </w:pPr>
+            <w:r>
+              <w:rPr>
+                <w:sz w:val="19"/>
+                <w:szCs w:val="19"/>
+              </w:rPr>
+              <w:t xml:space="preserve">AB01</w:t>
+            </w:r>
+          </w:p>
+        </w:tc>
+        <w:tc>
+          <w:tcPr>
+            <w:tcW w:type="dxa" w:w="1700"/>
+            <w:tcMar>
+              <w:top w:type="dxa" w:w="60"/>
+              <w:left w:type="dxa" w:w="100"/>
+              <w:bottom w:type="dxa" w:w="60"/>
+              <w:right w:type="dxa" w:w="100"/>
+            </w:tcMar>
+            <w:vAlign w:val="center"/>
+          </w:tcPr>
+          <w:p>
+            <w:pPr>
+              <w:jc w:val="left"/>
+            </w:pPr>
+            <w:r>
+              <w:rPr>
+                <w:sz w:val="19"/>
+                <w:szCs w:val="19"/>
+              </w:rPr>
+              <w:t xml:space="preserve">Auto Loan - Balloon</w:t>
+            </w:r>
+          </w:p>
+        </w:tc>
+        <w:tc>
+          <w:tcPr>
+            <w:tcW w:type="dxa" w:w="3000"/>
+            <w:tcMar>
+              <w:top w:type="dxa" w:w="60"/>
+              <w:left w:type="dxa" w:w="100"/>
+              <w:bottom w:type="dxa" w:w="60"/>
+              <w:right w:type="dxa" w:w="100"/>
+            </w:tcMar>
+            <w:vAlign w:val="center"/>
+          </w:tcPr>
+          <w:p>
+            <w:pPr>
+              <w:jc w:val="left"/>
+            </w:pPr>
+            <w:r>
+              <w:rPr>
+                <w:sz w:val="19"/>
+                <w:szCs w:val="19"/>
+              </w:rPr>
+              <w:t xml:space="preserve">Unsecured, fixed; balloon (default 30%, up to 50%), up to 6 months moratorium</w:t>
+            </w:r>
+          </w:p>
+        </w:tc>
+        <w:tc>
+          <w:tcPr>
+            <w:tcW w:type="dxa" w:w="1300"/>
+            <w:tcMar>
+              <w:top w:type="dxa" w:w="60"/>
+              <w:left w:type="dxa" w:w="100"/>
+              <w:bottom w:type="dxa" w:w="60"/>
+              <w:right w:type="dxa" w:w="100"/>
+            </w:tcMar>
+            <w:vAlign w:val="center"/>
+          </w:tcPr>
+          <w:p>
+            <w:pPr>
+              <w:jc w:val="left"/>
+            </w:pPr>
+            <w:r>
+              <w:rPr>
+                <w:sz w:val="19"/>
+                <w:szCs w:val="19"/>
+              </w:rPr>
+              <w:t xml:space="preserve">9.5% (8-13)</w:t>
+            </w:r>
+          </w:p>
+        </w:tc>
+        <w:tc>
+          <w:tcPr>
+            <w:tcW w:type="dxa" w:w="1700"/>
+            <w:tcMar>
+              <w:top w:type="dxa" w:w="60"/>
+              <w:left w:type="dxa" w:w="100"/>
+              <w:bottom w:type="dxa" w:w="60"/>
+              <w:right w:type="dxa" w:w="100"/>
+            </w:tcMar>
+            <w:vAlign w:val="center"/>
+          </w:tcPr>
+          <w:p>
+            <w:pPr>
+              <w:jc w:val="left"/>
+            </w:pPr>
+            <w:r>
+              <w:rPr>
+                <w:sz w:val="19"/>
+                <w:szCs w:val="19"/>
+              </w:rPr>
+              <w:t xml:space="preserve">100,000 - 5,000,000</w:t>
+            </w:r>
+          </w:p>
+        </w:tc>
+        <w:tc>
+          <w:tcPr>
+            <w:tcW w:type="dxa" w:w="1100"/>
+            <w:tcMar>
+              <w:top w:type="dxa" w:w="60"/>
+              <w:left w:type="dxa" w:w="100"/>
+              <w:bottom w:type="dxa" w:w="60"/>
+              <w:right w:type="dxa" w:w="100"/>
+            </w:tcMar>
+            <w:vAlign w:val="center"/>
+          </w:tcPr>
+          <w:p>
+            <w:pPr>
+              <w:jc w:val="left"/>
+            </w:pPr>
+            <w:r>
+              <w:rPr>
+                <w:sz w:val="19"/>
+                <w:szCs w:val="19"/>
+              </w:rPr>
+              <w:t xml:space="preserve">12 - 84</w:t>
+            </w:r>
+          </w:p>
+        </w:tc>
+      </w:tr>
+      <w:tr>
+        <w:trPr>
+          <w:cantSplit/>
+        </w:trPr>
+        <w:tc>
+          <w:tcPr>
+            <w:tcW w:type="dxa" w:w="700"/>
+            <w:shd w:fill="F5F8FC" w:val="clear"/>
+            <w:tcMar>
+              <w:top w:type="dxa" w:w="60"/>
+              <w:left w:type="dxa" w:w="100"/>
+              <w:bottom w:type="dxa" w:w="60"/>
+              <w:right w:type="dxa" w:w="100"/>
+            </w:tcMar>
+            <w:vAlign w:val="center"/>
+          </w:tcPr>
+          <w:p>
+            <w:pPr>
+              <w:jc w:val="left"/>
+            </w:pPr>
+            <w:r>
+              <w:rPr>
+                <w:sz w:val="19"/>
+                <w:szCs w:val="19"/>
+              </w:rPr>
+              <w:t xml:space="preserve">SU01</w:t>
+            </w:r>
+          </w:p>
+        </w:tc>
+        <w:tc>
+          <w:tcPr>
+            <w:tcW w:type="dxa" w:w="1700"/>
+            <w:shd w:fill="F5F8FC" w:val="clear"/>
+            <w:tcMar>
+              <w:top w:type="dxa" w:w="60"/>
+              <w:left w:type="dxa" w:w="100"/>
+              <w:bottom w:type="dxa" w:w="60"/>
+              <w:right w:type="dxa" w:w="100"/>
+            </w:tcMar>
+            <w:vAlign w:val="center"/>
+          </w:tcPr>
+          <w:p>
+            <w:pPr>
+              <w:jc w:val="left"/>
+            </w:pPr>
+            <w:r>
+              <w:rPr>
+                <w:sz w:val="19"/>
+                <w:szCs w:val="19"/>
+              </w:rPr>
+              <w:t xml:space="preserve">Step-up Personal Loan</w:t>
+            </w:r>
+          </w:p>
+        </w:tc>
+        <w:tc>
+          <w:tcPr>
+            <w:tcW w:type="dxa" w:w="3000"/>
+            <w:shd w:fill="F5F8FC" w:val="clear"/>
+            <w:tcMar>
+              <w:top w:type="dxa" w:w="60"/>
+              <w:left w:type="dxa" w:w="100"/>
+              <w:bottom w:type="dxa" w:w="60"/>
+              <w:right w:type="dxa" w:w="100"/>
+            </w:tcMar>
+            <w:vAlign w:val="center"/>
+          </w:tcPr>
+          <w:p>
+            <w:pPr>
+              <w:jc w:val="left"/>
+            </w:pPr>
+            <w:r>
+              <w:rPr>
+                <w:sz w:val="19"/>
+                <w:szCs w:val="19"/>
+              </w:rPr>
+              <w:t xml:space="preserve">Unsecured, fixed; instalment rises 5% a year (up to 15%); monthly or quarterly</w:t>
+            </w:r>
+          </w:p>
+        </w:tc>
+        <w:tc>
+          <w:tcPr>
+            <w:tcW w:type="dxa" w:w="1300"/>
+            <w:shd w:fill="F5F8FC" w:val="clear"/>
+            <w:tcMar>
+              <w:top w:type="dxa" w:w="60"/>
+              <w:left w:type="dxa" w:w="100"/>
+              <w:bottom w:type="dxa" w:w="60"/>
+              <w:right w:type="dxa" w:w="100"/>
+            </w:tcMar>
+            <w:vAlign w:val="center"/>
+          </w:tcPr>
+          <w:p>
+            <w:pPr>
+              <w:jc w:val="left"/>
+            </w:pPr>
+            <w:r>
+              <w:rPr>
+                <w:sz w:val="19"/>
+                <w:szCs w:val="19"/>
+              </w:rPr>
+              <w:t xml:space="preserve">12.0% (9-17)</w:t>
+            </w:r>
+          </w:p>
+        </w:tc>
+        <w:tc>
+          <w:tcPr>
+            <w:tcW w:type="dxa" w:w="1700"/>
+            <w:shd w:fill="F5F8FC" w:val="clear"/>
+            <w:tcMar>
+              <w:top w:type="dxa" w:w="60"/>
+              <w:left w:type="dxa" w:w="100"/>
+              <w:bottom w:type="dxa" w:w="60"/>
+              <w:right w:type="dxa" w:w="100"/>
+            </w:tcMar>
+            <w:vAlign w:val="center"/>
+          </w:tcPr>
+          <w:p>
+            <w:pPr>
+              <w:jc w:val="left"/>
+            </w:pPr>
+            <w:r>
+              <w:rPr>
+                <w:sz w:val="19"/>
+                <w:szCs w:val="19"/>
+              </w:rPr>
+              <w:t xml:space="preserve">50,000 - 3,000,000</w:t>
+            </w:r>
+          </w:p>
+        </w:tc>
+        <w:tc>
+          <w:tcPr>
+            <w:tcW w:type="dxa" w:w="1100"/>
+            <w:shd w:fill="F5F8FC" w:val="clear"/>
+            <w:tcMar>
+              <w:top w:type="dxa" w:w="60"/>
+              <w:left w:type="dxa" w:w="100"/>
+              <w:bottom w:type="dxa" w:w="60"/>
+              <w:right w:type="dxa" w:w="100"/>
+            </w:tcMar>
+            <w:vAlign w:val="center"/>
+          </w:tcPr>
+          <w:p>
+            <w:pPr>
+              <w:jc w:val="left"/>
+            </w:pPr>
+            <w:r>
+              <w:rPr>
+                <w:sz w:val="19"/>
+                <w:szCs w:val="19"/>
+              </w:rPr>
+              <w:t xml:space="preserve">12 - 84</w:t>
+            </w:r>
+          </w:p>
+        </w:tc>
+      </w:tr>
+      <w:tr>
+        <w:trPr>
+          <w:cantSplit/>
+        </w:trPr>
+        <w:tc>
+          <w:tcPr>
+            <w:tcW w:type="dxa" w:w="700"/>
+            <w:tcMar>
+              <w:top w:type="dxa" w:w="60"/>
+              <w:left w:type="dxa" w:w="100"/>
+              <w:bottom w:type="dxa" w:w="60"/>
+              <w:right w:type="dxa" w:w="100"/>
+            </w:tcMar>
+            <w:vAlign w:val="center"/>
+          </w:tcPr>
+          <w:p>
+            <w:pPr>
+              <w:jc w:val="left"/>
+            </w:pPr>
+            <w:r>
+              <w:rPr>
+                <w:sz w:val="19"/>
+                <w:szCs w:val="19"/>
+              </w:rPr>
+              <w:t xml:space="preserve">EM01</w:t>
+            </w:r>
+          </w:p>
+        </w:tc>
+        <w:tc>
+          <w:tcPr>
+            <w:tcW w:type="dxa" w:w="1700"/>
+            <w:tcMar>
+              <w:top w:type="dxa" w:w="60"/>
+              <w:left w:type="dxa" w:w="100"/>
+              <w:bottom w:type="dxa" w:w="60"/>
+              <w:right w:type="dxa" w:w="100"/>
+            </w:tcMar>
+            <w:vAlign w:val="center"/>
+          </w:tcPr>
+          <w:p>
+            <w:pPr>
+              <w:jc w:val="left"/>
+            </w:pPr>
+            <w:r>
+              <w:rPr>
+                <w:sz w:val="19"/>
+                <w:szCs w:val="19"/>
+              </w:rPr>
+              <w:t xml:space="preserve">Education Loan - Study Moratorium</w:t>
+            </w:r>
+          </w:p>
+        </w:tc>
+        <w:tc>
+          <w:tcPr>
+            <w:tcW w:type="dxa" w:w="3000"/>
+            <w:tcMar>
+              <w:top w:type="dxa" w:w="60"/>
+              <w:left w:type="dxa" w:w="100"/>
+              <w:bottom w:type="dxa" w:w="60"/>
+              <w:right w:type="dxa" w:w="100"/>
+            </w:tcMar>
+            <w:vAlign w:val="center"/>
+          </w:tcPr>
+          <w:p>
+            <w:pPr>
+              <w:jc w:val="left"/>
+            </w:pPr>
+            <w:r>
+              <w:rPr>
+                <w:sz w:val="19"/>
+                <w:szCs w:val="19"/>
+              </w:rPr>
+              <w:t xml:space="preserve">Unsecured, fixed; EMI after a 12-month interest-only study period (up to 48), 30/360</w:t>
+            </w:r>
+          </w:p>
+        </w:tc>
+        <w:tc>
+          <w:tcPr>
+            <w:tcW w:type="dxa" w:w="1300"/>
+            <w:tcMar>
+              <w:top w:type="dxa" w:w="60"/>
+              <w:left w:type="dxa" w:w="100"/>
+              <w:bottom w:type="dxa" w:w="60"/>
+              <w:right w:type="dxa" w:w="100"/>
+            </w:tcMar>
+            <w:vAlign w:val="center"/>
+          </w:tcPr>
+          <w:p>
+            <w:pPr>
+              <w:jc w:val="left"/>
+            </w:pPr>
+            <w:r>
+              <w:rPr>
+                <w:sz w:val="19"/>
+                <w:szCs w:val="19"/>
+              </w:rPr>
+              <w:t xml:space="preserve">9.5% (8-13)</w:t>
+            </w:r>
+          </w:p>
+        </w:tc>
+        <w:tc>
+          <w:tcPr>
+            <w:tcW w:type="dxa" w:w="1700"/>
+            <w:tcMar>
+              <w:top w:type="dxa" w:w="60"/>
+              <w:left w:type="dxa" w:w="100"/>
+              <w:bottom w:type="dxa" w:w="60"/>
+              <w:right w:type="dxa" w:w="100"/>
+            </w:tcMar>
+            <w:vAlign w:val="center"/>
+          </w:tcPr>
+          <w:p>
+            <w:pPr>
+              <w:jc w:val="left"/>
+            </w:pPr>
+            <w:r>
+              <w:rPr>
+                <w:sz w:val="19"/>
+                <w:szCs w:val="19"/>
+              </w:rPr>
+              <w:t xml:space="preserve">100,000 - 5,000,000</w:t>
+            </w:r>
+          </w:p>
+        </w:tc>
+        <w:tc>
+          <w:tcPr>
+            <w:tcW w:type="dxa" w:w="1100"/>
+            <w:tcMar>
+              <w:top w:type="dxa" w:w="60"/>
+              <w:left w:type="dxa" w:w="100"/>
+              <w:bottom w:type="dxa" w:w="60"/>
+              <w:right w:type="dxa" w:w="100"/>
+            </w:tcMar>
+            <w:vAlign w:val="center"/>
+          </w:tcPr>
+          <w:p>
+            <w:pPr>
+              <w:jc w:val="left"/>
+            </w:pPr>
+            <w:r>
+              <w:rPr>
+                <w:sz w:val="19"/>
+                <w:szCs w:val="19"/>
+              </w:rPr>
+              <w:t xml:space="preserve">24 - 144</w:t>
+            </w:r>
+          </w:p>
+        </w:tc>
+      </w:tr>
+    </w:tbl>
+    <w:p>
+      <w:pPr>
+        <w:spacing w:after="60"/>
+      </w:pPr>
+    </w:p>
+    <w:p>
+      <w:pPr>
+        <w:spacing w:after="140" w:line="276"/>
+      </w:pPr>
+      <w:r>
+        <w:rPr>
+          <w:sz w:val="21"/>
+          <w:szCs w:val="21"/>
+        </w:rPr>
+        <w:t xml:space="preserve">The first six are the standard products that the database creates on first start; the last five are the sample products for the other schedule types. The end-to-end test suite (13.19) expects TL01, BB01, AB01, SU01 and EM01.</w:t>
+      </w:r>
+    </w:p>
+    <w:p>
+      <w:pPr>
+        <w:pStyle w:val="Heading2"/>
+        <w:spacing w:after="120" w:before="280"/>
+      </w:pPr>
+      <w:r>
+        <w:rPr>
+          <w:b/>
+          <w:bCs/>
+          <w:color w:val="2E5AA8"/>
+          <w:sz w:val="25"/>
+          <w:szCs w:val="25"/>
+        </w:rPr>
+        <w:t xml:space="preserve">13.18 Batch Processing: Changes and Fixes</w:t>
+      </w:r>
+    </w:p>
+    <w:p>
+      <w:pPr>
+        <w:spacing w:after="140" w:line="276"/>
+      </w:pPr>
+      <w:r>
+        <w:rPr>
+          <w:sz w:val="21"/>
+          <w:szCs w:val="21"/>
+        </w:rPr>
+        <w:t xml:space="preserve">Running end of day on the sandbox showed several problems in the batch framework. They are fixed in this version.</w:t>
+      </w:r>
+    </w:p>
+    <w:tbl>
+      <w:tblPr>
+        <w:tblW w:type="dxa" w:w="9500"/>
+        <w:tblBorders>
+          <w:top w:val="single" w:color="auto" w:sz="4"/>
+          <w:left w:val="single" w:color="auto" w:sz="4"/>
+          <w:bottom w:val="single" w:color="auto" w:sz="4"/>
+          <w:right w:val="single" w:color="auto" w:sz="4"/>
+          <w:insideH w:val="single" w:color="auto" w:sz="4"/>
+          <w:insideV w:val="single" w:color="auto" w:sz="4"/>
+        </w:tblBorders>
+      </w:tblPr>
+      <w:tblGrid>
+        <w:gridCol w:w="1800"/>
+        <w:gridCol w:w="3900"/>
+        <w:gridCol w:w="3800"/>
+      </w:tblGrid>
+      <w:tr>
+        <w:trPr>
+          <w:tblHeader/>
+        </w:trPr>
+        <w:tc>
+          <w:tcPr>
+            <w:tcW w:type="dxa" w:w="1800"/>
+            <w:shd w:fill="1F3864" w:val="clear"/>
+            <w:tcMar>
+              <w:top w:type="dxa" w:w="60"/>
+              <w:left w:type="dxa" w:w="100"/>
+              <w:bottom w:type="dxa" w:w="60"/>
+              <w:right w:type="dxa" w:w="100"/>
+            </w:tcMar>
+            <w:vAlign w:val="center"/>
+          </w:tcPr>
+          <w:p>
+            <w:pPr>
+              <w:jc w:val="left"/>
+            </w:pPr>
+            <w:r>
+              <w:rPr>
+                <w:b/>
+                <w:bCs/>
+                <w:color w:val="FFFFFF"/>
+                <w:sz w:val="19"/>
+                <w:szCs w:val="19"/>
+              </w:rPr>
+              <w:t xml:space="preserve">Area</w:t>
+            </w:r>
+          </w:p>
+        </w:tc>
+        <w:tc>
+          <w:tcPr>
+            <w:tcW w:type="dxa" w:w="3900"/>
+            <w:shd w:fill="1F3864" w:val="clear"/>
+            <w:tcMar>
+              <w:top w:type="dxa" w:w="60"/>
+              <w:left w:type="dxa" w:w="100"/>
+              <w:bottom w:type="dxa" w:w="60"/>
+              <w:right w:type="dxa" w:w="100"/>
+            </w:tcMar>
+            <w:vAlign w:val="center"/>
+          </w:tcPr>
+          <w:p>
+            <w:pPr>
+              <w:jc w:val="left"/>
+            </w:pPr>
+            <w:r>
+              <w:rPr>
+                <w:b/>
+                <w:bCs/>
+                <w:color w:val="FFFFFF"/>
+                <w:sz w:val="19"/>
+                <w:szCs w:val="19"/>
+              </w:rPr>
+              <w:t xml:space="preserve">What was wrong</w:t>
+            </w:r>
+          </w:p>
+        </w:tc>
+        <w:tc>
+          <w:tcPr>
+            <w:tcW w:type="dxa" w:w="3800"/>
+            <w:shd w:fill="1F3864" w:val="clear"/>
+            <w:tcMar>
+              <w:top w:type="dxa" w:w="60"/>
+              <w:left w:type="dxa" w:w="100"/>
+              <w:bottom w:type="dxa" w:w="60"/>
+              <w:right w:type="dxa" w:w="100"/>
+            </w:tcMar>
+            <w:vAlign w:val="center"/>
+          </w:tcPr>
+          <w:p>
+            <w:pPr>
+              <w:jc w:val="left"/>
+            </w:pPr>
+            <w:r>
+              <w:rPr>
+                <w:b/>
+                <w:bCs/>
+                <w:color w:val="FFFFFF"/>
+                <w:sz w:val="19"/>
+                <w:szCs w:val="19"/>
+              </w:rPr>
+              <w:t xml:space="preserve">What happens now</w:t>
+            </w:r>
+          </w:p>
+        </w:tc>
+      </w:tr>
+      <w:tr>
+        <w:trPr>
+          <w:cantSplit/>
+        </w:trPr>
+        <w:tc>
+          <w:tcPr>
+            <w:tcW w:type="dxa" w:w="1800"/>
+            <w:tcMar>
+              <w:top w:type="dxa" w:w="60"/>
+              <w:left w:type="dxa" w:w="100"/>
+              <w:bottom w:type="dxa" w:w="60"/>
+              <w:right w:type="dxa" w:w="100"/>
+            </w:tcMar>
+            <w:vAlign w:val="center"/>
+          </w:tcPr>
+          <w:p>
+            <w:pPr>
+              <w:jc w:val="left"/>
+            </w:pPr>
+            <w:r>
+              <w:rPr>
+                <w:sz w:val="19"/>
+                <w:szCs w:val="19"/>
+              </w:rPr>
+              <w:t xml:space="preserve">End of day chain</w:t>
+            </w:r>
+          </w:p>
+        </w:tc>
+        <w:tc>
+          <w:tcPr>
+            <w:tcW w:type="dxa" w:w="3900"/>
+            <w:tcMar>
+              <w:top w:type="dxa" w:w="60"/>
+              <w:left w:type="dxa" w:w="100"/>
+              <w:bottom w:type="dxa" w:w="60"/>
+              <w:right w:type="dxa" w:w="100"/>
+            </w:tcMar>
+            <w:vAlign w:val="center"/>
+          </w:tcPr>
+          <w:p>
+            <w:pPr>
+              <w:jc w:val="left"/>
+            </w:pPr>
+            <w:r>
+              <w:rPr>
+                <w:sz w:val="19"/>
+                <w:szCs w:val="19"/>
+              </w:rPr>
+              <w:t xml:space="preserve">End of day started a job, looked at it while it was still starting, took that for a failure and stopped. Each run completed one job; the next run completed the next.</w:t>
+            </w:r>
+          </w:p>
+        </w:tc>
+        <w:tc>
+          <w:tcPr>
+            <w:tcW w:type="dxa" w:w="3800"/>
+            <w:tcMar>
+              <w:top w:type="dxa" w:w="60"/>
+              <w:left w:type="dxa" w:w="100"/>
+              <w:bottom w:type="dxa" w:w="60"/>
+              <w:right w:type="dxa" w:w="100"/>
+            </w:tcMar>
+            <w:vAlign w:val="center"/>
+          </w:tcPr>
+          <w:p>
+            <w:pPr>
+              <w:jc w:val="left"/>
+            </w:pPr>
+            <w:r>
+              <w:rPr>
+                <w:sz w:val="19"/>
+                <w:szCs w:val="19"/>
+              </w:rPr>
+              <w:t xml:space="preserve">End of day waits for each job to reach a final state before starting the next, in priority order, and advances the business date after the last. A job that fails, or is still running after the time limit, stops the chain and the reason is logged.</w:t>
+            </w:r>
+          </w:p>
+        </w:tc>
+      </w:tr>
+      <w:tr>
+        <w:trPr>
+          <w:cantSplit/>
+        </w:trPr>
+        <w:tc>
+          <w:tcPr>
+            <w:tcW w:type="dxa" w:w="1800"/>
+            <w:shd w:fill="F5F8FC" w:val="clear"/>
+            <w:tcMar>
+              <w:top w:type="dxa" w:w="60"/>
+              <w:left w:type="dxa" w:w="100"/>
+              <w:bottom w:type="dxa" w:w="60"/>
+              <w:right w:type="dxa" w:w="100"/>
+            </w:tcMar>
+            <w:vAlign w:val="center"/>
+          </w:tcPr>
+          <w:p>
+            <w:pPr>
+              <w:jc w:val="left"/>
+            </w:pPr>
+            <w:r>
+              <w:rPr>
+                <w:sz w:val="19"/>
+                <w:szCs w:val="19"/>
+              </w:rPr>
+              <w:t xml:space="preserve">Skipped accounts</w:t>
+            </w:r>
+          </w:p>
+        </w:tc>
+        <w:tc>
+          <w:tcPr>
+            <w:tcW w:type="dxa" w:w="3900"/>
+            <w:shd w:fill="F5F8FC" w:val="clear"/>
+            <w:tcMar>
+              <w:top w:type="dxa" w:w="60"/>
+              <w:left w:type="dxa" w:w="100"/>
+              <w:bottom w:type="dxa" w:w="60"/>
+              <w:right w:type="dxa" w:w="100"/>
+            </w:tcMar>
+            <w:vAlign w:val="center"/>
+          </w:tcPr>
+          <w:p>
+            <w:pPr>
+              <w:jc w:val="left"/>
+            </w:pPr>
+            <w:r>
+              <w:rPr>
+                <w:sz w:val="19"/>
+                <w:szCs w:val="19"/>
+              </w:rPr>
+              <w:t xml:space="preserve">Jobs split into parallel streams shared one reader. When two streams started together, one could read the other's range and its own range was never processed, with no error. The same fault made some runs fail with "Reader must be open before it can be read" (seen on the days-past-due job).</w:t>
+            </w:r>
+          </w:p>
+        </w:tc>
+        <w:tc>
+          <w:tcPr>
+            <w:tcW w:type="dxa" w:w="3800"/>
+            <w:shd w:fill="F5F8FC" w:val="clear"/>
+            <w:tcMar>
+              <w:top w:type="dxa" w:w="60"/>
+              <w:left w:type="dxa" w:w="100"/>
+              <w:bottom w:type="dxa" w:w="60"/>
+              <w:right w:type="dxa" w:w="100"/>
+            </w:tcMar>
+            <w:vAlign w:val="center"/>
+          </w:tcPr>
+          <w:p>
+            <w:pPr>
+              <w:jc w:val="left"/>
+            </w:pPr>
+            <w:r>
+              <w:rPr>
+                <w:sz w:val="19"/>
+                <w:szCs w:val="19"/>
+              </w:rPr>
+              <w:t xml:space="preserve">Each stream keeps its own reader. Every stream now logs the account range it reads and its read, written and skipped counts, so a gap is visible.</w:t>
+            </w:r>
+          </w:p>
+        </w:tc>
+      </w:tr>
+      <w:tr>
+        <w:trPr>
+          <w:cantSplit/>
+        </w:trPr>
+        <w:tc>
+          <w:tcPr>
+            <w:tcW w:type="dxa" w:w="1800"/>
+            <w:tcMar>
+              <w:top w:type="dxa" w:w="60"/>
+              <w:left w:type="dxa" w:w="100"/>
+              <w:bottom w:type="dxa" w:w="60"/>
+              <w:right w:type="dxa" w:w="100"/>
+            </w:tcMar>
+            <w:vAlign w:val="center"/>
+          </w:tcPr>
+          <w:p>
+            <w:pPr>
+              <w:jc w:val="left"/>
+            </w:pPr>
+            <w:r>
+              <w:rPr>
+                <w:sz w:val="19"/>
+                <w:szCs w:val="19"/>
+              </w:rPr>
+              <w:t xml:space="preserve">Streams</w:t>
+            </w:r>
+          </w:p>
+        </w:tc>
+        <w:tc>
+          <w:tcPr>
+            <w:tcW w:type="dxa" w:w="3900"/>
+            <w:tcMar>
+              <w:top w:type="dxa" w:w="60"/>
+              <w:left w:type="dxa" w:w="100"/>
+              <w:bottom w:type="dxa" w:w="60"/>
+              <w:right w:type="dxa" w:w="100"/>
+            </w:tcMar>
+            <w:vAlign w:val="center"/>
+          </w:tcPr>
+          <w:p>
+            <w:pPr>
+              <w:jc w:val="left"/>
+            </w:pPr>
+            <w:r>
+              <w:rPr>
+                <w:sz w:val="19"/>
+                <w:szCs w:val="19"/>
+              </w:rPr>
+              <w:t xml:space="preserve">Chunk jobs ran with 4 to 8 streams.</w:t>
+            </w:r>
+          </w:p>
+        </w:tc>
+        <w:tc>
+          <w:tcPr>
+            <w:tcW w:type="dxa" w:w="3800"/>
+            <w:tcMar>
+              <w:top w:type="dxa" w:w="60"/>
+              <w:left w:type="dxa" w:w="100"/>
+              <w:bottom w:type="dxa" w:w="60"/>
+              <w:right w:type="dxa" w:w="100"/>
+            </w:tcMar>
+            <w:vAlign w:val="center"/>
+          </w:tcPr>
+          <w:p>
+            <w:pPr>
+              <w:jc w:val="left"/>
+            </w:pPr>
+            <w:r>
+              <w:rPr>
+                <w:sz w:val="19"/>
+                <w:szCs w:val="19"/>
+              </w:rPr>
+              <w:t xml:space="preserve">Every chunk job runs in </w:t>
+            </w:r>
+            <w:r>
+              <w:rPr>
+                <w:b/>
+                <w:bCs/>
+                <w:sz w:val="19"/>
+                <w:szCs w:val="19"/>
+              </w:rPr>
+              <w:t xml:space="preserve">2 streams</w:t>
+            </w:r>
+            <w:r>
+              <w:rPr>
+                <w:sz w:val="19"/>
+                <w:szCs w:val="19"/>
+              </w:rPr>
+              <w:t xml:space="preserve">. The number of streams is still a per-job setting (13.10) and takes effect from that job's next run.</w:t>
+            </w:r>
+          </w:p>
+        </w:tc>
+      </w:tr>
+      <w:tr>
+        <w:trPr>
+          <w:cantSplit/>
+        </w:trPr>
+        <w:tc>
+          <w:tcPr>
+            <w:tcW w:type="dxa" w:w="1800"/>
+            <w:shd w:fill="F5F8FC" w:val="clear"/>
+            <w:tcMar>
+              <w:top w:type="dxa" w:w="60"/>
+              <w:left w:type="dxa" w:w="100"/>
+              <w:bottom w:type="dxa" w:w="60"/>
+              <w:right w:type="dxa" w:w="100"/>
+            </w:tcMar>
+            <w:vAlign w:val="center"/>
+          </w:tcPr>
+          <w:p>
+            <w:pPr>
+              <w:jc w:val="left"/>
+            </w:pPr>
+            <w:r>
+              <w:rPr>
+                <w:sz w:val="19"/>
+                <w:szCs w:val="19"/>
+              </w:rPr>
+              <w:t xml:space="preserve">Single-action jobs with a time limit</w:t>
+            </w:r>
+          </w:p>
+        </w:tc>
+        <w:tc>
+          <w:tcPr>
+            <w:tcW w:type="dxa" w:w="3900"/>
+            <w:shd w:fill="F5F8FC" w:val="clear"/>
+            <w:tcMar>
+              <w:top w:type="dxa" w:w="60"/>
+              <w:left w:type="dxa" w:w="100"/>
+              <w:bottom w:type="dxa" w:w="60"/>
+              <w:right w:type="dxa" w:w="100"/>
+            </w:tcMar>
+            <w:vAlign w:val="center"/>
+          </w:tcPr>
+          <w:p>
+            <w:pPr>
+              <w:jc w:val="left"/>
+            </w:pPr>
+            <w:r>
+              <w:rPr>
+                <w:sz w:val="19"/>
+                <w:szCs w:val="19"/>
+              </w:rPr>
+              <w:t xml:space="preserve">The GL posting reconciliation job failed with "No business date in the job context", because the time-limit guard ran the job on another thread that did not have the business date.</w:t>
+            </w:r>
+          </w:p>
+        </w:tc>
+        <w:tc>
+          <w:tcPr>
+            <w:tcW w:type="dxa" w:w="3800"/>
+            <w:shd w:fill="F5F8FC" w:val="clear"/>
+            <w:tcMar>
+              <w:top w:type="dxa" w:w="60"/>
+              <w:left w:type="dxa" w:w="100"/>
+              <w:bottom w:type="dxa" w:w="60"/>
+              <w:right w:type="dxa" w:w="100"/>
+            </w:tcMar>
+            <w:vAlign w:val="center"/>
+          </w:tcPr>
+          <w:p>
+            <w:pPr>
+              <w:jc w:val="left"/>
+            </w:pPr>
+            <w:r>
+              <w:rPr>
+                <w:sz w:val="19"/>
+                <w:szCs w:val="19"/>
+              </w:rPr>
+              <w:t xml:space="preserve">The business date and job parameters are passed to that thread. This applies to every such job.</w:t>
+            </w:r>
+          </w:p>
+        </w:tc>
+      </w:tr>
+      <w:tr>
+        <w:trPr>
+          <w:cantSplit/>
+        </w:trPr>
+        <w:tc>
+          <w:tcPr>
+            <w:tcW w:type="dxa" w:w="1800"/>
+            <w:tcMar>
+              <w:top w:type="dxa" w:w="60"/>
+              <w:left w:type="dxa" w:w="100"/>
+              <w:bottom w:type="dxa" w:w="60"/>
+              <w:right w:type="dxa" w:w="100"/>
+            </w:tcMar>
+            <w:vAlign w:val="center"/>
+          </w:tcPr>
+          <w:p>
+            <w:pPr>
+              <w:jc w:val="left"/>
+            </w:pPr>
+            <w:r>
+              <w:rPr>
+                <w:sz w:val="19"/>
+                <w:szCs w:val="19"/>
+              </w:rPr>
+              <w:t xml:space="preserve">Lending service asleep</w:t>
+            </w:r>
+          </w:p>
+        </w:tc>
+        <w:tc>
+          <w:tcPr>
+            <w:tcW w:type="dxa" w:w="3900"/>
+            <w:tcMar>
+              <w:top w:type="dxa" w:w="60"/>
+              <w:left w:type="dxa" w:w="100"/>
+              <w:bottom w:type="dxa" w:w="60"/>
+              <w:right w:type="dxa" w:w="100"/>
+            </w:tcMar>
+            <w:vAlign w:val="center"/>
+          </w:tcPr>
+          <w:p>
+            <w:pPr>
+              <w:jc w:val="left"/>
+            </w:pPr>
+            <w:r>
+              <w:rPr>
+                <w:sz w:val="19"/>
+                <w:szCs w:val="19"/>
+              </w:rPr>
+              <w:t xml:space="preserve">On the free tier the lending service answers 502 for up to a minute or two after a restart. End of day gave up after about 3 seconds.</w:t>
+            </w:r>
+          </w:p>
+        </w:tc>
+        <w:tc>
+          <w:tcPr>
+            <w:tcW w:type="dxa" w:w="3800"/>
+            <w:tcMar>
+              <w:top w:type="dxa" w:w="60"/>
+              <w:left w:type="dxa" w:w="100"/>
+              <w:bottom w:type="dxa" w:w="60"/>
+              <w:right w:type="dxa" w:w="100"/>
+            </w:tcMar>
+            <w:vAlign w:val="center"/>
+          </w:tcPr>
+          <w:p>
+            <w:pPr>
+              <w:jc w:val="left"/>
+            </w:pPr>
+            <w:r>
+              <w:rPr>
+                <w:sz w:val="19"/>
+                <w:szCs w:val="19"/>
+              </w:rPr>
+              <w:t xml:space="preserve">The business-date calls retry for roughly two minutes (only for 429, 502, 503, 504 and connection errors). Calls for a single account keep the short retry.</w:t>
+            </w:r>
+          </w:p>
+        </w:tc>
+      </w:tr>
+    </w:tbl>
+    <w:p>
+      <w:pPr>
+        <w:spacing w:after="60"/>
+      </w:pPr>
+    </w:p>
+    <w:p>
+      <w:pPr>
+        <w:pStyle w:val="Heading3"/>
+        <w:spacing w:after="100" w:before="200"/>
+      </w:pPr>
+      <w:r>
+        <w:rPr>
+          <w:b/>
+          <w:bCs/>
+          <w:color w:val="2E5AA8"/>
+          <w:sz w:val="22"/>
+          <w:szCs w:val="22"/>
+        </w:rPr>
+        <w:t xml:space="preserve">Operating switches</w:t>
+      </w:r>
+    </w:p>
+    <w:tbl>
+      <w:tblPr>
+        <w:tblW w:type="dxa" w:w="9500"/>
+        <w:tblBorders>
+          <w:top w:val="single" w:color="auto" w:sz="4"/>
+          <w:left w:val="single" w:color="auto" w:sz="4"/>
+          <w:bottom w:val="single" w:color="auto" w:sz="4"/>
+          <w:right w:val="single" w:color="auto" w:sz="4"/>
+          <w:insideH w:val="single" w:color="auto" w:sz="4"/>
+          <w:insideV w:val="single" w:color="auto" w:sz="4"/>
+        </w:tblBorders>
+      </w:tblPr>
+      <w:tblGrid>
+        <w:gridCol w:w="3000"/>
+        <w:gridCol w:w="2400"/>
+        <w:gridCol w:w="4100"/>
+      </w:tblGrid>
+      <w:tr>
+        <w:trPr>
+          <w:tblHeader/>
+        </w:trPr>
+        <w:tc>
+          <w:tcPr>
+            <w:tcW w:type="dxa" w:w="3000"/>
+            <w:shd w:fill="1F3864" w:val="clear"/>
+            <w:tcMar>
+              <w:top w:type="dxa" w:w="60"/>
+              <w:left w:type="dxa" w:w="100"/>
+              <w:bottom w:type="dxa" w:w="60"/>
+              <w:right w:type="dxa" w:w="100"/>
+            </w:tcMar>
+            <w:vAlign w:val="center"/>
+          </w:tcPr>
+          <w:p>
+            <w:pPr>
+              <w:jc w:val="left"/>
+            </w:pPr>
+            <w:r>
+              <w:rPr>
+                <w:b/>
+                <w:bCs/>
+                <w:color w:val="FFFFFF"/>
+                <w:sz w:val="19"/>
+                <w:szCs w:val="19"/>
+              </w:rPr>
+              <w:t xml:space="preserve">Setting</w:t>
+            </w:r>
+          </w:p>
+        </w:tc>
+        <w:tc>
+          <w:tcPr>
+            <w:tcW w:type="dxa" w:w="2400"/>
+            <w:shd w:fill="1F3864" w:val="clear"/>
+            <w:tcMar>
+              <w:top w:type="dxa" w:w="60"/>
+              <w:left w:type="dxa" w:w="100"/>
+              <w:bottom w:type="dxa" w:w="60"/>
+              <w:right w:type="dxa" w:w="100"/>
+            </w:tcMar>
+            <w:vAlign w:val="center"/>
+          </w:tcPr>
+          <w:p>
+            <w:pPr>
+              <w:jc w:val="left"/>
+            </w:pPr>
+            <w:r>
+              <w:rPr>
+                <w:b/>
+                <w:bCs/>
+                <w:color w:val="FFFFFF"/>
+                <w:sz w:val="19"/>
+                <w:szCs w:val="19"/>
+              </w:rPr>
+              <w:t xml:space="preserve">Default</w:t>
+            </w:r>
+          </w:p>
+        </w:tc>
+        <w:tc>
+          <w:tcPr>
+            <w:tcW w:type="dxa" w:w="4100"/>
+            <w:shd w:fill="1F3864" w:val="clear"/>
+            <w:tcMar>
+              <w:top w:type="dxa" w:w="60"/>
+              <w:left w:type="dxa" w:w="100"/>
+              <w:bottom w:type="dxa" w:w="60"/>
+              <w:right w:type="dxa" w:w="100"/>
+            </w:tcMar>
+            <w:vAlign w:val="center"/>
+          </w:tcPr>
+          <w:p>
+            <w:pPr>
+              <w:jc w:val="left"/>
+            </w:pPr>
+            <w:r>
+              <w:rPr>
+                <w:b/>
+                <w:bCs/>
+                <w:color w:val="FFFFFF"/>
+                <w:sz w:val="19"/>
+                <w:szCs w:val="19"/>
+              </w:rPr>
+              <w:t xml:space="preserve">Meaning</w:t>
+            </w:r>
+          </w:p>
+        </w:tc>
+      </w:tr>
+      <w:tr>
+        <w:trPr>
+          <w:cantSplit/>
+        </w:trPr>
+        <w:tc>
+          <w:tcPr>
+            <w:tcW w:type="dxa" w:w="3000"/>
+            <w:tcMar>
+              <w:top w:type="dxa" w:w="60"/>
+              <w:left w:type="dxa" w:w="100"/>
+              <w:bottom w:type="dxa" w:w="60"/>
+              <w:right w:type="dxa" w:w="100"/>
+            </w:tcMar>
+            <w:vAlign w:val="center"/>
+          </w:tcPr>
+          <w:p>
+            <w:pPr>
+              <w:jc w:val="left"/>
+            </w:pPr>
+            <w:r>
+              <w:rPr>
+                <w:rFonts w:ascii="Consolas" w:hAnsi="Consolas" w:cs="Consolas"/>
+                <w:color w:val="1F3864"/>
+                <w:sz w:val="17"/>
+                <w:szCs w:val="17"/>
+              </w:rPr>
+              <w:t xml:space="preserve">concurrency</w:t>
+            </w:r>
+            <w:r>
+              <w:rPr>
+                <w:sz w:val="19"/>
+                <w:szCs w:val="19"/>
+              </w:rPr>
+              <w:t xml:space="preserve"> per job</w:t>
+            </w:r>
+          </w:p>
+        </w:tc>
+        <w:tc>
+          <w:tcPr>
+            <w:tcW w:type="dxa" w:w="2400"/>
+            <w:tcMar>
+              <w:top w:type="dxa" w:w="60"/>
+              <w:left w:type="dxa" w:w="100"/>
+              <w:bottom w:type="dxa" w:w="60"/>
+              <w:right w:type="dxa" w:w="100"/>
+            </w:tcMar>
+            <w:vAlign w:val="center"/>
+          </w:tcPr>
+          <w:p>
+            <w:pPr>
+              <w:jc w:val="left"/>
+            </w:pPr>
+            <w:r>
+              <w:rPr>
+                <w:sz w:val="19"/>
+                <w:szCs w:val="19"/>
+              </w:rPr>
+              <w:t xml:space="preserve">2</w:t>
+            </w:r>
+          </w:p>
+        </w:tc>
+        <w:tc>
+          <w:tcPr>
+            <w:tcW w:type="dxa" w:w="4100"/>
+            <w:tcMar>
+              <w:top w:type="dxa" w:w="60"/>
+              <w:left w:type="dxa" w:w="100"/>
+              <w:bottom w:type="dxa" w:w="60"/>
+              <w:right w:type="dxa" w:w="100"/>
+            </w:tcMar>
+            <w:vAlign w:val="center"/>
+          </w:tcPr>
+          <w:p>
+            <w:pPr>
+              <w:jc w:val="left"/>
+            </w:pPr>
+            <w:r>
+              <w:rPr>
+                <w:sz w:val="19"/>
+                <w:szCs w:val="19"/>
+              </w:rPr>
+              <w:t xml:space="preserve">Number of streams (partitions) a chunk job runs in; edit on the Configuration screen. </w:t>
+            </w:r>
+            <w:r>
+              <w:rPr>
+                <w:rFonts w:ascii="Consolas" w:hAnsi="Consolas" w:cs="Consolas"/>
+                <w:color w:val="1F3864"/>
+                <w:sz w:val="17"/>
+                <w:szCs w:val="17"/>
+              </w:rPr>
+              <w:t xml:space="preserve">throttle_limit</w:t>
+            </w:r>
+            <w:r>
+              <w:rPr>
+                <w:sz w:val="19"/>
+                <w:szCs w:val="19"/>
+              </w:rPr>
+              <w:t xml:space="preserve"> (threads) is also 2.</w:t>
+            </w:r>
+          </w:p>
+        </w:tc>
+      </w:tr>
+      <w:tr>
+        <w:trPr>
+          <w:cantSplit/>
+        </w:trPr>
+        <w:tc>
+          <w:tcPr>
+            <w:tcW w:type="dxa" w:w="3000"/>
+            <w:shd w:fill="F5F8FC" w:val="clear"/>
+            <w:tcMar>
+              <w:top w:type="dxa" w:w="60"/>
+              <w:left w:type="dxa" w:w="100"/>
+              <w:bottom w:type="dxa" w:w="60"/>
+              <w:right w:type="dxa" w:w="100"/>
+            </w:tcMar>
+            <w:vAlign w:val="center"/>
+          </w:tcPr>
+          <w:p>
+            <w:pPr>
+              <w:jc w:val="left"/>
+            </w:pPr>
+            <w:r>
+              <w:rPr>
+                <w:rFonts w:ascii="Consolas" w:hAnsi="Consolas" w:cs="Consolas"/>
+                <w:color w:val="1F3864"/>
+                <w:sz w:val="17"/>
+                <w:szCs w:val="17"/>
+              </w:rPr>
+              <w:t xml:space="preserve">BATCH_EOD_JOB_TIMEOUT_MINUTES</w:t>
+            </w:r>
+          </w:p>
+        </w:tc>
+        <w:tc>
+          <w:tcPr>
+            <w:tcW w:type="dxa" w:w="2400"/>
+            <w:shd w:fill="F5F8FC" w:val="clear"/>
+            <w:tcMar>
+              <w:top w:type="dxa" w:w="60"/>
+              <w:left w:type="dxa" w:w="100"/>
+              <w:bottom w:type="dxa" w:w="60"/>
+              <w:right w:type="dxa" w:w="100"/>
+            </w:tcMar>
+            <w:vAlign w:val="center"/>
+          </w:tcPr>
+          <w:p>
+            <w:pPr>
+              <w:jc w:val="left"/>
+            </w:pPr>
+            <w:r>
+              <w:rPr>
+                <w:sz w:val="19"/>
+                <w:szCs w:val="19"/>
+              </w:rPr>
+              <w:t xml:space="preserve">180</w:t>
+            </w:r>
+          </w:p>
+        </w:tc>
+        <w:tc>
+          <w:tcPr>
+            <w:tcW w:type="dxa" w:w="4100"/>
+            <w:shd w:fill="F5F8FC" w:val="clear"/>
+            <w:tcMar>
+              <w:top w:type="dxa" w:w="60"/>
+              <w:left w:type="dxa" w:w="100"/>
+              <w:bottom w:type="dxa" w:w="60"/>
+              <w:right w:type="dxa" w:w="100"/>
+            </w:tcMar>
+            <w:vAlign w:val="center"/>
+          </w:tcPr>
+          <w:p>
+            <w:pPr>
+              <w:jc w:val="left"/>
+            </w:pPr>
+            <w:r>
+              <w:rPr>
+                <w:sz w:val="19"/>
+                <w:szCs w:val="19"/>
+              </w:rPr>
+              <w:t xml:space="preserve">How long end of day waits for one job before it stops the chain.</w:t>
+            </w:r>
+          </w:p>
+        </w:tc>
+      </w:tr>
+      <w:tr>
+        <w:trPr>
+          <w:cantSplit/>
+        </w:trPr>
+        <w:tc>
+          <w:tcPr>
+            <w:tcW w:type="dxa" w:w="3000"/>
+            <w:tcMar>
+              <w:top w:type="dxa" w:w="60"/>
+              <w:left w:type="dxa" w:w="100"/>
+              <w:bottom w:type="dxa" w:w="60"/>
+              <w:right w:type="dxa" w:w="100"/>
+            </w:tcMar>
+            <w:vAlign w:val="center"/>
+          </w:tcPr>
+          <w:p>
+            <w:pPr>
+              <w:jc w:val="left"/>
+            </w:pPr>
+            <w:r>
+              <w:rPr>
+                <w:rFonts w:ascii="Consolas" w:hAnsi="Consolas" w:cs="Consolas"/>
+                <w:color w:val="1F3864"/>
+                <w:sz w:val="17"/>
+                <w:szCs w:val="17"/>
+              </w:rPr>
+              <w:t xml:space="preserve">BATCH_KAFKA_ENABLED</w:t>
+            </w:r>
+          </w:p>
+        </w:tc>
+        <w:tc>
+          <w:tcPr>
+            <w:tcW w:type="dxa" w:w="2400"/>
+            <w:tcMar>
+              <w:top w:type="dxa" w:w="60"/>
+              <w:left w:type="dxa" w:w="100"/>
+              <w:bottom w:type="dxa" w:w="60"/>
+              <w:right w:type="dxa" w:w="100"/>
+            </w:tcMar>
+            <w:vAlign w:val="center"/>
+          </w:tcPr>
+          <w:p>
+            <w:pPr>
+              <w:jc w:val="left"/>
+            </w:pPr>
+            <w:r>
+              <w:rPr>
+                <w:sz w:val="19"/>
+                <w:szCs w:val="19"/>
+              </w:rPr>
+              <w:t xml:space="preserve">on (off in the local profile and on Render)</w:t>
+            </w:r>
+          </w:p>
+        </w:tc>
+        <w:tc>
+          <w:tcPr>
+            <w:tcW w:type="dxa" w:w="4100"/>
+            <w:tcMar>
+              <w:top w:type="dxa" w:w="60"/>
+              <w:left w:type="dxa" w:w="100"/>
+              <w:bottom w:type="dxa" w:w="60"/>
+              <w:right w:type="dxa" w:w="100"/>
+            </w:tcMar>
+            <w:vAlign w:val="center"/>
+          </w:tcPr>
+          <w:p>
+            <w:pPr>
+              <w:jc w:val="left"/>
+            </w:pPr>
+            <w:r>
+              <w:rPr>
+                <w:sz w:val="19"/>
+                <w:szCs w:val="19"/>
+              </w:rPr>
+              <w:t xml:space="preserve">When off, no events are published about finished jobs and nothing tries to reach a Kafka broker. Jobs are not affected.</w:t>
+            </w:r>
+          </w:p>
+        </w:tc>
+      </w:tr>
+      <w:tr>
+        <w:trPr>
+          <w:cantSplit/>
+        </w:trPr>
+        <w:tc>
+          <w:tcPr>
+            <w:tcW w:type="dxa" w:w="3000"/>
+            <w:shd w:fill="F5F8FC" w:val="clear"/>
+            <w:tcMar>
+              <w:top w:type="dxa" w:w="60"/>
+              <w:left w:type="dxa" w:w="100"/>
+              <w:bottom w:type="dxa" w:w="60"/>
+              <w:right w:type="dxa" w:w="100"/>
+            </w:tcMar>
+            <w:vAlign w:val="center"/>
+          </w:tcPr>
+          <w:p>
+            <w:pPr>
+              <w:jc w:val="left"/>
+            </w:pPr>
+            <w:r>
+              <w:rPr>
+                <w:rFonts w:ascii="Consolas" w:hAnsi="Consolas" w:cs="Consolas"/>
+                <w:color w:val="1F3864"/>
+                <w:sz w:val="17"/>
+                <w:szCs w:val="17"/>
+              </w:rPr>
+              <w:t xml:space="preserve">BATCH_SWAGGER_ENABLED</w:t>
+            </w:r>
+          </w:p>
+        </w:tc>
+        <w:tc>
+          <w:tcPr>
+            <w:tcW w:type="dxa" w:w="2400"/>
+            <w:shd w:fill="F5F8FC" w:val="clear"/>
+            <w:tcMar>
+              <w:top w:type="dxa" w:w="60"/>
+              <w:left w:type="dxa" w:w="100"/>
+              <w:bottom w:type="dxa" w:w="60"/>
+              <w:right w:type="dxa" w:w="100"/>
+            </w:tcMar>
+            <w:vAlign w:val="center"/>
+          </w:tcPr>
+          <w:p>
+            <w:pPr>
+              <w:jc w:val="left"/>
+            </w:pPr>
+            <w:r>
+              <w:rPr>
+                <w:sz w:val="19"/>
+                <w:szCs w:val="19"/>
+              </w:rPr>
+              <w:t xml:space="preserve">on (off in production profile; on in the Render blueprint)</w:t>
+            </w:r>
+          </w:p>
+        </w:tc>
+        <w:tc>
+          <w:tcPr>
+            <w:tcW w:type="dxa" w:w="4100"/>
+            <w:shd w:fill="F5F8FC" w:val="clear"/>
+            <w:tcMar>
+              <w:top w:type="dxa" w:w="60"/>
+              <w:left w:type="dxa" w:w="100"/>
+              <w:bottom w:type="dxa" w:w="60"/>
+              <w:right w:type="dxa" w:w="100"/>
+            </w:tcMar>
+            <w:vAlign w:val="center"/>
+          </w:tcPr>
+          <w:p>
+            <w:pPr>
+              <w:jc w:val="left"/>
+            </w:pPr>
+            <w:r>
+              <w:rPr>
+                <w:sz w:val="19"/>
+                <w:szCs w:val="19"/>
+              </w:rPr>
+              <w:t xml:space="preserve">Swagger UI for the batch operator endpoints at </w:t>
+            </w:r>
+            <w:r>
+              <w:rPr>
+                <w:rFonts w:ascii="Consolas" w:hAnsi="Consolas" w:cs="Consolas"/>
+                <w:color w:val="1F3864"/>
+                <w:sz w:val="17"/>
+                <w:szCs w:val="17"/>
+              </w:rPr>
+              <w:t xml:space="preserve">/swagger-ui.html</w:t>
+            </w:r>
+            <w:r>
+              <w:rPr>
+                <w:sz w:val="19"/>
+                <w:szCs w:val="19"/>
+              </w:rPr>
+              <w:t xml:space="preserve">, behind the same login as the endpoints.</w:t>
+            </w:r>
+          </w:p>
+        </w:tc>
+      </w:tr>
+    </w:tbl>
+    <w:p>
+      <w:pPr>
+        <w:spacing w:after="60"/>
+      </w:pPr>
+    </w:p>
+    <w:p>
+      <w:pPr>
+        <w:pStyle w:val="Heading2"/>
+        <w:spacing w:after="120" w:before="280"/>
+      </w:pPr>
+      <w:r>
+        <w:rPr>
+          <w:b/>
+          <w:bCs/>
+          <w:color w:val="2E5AA8"/>
+          <w:sz w:val="25"/>
+          <w:szCs w:val="25"/>
+        </w:rPr>
+        <w:t xml:space="preserve">13.19 End-to-End Test Suite: Existing Products and Resilience</w:t>
+      </w:r>
+    </w:p>
+    <w:p>
+      <w:pPr>
+        <w:spacing w:after="140" w:line="276"/>
+      </w:pPr>
+      <w:r>
+        <w:rPr>
+          <w:sz w:val="21"/>
+          <w:szCs w:val="21"/>
+        </w:rPr>
+        <w:t xml:space="preserve">The first runs on the sandbox stopped before creating a single account because the suite wanted sample products (TL01, BB01, AB01, SU01, EM01) that did not exist. The suite now adapts and carries on.</w:t>
+      </w:r>
+    </w:p>
+    <w:p>
+      <w:pPr>
+        <w:pStyle w:val="ListParagraph"/>
+        <w:numPr>
+          <w:ilvl w:val="0"/>
+          <w:numId w:val="1"/>
+        </w:numPr>
+        <w:spacing w:after="80" w:line="264"/>
+      </w:pPr>
+      <w:r>
+        <w:rPr>
+          <w:b/>
+          <w:bCs/>
+          <w:sz w:val="21"/>
+          <w:szCs w:val="21"/>
+        </w:rPr>
+        <w:t xml:space="preserve">Existing products only.</w:t>
+      </w:r>
+      <w:r>
+        <w:rPr>
+          <w:sz w:val="21"/>
+          <w:szCs w:val="21"/>
+        </w:rPr>
+        <w:t xml:space="preserve"> Before its pre-run check the suite reads the product list. An account whose product does not exist, is inactive or is a mortgage product moves to the closest existing active unsecured product and loses its product-specific overrides (day count, moratorium, balloon, step-up). Setting </w:t>
+      </w:r>
+      <w:r>
+        <w:rPr>
+          <w:rFonts w:ascii="Consolas" w:hAnsi="Consolas" w:cs="Consolas"/>
+          <w:color w:val="1F3864"/>
+          <w:sz w:val="19"/>
+          <w:szCs w:val="19"/>
+        </w:rPr>
+        <w:t xml:space="preserve">e2e.products.fallback=SKIP</w:t>
+      </w:r>
+      <w:r>
+        <w:rPr>
+          <w:sz w:val="21"/>
+          <w:szCs w:val="21"/>
+        </w:rPr>
+        <w:t xml:space="preserve"> leaves those accounts out instead.</w:t>
+      </w:r>
+    </w:p>
+    <w:p>
+      <w:pPr>
+        <w:pStyle w:val="ListParagraph"/>
+        <w:numPr>
+          <w:ilvl w:val="0"/>
+          <w:numId w:val="1"/>
+        </w:numPr>
+        <w:spacing w:after="80" w:line="264"/>
+      </w:pPr>
+      <w:r>
+        <w:rPr>
+          <w:b/>
+          <w:bCs/>
+          <w:sz w:val="21"/>
+          <w:szCs w:val="21"/>
+        </w:rPr>
+        <w:t xml:space="preserve">Limits.</w:t>
+      </w:r>
+      <w:r>
+        <w:rPr>
+          <w:sz w:val="21"/>
+          <w:szCs w:val="21"/>
+        </w:rPr>
+        <w:t xml:space="preserve"> Amounts, tenures, rates and repayment frequencies that fall outside a product's limits are moved inside them. Each change is shown as ADAPT in the log and listed in the run report.</w:t>
+      </w:r>
+    </w:p>
+    <w:p>
+      <w:pPr>
+        <w:pStyle w:val="ListParagraph"/>
+        <w:numPr>
+          <w:ilvl w:val="0"/>
+          <w:numId w:val="1"/>
+        </w:numPr>
+        <w:spacing w:after="80" w:line="264"/>
+      </w:pPr>
+      <w:r>
+        <w:rPr>
+          <w:b/>
+          <w:bCs/>
+          <w:sz w:val="21"/>
+          <w:szCs w:val="21"/>
+        </w:rPr>
+        <w:t xml:space="preserve">Warnings and blocking problems.</w:t>
+      </w:r>
+      <w:r>
+        <w:rPr>
+          <w:sz w:val="21"/>
+          <w:szCs w:val="21"/>
+        </w:rPr>
+        <w:t xml:space="preserve"> Product trouble is now a warning. Only an unreachable service, a disabled batch job, a business date that is wrong for the run, or no usable product at all stops the run before it starts.</w:t>
+      </w:r>
+    </w:p>
+    <w:p>
+      <w:pPr>
+        <w:pStyle w:val="ListParagraph"/>
+        <w:numPr>
+          <w:ilvl w:val="0"/>
+          <w:numId w:val="1"/>
+        </w:numPr>
+        <w:spacing w:after="80" w:line="264"/>
+      </w:pPr>
+      <w:r>
+        <w:rPr>
+          <w:b/>
+          <w:bCs/>
+          <w:sz w:val="21"/>
+          <w:szCs w:val="21"/>
+        </w:rPr>
+        <w:t xml:space="preserve">One bad account does not stop the rest.</w:t>
+      </w:r>
+      <w:r>
+        <w:rPr>
+          <w:sz w:val="21"/>
+          <w:szCs w:val="21"/>
+        </w:rPr>
+        <w:t xml:space="preserve"> If an account cannot be created, disbursed or set up (SETUP-01, SETUP-02, SETUP-03 in the checks and defects), it is recorded and the others carry on.</w:t>
+      </w:r>
+    </w:p>
+    <w:p>
+      <w:pPr>
+        <w:pStyle w:val="ListParagraph"/>
+        <w:numPr>
+          <w:ilvl w:val="0"/>
+          <w:numId w:val="1"/>
+        </w:numPr>
+        <w:spacing w:after="80" w:line="264"/>
+      </w:pPr>
+      <w:r>
+        <w:rPr>
+          <w:sz w:val="21"/>
+          <w:szCs w:val="21"/>
+        </w:rPr>
+        <w:t xml:space="preserve">To exercise every schedule type, run </w:t>
+      </w:r>
+      <w:r>
+        <w:rPr>
+          <w:b/>
+          <w:bCs/>
+          <w:sz w:val="21"/>
+          <w:szCs w:val="21"/>
+        </w:rPr>
+        <w:t xml:space="preserve">Maintenance - Create base products</w:t>
+      </w:r>
+      <w:r>
+        <w:rPr>
+          <w:sz w:val="21"/>
+          <w:szCs w:val="21"/>
+        </w:rPr>
+        <w:t xml:space="preserve"> first, so the five sample products exist.</w:t>
+      </w:r>
+    </w:p>
+    <w:p>
+      <w:pPr>
+        <w:pStyle w:val="Heading2"/>
+        <w:spacing w:after="120" w:before="280"/>
+      </w:pPr>
+      <w:r>
+        <w:rPr>
+          <w:b/>
+          <w:bCs/>
+          <w:color w:val="2E5AA8"/>
+          <w:sz w:val="25"/>
+          <w:szCs w:val="25"/>
+        </w:rPr>
+        <w:t xml:space="preserve">13.20 Open Items and Verification (version 1.5)</w:t>
+      </w:r>
+    </w:p>
+    <w:p>
+      <w:pPr>
+        <w:pStyle w:val="ListParagraph"/>
+        <w:numPr>
+          <w:ilvl w:val="0"/>
+          <w:numId w:val="1"/>
+        </w:numPr>
+        <w:spacing w:after="80" w:line="264"/>
+      </w:pPr>
+      <w:r>
+        <w:rPr>
+          <w:b/>
+          <w:bCs/>
+          <w:sz w:val="21"/>
+          <w:szCs w:val="21"/>
+        </w:rPr>
+        <w:t xml:space="preserve">Clear all data is destructive</w:t>
+      </w:r>
+      <w:r>
+        <w:rPr>
+          <w:sz w:val="21"/>
+          <w:szCs w:val="21"/>
+        </w:rPr>
+        <w:t xml:space="preserve"> and the lending API has no authentication; the switch and the typed confirmation are the only protection. Use it on sandboxes only.</w:t>
+      </w:r>
+    </w:p>
+    <w:p>
+      <w:pPr>
+        <w:pStyle w:val="ListParagraph"/>
+        <w:numPr>
+          <w:ilvl w:val="0"/>
+          <w:numId w:val="1"/>
+        </w:numPr>
+        <w:spacing w:after="80" w:line="264"/>
+      </w:pPr>
+      <w:r>
+        <w:rPr>
+          <w:sz w:val="21"/>
+          <w:szCs w:val="21"/>
+        </w:rPr>
+        <w:t xml:space="preserve">It has not been confirmed on the sandbox that interest accrual now covers every active account after the stream fix; compare the per-stream counts in the log with the number of active accounts after the next end of day.</w:t>
+      </w:r>
+    </w:p>
+    <w:p>
+      <w:pPr>
+        <w:pStyle w:val="ListParagraph"/>
+        <w:numPr>
+          <w:ilvl w:val="0"/>
+          <w:numId w:val="1"/>
+        </w:numPr>
+        <w:spacing w:after="80" w:line="264"/>
+      </w:pPr>
+      <w:r>
+        <w:rPr>
+          <w:sz w:val="21"/>
+          <w:szCs w:val="21"/>
+        </w:rPr>
+        <w:t xml:space="preserve">Monthly, periodic and event jobs are still not chained: only the daily jobs run in the end-of-day sequence.</w:t>
+      </w:r>
+    </w:p>
+    <w:p>
+      <w:pPr>
+        <w:pStyle w:val="ListParagraph"/>
+        <w:numPr>
+          <w:ilvl w:val="0"/>
+          <w:numId w:val="1"/>
+        </w:numPr>
+        <w:spacing w:after="80" w:line="264"/>
+      </w:pPr>
+      <w:r>
+        <w:rPr>
+          <w:sz w:val="21"/>
+          <w:szCs w:val="21"/>
+        </w:rPr>
+        <w:t xml:space="preserve">On the sandbox Kafka is off, so job-completion events are not published.</w:t>
+      </w:r>
+    </w:p>
+    <w:p>
+      <w:pPr>
+        <w:pStyle w:val="ListParagraph"/>
+        <w:numPr>
+          <w:ilvl w:val="0"/>
+          <w:numId w:val="1"/>
+        </w:numPr>
+        <w:spacing w:after="80" w:line="264"/>
+      </w:pPr>
+      <w:r>
+        <w:rPr>
+          <w:sz w:val="21"/>
+          <w:szCs w:val="21"/>
+        </w:rPr>
+        <w:t xml:space="preserve">Accounts left "pending disbursement" by the early test runs do not accrue interest; clear them with the Maintenance screen. The cause of those failed disbursals was not seen in the logs.</w:t>
+      </w:r>
+    </w:p>
+    <w:p>
+      <w:pPr>
+        <w:pStyle w:val="ListParagraph"/>
+        <w:numPr>
+          <w:ilvl w:val="0"/>
+          <w:numId w:val="1"/>
+        </w:numPr>
+        <w:spacing w:after="80" w:line="264"/>
+      </w:pPr>
+      <w:r>
+        <w:rPr>
+          <w:b/>
+          <w:bCs/>
+          <w:sz w:val="21"/>
+          <w:szCs w:val="21"/>
+        </w:rPr>
+        <w:t xml:space="preserve">Verification:</w:t>
+      </w:r>
+      <w:r>
+        <w:rPr>
+          <w:sz w:val="21"/>
+          <w:szCs w:val="21"/>
+        </w:rPr>
+        <w:t xml:space="preserve"> the eleven base products were checked against the product validation rules with a small program, and the product-fitting logic was run against a sample product list. The new Java code, the migration V5 and the unit tests have </w:t>
+      </w:r>
+      <w:r>
+        <w:rPr>
+          <w:b/>
+          <w:bCs/>
+          <w:sz w:val="21"/>
+          <w:szCs w:val="21"/>
+        </w:rPr>
+        <w:t xml:space="preserve">not been built or run with Maven</w:t>
+      </w:r>
+      <w:r>
+        <w:rPr>
+          <w:sz w:val="21"/>
+          <w:szCs w:val="21"/>
+        </w:rPr>
+        <w:t xml:space="preserve"> in this environment; run the full build and the integration tests before relying on them.</w:t>
       </w:r>
     </w:p>
     <w:sectPr>

</xml_diff>

<commit_message>
Documentation v1.7: demands, payment waterfall and penal interest
- Functional Specification v1.7: new Chapter 14, sections 6.2 to 6.4 corrected
- Technical Design Document v1.7: new sections 15.22 to 15.27
- Architecture deck v1.7: five new slides, counts and flows updated
- Unversioned Specification and Design files now hold v1.7 (v1.5 copies kept)

Co-Authored-By: Claude Sonnet 5.5 <noreply@anthropic.com>
Claude-Session: https://claude.ai/code/session_011Ly3TH5YUMArmTYksVUGUE
</commit_message>
<xml_diff>
--- a/docs/Lending_Platform_Functional_Specification.docx
+++ b/docs/Lending_Platform_Functional_Specification.docx
@@ -79,7 +79,7 @@
           <w:sz w:val="20"/>
           <w:szCs w:val="20"/>
         </w:rPr>
-        <w:t xml:space="preserve">Document version 1.5 — updated 13 October 2026 (adds the Maintenance screen with eleven base products, a test suite that works with the products that exist, and batch fixes: two streams per job, end of day that waits for each job, safer retries)</w:t>
+        <w:t xml:space="preserve">Document version 1.7 — updated 17 October 2026 (adds demands raised on the due date, a payment waterfall that accepts any amount and works on overdue accounts, and penal interest with its settings on the product)</w:t>
       </w:r>
     </w:p>
     <w:p>
@@ -286,6 +286,27 @@
           <w:szCs w:val="21"/>
         </w:rPr>
         <w:t xml:space="preserve"> adds the Maintenance screen to start again from scratch and a set of eleven base products (13.17), batch processing changes and fixes found while running end of day on the sandbox (13.18), and an end-to-end test suite that uses the products that exist and carries on when an account fails (13.19).</w:t>
+      </w:r>
+    </w:p>
+    <w:p>
+      <w:pPr>
+        <w:spacing w:after="140" w:line="276"/>
+      </w:pPr>
+      <w:r>
+        <w:rPr>
+          <w:b/>
+          <w:bCs/>
+          <w:sz w:val="21"/>
+          <w:szCs w:val="21"/>
+        </w:rPr>
+        <w:t xml:space="preserve">Version 1.7 (17 October 2026):</w:t>
+      </w:r>
+      <w:r>
+        <w:rPr>
+          <w:sz w:val="21"/>
+          <w:szCs w:val="21"/>
+        </w:rPr>
+        <w:t xml:space="preserve"> adds demand records raised on each due date, a payment waterfall that takes any amount and also works on accounts in an NPA status, the Amount payable and Payment preview reads (Chapter 14), and penal interest with its rate, grace days and cap set on the product (14.6). Chapters 6.2 to 6.4 are updated. Version numbers 1.6 and 1.7 were taken together so that this specification, the Technical Design Document and the architecture deck carry the same number.</w:t>
       </w:r>
     </w:p>
     <w:p>
@@ -8880,7 +8901,7 @@
                 <w:sz w:val="19"/>
                 <w:szCs w:val="19"/>
               </w:rPr>
-              <w:t xml:space="preserve">Must exactly match the next pending installment's due amount (principal + interest component).</w:t>
+              <w:t xml:space="preserve">Any positive amount. It is applied through the payment waterfall (14.3). The amount payable is read from 14.7.</w:t>
             </w:r>
           </w:p>
         </w:tc>
@@ -9090,7 +9111,7 @@
           <w:sz w:val="21"/>
           <w:szCs w:val="21"/>
         </w:rPr>
-        <w:t xml:space="preserve">The account must be ACTIVE — rejected (409) otherwise.</w:t>
+        <w:t xml:space="preserve">The account must be ACTIVE or in an NPA status (NPA_SMA0 to NPA_LOSS) — rejected (409) otherwise. Before version 1.7 only ACTIVE accounts could pay, so an account that had fallen behind could never be brought current.</w:t>
       </w:r>
     </w:p>
     <w:p>
@@ -9107,7 +9128,7 @@
           <w:sz w:val="21"/>
           <w:szCs w:val="21"/>
         </w:rPr>
-        <w:t xml:space="preserve">amount must equal the exact EMI due for the next pending installment; any other amount is rejected (409) with guidance to use the part-payment endpoint instead.</w:t>
+        <w:t xml:space="preserve">Any positive amount is accepted (before version 1.7 it had to equal the next instalment exactly). Money clears penal interest first, then the oldest demand, interest before principal; what is left is held as an advance and applied when the next demand is raised. An amount larger than everything still payable on the account is rejected (409) with guidance to use foreclosure.</w:t>
       </w:r>
     </w:p>
     <w:p>
@@ -9124,7 +9145,7 @@
           <w:sz w:val="21"/>
           <w:szCs w:val="21"/>
         </w:rPr>
-        <w:t xml:space="preserve">On success: the installment is marked PAID, an EMI transaction is recorded, an EMI_POSTING ledger event is written (§7), and — if that was the last pending installment — the account transitions to CLOSED.</w:t>
+        <w:t xml:space="preserve">On success: each demand that is fully paid becomes CLEARED and its instalment PAID, an EMI transaction is recorded with the totals paid to principal, interest and penal interest, an EMI_POSTING ledger event is written (§7), the status and days past due are recalculated straight away, and — once every instalment and every demand (penal interest included) is paid — the account transitions to CLOSED. The response also carries the allocation lines and the advance held.</w:t>
       </w:r>
     </w:p>
     <w:p>
@@ -9418,7 +9439,7 @@
                 <w:sz w:val="19"/>
                 <w:szCs w:val="19"/>
               </w:rPr>
-              <w:t xml:space="preserve">Must be positive and not exceed current outstanding principal (use foreclosure instead if it would).</w:t>
+              <w:t xml:space="preserve">Must be positive. What is due (penal interest and open demands) is cleared first; only the rest reduces principal, and that rest must not exceed outstanding principal (use foreclosure instead if it would).</w:t>
             </w:r>
           </w:p>
         </w:tc>
@@ -9628,7 +9649,7 @@
           <w:sz w:val="21"/>
           <w:szCs w:val="21"/>
         </w:rPr>
-        <w:t xml:space="preserve">Reduces outstanding principal by the payment amount and regenerates the remaining schedule at the same installment count with a recalculated (lower) EMI — tenure is not shortened by a part-payment in the current design.</w:t>
+        <w:t xml:space="preserve">Clears what is due first (14.3). The remainder reduces outstanding principal and the instalments not yet demanded are regenerated at the same installment count with a recalculated (lower) EMI — tenure is not shortened by a part-payment in the current design. A part-payment smaller than the arrears changes no schedule.</w:t>
       </w:r>
     </w:p>
     <w:p>
@@ -10097,7 +10118,7 @@
           <w:sz w:val="21"/>
           <w:szCs w:val="21"/>
         </w:rPr>
-        <w:t xml:space="preserve">Payoff amount = outstanding principal (as of the next pending installment) + interest accrued between the day after the last paid installment's due date and the foreclosure date (summed from posted interest_accrual rows).</w:t>
+        <w:t xml:space="preserve">Payoff amount = what is still owed on raised demands (principal, interest and penal interest) + principal of instalments not yet demanded + interest accrued between the day after the last demand's due date and the foreclosure date (summed from posted interest_accrual rows) + penal interest charged up to the day before the foreclosure date, less any advance the account holds. Penal interest stops at the foreclosure date.</w:t>
       </w:r>
     </w:p>
     <w:p>
@@ -32977,7 +32998,7 @@
           <w:sz w:val="21"/>
           <w:szCs w:val="21"/>
         </w:rPr>
-        <w:t xml:space="preserve">) are unchanged. The other 27 jobs remain stubs; Chapter 10 describes what each is meant to do.</w:t>
+        <w:t xml:space="preserve">) are unchanged. Version 1.7 adds two more: DEMAND_RAISE_DAILY and PENAL_INTEREST_CALCULATION_DAILY (14.9). The jobs not listed here remain stubs; Chapter 10 describes what each is meant to do.</w:t>
       </w:r>
     </w:p>
     <w:p>
@@ -36968,6 +36989,4084 @@
           <w:szCs w:val="21"/>
         </w:rPr>
         <w:t xml:space="preserve"> in this environment; run the full build and the integration tests before relying on them.</w:t>
+      </w:r>
+    </w:p>
+    <w:p>
+      <w:pPr>
+        <w:pStyle w:val="Heading1"/>
+        <w:pBdr>
+          <w:bottom w:val="single" w:color="1F3864" w:sz="8" w:space="4"/>
+        </w:pBdr>
+        <w:spacing w:after="160" w:before="360"/>
+      </w:pPr>
+      <w:r>
+        <w:rPr>
+          <w:b/>
+          <w:bCs/>
+          <w:color w:val="1F3864"/>
+          <w:sz w:val="30"/>
+          <w:szCs w:val="30"/>
+        </w:rPr>
+        <w:t xml:space="preserve">14. Demands, Payment Waterfall and Penal Interest (version 1.7)</w:t>
+      </w:r>
+    </w:p>
+    <w:p>
+      <w:pPr>
+        <w:pStyle w:val="Heading2"/>
+        <w:spacing w:after="120" w:before="280"/>
+      </w:pPr>
+      <w:r>
+        <w:rPr>
+          <w:b/>
+          <w:bCs/>
+          <w:color w:val="2E5AA8"/>
+          <w:sz w:val="25"/>
+          <w:szCs w:val="25"/>
+        </w:rPr>
+        <w:t xml:space="preserve">14.1 What Is New</w:t>
+      </w:r>
+    </w:p>
+    <w:p>
+      <w:pPr>
+        <w:spacing w:after="140" w:line="276"/>
+      </w:pPr>
+      <w:r>
+        <w:rPr>
+          <w:sz w:val="21"/>
+          <w:szCs w:val="21"/>
+        </w:rPr>
+        <w:t xml:space="preserve">Until version 1.6 an instalment was either paid or not, a payment had to equal the instalment exactly, only an ACTIVE account could pay, and a late instalment cost nothing extra. Version 1.7 changes this in two steps, both described here.</w:t>
+      </w:r>
+    </w:p>
+    <w:p>
+      <w:pPr>
+        <w:pStyle w:val="ListParagraph"/>
+        <w:numPr>
+          <w:ilvl w:val="0"/>
+          <w:numId w:val="1"/>
+        </w:numPr>
+        <w:spacing w:after="80" w:line="264"/>
+      </w:pPr>
+      <w:r>
+        <w:rPr>
+          <w:b/>
+          <w:bCs/>
+          <w:sz w:val="21"/>
+          <w:szCs w:val="21"/>
+        </w:rPr>
+        <w:t xml:space="preserve">Phase 1 — demands and the payment waterfall.</w:t>
+      </w:r>
+      <w:r>
+        <w:rPr>
+          <w:sz w:val="21"/>
+          <w:szCs w:val="21"/>
+        </w:rPr>
+        <w:t xml:space="preserve"> What falls due on a due date becomes a demand. A payment of any amount is applied to demands oldest first, and payments are accepted on accounts in an NPA status.</w:t>
+      </w:r>
+    </w:p>
+    <w:p>
+      <w:pPr>
+        <w:pStyle w:val="ListParagraph"/>
+        <w:numPr>
+          <w:ilvl w:val="0"/>
+          <w:numId w:val="1"/>
+        </w:numPr>
+        <w:spacing w:after="80" w:line="264"/>
+      </w:pPr>
+      <w:r>
+        <w:rPr>
+          <w:b/>
+          <w:bCs/>
+          <w:sz w:val="21"/>
+          <w:szCs w:val="21"/>
+        </w:rPr>
+        <w:t xml:space="preserve">Phase 2 — penal interest.</w:t>
+      </w:r>
+      <w:r>
+        <w:rPr>
+          <w:sz w:val="21"/>
+          <w:szCs w:val="21"/>
+        </w:rPr>
+        <w:t xml:space="preserve"> An overdue demand earns penal interest each day at a rate set on the product. Penal interest is paid first by the waterfall and is shown in every figure a borrower or operator sees.</w:t>
+      </w:r>
+    </w:p>
+    <w:p>
+      <w:pPr>
+        <w:spacing w:after="140" w:line="276"/>
+      </w:pPr>
+      <w:r>
+        <w:rPr>
+          <w:sz w:val="21"/>
+          <w:szCs w:val="21"/>
+        </w:rPr>
+        <w:t xml:space="preserve">The figures in the worked examples below use the placeholder settings of the requirement document (24% p.a., ACT/365, 0 grace days, no cap). They are the defaults of the product settings, not a policy decision.</w:t>
+      </w:r>
+    </w:p>
+    <w:p>
+      <w:pPr>
+        <w:pStyle w:val="Heading2"/>
+        <w:spacing w:after="120" w:before="280"/>
+      </w:pPr>
+      <w:r>
+        <w:rPr>
+          <w:b/>
+          <w:bCs/>
+          <w:color w:val="2E5AA8"/>
+          <w:sz w:val="25"/>
+          <w:szCs w:val="25"/>
+        </w:rPr>
+        <w:t xml:space="preserve">14.2 Demand on the Due Date</w:t>
+      </w:r>
+    </w:p>
+    <w:p>
+      <w:pPr>
+        <w:spacing w:after="140" w:line="276"/>
+      </w:pPr>
+      <w:r>
+        <w:rPr>
+          <w:sz w:val="21"/>
+          <w:szCs w:val="21"/>
+        </w:rPr>
+        <w:t xml:space="preserve">A demand is one row per account and instalment: the principal and interest that fell due, how much of each has been paid, and the penal interest charged and paid. The daily job DEMAND_RAISE_DAILY raises a demand for every instalment due on or before the business date. Raising twice changes nothing, and a missed day is caught up. A payment also raises any due demand first, so payments do not depend on the job having run.</w:t>
+      </w:r>
+    </w:p>
+    <w:tbl>
+      <w:tblPr>
+        <w:tblW w:type="dxa" w:w="9500"/>
+        <w:tblBorders>
+          <w:top w:val="single" w:color="auto" w:sz="4"/>
+          <w:left w:val="single" w:color="auto" w:sz="4"/>
+          <w:bottom w:val="single" w:color="auto" w:sz="4"/>
+          <w:right w:val="single" w:color="auto" w:sz="4"/>
+          <w:insideH w:val="single" w:color="auto" w:sz="4"/>
+          <w:insideV w:val="single" w:color="auto" w:sz="4"/>
+        </w:tblBorders>
+      </w:tblPr>
+      <w:tblGrid>
+        <w:gridCol w:w="2100"/>
+        <w:gridCol w:w="7400"/>
+      </w:tblGrid>
+      <w:tr>
+        <w:trPr>
+          <w:tblHeader/>
+        </w:trPr>
+        <w:tc>
+          <w:tcPr>
+            <w:tcW w:type="dxa" w:w="2100"/>
+            <w:shd w:fill="1F3864" w:val="clear"/>
+            <w:tcMar>
+              <w:top w:type="dxa" w:w="60"/>
+              <w:left w:type="dxa" w:w="100"/>
+              <w:bottom w:type="dxa" w:w="60"/>
+              <w:right w:type="dxa" w:w="100"/>
+            </w:tcMar>
+            <w:vAlign w:val="center"/>
+          </w:tcPr>
+          <w:p>
+            <w:pPr>
+              <w:jc w:val="left"/>
+            </w:pPr>
+            <w:r>
+              <w:rPr>
+                <w:b/>
+                <w:bCs/>
+                <w:color w:val="FFFFFF"/>
+                <w:sz w:val="19"/>
+                <w:szCs w:val="19"/>
+              </w:rPr>
+              <w:t xml:space="preserve">Demand status</w:t>
+            </w:r>
+          </w:p>
+        </w:tc>
+        <w:tc>
+          <w:tcPr>
+            <w:tcW w:type="dxa" w:w="7400"/>
+            <w:shd w:fill="1F3864" w:val="clear"/>
+            <w:tcMar>
+              <w:top w:type="dxa" w:w="60"/>
+              <w:left w:type="dxa" w:w="100"/>
+              <w:bottom w:type="dxa" w:w="60"/>
+              <w:right w:type="dxa" w:w="100"/>
+            </w:tcMar>
+            <w:vAlign w:val="center"/>
+          </w:tcPr>
+          <w:p>
+            <w:pPr>
+              <w:jc w:val="left"/>
+            </w:pPr>
+            <w:r>
+              <w:rPr>
+                <w:b/>
+                <w:bCs/>
+                <w:color w:val="FFFFFF"/>
+                <w:sz w:val="19"/>
+                <w:szCs w:val="19"/>
+              </w:rPr>
+              <w:t xml:space="preserve">Meaning</w:t>
+            </w:r>
+          </w:p>
+        </w:tc>
+      </w:tr>
+      <w:tr>
+        <w:trPr>
+          <w:cantSplit/>
+        </w:trPr>
+        <w:tc>
+          <w:tcPr>
+            <w:tcW w:type="dxa" w:w="2100"/>
+            <w:tcMar>
+              <w:top w:type="dxa" w:w="60"/>
+              <w:left w:type="dxa" w:w="100"/>
+              <w:bottom w:type="dxa" w:w="60"/>
+              <w:right w:type="dxa" w:w="100"/>
+            </w:tcMar>
+            <w:vAlign w:val="center"/>
+          </w:tcPr>
+          <w:p>
+            <w:pPr>
+              <w:jc w:val="left"/>
+            </w:pPr>
+            <w:r>
+              <w:rPr>
+                <w:sz w:val="19"/>
+                <w:szCs w:val="19"/>
+              </w:rPr>
+              <w:t xml:space="preserve">OPEN</w:t>
+            </w:r>
+          </w:p>
+        </w:tc>
+        <w:tc>
+          <w:tcPr>
+            <w:tcW w:type="dxa" w:w="7400"/>
+            <w:tcMar>
+              <w:top w:type="dxa" w:w="60"/>
+              <w:left w:type="dxa" w:w="100"/>
+              <w:bottom w:type="dxa" w:w="60"/>
+              <w:right w:type="dxa" w:w="100"/>
+            </w:tcMar>
+            <w:vAlign w:val="center"/>
+          </w:tcPr>
+          <w:p>
+            <w:pPr>
+              <w:jc w:val="left"/>
+            </w:pPr>
+            <w:r>
+              <w:rPr>
+                <w:sz w:val="19"/>
+                <w:szCs w:val="19"/>
+              </w:rPr>
+              <w:t xml:space="preserve">Raised; nothing paid yet.</w:t>
+            </w:r>
+          </w:p>
+        </w:tc>
+      </w:tr>
+      <w:tr>
+        <w:trPr>
+          <w:cantSplit/>
+        </w:trPr>
+        <w:tc>
+          <w:tcPr>
+            <w:tcW w:type="dxa" w:w="2100"/>
+            <w:shd w:fill="F5F8FC" w:val="clear"/>
+            <w:tcMar>
+              <w:top w:type="dxa" w:w="60"/>
+              <w:left w:type="dxa" w:w="100"/>
+              <w:bottom w:type="dxa" w:w="60"/>
+              <w:right w:type="dxa" w:w="100"/>
+            </w:tcMar>
+            <w:vAlign w:val="center"/>
+          </w:tcPr>
+          <w:p>
+            <w:pPr>
+              <w:jc w:val="left"/>
+            </w:pPr>
+            <w:r>
+              <w:rPr>
+                <w:sz w:val="19"/>
+                <w:szCs w:val="19"/>
+              </w:rPr>
+              <w:t xml:space="preserve">PART_PAID</w:t>
+            </w:r>
+          </w:p>
+        </w:tc>
+        <w:tc>
+          <w:tcPr>
+            <w:tcW w:type="dxa" w:w="7400"/>
+            <w:shd w:fill="F5F8FC" w:val="clear"/>
+            <w:tcMar>
+              <w:top w:type="dxa" w:w="60"/>
+              <w:left w:type="dxa" w:w="100"/>
+              <w:bottom w:type="dxa" w:w="60"/>
+              <w:right w:type="dxa" w:w="100"/>
+            </w:tcMar>
+            <w:vAlign w:val="center"/>
+          </w:tcPr>
+          <w:p>
+            <w:pPr>
+              <w:jc w:val="left"/>
+            </w:pPr>
+            <w:r>
+              <w:rPr>
+                <w:sz w:val="19"/>
+                <w:szCs w:val="19"/>
+              </w:rPr>
+              <w:t xml:space="preserve">Something is paid, but principal, interest or penal interest is still owed.</w:t>
+            </w:r>
+          </w:p>
+        </w:tc>
+      </w:tr>
+      <w:tr>
+        <w:trPr>
+          <w:cantSplit/>
+        </w:trPr>
+        <w:tc>
+          <w:tcPr>
+            <w:tcW w:type="dxa" w:w="2100"/>
+            <w:tcMar>
+              <w:top w:type="dxa" w:w="60"/>
+              <w:left w:type="dxa" w:w="100"/>
+              <w:bottom w:type="dxa" w:w="60"/>
+              <w:right w:type="dxa" w:w="100"/>
+            </w:tcMar>
+            <w:vAlign w:val="center"/>
+          </w:tcPr>
+          <w:p>
+            <w:pPr>
+              <w:jc w:val="left"/>
+            </w:pPr>
+            <w:r>
+              <w:rPr>
+                <w:sz w:val="19"/>
+                <w:szCs w:val="19"/>
+              </w:rPr>
+              <w:t xml:space="preserve">CLEARED</w:t>
+            </w:r>
+          </w:p>
+        </w:tc>
+        <w:tc>
+          <w:tcPr>
+            <w:tcW w:type="dxa" w:w="7400"/>
+            <w:tcMar>
+              <w:top w:type="dxa" w:w="60"/>
+              <w:left w:type="dxa" w:w="100"/>
+              <w:bottom w:type="dxa" w:w="60"/>
+              <w:right w:type="dxa" w:w="100"/>
+            </w:tcMar>
+            <w:vAlign w:val="center"/>
+          </w:tcPr>
+          <w:p>
+            <w:pPr>
+              <w:jc w:val="left"/>
+            </w:pPr>
+            <w:r>
+              <w:rPr>
+                <w:sz w:val="19"/>
+                <w:szCs w:val="19"/>
+              </w:rPr>
+              <w:t xml:space="preserve">Principal, interest </w:t>
+            </w:r>
+            <w:r>
+              <w:rPr>
+                <w:b/>
+                <w:bCs/>
+                <w:sz w:val="19"/>
+                <w:szCs w:val="19"/>
+              </w:rPr>
+              <w:t xml:space="preserve">and</w:t>
+            </w:r>
+            <w:r>
+              <w:rPr>
+                <w:sz w:val="19"/>
+                <w:szCs w:val="19"/>
+              </w:rPr>
+              <w:t xml:space="preserve"> penal interest are all paid. The instalment on the schedule is marked PAID as soon as principal and interest are paid, but the demand stays open until penal interest is paid too.</w:t>
+            </w:r>
+          </w:p>
+        </w:tc>
+      </w:tr>
+    </w:tbl>
+    <w:p>
+      <w:pPr>
+        <w:spacing w:after="60"/>
+      </w:pPr>
+    </w:p>
+    <w:p>
+      <w:pPr>
+        <w:spacing w:after="140" w:line="276"/>
+      </w:pPr>
+      <w:r>
+        <w:rPr>
+          <w:b/>
+          <w:bCs/>
+          <w:sz w:val="21"/>
+          <w:szCs w:val="21"/>
+        </w:rPr>
+        <w:t xml:space="preserve">Accounts that existed before demands.</w:t>
+      </w:r>
+      <w:r>
+        <w:rPr>
+          <w:sz w:val="21"/>
+          <w:szCs w:val="21"/>
+        </w:rPr>
+        <w:t xml:space="preserve"> The first time demands are raised for an account, every due instalment of its current schedule gets a demand, and instalments already PAID become CLEARED demands. Rate resets and part-payments re-price or regenerate only instalments that have no demand yet.</w:t>
+      </w:r>
+    </w:p>
+    <w:p>
+      <w:pPr>
+        <w:pStyle w:val="Heading2"/>
+        <w:spacing w:after="120" w:before="280"/>
+      </w:pPr>
+      <w:r>
+        <w:rPr>
+          <w:b/>
+          <w:bCs/>
+          <w:color w:val="2E5AA8"/>
+          <w:sz w:val="25"/>
+          <w:szCs w:val="25"/>
+        </w:rPr>
+        <w:t xml:space="preserve">14.3 How a Payment Is Applied (the Waterfall)</w:t>
+      </w:r>
+    </w:p>
+    <w:p>
+      <w:pPr>
+        <w:spacing w:after="140" w:line="276"/>
+      </w:pPr>
+      <w:r>
+        <w:rPr>
+          <w:sz w:val="21"/>
+          <w:szCs w:val="21"/>
+        </w:rPr>
+        <w:t xml:space="preserve">Every payment — EMI, part-payment or foreclosure — is applied in this order:</w:t>
+      </w:r>
+    </w:p>
+    <w:p>
+      <w:pPr>
+        <w:pStyle w:val="ListParagraph"/>
+        <w:numPr>
+          <w:ilvl w:val="0"/>
+          <w:numId w:val="1"/>
+        </w:numPr>
+        <w:spacing w:after="80" w:line="264"/>
+      </w:pPr>
+      <w:r>
+        <w:rPr>
+          <w:b/>
+          <w:bCs/>
+          <w:sz w:val="21"/>
+          <w:szCs w:val="21"/>
+        </w:rPr>
+        <w:t xml:space="preserve">Penal interest</w:t>
+      </w:r>
+      <w:r>
+        <w:rPr>
+          <w:sz w:val="21"/>
+          <w:szCs w:val="21"/>
+        </w:rPr>
+        <w:t xml:space="preserve">, oldest demand first.</w:t>
+      </w:r>
+    </w:p>
+    <w:p>
+      <w:pPr>
+        <w:pStyle w:val="ListParagraph"/>
+        <w:numPr>
+          <w:ilvl w:val="0"/>
+          <w:numId w:val="1"/>
+        </w:numPr>
+        <w:spacing w:after="80" w:line="264"/>
+      </w:pPr>
+      <w:r>
+        <w:rPr>
+          <w:b/>
+          <w:bCs/>
+          <w:sz w:val="21"/>
+          <w:szCs w:val="21"/>
+        </w:rPr>
+        <w:t xml:space="preserve">Demands, oldest first.</w:t>
+      </w:r>
+      <w:r>
+        <w:rPr>
+          <w:sz w:val="21"/>
+          <w:szCs w:val="21"/>
+        </w:rPr>
+        <w:t xml:space="preserve"> Within a demand: interest due, then principal due.</w:t>
+      </w:r>
+    </w:p>
+    <w:p>
+      <w:pPr>
+        <w:pStyle w:val="ListParagraph"/>
+        <w:numPr>
+          <w:ilvl w:val="0"/>
+          <w:numId w:val="1"/>
+        </w:numPr>
+        <w:spacing w:after="80" w:line="264"/>
+      </w:pPr>
+      <w:r>
+        <w:rPr>
+          <w:b/>
+          <w:bCs/>
+          <w:sz w:val="21"/>
+          <w:szCs w:val="21"/>
+        </w:rPr>
+        <w:t xml:space="preserve">Surplus</w:t>
+      </w:r>
+      <w:r>
+        <w:rPr>
+          <w:sz w:val="21"/>
+          <w:szCs w:val="21"/>
+        </w:rPr>
+        <w:t xml:space="preserve">, after every demand is cleared: held as an </w:t>
+      </w:r>
+      <w:r>
+        <w:rPr>
+          <w:b/>
+          <w:bCs/>
+          <w:sz w:val="21"/>
+          <w:szCs w:val="21"/>
+        </w:rPr>
+        <w:t xml:space="preserve">advance</w:t>
+      </w:r>
+      <w:r>
+        <w:rPr>
+          <w:sz w:val="21"/>
+          <w:szCs w:val="21"/>
+        </w:rPr>
+        <w:t xml:space="preserve"> on the account for an EMI payment, or applied to </w:t>
+      </w:r>
+      <w:r>
+        <w:rPr>
+          <w:b/>
+          <w:bCs/>
+          <w:sz w:val="21"/>
+          <w:szCs w:val="21"/>
+        </w:rPr>
+        <w:t xml:space="preserve">principal</w:t>
+      </w:r>
+      <w:r>
+        <w:rPr>
+          <w:sz w:val="21"/>
+          <w:szCs w:val="21"/>
+        </w:rPr>
+        <w:t xml:space="preserve"> for a part-payment.</w:t>
+      </w:r>
+    </w:p>
+    <w:p>
+      <w:pPr>
+        <w:spacing w:after="140" w:line="276"/>
+      </w:pPr>
+      <w:r>
+        <w:rPr>
+          <w:sz w:val="21"/>
+          <w:szCs w:val="21"/>
+        </w:rPr>
+        <w:t xml:space="preserve">An advance (money received that matches no demand, including a payment made before the due date) is applied automatically when the next demand is raised. Every application is stored line by line (payment, demand, bucket, amount), and the payment record carries the totals paid to principal, interest and penal interest.</w:t>
+      </w:r>
+    </w:p>
+    <w:p>
+      <w:pPr>
+        <w:spacing w:after="140" w:line="276"/>
+      </w:pPr>
+      <w:r>
+        <w:rPr>
+          <w:b/>
+          <w:bCs/>
+          <w:sz w:val="21"/>
+          <w:szCs w:val="21"/>
+        </w:rPr>
+        <w:t xml:space="preserve">Example.</w:t>
+      </w:r>
+      <w:r>
+        <w:rPr>
+          <w:sz w:val="21"/>
+          <w:szCs w:val="21"/>
+        </w:rPr>
+        <w:t xml:space="preserve"> Two instalments of 15,000.00 (12,000.00 principal and 3,000.00 interest) were due on 5 Nov and 5 Dec and nothing was paid. On 10 Dec the amount payable is 30,374.79 (case C in 14.5). A payment of 20,000.00 is applied like this:</w:t>
+      </w:r>
+    </w:p>
+    <w:tbl>
+      <w:tblPr>
+        <w:tblW w:type="dxa" w:w="9500"/>
+        <w:tblBorders>
+          <w:top w:val="single" w:color="auto" w:sz="4"/>
+          <w:left w:val="single" w:color="auto" w:sz="4"/>
+          <w:bottom w:val="single" w:color="auto" w:sz="4"/>
+          <w:right w:val="single" w:color="auto" w:sz="4"/>
+          <w:insideH w:val="single" w:color="auto" w:sz="4"/>
+          <w:insideV w:val="single" w:color="auto" w:sz="4"/>
+        </w:tblBorders>
+      </w:tblPr>
+      <w:tblGrid>
+        <w:gridCol w:w="5000"/>
+        <w:gridCol w:w="2250"/>
+        <w:gridCol w:w="2250"/>
+      </w:tblGrid>
+      <w:tr>
+        <w:trPr>
+          <w:tblHeader/>
+        </w:trPr>
+        <w:tc>
+          <w:tcPr>
+            <w:tcW w:type="dxa" w:w="5000"/>
+            <w:shd w:fill="1F3864" w:val="clear"/>
+            <w:tcMar>
+              <w:top w:type="dxa" w:w="60"/>
+              <w:left w:type="dxa" w:w="100"/>
+              <w:bottom w:type="dxa" w:w="60"/>
+              <w:right w:type="dxa" w:w="100"/>
+            </w:tcMar>
+            <w:vAlign w:val="center"/>
+          </w:tcPr>
+          <w:p>
+            <w:pPr>
+              <w:jc w:val="left"/>
+            </w:pPr>
+            <w:r>
+              <w:rPr>
+                <w:b/>
+                <w:bCs/>
+                <w:color w:val="FFFFFF"/>
+                <w:sz w:val="19"/>
+                <w:szCs w:val="19"/>
+              </w:rPr>
+              <w:t xml:space="preserve">Step</w:t>
+            </w:r>
+          </w:p>
+        </w:tc>
+        <w:tc>
+          <w:tcPr>
+            <w:tcW w:type="dxa" w:w="2250"/>
+            <w:shd w:fill="1F3864" w:val="clear"/>
+            <w:tcMar>
+              <w:top w:type="dxa" w:w="60"/>
+              <w:left w:type="dxa" w:w="100"/>
+              <w:bottom w:type="dxa" w:w="60"/>
+              <w:right w:type="dxa" w:w="100"/>
+            </w:tcMar>
+            <w:vAlign w:val="center"/>
+          </w:tcPr>
+          <w:p>
+            <w:pPr>
+              <w:jc w:val="left"/>
+            </w:pPr>
+            <w:r>
+              <w:rPr>
+                <w:b/>
+                <w:bCs/>
+                <w:color w:val="FFFFFF"/>
+                <w:sz w:val="19"/>
+                <w:szCs w:val="19"/>
+              </w:rPr>
+              <w:t xml:space="preserve">Applied</w:t>
+            </w:r>
+          </w:p>
+        </w:tc>
+        <w:tc>
+          <w:tcPr>
+            <w:tcW w:type="dxa" w:w="2250"/>
+            <w:shd w:fill="1F3864" w:val="clear"/>
+            <w:tcMar>
+              <w:top w:type="dxa" w:w="60"/>
+              <w:left w:type="dxa" w:w="100"/>
+              <w:bottom w:type="dxa" w:w="60"/>
+              <w:right w:type="dxa" w:w="100"/>
+            </w:tcMar>
+            <w:vAlign w:val="center"/>
+          </w:tcPr>
+          <w:p>
+            <w:pPr>
+              <w:jc w:val="left"/>
+            </w:pPr>
+            <w:r>
+              <w:rPr>
+                <w:b/>
+                <w:bCs/>
+                <w:color w:val="FFFFFF"/>
+                <w:sz w:val="19"/>
+                <w:szCs w:val="19"/>
+              </w:rPr>
+              <w:t xml:space="preserve">Left</w:t>
+            </w:r>
+          </w:p>
+        </w:tc>
+      </w:tr>
+      <w:tr>
+        <w:trPr>
+          <w:cantSplit/>
+        </w:trPr>
+        <w:tc>
+          <w:tcPr>
+            <w:tcW w:type="dxa" w:w="5000"/>
+            <w:tcMar>
+              <w:top w:type="dxa" w:w="60"/>
+              <w:left w:type="dxa" w:w="100"/>
+              <w:bottom w:type="dxa" w:w="60"/>
+              <w:right w:type="dxa" w:w="100"/>
+            </w:tcMar>
+            <w:vAlign w:val="center"/>
+          </w:tcPr>
+          <w:p>
+            <w:pPr>
+              <w:jc w:val="left"/>
+            </w:pPr>
+            <w:r>
+              <w:rPr>
+                <w:sz w:val="19"/>
+                <w:szCs w:val="19"/>
+              </w:rPr>
+              <w:t xml:space="preserve">Penal interest, 5 Nov demand</w:t>
+            </w:r>
+          </w:p>
+        </w:tc>
+        <w:tc>
+          <w:tcPr>
+            <w:tcW w:type="dxa" w:w="2250"/>
+            <w:tcMar>
+              <w:top w:type="dxa" w:w="60"/>
+              <w:left w:type="dxa" w:w="100"/>
+              <w:bottom w:type="dxa" w:w="60"/>
+              <w:right w:type="dxa" w:w="100"/>
+            </w:tcMar>
+            <w:vAlign w:val="center"/>
+          </w:tcPr>
+          <w:p>
+            <w:pPr>
+              <w:jc w:val="left"/>
+            </w:pPr>
+            <w:r>
+              <w:rPr>
+                <w:sz w:val="19"/>
+                <w:szCs w:val="19"/>
+              </w:rPr>
+              <w:t xml:space="preserve">335.34</w:t>
+            </w:r>
+          </w:p>
+        </w:tc>
+        <w:tc>
+          <w:tcPr>
+            <w:tcW w:type="dxa" w:w="2250"/>
+            <w:tcMar>
+              <w:top w:type="dxa" w:w="60"/>
+              <w:left w:type="dxa" w:w="100"/>
+              <w:bottom w:type="dxa" w:w="60"/>
+              <w:right w:type="dxa" w:w="100"/>
+            </w:tcMar>
+            <w:vAlign w:val="center"/>
+          </w:tcPr>
+          <w:p>
+            <w:pPr>
+              <w:jc w:val="left"/>
+            </w:pPr>
+            <w:r>
+              <w:rPr>
+                <w:sz w:val="19"/>
+                <w:szCs w:val="19"/>
+              </w:rPr>
+              <w:t xml:space="preserve">19,664.66</w:t>
+            </w:r>
+          </w:p>
+        </w:tc>
+      </w:tr>
+      <w:tr>
+        <w:trPr>
+          <w:cantSplit/>
+        </w:trPr>
+        <w:tc>
+          <w:tcPr>
+            <w:tcW w:type="dxa" w:w="5000"/>
+            <w:shd w:fill="F5F8FC" w:val="clear"/>
+            <w:tcMar>
+              <w:top w:type="dxa" w:w="60"/>
+              <w:left w:type="dxa" w:w="100"/>
+              <w:bottom w:type="dxa" w:w="60"/>
+              <w:right w:type="dxa" w:w="100"/>
+            </w:tcMar>
+            <w:vAlign w:val="center"/>
+          </w:tcPr>
+          <w:p>
+            <w:pPr>
+              <w:jc w:val="left"/>
+            </w:pPr>
+            <w:r>
+              <w:rPr>
+                <w:sz w:val="19"/>
+                <w:szCs w:val="19"/>
+              </w:rPr>
+              <w:t xml:space="preserve">Penal interest, 5 Dec demand</w:t>
+            </w:r>
+          </w:p>
+        </w:tc>
+        <w:tc>
+          <w:tcPr>
+            <w:tcW w:type="dxa" w:w="2250"/>
+            <w:shd w:fill="F5F8FC" w:val="clear"/>
+            <w:tcMar>
+              <w:top w:type="dxa" w:w="60"/>
+              <w:left w:type="dxa" w:w="100"/>
+              <w:bottom w:type="dxa" w:w="60"/>
+              <w:right w:type="dxa" w:w="100"/>
+            </w:tcMar>
+            <w:vAlign w:val="center"/>
+          </w:tcPr>
+          <w:p>
+            <w:pPr>
+              <w:jc w:val="left"/>
+            </w:pPr>
+            <w:r>
+              <w:rPr>
+                <w:sz w:val="19"/>
+                <w:szCs w:val="19"/>
+              </w:rPr>
+              <w:t xml:space="preserve">39.45</w:t>
+            </w:r>
+          </w:p>
+        </w:tc>
+        <w:tc>
+          <w:tcPr>
+            <w:tcW w:type="dxa" w:w="2250"/>
+            <w:shd w:fill="F5F8FC" w:val="clear"/>
+            <w:tcMar>
+              <w:top w:type="dxa" w:w="60"/>
+              <w:left w:type="dxa" w:w="100"/>
+              <w:bottom w:type="dxa" w:w="60"/>
+              <w:right w:type="dxa" w:w="100"/>
+            </w:tcMar>
+            <w:vAlign w:val="center"/>
+          </w:tcPr>
+          <w:p>
+            <w:pPr>
+              <w:jc w:val="left"/>
+            </w:pPr>
+            <w:r>
+              <w:rPr>
+                <w:sz w:val="19"/>
+                <w:szCs w:val="19"/>
+              </w:rPr>
+              <w:t xml:space="preserve">19,625.21</w:t>
+            </w:r>
+          </w:p>
+        </w:tc>
+      </w:tr>
+      <w:tr>
+        <w:trPr>
+          <w:cantSplit/>
+        </w:trPr>
+        <w:tc>
+          <w:tcPr>
+            <w:tcW w:type="dxa" w:w="5000"/>
+            <w:tcMar>
+              <w:top w:type="dxa" w:w="60"/>
+              <w:left w:type="dxa" w:w="100"/>
+              <w:bottom w:type="dxa" w:w="60"/>
+              <w:right w:type="dxa" w:w="100"/>
+            </w:tcMar>
+            <w:vAlign w:val="center"/>
+          </w:tcPr>
+          <w:p>
+            <w:pPr>
+              <w:jc w:val="left"/>
+            </w:pPr>
+            <w:r>
+              <w:rPr>
+                <w:sz w:val="19"/>
+                <w:szCs w:val="19"/>
+              </w:rPr>
+              <w:t xml:space="preserve">5 Nov demand: interest, then principal</w:t>
+            </w:r>
+          </w:p>
+        </w:tc>
+        <w:tc>
+          <w:tcPr>
+            <w:tcW w:type="dxa" w:w="2250"/>
+            <w:tcMar>
+              <w:top w:type="dxa" w:w="60"/>
+              <w:left w:type="dxa" w:w="100"/>
+              <w:bottom w:type="dxa" w:w="60"/>
+              <w:right w:type="dxa" w:w="100"/>
+            </w:tcMar>
+            <w:vAlign w:val="center"/>
+          </w:tcPr>
+          <w:p>
+            <w:pPr>
+              <w:jc w:val="left"/>
+            </w:pPr>
+            <w:r>
+              <w:rPr>
+                <w:sz w:val="19"/>
+                <w:szCs w:val="19"/>
+              </w:rPr>
+              <w:t xml:space="preserve">3,000.00 + 12,000.00</w:t>
+            </w:r>
+          </w:p>
+        </w:tc>
+        <w:tc>
+          <w:tcPr>
+            <w:tcW w:type="dxa" w:w="2250"/>
+            <w:tcMar>
+              <w:top w:type="dxa" w:w="60"/>
+              <w:left w:type="dxa" w:w="100"/>
+              <w:bottom w:type="dxa" w:w="60"/>
+              <w:right w:type="dxa" w:w="100"/>
+            </w:tcMar>
+            <w:vAlign w:val="center"/>
+          </w:tcPr>
+          <w:p>
+            <w:pPr>
+              <w:jc w:val="left"/>
+            </w:pPr>
+            <w:r>
+              <w:rPr>
+                <w:sz w:val="19"/>
+                <w:szCs w:val="19"/>
+              </w:rPr>
+              <w:t xml:space="preserve">4,625.21</w:t>
+            </w:r>
+          </w:p>
+        </w:tc>
+      </w:tr>
+      <w:tr>
+        <w:trPr>
+          <w:cantSplit/>
+        </w:trPr>
+        <w:tc>
+          <w:tcPr>
+            <w:tcW w:type="dxa" w:w="5000"/>
+            <w:shd w:fill="F5F8FC" w:val="clear"/>
+            <w:tcMar>
+              <w:top w:type="dxa" w:w="60"/>
+              <w:left w:type="dxa" w:w="100"/>
+              <w:bottom w:type="dxa" w:w="60"/>
+              <w:right w:type="dxa" w:w="100"/>
+            </w:tcMar>
+            <w:vAlign w:val="center"/>
+          </w:tcPr>
+          <w:p>
+            <w:pPr>
+              <w:jc w:val="left"/>
+            </w:pPr>
+            <w:r>
+              <w:rPr>
+                <w:sz w:val="19"/>
+                <w:szCs w:val="19"/>
+              </w:rPr>
+              <w:t xml:space="preserve">5 Dec demand: interest</w:t>
+            </w:r>
+          </w:p>
+        </w:tc>
+        <w:tc>
+          <w:tcPr>
+            <w:tcW w:type="dxa" w:w="2250"/>
+            <w:shd w:fill="F5F8FC" w:val="clear"/>
+            <w:tcMar>
+              <w:top w:type="dxa" w:w="60"/>
+              <w:left w:type="dxa" w:w="100"/>
+              <w:bottom w:type="dxa" w:w="60"/>
+              <w:right w:type="dxa" w:w="100"/>
+            </w:tcMar>
+            <w:vAlign w:val="center"/>
+          </w:tcPr>
+          <w:p>
+            <w:pPr>
+              <w:jc w:val="left"/>
+            </w:pPr>
+            <w:r>
+              <w:rPr>
+                <w:sz w:val="19"/>
+                <w:szCs w:val="19"/>
+              </w:rPr>
+              <w:t xml:space="preserve">3,000.00</w:t>
+            </w:r>
+          </w:p>
+        </w:tc>
+        <w:tc>
+          <w:tcPr>
+            <w:tcW w:type="dxa" w:w="2250"/>
+            <w:shd w:fill="F5F8FC" w:val="clear"/>
+            <w:tcMar>
+              <w:top w:type="dxa" w:w="60"/>
+              <w:left w:type="dxa" w:w="100"/>
+              <w:bottom w:type="dxa" w:w="60"/>
+              <w:right w:type="dxa" w:w="100"/>
+            </w:tcMar>
+            <w:vAlign w:val="center"/>
+          </w:tcPr>
+          <w:p>
+            <w:pPr>
+              <w:jc w:val="left"/>
+            </w:pPr>
+            <w:r>
+              <w:rPr>
+                <w:sz w:val="19"/>
+                <w:szCs w:val="19"/>
+              </w:rPr>
+              <w:t xml:space="preserve">1,625.21</w:t>
+            </w:r>
+          </w:p>
+        </w:tc>
+      </w:tr>
+      <w:tr>
+        <w:trPr>
+          <w:cantSplit/>
+        </w:trPr>
+        <w:tc>
+          <w:tcPr>
+            <w:tcW w:type="dxa" w:w="5000"/>
+            <w:tcMar>
+              <w:top w:type="dxa" w:w="60"/>
+              <w:left w:type="dxa" w:w="100"/>
+              <w:bottom w:type="dxa" w:w="60"/>
+              <w:right w:type="dxa" w:w="100"/>
+            </w:tcMar>
+            <w:vAlign w:val="center"/>
+          </w:tcPr>
+          <w:p>
+            <w:pPr>
+              <w:jc w:val="left"/>
+            </w:pPr>
+            <w:r>
+              <w:rPr>
+                <w:sz w:val="19"/>
+                <w:szCs w:val="19"/>
+              </w:rPr>
+              <w:t xml:space="preserve">5 Dec demand: principal</w:t>
+            </w:r>
+          </w:p>
+        </w:tc>
+        <w:tc>
+          <w:tcPr>
+            <w:tcW w:type="dxa" w:w="2250"/>
+            <w:tcMar>
+              <w:top w:type="dxa" w:w="60"/>
+              <w:left w:type="dxa" w:w="100"/>
+              <w:bottom w:type="dxa" w:w="60"/>
+              <w:right w:type="dxa" w:w="100"/>
+            </w:tcMar>
+            <w:vAlign w:val="center"/>
+          </w:tcPr>
+          <w:p>
+            <w:pPr>
+              <w:jc w:val="left"/>
+            </w:pPr>
+            <w:r>
+              <w:rPr>
+                <w:sz w:val="19"/>
+                <w:szCs w:val="19"/>
+              </w:rPr>
+              <w:t xml:space="preserve">1,625.21 of 12,000.00</w:t>
+            </w:r>
+          </w:p>
+        </w:tc>
+        <w:tc>
+          <w:tcPr>
+            <w:tcW w:type="dxa" w:w="2250"/>
+            <w:tcMar>
+              <w:top w:type="dxa" w:w="60"/>
+              <w:left w:type="dxa" w:w="100"/>
+              <w:bottom w:type="dxa" w:w="60"/>
+              <w:right w:type="dxa" w:w="100"/>
+            </w:tcMar>
+            <w:vAlign w:val="center"/>
+          </w:tcPr>
+          <w:p>
+            <w:pPr>
+              <w:jc w:val="left"/>
+            </w:pPr>
+            <w:r>
+              <w:rPr>
+                <w:sz w:val="19"/>
+                <w:szCs w:val="19"/>
+              </w:rPr>
+              <w:t xml:space="preserve">0.00</w:t>
+            </w:r>
+          </w:p>
+        </w:tc>
+      </w:tr>
+    </w:tbl>
+    <w:p>
+      <w:pPr>
+        <w:spacing w:after="60"/>
+      </w:pPr>
+    </w:p>
+    <w:p>
+      <w:pPr>
+        <w:spacing w:after="140" w:line="276"/>
+      </w:pPr>
+      <w:r>
+        <w:rPr>
+          <w:sz w:val="21"/>
+          <w:szCs w:val="21"/>
+        </w:rPr>
+        <w:t xml:space="preserve">The 5 Dec demand still owes 10,374.79 of principal, so from the close of 10 Dec it earns 10,374.79 × 24% ÷ 365 = 6.8218 a day until it is paid.</w:t>
+      </w:r>
+    </w:p>
+    <w:p>
+      <w:pPr>
+        <w:pStyle w:val="Heading2"/>
+        <w:spacing w:after="120" w:before="280"/>
+      </w:pPr>
+      <w:r>
+        <w:rPr>
+          <w:b/>
+          <w:bCs/>
+          <w:color w:val="2E5AA8"/>
+          <w:sz w:val="25"/>
+          <w:szCs w:val="25"/>
+        </w:rPr>
+        <w:t xml:space="preserve">14.4 Changes to Payments</w:t>
+      </w:r>
+    </w:p>
+    <w:tbl>
+      <w:tblPr>
+        <w:tblW w:type="dxa" w:w="9500"/>
+        <w:tblBorders>
+          <w:top w:val="single" w:color="auto" w:sz="4"/>
+          <w:left w:val="single" w:color="auto" w:sz="4"/>
+          <w:bottom w:val="single" w:color="auto" w:sz="4"/>
+          <w:right w:val="single" w:color="auto" w:sz="4"/>
+          <w:insideH w:val="single" w:color="auto" w:sz="4"/>
+          <w:insideV w:val="single" w:color="auto" w:sz="4"/>
+        </w:tblBorders>
+      </w:tblPr>
+      <w:tblGrid>
+        <w:gridCol w:w="2600"/>
+        <w:gridCol w:w="3300"/>
+        <w:gridCol w:w="3600"/>
+      </w:tblGrid>
+      <w:tr>
+        <w:trPr>
+          <w:tblHeader/>
+        </w:trPr>
+        <w:tc>
+          <w:tcPr>
+            <w:tcW w:type="dxa" w:w="2600"/>
+            <w:shd w:fill="1F3864" w:val="clear"/>
+            <w:tcMar>
+              <w:top w:type="dxa" w:w="60"/>
+              <w:left w:type="dxa" w:w="100"/>
+              <w:bottom w:type="dxa" w:w="60"/>
+              <w:right w:type="dxa" w:w="100"/>
+            </w:tcMar>
+            <w:vAlign w:val="center"/>
+          </w:tcPr>
+          <w:p>
+            <w:pPr>
+              <w:jc w:val="left"/>
+            </w:pPr>
+            <w:r>
+              <w:rPr>
+                <w:b/>
+                <w:bCs/>
+                <w:color w:val="FFFFFF"/>
+                <w:sz w:val="19"/>
+                <w:szCs w:val="19"/>
+              </w:rPr>
+              <w:t xml:space="preserve">Rule</w:t>
+            </w:r>
+          </w:p>
+        </w:tc>
+        <w:tc>
+          <w:tcPr>
+            <w:tcW w:type="dxa" w:w="3300"/>
+            <w:shd w:fill="1F3864" w:val="clear"/>
+            <w:tcMar>
+              <w:top w:type="dxa" w:w="60"/>
+              <w:left w:type="dxa" w:w="100"/>
+              <w:bottom w:type="dxa" w:w="60"/>
+              <w:right w:type="dxa" w:w="100"/>
+            </w:tcMar>
+            <w:vAlign w:val="center"/>
+          </w:tcPr>
+          <w:p>
+            <w:pPr>
+              <w:jc w:val="left"/>
+            </w:pPr>
+            <w:r>
+              <w:rPr>
+                <w:b/>
+                <w:bCs/>
+                <w:color w:val="FFFFFF"/>
+                <w:sz w:val="19"/>
+                <w:szCs w:val="19"/>
+              </w:rPr>
+              <w:t xml:space="preserve">Before version 1.7</w:t>
+            </w:r>
+          </w:p>
+        </w:tc>
+        <w:tc>
+          <w:tcPr>
+            <w:tcW w:type="dxa" w:w="3600"/>
+            <w:shd w:fill="1F3864" w:val="clear"/>
+            <w:tcMar>
+              <w:top w:type="dxa" w:w="60"/>
+              <w:left w:type="dxa" w:w="100"/>
+              <w:bottom w:type="dxa" w:w="60"/>
+              <w:right w:type="dxa" w:w="100"/>
+            </w:tcMar>
+            <w:vAlign w:val="center"/>
+          </w:tcPr>
+          <w:p>
+            <w:pPr>
+              <w:jc w:val="left"/>
+            </w:pPr>
+            <w:r>
+              <w:rPr>
+                <w:b/>
+                <w:bCs/>
+                <w:color w:val="FFFFFF"/>
+                <w:sz w:val="19"/>
+                <w:szCs w:val="19"/>
+              </w:rPr>
+              <w:t xml:space="preserve">Now</w:t>
+            </w:r>
+          </w:p>
+        </w:tc>
+      </w:tr>
+      <w:tr>
+        <w:trPr>
+          <w:cantSplit/>
+        </w:trPr>
+        <w:tc>
+          <w:tcPr>
+            <w:tcW w:type="dxa" w:w="2600"/>
+            <w:tcMar>
+              <w:top w:type="dxa" w:w="60"/>
+              <w:left w:type="dxa" w:w="100"/>
+              <w:bottom w:type="dxa" w:w="60"/>
+              <w:right w:type="dxa" w:w="100"/>
+            </w:tcMar>
+            <w:vAlign w:val="center"/>
+          </w:tcPr>
+          <w:p>
+            <w:pPr>
+              <w:jc w:val="left"/>
+            </w:pPr>
+            <w:r>
+              <w:rPr>
+                <w:sz w:val="19"/>
+                <w:szCs w:val="19"/>
+              </w:rPr>
+              <w:t xml:space="preserve">Amount of an EMI payment</w:t>
+            </w:r>
+          </w:p>
+        </w:tc>
+        <w:tc>
+          <w:tcPr>
+            <w:tcW w:type="dxa" w:w="3300"/>
+            <w:tcMar>
+              <w:top w:type="dxa" w:w="60"/>
+              <w:left w:type="dxa" w:w="100"/>
+              <w:bottom w:type="dxa" w:w="60"/>
+              <w:right w:type="dxa" w:w="100"/>
+            </w:tcMar>
+            <w:vAlign w:val="center"/>
+          </w:tcPr>
+          <w:p>
+            <w:pPr>
+              <w:jc w:val="left"/>
+            </w:pPr>
+            <w:r>
+              <w:rPr>
+                <w:sz w:val="19"/>
+                <w:szCs w:val="19"/>
+              </w:rPr>
+              <w:t xml:space="preserve">Had to equal the next instalment exactly</w:t>
+            </w:r>
+          </w:p>
+        </w:tc>
+        <w:tc>
+          <w:tcPr>
+            <w:tcW w:type="dxa" w:w="3600"/>
+            <w:tcMar>
+              <w:top w:type="dxa" w:w="60"/>
+              <w:left w:type="dxa" w:w="100"/>
+              <w:bottom w:type="dxa" w:w="60"/>
+              <w:right w:type="dxa" w:w="100"/>
+            </w:tcMar>
+            <w:vAlign w:val="center"/>
+          </w:tcPr>
+          <w:p>
+            <w:pPr>
+              <w:jc w:val="left"/>
+            </w:pPr>
+            <w:r>
+              <w:rPr>
+                <w:sz w:val="19"/>
+                <w:szCs w:val="19"/>
+              </w:rPr>
+              <w:t xml:space="preserve">Any positive amount; surplus is held as an advance</w:t>
+            </w:r>
+          </w:p>
+        </w:tc>
+      </w:tr>
+      <w:tr>
+        <w:trPr>
+          <w:cantSplit/>
+        </w:trPr>
+        <w:tc>
+          <w:tcPr>
+            <w:tcW w:type="dxa" w:w="2600"/>
+            <w:shd w:fill="F5F8FC" w:val="clear"/>
+            <w:tcMar>
+              <w:top w:type="dxa" w:w="60"/>
+              <w:left w:type="dxa" w:w="100"/>
+              <w:bottom w:type="dxa" w:w="60"/>
+              <w:right w:type="dxa" w:w="100"/>
+            </w:tcMar>
+            <w:vAlign w:val="center"/>
+          </w:tcPr>
+          <w:p>
+            <w:pPr>
+              <w:jc w:val="left"/>
+            </w:pPr>
+            <w:r>
+              <w:rPr>
+                <w:sz w:val="19"/>
+                <w:szCs w:val="19"/>
+              </w:rPr>
+              <w:t xml:space="preserve">Accounts that can pay</w:t>
+            </w:r>
+          </w:p>
+        </w:tc>
+        <w:tc>
+          <w:tcPr>
+            <w:tcW w:type="dxa" w:w="3300"/>
+            <w:shd w:fill="F5F8FC" w:val="clear"/>
+            <w:tcMar>
+              <w:top w:type="dxa" w:w="60"/>
+              <w:left w:type="dxa" w:w="100"/>
+              <w:bottom w:type="dxa" w:w="60"/>
+              <w:right w:type="dxa" w:w="100"/>
+            </w:tcMar>
+            <w:vAlign w:val="center"/>
+          </w:tcPr>
+          <w:p>
+            <w:pPr>
+              <w:jc w:val="left"/>
+            </w:pPr>
+            <w:r>
+              <w:rPr>
+                <w:sz w:val="19"/>
+                <w:szCs w:val="19"/>
+              </w:rPr>
+              <w:t xml:space="preserve">ACTIVE only</w:t>
+            </w:r>
+          </w:p>
+        </w:tc>
+        <w:tc>
+          <w:tcPr>
+            <w:tcW w:type="dxa" w:w="3600"/>
+            <w:shd w:fill="F5F8FC" w:val="clear"/>
+            <w:tcMar>
+              <w:top w:type="dxa" w:w="60"/>
+              <w:left w:type="dxa" w:w="100"/>
+              <w:bottom w:type="dxa" w:w="60"/>
+              <w:right w:type="dxa" w:w="100"/>
+            </w:tcMar>
+            <w:vAlign w:val="center"/>
+          </w:tcPr>
+          <w:p>
+            <w:pPr>
+              <w:jc w:val="left"/>
+            </w:pPr>
+            <w:r>
+              <w:rPr>
+                <w:sz w:val="19"/>
+                <w:szCs w:val="19"/>
+              </w:rPr>
+              <w:t xml:space="preserve">ACTIVE and every NPA status</w:t>
+            </w:r>
+          </w:p>
+        </w:tc>
+      </w:tr>
+      <w:tr>
+        <w:trPr>
+          <w:cantSplit/>
+        </w:trPr>
+        <w:tc>
+          <w:tcPr>
+            <w:tcW w:type="dxa" w:w="2600"/>
+            <w:tcMar>
+              <w:top w:type="dxa" w:w="60"/>
+              <w:left w:type="dxa" w:w="100"/>
+              <w:bottom w:type="dxa" w:w="60"/>
+              <w:right w:type="dxa" w:w="100"/>
+            </w:tcMar>
+            <w:vAlign w:val="center"/>
+          </w:tcPr>
+          <w:p>
+            <w:pPr>
+              <w:jc w:val="left"/>
+            </w:pPr>
+            <w:r>
+              <w:rPr>
+                <w:sz w:val="19"/>
+                <w:szCs w:val="19"/>
+              </w:rPr>
+              <w:t xml:space="preserve">Payment before the due date</w:t>
+            </w:r>
+          </w:p>
+        </w:tc>
+        <w:tc>
+          <w:tcPr>
+            <w:tcW w:type="dxa" w:w="3300"/>
+            <w:tcMar>
+              <w:top w:type="dxa" w:w="60"/>
+              <w:left w:type="dxa" w:w="100"/>
+              <w:bottom w:type="dxa" w:w="60"/>
+              <w:right w:type="dxa" w:w="100"/>
+            </w:tcMar>
+            <w:vAlign w:val="center"/>
+          </w:tcPr>
+          <w:p>
+            <w:pPr>
+              <w:jc w:val="left"/>
+            </w:pPr>
+            <w:r>
+              <w:rPr>
+                <w:sz w:val="19"/>
+                <w:szCs w:val="19"/>
+              </w:rPr>
+              <w:t xml:space="preserve">Paid the next instalment on the spot</w:t>
+            </w:r>
+          </w:p>
+        </w:tc>
+        <w:tc>
+          <w:tcPr>
+            <w:tcW w:type="dxa" w:w="3600"/>
+            <w:tcMar>
+              <w:top w:type="dxa" w:w="60"/>
+              <w:left w:type="dxa" w:w="100"/>
+              <w:bottom w:type="dxa" w:w="60"/>
+              <w:right w:type="dxa" w:w="100"/>
+            </w:tcMar>
+            <w:vAlign w:val="center"/>
+          </w:tcPr>
+          <w:p>
+            <w:pPr>
+              <w:jc w:val="left"/>
+            </w:pPr>
+            <w:r>
+              <w:rPr>
+                <w:sz w:val="19"/>
+                <w:szCs w:val="19"/>
+              </w:rPr>
+              <w:t xml:space="preserve">Held as an advance and applied on the due date</w:t>
+            </w:r>
+          </w:p>
+        </w:tc>
+      </w:tr>
+      <w:tr>
+        <w:trPr>
+          <w:cantSplit/>
+        </w:trPr>
+        <w:tc>
+          <w:tcPr>
+            <w:tcW w:type="dxa" w:w="2600"/>
+            <w:shd w:fill="F5F8FC" w:val="clear"/>
+            <w:tcMar>
+              <w:top w:type="dxa" w:w="60"/>
+              <w:left w:type="dxa" w:w="100"/>
+              <w:bottom w:type="dxa" w:w="60"/>
+              <w:right w:type="dxa" w:w="100"/>
+            </w:tcMar>
+            <w:vAlign w:val="center"/>
+          </w:tcPr>
+          <w:p>
+            <w:pPr>
+              <w:jc w:val="left"/>
+            </w:pPr>
+            <w:r>
+              <w:rPr>
+                <w:sz w:val="19"/>
+                <w:szCs w:val="19"/>
+              </w:rPr>
+              <w:t xml:space="preserve">Part-payment</w:t>
+            </w:r>
+          </w:p>
+        </w:tc>
+        <w:tc>
+          <w:tcPr>
+            <w:tcW w:type="dxa" w:w="3300"/>
+            <w:shd w:fill="F5F8FC" w:val="clear"/>
+            <w:tcMar>
+              <w:top w:type="dxa" w:w="60"/>
+              <w:left w:type="dxa" w:w="100"/>
+              <w:bottom w:type="dxa" w:w="60"/>
+              <w:right w:type="dxa" w:w="100"/>
+            </w:tcMar>
+            <w:vAlign w:val="center"/>
+          </w:tcPr>
+          <w:p>
+            <w:pPr>
+              <w:jc w:val="left"/>
+            </w:pPr>
+            <w:r>
+              <w:rPr>
+                <w:sz w:val="19"/>
+                <w:szCs w:val="19"/>
+              </w:rPr>
+              <w:t xml:space="preserve">Reduced principal at once</w:t>
+            </w:r>
+          </w:p>
+        </w:tc>
+        <w:tc>
+          <w:tcPr>
+            <w:tcW w:type="dxa" w:w="3600"/>
+            <w:shd w:fill="F5F8FC" w:val="clear"/>
+            <w:tcMar>
+              <w:top w:type="dxa" w:w="60"/>
+              <w:left w:type="dxa" w:w="100"/>
+              <w:bottom w:type="dxa" w:w="60"/>
+              <w:right w:type="dxa" w:w="100"/>
+            </w:tcMar>
+            <w:vAlign w:val="center"/>
+          </w:tcPr>
+          <w:p>
+            <w:pPr>
+              <w:jc w:val="left"/>
+            </w:pPr>
+            <w:r>
+              <w:rPr>
+                <w:sz w:val="19"/>
+                <w:szCs w:val="19"/>
+              </w:rPr>
+              <w:t xml:space="preserve">Clears what is due first; only the rest reduces principal</w:t>
+            </w:r>
+          </w:p>
+        </w:tc>
+      </w:tr>
+      <w:tr>
+        <w:trPr>
+          <w:cantSplit/>
+        </w:trPr>
+        <w:tc>
+          <w:tcPr>
+            <w:tcW w:type="dxa" w:w="2600"/>
+            <w:tcMar>
+              <w:top w:type="dxa" w:w="60"/>
+              <w:left w:type="dxa" w:w="100"/>
+              <w:bottom w:type="dxa" w:w="60"/>
+              <w:right w:type="dxa" w:w="100"/>
+            </w:tcMar>
+            <w:vAlign w:val="center"/>
+          </w:tcPr>
+          <w:p>
+            <w:pPr>
+              <w:jc w:val="left"/>
+            </w:pPr>
+            <w:r>
+              <w:rPr>
+                <w:sz w:val="19"/>
+                <w:szCs w:val="19"/>
+              </w:rPr>
+              <w:t xml:space="preserve">Status after a payment</w:t>
+            </w:r>
+          </w:p>
+        </w:tc>
+        <w:tc>
+          <w:tcPr>
+            <w:tcW w:type="dxa" w:w="3300"/>
+            <w:tcMar>
+              <w:top w:type="dxa" w:w="60"/>
+              <w:left w:type="dxa" w:w="100"/>
+              <w:bottom w:type="dxa" w:w="60"/>
+              <w:right w:type="dxa" w:w="100"/>
+            </w:tcMar>
+            <w:vAlign w:val="center"/>
+          </w:tcPr>
+          <w:p>
+            <w:pPr>
+              <w:jc w:val="left"/>
+            </w:pPr>
+            <w:r>
+              <w:rPr>
+                <w:sz w:val="19"/>
+                <w:szCs w:val="19"/>
+              </w:rPr>
+              <w:t xml:space="preserve">Re-derived by the next classification run</w:t>
+            </w:r>
+          </w:p>
+        </w:tc>
+        <w:tc>
+          <w:tcPr>
+            <w:tcW w:type="dxa" w:w="3600"/>
+            <w:tcMar>
+              <w:top w:type="dxa" w:w="60"/>
+              <w:left w:type="dxa" w:w="100"/>
+              <w:bottom w:type="dxa" w:w="60"/>
+              <w:right w:type="dxa" w:w="100"/>
+            </w:tcMar>
+            <w:vAlign w:val="center"/>
+          </w:tcPr>
+          <w:p>
+            <w:pPr>
+              <w:jc w:val="left"/>
+            </w:pPr>
+            <w:r>
+              <w:rPr>
+                <w:sz w:val="19"/>
+                <w:szCs w:val="19"/>
+              </w:rPr>
+              <w:t xml:space="preserve">Recalculated straight away; clearing arrears lowers or removes the NPA status</w:t>
+            </w:r>
+          </w:p>
+        </w:tc>
+      </w:tr>
+      <w:tr>
+        <w:trPr>
+          <w:cantSplit/>
+        </w:trPr>
+        <w:tc>
+          <w:tcPr>
+            <w:tcW w:type="dxa" w:w="2600"/>
+            <w:shd w:fill="F5F8FC" w:val="clear"/>
+            <w:tcMar>
+              <w:top w:type="dxa" w:w="60"/>
+              <w:left w:type="dxa" w:w="100"/>
+              <w:bottom w:type="dxa" w:w="60"/>
+              <w:right w:type="dxa" w:w="100"/>
+            </w:tcMar>
+            <w:vAlign w:val="center"/>
+          </w:tcPr>
+          <w:p>
+            <w:pPr>
+              <w:jc w:val="left"/>
+            </w:pPr>
+            <w:r>
+              <w:rPr>
+                <w:sz w:val="19"/>
+                <w:szCs w:val="19"/>
+              </w:rPr>
+              <w:t xml:space="preserve">Account closes</w:t>
+            </w:r>
+          </w:p>
+        </w:tc>
+        <w:tc>
+          <w:tcPr>
+            <w:tcW w:type="dxa" w:w="3300"/>
+            <w:shd w:fill="F5F8FC" w:val="clear"/>
+            <w:tcMar>
+              <w:top w:type="dxa" w:w="60"/>
+              <w:left w:type="dxa" w:w="100"/>
+              <w:bottom w:type="dxa" w:w="60"/>
+              <w:right w:type="dxa" w:w="100"/>
+            </w:tcMar>
+            <w:vAlign w:val="center"/>
+          </w:tcPr>
+          <w:p>
+            <w:pPr>
+              <w:jc w:val="left"/>
+            </w:pPr>
+            <w:r>
+              <w:rPr>
+                <w:sz w:val="19"/>
+                <w:szCs w:val="19"/>
+              </w:rPr>
+              <w:t xml:space="preserve">When every instalment is paid</w:t>
+            </w:r>
+          </w:p>
+        </w:tc>
+        <w:tc>
+          <w:tcPr>
+            <w:tcW w:type="dxa" w:w="3600"/>
+            <w:shd w:fill="F5F8FC" w:val="clear"/>
+            <w:tcMar>
+              <w:top w:type="dxa" w:w="60"/>
+              <w:left w:type="dxa" w:w="100"/>
+              <w:bottom w:type="dxa" w:w="60"/>
+              <w:right w:type="dxa" w:w="100"/>
+            </w:tcMar>
+            <w:vAlign w:val="center"/>
+          </w:tcPr>
+          <w:p>
+            <w:pPr>
+              <w:jc w:val="left"/>
+            </w:pPr>
+            <w:r>
+              <w:rPr>
+                <w:sz w:val="19"/>
+                <w:szCs w:val="19"/>
+              </w:rPr>
+              <w:t xml:space="preserve">When every instalment and every demand, penal interest included, is paid</w:t>
+            </w:r>
+          </w:p>
+        </w:tc>
+      </w:tr>
+    </w:tbl>
+    <w:p>
+      <w:pPr>
+        <w:spacing w:after="60"/>
+      </w:pPr>
+    </w:p>
+    <w:p>
+      <w:pPr>
+        <w:spacing w:after="140" w:line="276"/>
+      </w:pPr>
+      <w:r>
+        <w:rPr>
+          <w:sz w:val="21"/>
+          <w:szCs w:val="21"/>
+        </w:rPr>
+        <w:t xml:space="preserve">The end-to-end test suite expects a short payment to be accepted (one new payment row) or refused with a clean 4xx; it no longer requires a refusal.</w:t>
+      </w:r>
+    </w:p>
+    <w:p>
+      <w:pPr>
+        <w:pStyle w:val="Heading2"/>
+        <w:spacing w:after="120" w:before="280"/>
+      </w:pPr>
+      <w:r>
+        <w:rPr>
+          <w:b/>
+          <w:bCs/>
+          <w:color w:val="2E5AA8"/>
+          <w:sz w:val="25"/>
+          <w:szCs w:val="25"/>
+        </w:rPr>
+        <w:t xml:space="preserve">14.5 Penal Interest</w:t>
+      </w:r>
+    </w:p>
+    <w:p>
+      <w:pPr>
+        <w:pStyle w:val="Heading3"/>
+        <w:spacing w:after="100" w:before="200"/>
+      </w:pPr>
+      <w:r>
+        <w:rPr>
+          <w:b/>
+          <w:bCs/>
+          <w:color w:val="2E5AA8"/>
+          <w:sz w:val="22"/>
+          <w:szCs w:val="22"/>
+        </w:rPr>
+        <w:t xml:space="preserve">14.5.1 The rule</w:t>
+      </w:r>
+    </w:p>
+    <w:p>
+      <w:pPr>
+        <w:pStyle w:val="ListParagraph"/>
+        <w:numPr>
+          <w:ilvl w:val="0"/>
+          <w:numId w:val="1"/>
+        </w:numPr>
+        <w:spacing w:after="80" w:line="264"/>
+      </w:pPr>
+      <w:r>
+        <w:rPr>
+          <w:b/>
+          <w:bCs/>
+          <w:sz w:val="21"/>
+          <w:szCs w:val="21"/>
+        </w:rPr>
+        <w:t xml:space="preserve">What is charged.</w:t>
+      </w:r>
+      <w:r>
+        <w:rPr>
+          <w:sz w:val="21"/>
+          <w:szCs w:val="21"/>
+        </w:rPr>
+        <w:t xml:space="preserve"> For each day later than the due date plus the grace days, on a demand with principal or interest still unpaid: penal base × annual penal rate ÷ days in the year. The base is the unpaid principal and interest of that demand at the close of the day, so payments dated that day or earlier are not charged. The day count is the account's own (ACT/365, ACT/ACT or 30/360), to four decimals.</w:t>
+      </w:r>
+    </w:p>
+    <w:p>
+      <w:pPr>
+        <w:pStyle w:val="ListParagraph"/>
+        <w:numPr>
+          <w:ilvl w:val="0"/>
+          <w:numId w:val="1"/>
+        </w:numPr>
+        <w:spacing w:after="80" w:line="264"/>
+      </w:pPr>
+      <w:r>
+        <w:rPr>
+          <w:b/>
+          <w:bCs/>
+          <w:sz w:val="21"/>
+          <w:szCs w:val="21"/>
+        </w:rPr>
+        <w:t xml:space="preserve">Simple, not compounded.</w:t>
+      </w:r>
+      <w:r>
+        <w:rPr>
+          <w:sz w:val="21"/>
+          <w:szCs w:val="21"/>
+        </w:rPr>
+        <w:t xml:space="preserve"> Penal interest is never added to the base, so it does not earn penal interest.</w:t>
+      </w:r>
+    </w:p>
+    <w:p>
+      <w:pPr>
+        <w:pStyle w:val="ListParagraph"/>
+        <w:numPr>
+          <w:ilvl w:val="0"/>
+          <w:numId w:val="1"/>
+        </w:numPr>
+        <w:spacing w:after="80" w:line="264"/>
+      </w:pPr>
+      <w:r>
+        <w:rPr>
+          <w:b/>
+          <w:bCs/>
+          <w:sz w:val="21"/>
+          <w:szCs w:val="21"/>
+        </w:rPr>
+        <w:t xml:space="preserve">Cap.</w:t>
+      </w:r>
+      <w:r>
+        <w:rPr>
+          <w:sz w:val="21"/>
+          <w:szCs w:val="21"/>
+        </w:rPr>
+        <w:t xml:space="preserve"> If the product has a cap, the total charged on a demand stops at that percentage of the demand's principal plus interest.</w:t>
+      </w:r>
+    </w:p>
+    <w:p>
+      <w:pPr>
+        <w:pStyle w:val="ListParagraph"/>
+        <w:numPr>
+          <w:ilvl w:val="0"/>
+          <w:numId w:val="1"/>
+        </w:numPr>
+        <w:spacing w:after="80" w:line="264"/>
+      </w:pPr>
+      <w:r>
+        <w:rPr>
+          <w:b/>
+          <w:bCs/>
+          <w:sz w:val="21"/>
+          <w:szCs w:val="21"/>
+        </w:rPr>
+        <w:t xml:space="preserve">Per demand.</w:t>
+      </w:r>
+      <w:r>
+        <w:rPr>
+          <w:sz w:val="21"/>
+          <w:szCs w:val="21"/>
+        </w:rPr>
+        <w:t xml:space="preserve"> Each demand counts its own days from its own due date. One row per demand and day is stored in the table penal_interest, which is also what stops a rerun from charging twice.</w:t>
+      </w:r>
+    </w:p>
+    <w:p>
+      <w:pPr>
+        <w:pStyle w:val="ListParagraph"/>
+        <w:numPr>
+          <w:ilvl w:val="0"/>
+          <w:numId w:val="1"/>
+        </w:numPr>
+        <w:spacing w:after="80" w:line="264"/>
+      </w:pPr>
+      <w:r>
+        <w:rPr>
+          <w:b/>
+          <w:bCs/>
+          <w:sz w:val="21"/>
+          <w:szCs w:val="21"/>
+        </w:rPr>
+        <w:t xml:space="preserve">Which accounts.</w:t>
+      </w:r>
+      <w:r>
+        <w:rPr>
+          <w:sz w:val="21"/>
+          <w:szCs w:val="21"/>
+        </w:rPr>
+        <w:t xml:space="preserve"> ACTIVE and every NPA status. It stops for CLOSED, FORECLOSED and WRITTEN_OFF. From SUBSTANDARD onward each daily charge is flagged suspended, for accounting.</w:t>
+      </w:r>
+    </w:p>
+    <w:p>
+      <w:pPr>
+        <w:pStyle w:val="ListParagraph"/>
+        <w:numPr>
+          <w:ilvl w:val="0"/>
+          <w:numId w:val="1"/>
+        </w:numPr>
+        <w:spacing w:after="80" w:line="264"/>
+      </w:pPr>
+      <w:r>
+        <w:rPr>
+          <w:b/>
+          <w:bCs/>
+          <w:sz w:val="21"/>
+          <w:szCs w:val="21"/>
+        </w:rPr>
+        <w:t xml:space="preserve">Rounding.</w:t>
+      </w:r>
+      <w:r>
+        <w:rPr>
+          <w:sz w:val="21"/>
+          <w:szCs w:val="21"/>
+        </w:rPr>
+        <w:t xml:space="preserve"> Daily amounts are kept to four decimals; the amount to pay is the running total rounded to two decimals, less what has been paid.</w:t>
+      </w:r>
+    </w:p>
+    <w:p>
+      <w:pPr>
+        <w:pStyle w:val="Heading3"/>
+        <w:spacing w:after="100" w:before="200"/>
+      </w:pPr>
+      <w:r>
+        <w:rPr>
+          <w:b/>
+          <w:bCs/>
+          <w:color w:val="2E5AA8"/>
+          <w:sz w:val="22"/>
+          <w:szCs w:val="22"/>
+        </w:rPr>
+        <w:t xml:space="preserve">14.5.2 Worked examples</w:t>
+      </w:r>
+    </w:p>
+    <w:p>
+      <w:pPr>
+        <w:spacing w:after="140" w:line="276"/>
+      </w:pPr>
+      <w:r>
+        <w:rPr>
+          <w:sz w:val="21"/>
+          <w:szCs w:val="21"/>
+        </w:rPr>
+        <w:t xml:space="preserve">Instalment 1 is due on 5 Nov 2026: principal 12,000.00 plus interest 3,000.00, a demand of 15,000.00. Daily penal interest on the full demand is 15,000.00 × 0.24 ÷ 365 = 9.8630.</w:t>
+      </w:r>
+    </w:p>
+    <w:tbl>
+      <w:tblPr>
+        <w:tblW w:type="dxa" w:w="9500"/>
+        <w:tblBorders>
+          <w:top w:val="single" w:color="auto" w:sz="4"/>
+          <w:left w:val="single" w:color="auto" w:sz="4"/>
+          <w:bottom w:val="single" w:color="auto" w:sz="4"/>
+          <w:right w:val="single" w:color="auto" w:sz="4"/>
+          <w:insideH w:val="single" w:color="auto" w:sz="4"/>
+          <w:insideV w:val="single" w:color="auto" w:sz="4"/>
+        </w:tblBorders>
+      </w:tblPr>
+      <w:tblGrid>
+        <w:gridCol w:w="1900"/>
+        <w:gridCol w:w="3200"/>
+        <w:gridCol w:w="2200"/>
+        <w:gridCol w:w="2200"/>
+      </w:tblGrid>
+      <w:tr>
+        <w:trPr>
+          <w:tblHeader/>
+        </w:trPr>
+        <w:tc>
+          <w:tcPr>
+            <w:tcW w:type="dxa" w:w="1900"/>
+            <w:shd w:fill="1F3864" w:val="clear"/>
+            <w:tcMar>
+              <w:top w:type="dxa" w:w="60"/>
+              <w:left w:type="dxa" w:w="100"/>
+              <w:bottom w:type="dxa" w:w="60"/>
+              <w:right w:type="dxa" w:w="100"/>
+            </w:tcMar>
+            <w:vAlign w:val="center"/>
+          </w:tcPr>
+          <w:p>
+            <w:pPr>
+              <w:jc w:val="left"/>
+            </w:pPr>
+            <w:r>
+              <w:rPr>
+                <w:b/>
+                <w:bCs/>
+                <w:color w:val="FFFFFF"/>
+                <w:sz w:val="19"/>
+                <w:szCs w:val="19"/>
+              </w:rPr>
+              <w:t xml:space="preserve">Case</w:t>
+            </w:r>
+          </w:p>
+        </w:tc>
+        <w:tc>
+          <w:tcPr>
+            <w:tcW w:type="dxa" w:w="3200"/>
+            <w:shd w:fill="1F3864" w:val="clear"/>
+            <w:tcMar>
+              <w:top w:type="dxa" w:w="60"/>
+              <w:left w:type="dxa" w:w="100"/>
+              <w:bottom w:type="dxa" w:w="60"/>
+              <w:right w:type="dxa" w:w="100"/>
+            </w:tcMar>
+            <w:vAlign w:val="center"/>
+          </w:tcPr>
+          <w:p>
+            <w:pPr>
+              <w:jc w:val="left"/>
+            </w:pPr>
+            <w:r>
+              <w:rPr>
+                <w:b/>
+                <w:bCs/>
+                <w:color w:val="FFFFFF"/>
+                <w:sz w:val="19"/>
+                <w:szCs w:val="19"/>
+              </w:rPr>
+              <w:t xml:space="preserve">What happens</w:t>
+            </w:r>
+          </w:p>
+        </w:tc>
+        <w:tc>
+          <w:tcPr>
+            <w:tcW w:type="dxa" w:w="2200"/>
+            <w:shd w:fill="1F3864" w:val="clear"/>
+            <w:tcMar>
+              <w:top w:type="dxa" w:w="60"/>
+              <w:left w:type="dxa" w:w="100"/>
+              <w:bottom w:type="dxa" w:w="60"/>
+              <w:right w:type="dxa" w:w="100"/>
+            </w:tcMar>
+            <w:vAlign w:val="center"/>
+          </w:tcPr>
+          <w:p>
+            <w:pPr>
+              <w:jc w:val="left"/>
+            </w:pPr>
+            <w:r>
+              <w:rPr>
+                <w:b/>
+                <w:bCs/>
+                <w:color w:val="FFFFFF"/>
+                <w:sz w:val="19"/>
+                <w:szCs w:val="19"/>
+              </w:rPr>
+              <w:t xml:space="preserve">Penal interest</w:t>
+            </w:r>
+          </w:p>
+        </w:tc>
+        <w:tc>
+          <w:tcPr>
+            <w:tcW w:type="dxa" w:w="2200"/>
+            <w:shd w:fill="1F3864" w:val="clear"/>
+            <w:tcMar>
+              <w:top w:type="dxa" w:w="60"/>
+              <w:left w:type="dxa" w:w="100"/>
+              <w:bottom w:type="dxa" w:w="60"/>
+              <w:right w:type="dxa" w:w="100"/>
+            </w:tcMar>
+            <w:vAlign w:val="center"/>
+          </w:tcPr>
+          <w:p>
+            <w:pPr>
+              <w:jc w:val="left"/>
+            </w:pPr>
+            <w:r>
+              <w:rPr>
+                <w:b/>
+                <w:bCs/>
+                <w:color w:val="FFFFFF"/>
+                <w:sz w:val="19"/>
+                <w:szCs w:val="19"/>
+              </w:rPr>
+              <w:t xml:space="preserve">Amount payable</w:t>
+            </w:r>
+          </w:p>
+        </w:tc>
+      </w:tr>
+      <w:tr>
+        <w:trPr>
+          <w:cantSplit/>
+        </w:trPr>
+        <w:tc>
+          <w:tcPr>
+            <w:tcW w:type="dxa" w:w="1900"/>
+            <w:tcMar>
+              <w:top w:type="dxa" w:w="60"/>
+              <w:left w:type="dxa" w:w="100"/>
+              <w:bottom w:type="dxa" w:w="60"/>
+              <w:right w:type="dxa" w:w="100"/>
+            </w:tcMar>
+            <w:vAlign w:val="center"/>
+          </w:tcPr>
+          <w:p>
+            <w:pPr>
+              <w:jc w:val="left"/>
+            </w:pPr>
+            <w:r>
+              <w:rPr>
+                <w:sz w:val="19"/>
+                <w:szCs w:val="19"/>
+              </w:rPr>
+              <w:t xml:space="preserve">A. Paid late in full</w:t>
+            </w:r>
+          </w:p>
+        </w:tc>
+        <w:tc>
+          <w:tcPr>
+            <w:tcW w:type="dxa" w:w="3200"/>
+            <w:tcMar>
+              <w:top w:type="dxa" w:w="60"/>
+              <w:left w:type="dxa" w:w="100"/>
+              <w:bottom w:type="dxa" w:w="60"/>
+              <w:right w:type="dxa" w:w="100"/>
+            </w:tcMar>
+            <w:vAlign w:val="center"/>
+          </w:tcPr>
+          <w:p>
+            <w:pPr>
+              <w:jc w:val="left"/>
+            </w:pPr>
+            <w:r>
+              <w:rPr>
+                <w:sz w:val="19"/>
+                <w:szCs w:val="19"/>
+              </w:rPr>
+              <w:t xml:space="preserve">Nothing paid 6 to 13 Nov (8 days). Paid in full on 14 Nov.</w:t>
+            </w:r>
+          </w:p>
+        </w:tc>
+        <w:tc>
+          <w:tcPr>
+            <w:tcW w:type="dxa" w:w="2200"/>
+            <w:tcMar>
+              <w:top w:type="dxa" w:w="60"/>
+              <w:left w:type="dxa" w:w="100"/>
+              <w:bottom w:type="dxa" w:w="60"/>
+              <w:right w:type="dxa" w:w="100"/>
+            </w:tcMar>
+            <w:vAlign w:val="center"/>
+          </w:tcPr>
+          <w:p>
+            <w:pPr>
+              <w:jc w:val="left"/>
+            </w:pPr>
+            <w:r>
+              <w:rPr>
+                <w:sz w:val="19"/>
+                <w:szCs w:val="19"/>
+              </w:rPr>
+              <w:t xml:space="preserve">8 × 9.8630 = 78.9040, posted as 78.90</w:t>
+            </w:r>
+          </w:p>
+        </w:tc>
+        <w:tc>
+          <w:tcPr>
+            <w:tcW w:type="dxa" w:w="2200"/>
+            <w:tcMar>
+              <w:top w:type="dxa" w:w="60"/>
+              <w:left w:type="dxa" w:w="100"/>
+              <w:bottom w:type="dxa" w:w="60"/>
+              <w:right w:type="dxa" w:w="100"/>
+            </w:tcMar>
+            <w:vAlign w:val="center"/>
+          </w:tcPr>
+          <w:p>
+            <w:pPr>
+              <w:jc w:val="left"/>
+            </w:pPr>
+            <w:r>
+              <w:rPr>
+                <w:sz w:val="19"/>
+                <w:szCs w:val="19"/>
+              </w:rPr>
+              <w:t xml:space="preserve">15,078.90 on 14 Nov; nothing left after payment</w:t>
+            </w:r>
+          </w:p>
+        </w:tc>
+      </w:tr>
+      <w:tr>
+        <w:trPr>
+          <w:cantSplit/>
+        </w:trPr>
+        <w:tc>
+          <w:tcPr>
+            <w:tcW w:type="dxa" w:w="1900"/>
+            <w:shd w:fill="F5F8FC" w:val="clear"/>
+            <w:tcMar>
+              <w:top w:type="dxa" w:w="60"/>
+              <w:left w:type="dxa" w:w="100"/>
+              <w:bottom w:type="dxa" w:w="60"/>
+              <w:right w:type="dxa" w:w="100"/>
+            </w:tcMar>
+            <w:vAlign w:val="center"/>
+          </w:tcPr>
+          <w:p>
+            <w:pPr>
+              <w:jc w:val="left"/>
+            </w:pPr>
+            <w:r>
+              <w:rPr>
+                <w:sz w:val="19"/>
+                <w:szCs w:val="19"/>
+              </w:rPr>
+              <w:t xml:space="preserve">B. Paid late in part</w:t>
+            </w:r>
+          </w:p>
+        </w:tc>
+        <w:tc>
+          <w:tcPr>
+            <w:tcW w:type="dxa" w:w="3200"/>
+            <w:shd w:fill="F5F8FC" w:val="clear"/>
+            <w:tcMar>
+              <w:top w:type="dxa" w:w="60"/>
+              <w:left w:type="dxa" w:w="100"/>
+              <w:bottom w:type="dxa" w:w="60"/>
+              <w:right w:type="dxa" w:w="100"/>
+            </w:tcMar>
+            <w:vAlign w:val="center"/>
+          </w:tcPr>
+          <w:p>
+            <w:pPr>
+              <w:jc w:val="left"/>
+            </w:pPr>
+            <w:r>
+              <w:rPr>
+                <w:sz w:val="19"/>
+                <w:szCs w:val="19"/>
+              </w:rPr>
+              <w:t xml:space="preserve">10,000.00 paid on 14 Nov: clears penal 78.90, interest 3,000.00 and 6,921.10 of principal. Principal left 5,078.90.</w:t>
+            </w:r>
+          </w:p>
+        </w:tc>
+        <w:tc>
+          <w:tcPr>
+            <w:tcW w:type="dxa" w:w="2200"/>
+            <w:shd w:fill="F5F8FC" w:val="clear"/>
+            <w:tcMar>
+              <w:top w:type="dxa" w:w="60"/>
+              <w:left w:type="dxa" w:w="100"/>
+              <w:bottom w:type="dxa" w:w="60"/>
+              <w:right w:type="dxa" w:w="100"/>
+            </w:tcMar>
+            <w:vAlign w:val="center"/>
+          </w:tcPr>
+          <w:p>
+            <w:pPr>
+              <w:jc w:val="left"/>
+            </w:pPr>
+            <w:r>
+              <w:rPr>
+                <w:sz w:val="19"/>
+                <w:szCs w:val="19"/>
+              </w:rPr>
+              <w:t xml:space="preserve">From 14 Nov the base is 5,078.90: 3.3396 a day. Cleared on 20 Nov: 6 days, 20.04</w:t>
+            </w:r>
+          </w:p>
+        </w:tc>
+        <w:tc>
+          <w:tcPr>
+            <w:tcW w:type="dxa" w:w="2200"/>
+            <w:shd w:fill="F5F8FC" w:val="clear"/>
+            <w:tcMar>
+              <w:top w:type="dxa" w:w="60"/>
+              <w:left w:type="dxa" w:w="100"/>
+              <w:bottom w:type="dxa" w:w="60"/>
+              <w:right w:type="dxa" w:w="100"/>
+            </w:tcMar>
+            <w:vAlign w:val="center"/>
+          </w:tcPr>
+          <w:p>
+            <w:pPr>
+              <w:jc w:val="left"/>
+            </w:pPr>
+            <w:r>
+              <w:rPr>
+                <w:sz w:val="19"/>
+                <w:szCs w:val="19"/>
+              </w:rPr>
+              <w:t xml:space="preserve">5,078.90 + 20.04 = 5,098.94 on 20 Nov</w:t>
+            </w:r>
+          </w:p>
+        </w:tc>
+      </w:tr>
+      <w:tr>
+        <w:trPr>
+          <w:cantSplit/>
+        </w:trPr>
+        <w:tc>
+          <w:tcPr>
+            <w:tcW w:type="dxa" w:w="1900"/>
+            <w:tcMar>
+              <w:top w:type="dxa" w:w="60"/>
+              <w:left w:type="dxa" w:w="100"/>
+              <w:bottom w:type="dxa" w:w="60"/>
+              <w:right w:type="dxa" w:w="100"/>
+            </w:tcMar>
+            <w:vAlign w:val="center"/>
+          </w:tcPr>
+          <w:p>
+            <w:pPr>
+              <w:jc w:val="left"/>
+            </w:pPr>
+            <w:r>
+              <w:rPr>
+                <w:sz w:val="19"/>
+                <w:szCs w:val="19"/>
+              </w:rPr>
+              <w:t xml:space="preserve">C. Two missed instalments</w:t>
+            </w:r>
+          </w:p>
+        </w:tc>
+        <w:tc>
+          <w:tcPr>
+            <w:tcW w:type="dxa" w:w="3200"/>
+            <w:tcMar>
+              <w:top w:type="dxa" w:w="60"/>
+              <w:left w:type="dxa" w:w="100"/>
+              <w:bottom w:type="dxa" w:w="60"/>
+              <w:right w:type="dxa" w:w="100"/>
+            </w:tcMar>
+            <w:vAlign w:val="center"/>
+          </w:tcPr>
+          <w:p>
+            <w:pPr>
+              <w:jc w:val="left"/>
+            </w:pPr>
+            <w:r>
+              <w:rPr>
+                <w:sz w:val="19"/>
+                <w:szCs w:val="19"/>
+              </w:rPr>
+              <w:t xml:space="preserve">Instalments due 5 Nov and 5 Dec, nothing paid. Look at 10 Dec.</w:t>
+            </w:r>
+          </w:p>
+        </w:tc>
+        <w:tc>
+          <w:tcPr>
+            <w:tcW w:type="dxa" w:w="2200"/>
+            <w:tcMar>
+              <w:top w:type="dxa" w:w="60"/>
+              <w:left w:type="dxa" w:w="100"/>
+              <w:bottom w:type="dxa" w:w="60"/>
+              <w:right w:type="dxa" w:w="100"/>
+            </w:tcMar>
+            <w:vAlign w:val="center"/>
+          </w:tcPr>
+          <w:p>
+            <w:pPr>
+              <w:jc w:val="left"/>
+            </w:pPr>
+            <w:r>
+              <w:rPr>
+                <w:sz w:val="19"/>
+                <w:szCs w:val="19"/>
+              </w:rPr>
+              <w:t xml:space="preserve">5 Nov demand: 34 days, 335.34. 5 Dec demand: 4 days, 39.45. Total 374.79</w:t>
+            </w:r>
+          </w:p>
+        </w:tc>
+        <w:tc>
+          <w:tcPr>
+            <w:tcW w:type="dxa" w:w="2200"/>
+            <w:tcMar>
+              <w:top w:type="dxa" w:w="60"/>
+              <w:left w:type="dxa" w:w="100"/>
+              <w:bottom w:type="dxa" w:w="60"/>
+              <w:right w:type="dxa" w:w="100"/>
+            </w:tcMar>
+            <w:vAlign w:val="center"/>
+          </w:tcPr>
+          <w:p>
+            <w:pPr>
+              <w:jc w:val="left"/>
+            </w:pPr>
+            <w:r>
+              <w:rPr>
+                <w:sz w:val="19"/>
+                <w:szCs w:val="19"/>
+              </w:rPr>
+              <w:t xml:space="preserve">30,000.00 + 374.79 = 30,374.79</w:t>
+            </w:r>
+          </w:p>
+        </w:tc>
+      </w:tr>
+    </w:tbl>
+    <w:p>
+      <w:pPr>
+        <w:spacing w:after="60"/>
+      </w:pPr>
+    </w:p>
+    <w:p>
+      <w:pPr>
+        <w:pStyle w:val="Heading3"/>
+        <w:spacing w:after="100" w:before="200"/>
+      </w:pPr>
+      <w:r>
+        <w:rPr>
+          <w:b/>
+          <w:bCs/>
+          <w:color w:val="2E5AA8"/>
+          <w:sz w:val="22"/>
+          <w:szCs w:val="22"/>
+        </w:rPr>
+        <w:t xml:space="preserve">14.5.3 What a payment sees</w:t>
+      </w:r>
+    </w:p>
+    <w:p>
+      <w:pPr>
+        <w:spacing w:after="140" w:line="276"/>
+      </w:pPr>
+      <w:r>
+        <w:rPr>
+          <w:sz w:val="21"/>
+          <w:szCs w:val="21"/>
+        </w:rPr>
+        <w:t xml:space="preserve">A payment charges penal interest up to the day </w:t>
+      </w:r>
+      <w:r>
+        <w:rPr>
+          <w:b/>
+          <w:bCs/>
+          <w:sz w:val="21"/>
+          <w:szCs w:val="21"/>
+        </w:rPr>
+        <w:t xml:space="preserve">before</w:t>
+      </w:r>
+      <w:r>
+        <w:rPr>
+          <w:sz w:val="21"/>
+          <w:szCs w:val="21"/>
+        </w:rPr>
+        <w:t xml:space="preserve"> its value date before it is applied, so the amount asked for is the same whether or not the nightly job has run. In case A the borrower pays on 14 Nov and owes 8 days (6 to 13 Nov). The Amount payable and Payment preview reads include days not yet posted, so the figure shown is the figure that will be posted. Catching up after a gap charges each missed day on the base it would have had.</w:t>
+      </w:r>
+    </w:p>
+    <w:p>
+      <w:pPr>
+        <w:pStyle w:val="Heading2"/>
+        <w:spacing w:after="120" w:before="280"/>
+      </w:pPr>
+      <w:r>
+        <w:rPr>
+          <w:b/>
+          <w:bCs/>
+          <w:color w:val="2E5AA8"/>
+          <w:sz w:val="25"/>
+          <w:szCs w:val="25"/>
+        </w:rPr>
+        <w:t xml:space="preserve">14.6 Product Settings for Penal Interest</w:t>
+      </w:r>
+    </w:p>
+    <w:p>
+      <w:pPr>
+        <w:spacing w:after="140" w:line="276"/>
+      </w:pPr>
+      <w:r>
+        <w:rPr>
+          <w:sz w:val="21"/>
+          <w:szCs w:val="21"/>
+        </w:rPr>
+        <w:t xml:space="preserve">Four settings sit on the loan product and are edited in the </w:t>
+      </w:r>
+      <w:r>
+        <w:rPr>
+          <w:b/>
+          <w:bCs/>
+          <w:sz w:val="21"/>
+          <w:szCs w:val="21"/>
+        </w:rPr>
+        <w:t xml:space="preserve">Products</w:t>
+      </w:r>
+      <w:r>
+        <w:rPr>
+          <w:sz w:val="21"/>
+          <w:szCs w:val="21"/>
+        </w:rPr>
+        <w:t xml:space="preserve"> screen (a Penal interest column in the list, and four fields in the New product / Edit dialog).</w:t>
+      </w:r>
+    </w:p>
+    <w:tbl>
+      <w:tblPr>
+        <w:tblW w:type="dxa" w:w="9500"/>
+        <w:tblBorders>
+          <w:top w:val="single" w:color="auto" w:sz="4"/>
+          <w:left w:val="single" w:color="auto" w:sz="4"/>
+          <w:bottom w:val="single" w:color="auto" w:sz="4"/>
+          <w:right w:val="single" w:color="auto" w:sz="4"/>
+          <w:insideH w:val="single" w:color="auto" w:sz="4"/>
+          <w:insideV w:val="single" w:color="auto" w:sz="4"/>
+        </w:tblBorders>
+      </w:tblPr>
+      <w:tblGrid>
+        <w:gridCol w:w="2300"/>
+        <w:gridCol w:w="1500"/>
+        <w:gridCol w:w="5700"/>
+      </w:tblGrid>
+      <w:tr>
+        <w:trPr>
+          <w:tblHeader/>
+        </w:trPr>
+        <w:tc>
+          <w:tcPr>
+            <w:tcW w:type="dxa" w:w="2300"/>
+            <w:shd w:fill="1F3864" w:val="clear"/>
+            <w:tcMar>
+              <w:top w:type="dxa" w:w="60"/>
+              <w:left w:type="dxa" w:w="100"/>
+              <w:bottom w:type="dxa" w:w="60"/>
+              <w:right w:type="dxa" w:w="100"/>
+            </w:tcMar>
+            <w:vAlign w:val="center"/>
+          </w:tcPr>
+          <w:p>
+            <w:pPr>
+              <w:jc w:val="left"/>
+            </w:pPr>
+            <w:r>
+              <w:rPr>
+                <w:b/>
+                <w:bCs/>
+                <w:color w:val="FFFFFF"/>
+                <w:sz w:val="19"/>
+                <w:szCs w:val="19"/>
+              </w:rPr>
+              <w:t xml:space="preserve">Setting</w:t>
+            </w:r>
+          </w:p>
+        </w:tc>
+        <w:tc>
+          <w:tcPr>
+            <w:tcW w:type="dxa" w:w="1500"/>
+            <w:shd w:fill="1F3864" w:val="clear"/>
+            <w:tcMar>
+              <w:top w:type="dxa" w:w="60"/>
+              <w:left w:type="dxa" w:w="100"/>
+              <w:bottom w:type="dxa" w:w="60"/>
+              <w:right w:type="dxa" w:w="100"/>
+            </w:tcMar>
+            <w:vAlign w:val="center"/>
+          </w:tcPr>
+          <w:p>
+            <w:pPr>
+              <w:jc w:val="left"/>
+            </w:pPr>
+            <w:r>
+              <w:rPr>
+                <w:b/>
+                <w:bCs/>
+                <w:color w:val="FFFFFF"/>
+                <w:sz w:val="19"/>
+                <w:szCs w:val="19"/>
+              </w:rPr>
+              <w:t xml:space="preserve">Default</w:t>
+            </w:r>
+          </w:p>
+        </w:tc>
+        <w:tc>
+          <w:tcPr>
+            <w:tcW w:type="dxa" w:w="5700"/>
+            <w:shd w:fill="1F3864" w:val="clear"/>
+            <w:tcMar>
+              <w:top w:type="dxa" w:w="60"/>
+              <w:left w:type="dxa" w:w="100"/>
+              <w:bottom w:type="dxa" w:w="60"/>
+              <w:right w:type="dxa" w:w="100"/>
+            </w:tcMar>
+            <w:vAlign w:val="center"/>
+          </w:tcPr>
+          <w:p>
+            <w:pPr>
+              <w:jc w:val="left"/>
+            </w:pPr>
+            <w:r>
+              <w:rPr>
+                <w:b/>
+                <w:bCs/>
+                <w:color w:val="FFFFFF"/>
+                <w:sz w:val="19"/>
+                <w:szCs w:val="19"/>
+              </w:rPr>
+              <w:t xml:space="preserve">Rule</w:t>
+            </w:r>
+          </w:p>
+        </w:tc>
+      </w:tr>
+      <w:tr>
+        <w:trPr>
+          <w:cantSplit/>
+        </w:trPr>
+        <w:tc>
+          <w:tcPr>
+            <w:tcW w:type="dxa" w:w="2300"/>
+            <w:tcMar>
+              <w:top w:type="dxa" w:w="60"/>
+              <w:left w:type="dxa" w:w="100"/>
+              <w:bottom w:type="dxa" w:w="60"/>
+              <w:right w:type="dxa" w:w="100"/>
+            </w:tcMar>
+            <w:vAlign w:val="center"/>
+          </w:tcPr>
+          <w:p>
+            <w:pPr>
+              <w:jc w:val="left"/>
+            </w:pPr>
+            <w:r>
+              <w:rPr>
+                <w:sz w:val="19"/>
+                <w:szCs w:val="19"/>
+              </w:rPr>
+              <w:t xml:space="preserve">Penal interest</w:t>
+            </w:r>
+          </w:p>
+        </w:tc>
+        <w:tc>
+          <w:tcPr>
+            <w:tcW w:type="dxa" w:w="1500"/>
+            <w:tcMar>
+              <w:top w:type="dxa" w:w="60"/>
+              <w:left w:type="dxa" w:w="100"/>
+              <w:bottom w:type="dxa" w:w="60"/>
+              <w:right w:type="dxa" w:w="100"/>
+            </w:tcMar>
+            <w:vAlign w:val="center"/>
+          </w:tcPr>
+          <w:p>
+            <w:pPr>
+              <w:jc w:val="left"/>
+            </w:pPr>
+            <w:r>
+              <w:rPr>
+                <w:sz w:val="19"/>
+                <w:szCs w:val="19"/>
+              </w:rPr>
+              <w:t xml:space="preserve">On</w:t>
+            </w:r>
+          </w:p>
+        </w:tc>
+        <w:tc>
+          <w:tcPr>
+            <w:tcW w:type="dxa" w:w="5700"/>
+            <w:tcMar>
+              <w:top w:type="dxa" w:w="60"/>
+              <w:left w:type="dxa" w:w="100"/>
+              <w:bottom w:type="dxa" w:w="60"/>
+              <w:right w:type="dxa" w:w="100"/>
+            </w:tcMar>
+            <w:vAlign w:val="center"/>
+          </w:tcPr>
+          <w:p>
+            <w:pPr>
+              <w:jc w:val="left"/>
+            </w:pPr>
+            <w:r>
+              <w:rPr>
+                <w:sz w:val="19"/>
+                <w:szCs w:val="19"/>
+              </w:rPr>
+              <w:t xml:space="preserve">Switches penal interest on or off for every account of the product.</w:t>
+            </w:r>
+          </w:p>
+        </w:tc>
+      </w:tr>
+      <w:tr>
+        <w:trPr>
+          <w:cantSplit/>
+        </w:trPr>
+        <w:tc>
+          <w:tcPr>
+            <w:tcW w:type="dxa" w:w="2300"/>
+            <w:shd w:fill="F5F8FC" w:val="clear"/>
+            <w:tcMar>
+              <w:top w:type="dxa" w:w="60"/>
+              <w:left w:type="dxa" w:w="100"/>
+              <w:bottom w:type="dxa" w:w="60"/>
+              <w:right w:type="dxa" w:w="100"/>
+            </w:tcMar>
+            <w:vAlign w:val="center"/>
+          </w:tcPr>
+          <w:p>
+            <w:pPr>
+              <w:jc w:val="left"/>
+            </w:pPr>
+            <w:r>
+              <w:rPr>
+                <w:sz w:val="19"/>
+                <w:szCs w:val="19"/>
+              </w:rPr>
+              <w:t xml:space="preserve">Penal rate (% p.a.)</w:t>
+            </w:r>
+          </w:p>
+        </w:tc>
+        <w:tc>
+          <w:tcPr>
+            <w:tcW w:type="dxa" w:w="1500"/>
+            <w:shd w:fill="F5F8FC" w:val="clear"/>
+            <w:tcMar>
+              <w:top w:type="dxa" w:w="60"/>
+              <w:left w:type="dxa" w:w="100"/>
+              <w:bottom w:type="dxa" w:w="60"/>
+              <w:right w:type="dxa" w:w="100"/>
+            </w:tcMar>
+            <w:vAlign w:val="center"/>
+          </w:tcPr>
+          <w:p>
+            <w:pPr>
+              <w:jc w:val="left"/>
+            </w:pPr>
+            <w:r>
+              <w:rPr>
+                <w:sz w:val="19"/>
+                <w:szCs w:val="19"/>
+              </w:rPr>
+              <w:t xml:space="preserve">24.0000</w:t>
+            </w:r>
+          </w:p>
+        </w:tc>
+        <w:tc>
+          <w:tcPr>
+            <w:tcW w:type="dxa" w:w="5700"/>
+            <w:shd w:fill="F5F8FC" w:val="clear"/>
+            <w:tcMar>
+              <w:top w:type="dxa" w:w="60"/>
+              <w:left w:type="dxa" w:w="100"/>
+              <w:bottom w:type="dxa" w:w="60"/>
+              <w:right w:type="dxa" w:w="100"/>
+            </w:tcMar>
+            <w:vAlign w:val="center"/>
+          </w:tcPr>
+          <w:p>
+            <w:pPr>
+              <w:jc w:val="left"/>
+            </w:pPr>
+            <w:r>
+              <w:rPr>
+                <w:sz w:val="19"/>
+                <w:szCs w:val="19"/>
+              </w:rPr>
+              <w:t xml:space="preserve">From 0 up to, but not including, 100, at most four decimals. 0 charges nothing.</w:t>
+            </w:r>
+          </w:p>
+        </w:tc>
+      </w:tr>
+      <w:tr>
+        <w:trPr>
+          <w:cantSplit/>
+        </w:trPr>
+        <w:tc>
+          <w:tcPr>
+            <w:tcW w:type="dxa" w:w="2300"/>
+            <w:tcMar>
+              <w:top w:type="dxa" w:w="60"/>
+              <w:left w:type="dxa" w:w="100"/>
+              <w:bottom w:type="dxa" w:w="60"/>
+              <w:right w:type="dxa" w:w="100"/>
+            </w:tcMar>
+            <w:vAlign w:val="center"/>
+          </w:tcPr>
+          <w:p>
+            <w:pPr>
+              <w:jc w:val="left"/>
+            </w:pPr>
+            <w:r>
+              <w:rPr>
+                <w:sz w:val="19"/>
+                <w:szCs w:val="19"/>
+              </w:rPr>
+              <w:t xml:space="preserve">Grace days</w:t>
+            </w:r>
+          </w:p>
+        </w:tc>
+        <w:tc>
+          <w:tcPr>
+            <w:tcW w:type="dxa" w:w="1500"/>
+            <w:tcMar>
+              <w:top w:type="dxa" w:w="60"/>
+              <w:left w:type="dxa" w:w="100"/>
+              <w:bottom w:type="dxa" w:w="60"/>
+              <w:right w:type="dxa" w:w="100"/>
+            </w:tcMar>
+            <w:vAlign w:val="center"/>
+          </w:tcPr>
+          <w:p>
+            <w:pPr>
+              <w:jc w:val="left"/>
+            </w:pPr>
+            <w:r>
+              <w:rPr>
+                <w:sz w:val="19"/>
+                <w:szCs w:val="19"/>
+              </w:rPr>
+              <w:t xml:space="preserve">0</w:t>
+            </w:r>
+          </w:p>
+        </w:tc>
+        <w:tc>
+          <w:tcPr>
+            <w:tcW w:type="dxa" w:w="5700"/>
+            <w:tcMar>
+              <w:top w:type="dxa" w:w="60"/>
+              <w:left w:type="dxa" w:w="100"/>
+              <w:bottom w:type="dxa" w:w="60"/>
+              <w:right w:type="dxa" w:w="100"/>
+            </w:tcMar>
+            <w:vAlign w:val="center"/>
+          </w:tcPr>
+          <w:p>
+            <w:pPr>
+              <w:jc w:val="left"/>
+            </w:pPr>
+            <w:r>
+              <w:rPr>
+                <w:sz w:val="19"/>
+                <w:szCs w:val="19"/>
+              </w:rPr>
+              <w:t xml:space="preserve">0 to 365. Charging starts the day after due date + grace days.</w:t>
+            </w:r>
+          </w:p>
+        </w:tc>
+      </w:tr>
+      <w:tr>
+        <w:trPr>
+          <w:cantSplit/>
+        </w:trPr>
+        <w:tc>
+          <w:tcPr>
+            <w:tcW w:type="dxa" w:w="2300"/>
+            <w:shd w:fill="F5F8FC" w:val="clear"/>
+            <w:tcMar>
+              <w:top w:type="dxa" w:w="60"/>
+              <w:left w:type="dxa" w:w="100"/>
+              <w:bottom w:type="dxa" w:w="60"/>
+              <w:right w:type="dxa" w:w="100"/>
+            </w:tcMar>
+            <w:vAlign w:val="center"/>
+          </w:tcPr>
+          <w:p>
+            <w:pPr>
+              <w:jc w:val="left"/>
+            </w:pPr>
+            <w:r>
+              <w:rPr>
+                <w:sz w:val="19"/>
+                <w:szCs w:val="19"/>
+              </w:rPr>
+              <w:t xml:space="preserve">Cap (% of the demand)</w:t>
+            </w:r>
+          </w:p>
+        </w:tc>
+        <w:tc>
+          <w:tcPr>
+            <w:tcW w:type="dxa" w:w="1500"/>
+            <w:shd w:fill="F5F8FC" w:val="clear"/>
+            <w:tcMar>
+              <w:top w:type="dxa" w:w="60"/>
+              <w:left w:type="dxa" w:w="100"/>
+              <w:bottom w:type="dxa" w:w="60"/>
+              <w:right w:type="dxa" w:w="100"/>
+            </w:tcMar>
+            <w:vAlign w:val="center"/>
+          </w:tcPr>
+          <w:p>
+            <w:pPr>
+              <w:jc w:val="left"/>
+            </w:pPr>
+            <w:r>
+              <w:rPr>
+                <w:sz w:val="19"/>
+                <w:szCs w:val="19"/>
+              </w:rPr>
+              <w:t xml:space="preserve">none</w:t>
+            </w:r>
+          </w:p>
+        </w:tc>
+        <w:tc>
+          <w:tcPr>
+            <w:tcW w:type="dxa" w:w="5700"/>
+            <w:shd w:fill="F5F8FC" w:val="clear"/>
+            <w:tcMar>
+              <w:top w:type="dxa" w:w="60"/>
+              <w:left w:type="dxa" w:w="100"/>
+              <w:bottom w:type="dxa" w:w="60"/>
+              <w:right w:type="dxa" w:w="100"/>
+            </w:tcMar>
+            <w:vAlign w:val="center"/>
+          </w:tcPr>
+          <w:p>
+            <w:pPr>
+              <w:jc w:val="left"/>
+            </w:pPr>
+            <w:r>
+              <w:rPr>
+                <w:sz w:val="19"/>
+                <w:szCs w:val="19"/>
+              </w:rPr>
+              <w:t xml:space="preserve">Blank means no cap. Otherwise above 0 and at most 1000, as a percentage of the demand's principal + interest.</w:t>
+            </w:r>
+          </w:p>
+        </w:tc>
+      </w:tr>
+    </w:tbl>
+    <w:p>
+      <w:pPr>
+        <w:spacing w:after="60"/>
+      </w:pPr>
+    </w:p>
+    <w:p>
+      <w:pPr>
+        <w:pStyle w:val="ListParagraph"/>
+        <w:numPr>
+          <w:ilvl w:val="0"/>
+          <w:numId w:val="1"/>
+        </w:numPr>
+        <w:spacing w:after="80" w:line="264"/>
+      </w:pPr>
+      <w:r>
+        <w:rPr>
+          <w:b/>
+          <w:bCs/>
+          <w:sz w:val="21"/>
+          <w:szCs w:val="21"/>
+        </w:rPr>
+        <w:t xml:space="preserve">When a change takes effect.</w:t>
+      </w:r>
+      <w:r>
+        <w:rPr>
+          <w:sz w:val="21"/>
+          <w:szCs w:val="21"/>
+        </w:rPr>
+        <w:t xml:space="preserve"> Penal terms are read at the time the charge is made. A change applies to </w:t>
+      </w:r>
+      <w:r>
+        <w:rPr>
+          <w:b/>
+          <w:bCs/>
+          <w:sz w:val="21"/>
+          <w:szCs w:val="21"/>
+        </w:rPr>
+        <w:t xml:space="preserve">every account of the product, existing ones included, from the next business date</w:t>
+      </w:r>
+      <w:r>
+        <w:rPr>
+          <w:sz w:val="21"/>
+          <w:szCs w:val="21"/>
+        </w:rPr>
+        <w:t xml:space="preserve">. Each daily row keeps the rate it was charged at, so earlier days are not rewritten.</w:t>
+      </w:r>
+    </w:p>
+    <w:p>
+      <w:pPr>
+        <w:pStyle w:val="ListParagraph"/>
+        <w:numPr>
+          <w:ilvl w:val="0"/>
+          <w:numId w:val="1"/>
+        </w:numPr>
+        <w:spacing w:after="80" w:line="264"/>
+      </w:pPr>
+      <w:r>
+        <w:rPr>
+          <w:b/>
+          <w:bCs/>
+          <w:sz w:val="21"/>
+          <w:szCs w:val="21"/>
+        </w:rPr>
+        <w:t xml:space="preserve">Existing products</w:t>
+      </w:r>
+      <w:r>
+        <w:rPr>
+          <w:sz w:val="21"/>
+          <w:szCs w:val="21"/>
+        </w:rPr>
+        <w:t xml:space="preserve"> receive the defaults when the update is applied.</w:t>
+      </w:r>
+    </w:p>
+    <w:p>
+      <w:pPr>
+        <w:pStyle w:val="ListParagraph"/>
+        <w:numPr>
+          <w:ilvl w:val="0"/>
+          <w:numId w:val="1"/>
+        </w:numPr>
+        <w:spacing w:after="80" w:line="264"/>
+      </w:pPr>
+      <w:r>
+        <w:rPr>
+          <w:b/>
+          <w:bCs/>
+          <w:sz w:val="21"/>
+          <w:szCs w:val="21"/>
+        </w:rPr>
+        <w:t xml:space="preserve">Saving.</w:t>
+      </w:r>
+      <w:r>
+        <w:rPr>
+          <w:sz w:val="21"/>
+          <w:szCs w:val="21"/>
+        </w:rPr>
+        <w:t xml:space="preserve"> If the On/Off setting is sent, all four settings are saved together (a blank rate means 24, blank grace means 0, blank cap means no cap). If it is left out, the product's penal settings are untouched.</w:t>
+      </w:r>
+    </w:p>
+    <w:p>
+      <w:pPr>
+        <w:pStyle w:val="Heading2"/>
+        <w:spacing w:after="120" w:before="280"/>
+      </w:pPr>
+      <w:r>
+        <w:rPr>
+          <w:b/>
+          <w:bCs/>
+          <w:color w:val="2E5AA8"/>
+          <w:sz w:val="25"/>
+          <w:szCs w:val="25"/>
+        </w:rPr>
+        <w:t xml:space="preserve">14.7 Amount Payable and Payment Preview</w:t>
+      </w:r>
+    </w:p>
+    <w:tbl>
+      <w:tblPr>
+        <w:tblW w:type="dxa" w:w="9500"/>
+        <w:tblBorders>
+          <w:top w:val="single" w:color="auto" w:sz="4"/>
+          <w:left w:val="single" w:color="auto" w:sz="4"/>
+          <w:bottom w:val="single" w:color="auto" w:sz="4"/>
+          <w:right w:val="single" w:color="auto" w:sz="4"/>
+          <w:insideH w:val="single" w:color="auto" w:sz="4"/>
+          <w:insideV w:val="single" w:color="auto" w:sz="4"/>
+        </w:tblBorders>
+      </w:tblPr>
+      <w:tblGrid>
+        <w:gridCol w:w="4300"/>
+        <w:gridCol w:w="5200"/>
+      </w:tblGrid>
+      <w:tr>
+        <w:trPr>
+          <w:tblHeader/>
+        </w:trPr>
+        <w:tc>
+          <w:tcPr>
+            <w:tcW w:type="dxa" w:w="4300"/>
+            <w:shd w:fill="1F3864" w:val="clear"/>
+            <w:tcMar>
+              <w:top w:type="dxa" w:w="60"/>
+              <w:left w:type="dxa" w:w="100"/>
+              <w:bottom w:type="dxa" w:w="60"/>
+              <w:right w:type="dxa" w:w="100"/>
+            </w:tcMar>
+            <w:vAlign w:val="center"/>
+          </w:tcPr>
+          <w:p>
+            <w:pPr>
+              <w:jc w:val="left"/>
+            </w:pPr>
+            <w:r>
+              <w:rPr>
+                <w:b/>
+                <w:bCs/>
+                <w:color w:val="FFFFFF"/>
+                <w:sz w:val="19"/>
+                <w:szCs w:val="19"/>
+              </w:rPr>
+              <w:t xml:space="preserve">Method and path</w:t>
+            </w:r>
+          </w:p>
+        </w:tc>
+        <w:tc>
+          <w:tcPr>
+            <w:tcW w:type="dxa" w:w="5200"/>
+            <w:shd w:fill="1F3864" w:val="clear"/>
+            <w:tcMar>
+              <w:top w:type="dxa" w:w="60"/>
+              <w:left w:type="dxa" w:w="100"/>
+              <w:bottom w:type="dxa" w:w="60"/>
+              <w:right w:type="dxa" w:w="100"/>
+            </w:tcMar>
+            <w:vAlign w:val="center"/>
+          </w:tcPr>
+          <w:p>
+            <w:pPr>
+              <w:jc w:val="left"/>
+            </w:pPr>
+            <w:r>
+              <w:rPr>
+                <w:b/>
+                <w:bCs/>
+                <w:color w:val="FFFFFF"/>
+                <w:sz w:val="19"/>
+                <w:szCs w:val="19"/>
+              </w:rPr>
+              <w:t xml:space="preserve">Purpose</w:t>
+            </w:r>
+          </w:p>
+        </w:tc>
+      </w:tr>
+      <w:tr>
+        <w:trPr>
+          <w:cantSplit/>
+        </w:trPr>
+        <w:tc>
+          <w:tcPr>
+            <w:tcW w:type="dxa" w:w="4300"/>
+            <w:tcMar>
+              <w:top w:type="dxa" w:w="60"/>
+              <w:left w:type="dxa" w:w="100"/>
+              <w:bottom w:type="dxa" w:w="60"/>
+              <w:right w:type="dxa" w:w="100"/>
+            </w:tcMar>
+            <w:vAlign w:val="center"/>
+          </w:tcPr>
+          <w:p>
+            <w:pPr>
+              <w:jc w:val="left"/>
+            </w:pPr>
+            <w:r>
+              <w:rPr>
+                <w:rFonts w:ascii="Consolas" w:hAnsi="Consolas" w:cs="Consolas"/>
+                <w:color w:val="1F3864"/>
+                <w:sz w:val="17"/>
+                <w:szCs w:val="17"/>
+              </w:rPr>
+              <w:t xml:space="preserve">GET /api/v1/loan-accounts/{id}/amount-payable?asOf=</w:t>
+            </w:r>
+          </w:p>
+        </w:tc>
+        <w:tc>
+          <w:tcPr>
+            <w:tcW w:type="dxa" w:w="5200"/>
+            <w:tcMar>
+              <w:top w:type="dxa" w:w="60"/>
+              <w:left w:type="dxa" w:w="100"/>
+              <w:bottom w:type="dxa" w:w="60"/>
+              <w:right w:type="dxa" w:w="100"/>
+            </w:tcMar>
+            <w:vAlign w:val="center"/>
+          </w:tcPr>
+          <w:p>
+            <w:pPr>
+              <w:jc w:val="left"/>
+            </w:pPr>
+            <w:r>
+              <w:rPr>
+                <w:sz w:val="19"/>
+                <w:szCs w:val="19"/>
+              </w:rPr>
+              <w:t xml:space="preserve">What is owed on a date: each open demand (oldest first) with its principal, interest and penal interest, total overdue, due today, total penal interest, advance held, days past due and the next instalment not yet due. A due instalment whose demand the job has not raised yet is shown as a line with raised = false.</w:t>
+            </w:r>
+          </w:p>
+        </w:tc>
+      </w:tr>
+      <w:tr>
+        <w:trPr>
+          <w:cantSplit/>
+        </w:trPr>
+        <w:tc>
+          <w:tcPr>
+            <w:tcW w:type="dxa" w:w="4300"/>
+            <w:shd w:fill="F5F8FC" w:val="clear"/>
+            <w:tcMar>
+              <w:top w:type="dxa" w:w="60"/>
+              <w:left w:type="dxa" w:w="100"/>
+              <w:bottom w:type="dxa" w:w="60"/>
+              <w:right w:type="dxa" w:w="100"/>
+            </w:tcMar>
+            <w:vAlign w:val="center"/>
+          </w:tcPr>
+          <w:p>
+            <w:pPr>
+              <w:jc w:val="left"/>
+            </w:pPr>
+            <w:r>
+              <w:rPr>
+                <w:rFonts w:ascii="Consolas" w:hAnsi="Consolas" w:cs="Consolas"/>
+                <w:color w:val="1F3864"/>
+                <w:sz w:val="17"/>
+                <w:szCs w:val="17"/>
+              </w:rPr>
+              <w:t xml:space="preserve">POST /api/v1/loan-accounts/{id}/payments/preview</w:t>
+            </w:r>
+          </w:p>
+        </w:tc>
+        <w:tc>
+          <w:tcPr>
+            <w:tcW w:type="dxa" w:w="5200"/>
+            <w:shd w:fill="F5F8FC" w:val="clear"/>
+            <w:tcMar>
+              <w:top w:type="dxa" w:w="60"/>
+              <w:left w:type="dxa" w:w="100"/>
+              <w:bottom w:type="dxa" w:w="60"/>
+              <w:right w:type="dxa" w:w="100"/>
+            </w:tcMar>
+            <w:vAlign w:val="center"/>
+          </w:tcPr>
+          <w:p>
+            <w:pPr>
+              <w:jc w:val="left"/>
+            </w:pPr>
+            <w:r>
+              <w:rPr>
+                <w:sz w:val="19"/>
+                <w:szCs w:val="19"/>
+              </w:rPr>
+              <w:t xml:space="preserve">Body: valueDate, amount, paymentType (EMI or PART_PAYMENT). Shows how a payment would be applied, line by line, and what would be left over. Changes nothing.</w:t>
+            </w:r>
+          </w:p>
+        </w:tc>
+      </w:tr>
+      <w:tr>
+        <w:trPr>
+          <w:cantSplit/>
+        </w:trPr>
+        <w:tc>
+          <w:tcPr>
+            <w:tcW w:type="dxa" w:w="4300"/>
+            <w:tcMar>
+              <w:top w:type="dxa" w:w="60"/>
+              <w:left w:type="dxa" w:w="100"/>
+              <w:bottom w:type="dxa" w:w="60"/>
+              <w:right w:type="dxa" w:w="100"/>
+            </w:tcMar>
+            <w:vAlign w:val="center"/>
+          </w:tcPr>
+          <w:p>
+            <w:pPr>
+              <w:jc w:val="left"/>
+            </w:pPr>
+            <w:r>
+              <w:rPr>
+                <w:rFonts w:ascii="Consolas" w:hAnsi="Consolas" w:cs="Consolas"/>
+                <w:color w:val="1F3864"/>
+                <w:sz w:val="17"/>
+                <w:szCs w:val="17"/>
+              </w:rPr>
+              <w:t xml:space="preserve">POST /api/v1/loan-accounts/{id}/demands?businessDate=</w:t>
+            </w:r>
+          </w:p>
+        </w:tc>
+        <w:tc>
+          <w:tcPr>
+            <w:tcW w:type="dxa" w:w="5200"/>
+            <w:tcMar>
+              <w:top w:type="dxa" w:w="60"/>
+              <w:left w:type="dxa" w:w="100"/>
+              <w:bottom w:type="dxa" w:w="60"/>
+              <w:right w:type="dxa" w:w="100"/>
+            </w:tcMar>
+            <w:vAlign w:val="center"/>
+          </w:tcPr>
+          <w:p>
+            <w:pPr>
+              <w:jc w:val="left"/>
+            </w:pPr>
+            <w:r>
+              <w:rPr>
+                <w:sz w:val="19"/>
+                <w:szCs w:val="19"/>
+              </w:rPr>
+              <w:t xml:space="preserve">Raise the demands due on or before the date for one account (used by the daily job).</w:t>
+            </w:r>
+          </w:p>
+        </w:tc>
+      </w:tr>
+      <w:tr>
+        <w:trPr>
+          <w:cantSplit/>
+        </w:trPr>
+        <w:tc>
+          <w:tcPr>
+            <w:tcW w:type="dxa" w:w="4300"/>
+            <w:shd w:fill="F5F8FC" w:val="clear"/>
+            <w:tcMar>
+              <w:top w:type="dxa" w:w="60"/>
+              <w:left w:type="dxa" w:w="100"/>
+              <w:bottom w:type="dxa" w:w="60"/>
+              <w:right w:type="dxa" w:w="100"/>
+            </w:tcMar>
+            <w:vAlign w:val="center"/>
+          </w:tcPr>
+          <w:p>
+            <w:pPr>
+              <w:jc w:val="left"/>
+            </w:pPr>
+            <w:r>
+              <w:rPr>
+                <w:rFonts w:ascii="Consolas" w:hAnsi="Consolas" w:cs="Consolas"/>
+                <w:color w:val="1F3864"/>
+                <w:sz w:val="17"/>
+                <w:szCs w:val="17"/>
+              </w:rPr>
+              <w:t xml:space="preserve">POST /api/v1/demands/raise</w:t>
+            </w:r>
+          </w:p>
+        </w:tc>
+        <w:tc>
+          <w:tcPr>
+            <w:tcW w:type="dxa" w:w="5200"/>
+            <w:shd w:fill="F5F8FC" w:val="clear"/>
+            <w:tcMar>
+              <w:top w:type="dxa" w:w="60"/>
+              <w:left w:type="dxa" w:w="100"/>
+              <w:bottom w:type="dxa" w:w="60"/>
+              <w:right w:type="dxa" w:w="100"/>
+            </w:tcMar>
+            <w:vAlign w:val="center"/>
+          </w:tcPr>
+          <w:p>
+            <w:pPr>
+              <w:jc w:val="left"/>
+            </w:pPr>
+            <w:r>
+              <w:rPr>
+                <w:sz w:val="19"/>
+                <w:szCs w:val="19"/>
+              </w:rPr>
+              <w:t xml:space="preserve">Raise demands for all accounts.</w:t>
+            </w:r>
+          </w:p>
+        </w:tc>
+      </w:tr>
+      <w:tr>
+        <w:trPr>
+          <w:cantSplit/>
+        </w:trPr>
+        <w:tc>
+          <w:tcPr>
+            <w:tcW w:type="dxa" w:w="4300"/>
+            <w:tcMar>
+              <w:top w:type="dxa" w:w="60"/>
+              <w:left w:type="dxa" w:w="100"/>
+              <w:bottom w:type="dxa" w:w="60"/>
+              <w:right w:type="dxa" w:w="100"/>
+            </w:tcMar>
+            <w:vAlign w:val="center"/>
+          </w:tcPr>
+          <w:p>
+            <w:pPr>
+              <w:jc w:val="left"/>
+            </w:pPr>
+            <w:r>
+              <w:rPr>
+                <w:rFonts w:ascii="Consolas" w:hAnsi="Consolas" w:cs="Consolas"/>
+                <w:color w:val="1F3864"/>
+                <w:sz w:val="17"/>
+                <w:szCs w:val="17"/>
+              </w:rPr>
+              <w:t xml:space="preserve">POST /api/v1/loan-accounts/{id}/penal-interest?businessDate=</w:t>
+            </w:r>
+          </w:p>
+        </w:tc>
+        <w:tc>
+          <w:tcPr>
+            <w:tcW w:type="dxa" w:w="5200"/>
+            <w:tcMar>
+              <w:top w:type="dxa" w:w="60"/>
+              <w:left w:type="dxa" w:w="100"/>
+              <w:bottom w:type="dxa" w:w="60"/>
+              <w:right w:type="dxa" w:w="100"/>
+            </w:tcMar>
+            <w:vAlign w:val="center"/>
+          </w:tcPr>
+          <w:p>
+            <w:pPr>
+              <w:jc w:val="left"/>
+            </w:pPr>
+            <w:r>
+              <w:rPr>
+                <w:sz w:val="19"/>
+                <w:szCs w:val="19"/>
+              </w:rPr>
+              <w:t xml:space="preserve">Charge penal interest up to and including the date for one account (used by the daily job); returns the number of daily charges written, their total and the penal interest outstanding.</w:t>
+            </w:r>
+          </w:p>
+        </w:tc>
+      </w:tr>
+      <w:tr>
+        <w:trPr>
+          <w:cantSplit/>
+        </w:trPr>
+        <w:tc>
+          <w:tcPr>
+            <w:tcW w:type="dxa" w:w="4300"/>
+            <w:shd w:fill="F5F8FC" w:val="clear"/>
+            <w:tcMar>
+              <w:top w:type="dxa" w:w="60"/>
+              <w:left w:type="dxa" w:w="100"/>
+              <w:bottom w:type="dxa" w:w="60"/>
+              <w:right w:type="dxa" w:w="100"/>
+            </w:tcMar>
+            <w:vAlign w:val="center"/>
+          </w:tcPr>
+          <w:p>
+            <w:pPr>
+              <w:jc w:val="left"/>
+            </w:pPr>
+            <w:r>
+              <w:rPr>
+                <w:rFonts w:ascii="Consolas" w:hAnsi="Consolas" w:cs="Consolas"/>
+                <w:color w:val="1F3864"/>
+                <w:sz w:val="17"/>
+                <w:szCs w:val="17"/>
+              </w:rPr>
+              <w:t xml:space="preserve">GET /api/v1/loan-accounts/{id}/penal-interest</w:t>
+            </w:r>
+          </w:p>
+        </w:tc>
+        <w:tc>
+          <w:tcPr>
+            <w:tcW w:type="dxa" w:w="5200"/>
+            <w:shd w:fill="F5F8FC" w:val="clear"/>
+            <w:tcMar>
+              <w:top w:type="dxa" w:w="60"/>
+              <w:left w:type="dxa" w:w="100"/>
+              <w:bottom w:type="dxa" w:w="60"/>
+              <w:right w:type="dxa" w:w="100"/>
+            </w:tcMar>
+            <w:vAlign w:val="center"/>
+          </w:tcPr>
+          <w:p>
+            <w:pPr>
+              <w:jc w:val="left"/>
+            </w:pPr>
+            <w:r>
+              <w:rPr>
+                <w:sz w:val="19"/>
+                <w:szCs w:val="19"/>
+              </w:rPr>
+              <w:t xml:space="preserve">The account's daily penal interest charges, oldest first.</w:t>
+            </w:r>
+          </w:p>
+        </w:tc>
+      </w:tr>
+    </w:tbl>
+    <w:p>
+      <w:pPr>
+        <w:spacing w:after="60"/>
+      </w:pPr>
+    </w:p>
+    <w:p>
+      <w:pPr>
+        <w:pStyle w:val="Heading2"/>
+        <w:spacing w:after="120" w:before="280"/>
+      </w:pPr>
+      <w:r>
+        <w:rPr>
+          <w:b/>
+          <w:bCs/>
+          <w:color w:val="2E5AA8"/>
+          <w:sz w:val="25"/>
+          <w:szCs w:val="25"/>
+        </w:rPr>
+        <w:t xml:space="preserve">14.8 Screens and Records</w:t>
+      </w:r>
+    </w:p>
+    <w:p>
+      <w:pPr>
+        <w:pStyle w:val="ListParagraph"/>
+        <w:numPr>
+          <w:ilvl w:val="0"/>
+          <w:numId w:val="1"/>
+        </w:numPr>
+        <w:spacing w:after="80" w:line="264"/>
+      </w:pPr>
+      <w:r>
+        <w:rPr>
+          <w:b/>
+          <w:bCs/>
+          <w:sz w:val="21"/>
+          <w:szCs w:val="21"/>
+        </w:rPr>
+        <w:t xml:space="preserve">Pay instalment</w:t>
+      </w:r>
+      <w:r>
+        <w:rPr>
+          <w:sz w:val="21"/>
+          <w:szCs w:val="21"/>
+        </w:rPr>
+        <w:t xml:space="preserve"> shows the amount payable (overdue, due today, penal interest, advance, total) with the open demands, pre-fills the total, accepts any amount, shows how it will be applied before you confirm, and shows the allocation on the receipt. NPA accounts can be paid from it.</w:t>
+      </w:r>
+    </w:p>
+    <w:p>
+      <w:pPr>
+        <w:pStyle w:val="ListParagraph"/>
+        <w:numPr>
+          <w:ilvl w:val="0"/>
+          <w:numId w:val="1"/>
+        </w:numPr>
+        <w:spacing w:after="80" w:line="264"/>
+      </w:pPr>
+      <w:r>
+        <w:rPr>
+          <w:b/>
+          <w:bCs/>
+          <w:sz w:val="21"/>
+          <w:szCs w:val="21"/>
+        </w:rPr>
+        <w:t xml:space="preserve">Products</w:t>
+      </w:r>
+      <w:r>
+        <w:rPr>
+          <w:sz w:val="21"/>
+          <w:szCs w:val="21"/>
+        </w:rPr>
+        <w:t xml:space="preserve"> has the penal settings (14.6).</w:t>
+      </w:r>
+    </w:p>
+    <w:p>
+      <w:pPr>
+        <w:pStyle w:val="ListParagraph"/>
+        <w:numPr>
+          <w:ilvl w:val="0"/>
+          <w:numId w:val="1"/>
+        </w:numPr>
+        <w:spacing w:after="80" w:line="264"/>
+      </w:pPr>
+      <w:r>
+        <w:rPr>
+          <w:b/>
+          <w:bCs/>
+          <w:sz w:val="21"/>
+          <w:szCs w:val="21"/>
+        </w:rPr>
+        <w:t xml:space="preserve">Account detail, Payments, Foreclosure and Part-payment</w:t>
+      </w:r>
+      <w:r>
+        <w:rPr>
+          <w:sz w:val="21"/>
+          <w:szCs w:val="21"/>
+        </w:rPr>
+        <w:t xml:space="preserve"> show penal interest as a column or row, and the Payments list and its CSV carry the penal interest paid.</w:t>
+      </w:r>
+    </w:p>
+    <w:p>
+      <w:pPr>
+        <w:pStyle w:val="ListParagraph"/>
+        <w:numPr>
+          <w:ilvl w:val="0"/>
+          <w:numId w:val="1"/>
+        </w:numPr>
+        <w:spacing w:after="80" w:line="264"/>
+      </w:pPr>
+      <w:r>
+        <w:rPr>
+          <w:b/>
+          <w:bCs/>
+          <w:sz w:val="21"/>
+          <w:szCs w:val="21"/>
+        </w:rPr>
+        <w:t xml:space="preserve">Customer statement (PDF)</w:t>
+      </w:r>
+      <w:r>
+        <w:rPr>
+          <w:sz w:val="21"/>
+          <w:szCs w:val="21"/>
+        </w:rPr>
+        <w:t xml:space="preserve"> has a Towards penal interest column in the payments table.</w:t>
+      </w:r>
+    </w:p>
+    <w:p>
+      <w:pPr>
+        <w:pStyle w:val="ListParagraph"/>
+        <w:numPr>
+          <w:ilvl w:val="0"/>
+          <w:numId w:val="1"/>
+        </w:numPr>
+        <w:spacing w:after="80" w:line="264"/>
+      </w:pPr>
+      <w:r>
+        <w:rPr>
+          <w:b/>
+          <w:bCs/>
+          <w:sz w:val="21"/>
+          <w:szCs w:val="21"/>
+        </w:rPr>
+        <w:t xml:space="preserve">Payment records</w:t>
+      </w:r>
+      <w:r>
+        <w:rPr>
+          <w:sz w:val="21"/>
+          <w:szCs w:val="21"/>
+        </w:rPr>
+        <w:t xml:space="preserve"> carry principal paid, interest paid and penal interest paid. The ledger event of a payment carries the penal amount too. The Maintenance screen's clear-all now includes the penal interest table.</w:t>
+      </w:r>
+    </w:p>
+    <w:p>
+      <w:pPr>
+        <w:pStyle w:val="Heading2"/>
+        <w:spacing w:after="120" w:before="280"/>
+      </w:pPr>
+      <w:r>
+        <w:rPr>
+          <w:b/>
+          <w:bCs/>
+          <w:color w:val="2E5AA8"/>
+          <w:sz w:val="25"/>
+          <w:szCs w:val="25"/>
+        </w:rPr>
+        <w:t xml:space="preserve">14.9 Batch Jobs and the End-of-Day Order</w:t>
+      </w:r>
+    </w:p>
+    <w:tbl>
+      <w:tblPr>
+        <w:tblW w:type="dxa" w:w="9500"/>
+        <w:tblBorders>
+          <w:top w:val="single" w:color="auto" w:sz="4"/>
+          <w:left w:val="single" w:color="auto" w:sz="4"/>
+          <w:bottom w:val="single" w:color="auto" w:sz="4"/>
+          <w:right w:val="single" w:color="auto" w:sz="4"/>
+          <w:insideH w:val="single" w:color="auto" w:sz="4"/>
+          <w:insideV w:val="single" w:color="auto" w:sz="4"/>
+        </w:tblBorders>
+      </w:tblPr>
+      <w:tblGrid>
+        <w:gridCol w:w="4300"/>
+        <w:gridCol w:w="5200"/>
+      </w:tblGrid>
+      <w:tr>
+        <w:trPr>
+          <w:tblHeader/>
+        </w:trPr>
+        <w:tc>
+          <w:tcPr>
+            <w:tcW w:type="dxa" w:w="4300"/>
+            <w:shd w:fill="1F3864" w:val="clear"/>
+            <w:tcMar>
+              <w:top w:type="dxa" w:w="60"/>
+              <w:left w:type="dxa" w:w="100"/>
+              <w:bottom w:type="dxa" w:w="60"/>
+              <w:right w:type="dxa" w:w="100"/>
+            </w:tcMar>
+            <w:vAlign w:val="center"/>
+          </w:tcPr>
+          <w:p>
+            <w:pPr>
+              <w:jc w:val="left"/>
+            </w:pPr>
+            <w:r>
+              <w:rPr>
+                <w:b/>
+                <w:bCs/>
+                <w:color w:val="FFFFFF"/>
+                <w:sz w:val="19"/>
+                <w:szCs w:val="19"/>
+              </w:rPr>
+              <w:t xml:space="preserve">Job</w:t>
+            </w:r>
+          </w:p>
+        </w:tc>
+        <w:tc>
+          <w:tcPr>
+            <w:tcW w:type="dxa" w:w="5200"/>
+            <w:shd w:fill="1F3864" w:val="clear"/>
+            <w:tcMar>
+              <w:top w:type="dxa" w:w="60"/>
+              <w:left w:type="dxa" w:w="100"/>
+              <w:bottom w:type="dxa" w:w="60"/>
+              <w:right w:type="dxa" w:w="100"/>
+            </w:tcMar>
+            <w:vAlign w:val="center"/>
+          </w:tcPr>
+          <w:p>
+            <w:pPr>
+              <w:jc w:val="left"/>
+            </w:pPr>
+            <w:r>
+              <w:rPr>
+                <w:b/>
+                <w:bCs/>
+                <w:color w:val="FFFFFF"/>
+                <w:sz w:val="19"/>
+                <w:szCs w:val="19"/>
+              </w:rPr>
+              <w:t xml:space="preserve">What it does</w:t>
+            </w:r>
+          </w:p>
+        </w:tc>
+      </w:tr>
+      <w:tr>
+        <w:trPr>
+          <w:cantSplit/>
+        </w:trPr>
+        <w:tc>
+          <w:tcPr>
+            <w:tcW w:type="dxa" w:w="4300"/>
+            <w:tcMar>
+              <w:top w:type="dxa" w:w="60"/>
+              <w:left w:type="dxa" w:w="100"/>
+              <w:bottom w:type="dxa" w:w="60"/>
+              <w:right w:type="dxa" w:w="100"/>
+            </w:tcMar>
+            <w:vAlign w:val="center"/>
+          </w:tcPr>
+          <w:p>
+            <w:pPr>
+              <w:jc w:val="left"/>
+            </w:pPr>
+            <w:r>
+              <w:rPr>
+                <w:rFonts w:ascii="Consolas" w:hAnsi="Consolas" w:cs="Consolas"/>
+                <w:color w:val="1F3864"/>
+                <w:sz w:val="17"/>
+                <w:szCs w:val="17"/>
+              </w:rPr>
+              <w:t xml:space="preserve">DEMAND_RAISE_DAILY</w:t>
+            </w:r>
+          </w:p>
+        </w:tc>
+        <w:tc>
+          <w:tcPr>
+            <w:tcW w:type="dxa" w:w="5200"/>
+            <w:tcMar>
+              <w:top w:type="dxa" w:w="60"/>
+              <w:left w:type="dxa" w:w="100"/>
+              <w:bottom w:type="dxa" w:w="60"/>
+              <w:right w:type="dxa" w:w="100"/>
+            </w:tcMar>
+            <w:vAlign w:val="center"/>
+          </w:tcPr>
+          <w:p>
+            <w:pPr>
+              <w:jc w:val="left"/>
+            </w:pPr>
+            <w:r>
+              <w:rPr>
+                <w:sz w:val="19"/>
+                <w:szCs w:val="19"/>
+              </w:rPr>
+              <w:t xml:space="preserve">New. Priority 5, first in the daily chain. For every ACTIVE and NPA account it raises the demands due on or before the business date and applies any advance.</w:t>
+            </w:r>
+          </w:p>
+        </w:tc>
+      </w:tr>
+      <w:tr>
+        <w:trPr>
+          <w:cantSplit/>
+        </w:trPr>
+        <w:tc>
+          <w:tcPr>
+            <w:tcW w:type="dxa" w:w="4300"/>
+            <w:shd w:fill="F5F8FC" w:val="clear"/>
+            <w:tcMar>
+              <w:top w:type="dxa" w:w="60"/>
+              <w:left w:type="dxa" w:w="100"/>
+              <w:bottom w:type="dxa" w:w="60"/>
+              <w:right w:type="dxa" w:w="100"/>
+            </w:tcMar>
+            <w:vAlign w:val="center"/>
+          </w:tcPr>
+          <w:p>
+            <w:pPr>
+              <w:jc w:val="left"/>
+            </w:pPr>
+            <w:r>
+              <w:rPr>
+                <w:rFonts w:ascii="Consolas" w:hAnsi="Consolas" w:cs="Consolas"/>
+                <w:color w:val="1F3864"/>
+                <w:sz w:val="17"/>
+                <w:szCs w:val="17"/>
+              </w:rPr>
+              <w:t xml:space="preserve">PENAL_INTEREST_CALCULATION_DAILY</w:t>
+            </w:r>
+          </w:p>
+        </w:tc>
+        <w:tc>
+          <w:tcPr>
+            <w:tcW w:type="dxa" w:w="5200"/>
+            <w:shd w:fill="F5F8FC" w:val="clear"/>
+            <w:tcMar>
+              <w:top w:type="dxa" w:w="60"/>
+              <w:left w:type="dxa" w:w="100"/>
+              <w:bottom w:type="dxa" w:w="60"/>
+              <w:right w:type="dxa" w:w="100"/>
+            </w:tcMar>
+            <w:vAlign w:val="center"/>
+          </w:tcPr>
+          <w:p>
+            <w:pPr>
+              <w:jc w:val="left"/>
+            </w:pPr>
+            <w:r>
+              <w:rPr>
+                <w:sz w:val="19"/>
+                <w:szCs w:val="19"/>
+              </w:rPr>
+              <w:t xml:space="preserve">Now has a body. Priority 20, after interest accrual. For every ACTIVE and NPA account it charges penal interest up to the business date. Repeating it for the same date adds nothing.</w:t>
+            </w:r>
+          </w:p>
+        </w:tc>
+      </w:tr>
+    </w:tbl>
+    <w:p>
+      <w:pPr>
+        <w:spacing w:after="60"/>
+      </w:pPr>
+    </w:p>
+    <w:p>
+      <w:pPr>
+        <w:spacing w:after="140" w:line="276"/>
+      </w:pPr>
+      <w:r>
+        <w:rPr>
+          <w:sz w:val="21"/>
+          <w:szCs w:val="21"/>
+        </w:rPr>
+        <w:t xml:space="preserve">The daily chain now runs in this order: DEMAND_RAISE_DAILY (5), INTEREST_ACCRUAL (10), PENAL_INTEREST_CALCULATION_DAILY (20), DPD_UPDATE (30), NPA_CLASSIFICATION (40), AUTO_DEBIT (50). Both new jobs call lending-service one account at a time; an account that fails is skipped and recorded in the dead-letter records, and the run carries on.</w:t>
+      </w:r>
+    </w:p>
+    <w:p>
+      <w:pPr>
+        <w:pStyle w:val="Heading2"/>
+        <w:spacing w:after="120" w:before="280"/>
+      </w:pPr>
+      <w:r>
+        <w:rPr>
+          <w:b/>
+          <w:bCs/>
+          <w:color w:val="2E5AA8"/>
+          <w:sz w:val="25"/>
+          <w:szCs w:val="25"/>
+        </w:rPr>
+        <w:t xml:space="preserve">14.10 Days Past Due and Classification</w:t>
+      </w:r>
+    </w:p>
+    <w:p>
+      <w:pPr>
+        <w:spacing w:after="140" w:line="276"/>
+      </w:pPr>
+      <w:r>
+        <w:rPr>
+          <w:sz w:val="21"/>
+          <w:szCs w:val="21"/>
+        </w:rPr>
+        <w:t xml:space="preserve">Days past due is now stored on the account by the classification run. It is counted from the oldest unpaid due date: the earlier of the oldest unpaid instalment on the schedule and the oldest open demand. Using the demands as well matters after a rate reset or part-payment, which regenerate only instalments without a demand. The bands themselves are unchanged (8.3): 1 to 30 days SMA0, up to &gt;1095 days LOSS, with no grace period before the first band. Penal grace days (14.6) delay only the penal charge, not the classification.</w:t>
+      </w:r>
+    </w:p>
+    <w:p>
+      <w:pPr>
+        <w:pStyle w:val="Heading2"/>
+        <w:spacing w:after="120" w:before="280"/>
+      </w:pPr>
+      <w:r>
+        <w:rPr>
+          <w:b/>
+          <w:bCs/>
+          <w:color w:val="2E5AA8"/>
+          <w:sz w:val="25"/>
+          <w:szCs w:val="25"/>
+        </w:rPr>
+        <w:t xml:space="preserve">14.11 Not Built Yet</w:t>
+      </w:r>
+    </w:p>
+    <w:p>
+      <w:pPr>
+        <w:spacing w:after="140" w:line="276"/>
+      </w:pPr>
+      <w:r>
+        <w:rPr>
+          <w:sz w:val="21"/>
+          <w:szCs w:val="21"/>
+        </w:rPr>
+        <w:t xml:space="preserve">The requirement document asks for more than is built. These items are known gaps:</w:t>
+      </w:r>
+    </w:p>
+    <w:p>
+      <w:pPr>
+        <w:pStyle w:val="ListParagraph"/>
+        <w:numPr>
+          <w:ilvl w:val="0"/>
+          <w:numId w:val="1"/>
+        </w:numPr>
+        <w:spacing w:after="80" w:line="264"/>
+      </w:pPr>
+      <w:r>
+        <w:rPr>
+          <w:b/>
+          <w:bCs/>
+          <w:sz w:val="21"/>
+          <w:szCs w:val="21"/>
+        </w:rPr>
+        <w:t xml:space="preserve">Waiver</w:t>
+      </w:r>
+      <w:r>
+        <w:rPr>
+          <w:sz w:val="21"/>
+          <w:szCs w:val="21"/>
+        </w:rPr>
+        <w:t xml:space="preserve"> of penal interest by an authorised user (REQ-PC-008).</w:t>
+      </w:r>
+    </w:p>
+    <w:p>
+      <w:pPr>
+        <w:pStyle w:val="ListParagraph"/>
+        <w:numPr>
+          <w:ilvl w:val="0"/>
+          <w:numId w:val="1"/>
+        </w:numPr>
+        <w:spacing w:after="80" w:line="264"/>
+      </w:pPr>
+      <w:r>
+        <w:rPr>
+          <w:b/>
+          <w:bCs/>
+          <w:sz w:val="21"/>
+          <w:szCs w:val="21"/>
+        </w:rPr>
+        <w:t xml:space="preserve">Back-dated payments and reversal</w:t>
+      </w:r>
+      <w:r>
+        <w:rPr>
+          <w:sz w:val="21"/>
+          <w:szCs w:val="21"/>
+        </w:rPr>
+        <w:t xml:space="preserve"> (REQ-PA-005, REQ-PA-006): penal interest already charged is not recomputed when a payment is back-dated or reversed. A future value date is still refused.</w:t>
+      </w:r>
+    </w:p>
+    <w:p>
+      <w:pPr>
+        <w:pStyle w:val="ListParagraph"/>
+        <w:numPr>
+          <w:ilvl w:val="0"/>
+          <w:numId w:val="1"/>
+        </w:numPr>
+        <w:spacing w:after="80" w:line="264"/>
+      </w:pPr>
+      <w:r>
+        <w:rPr>
+          <w:b/>
+          <w:bCs/>
+          <w:sz w:val="21"/>
+          <w:szCs w:val="21"/>
+        </w:rPr>
+        <w:t xml:space="preserve">Account-level override</w:t>
+      </w:r>
+      <w:r>
+        <w:rPr>
+          <w:sz w:val="21"/>
+          <w:szCs w:val="21"/>
+        </w:rPr>
+        <w:t xml:space="preserve"> of the penal rate or grace days. Penal terms come only from the product.</w:t>
+      </w:r>
+    </w:p>
+    <w:p>
+      <w:pPr>
+        <w:pStyle w:val="ListParagraph"/>
+        <w:numPr>
+          <w:ilvl w:val="0"/>
+          <w:numId w:val="1"/>
+        </w:numPr>
+        <w:spacing w:after="80" w:line="264"/>
+      </w:pPr>
+      <w:r>
+        <w:rPr>
+          <w:b/>
+          <w:bCs/>
+          <w:sz w:val="21"/>
+          <w:szCs w:val="21"/>
+        </w:rPr>
+        <w:t xml:space="preserve">Ledger posting of penal interest accruals.</w:t>
+      </w:r>
+      <w:r>
+        <w:rPr>
+          <w:sz w:val="21"/>
+          <w:szCs w:val="21"/>
+        </w:rPr>
+        <w:t xml:space="preserve"> The ledger client is still a stub, as for every other ledger event.</w:t>
+      </w:r>
+    </w:p>
+    <w:p>
+      <w:pPr>
+        <w:pStyle w:val="Heading2"/>
+        <w:spacing w:after="120" w:before="280"/>
+      </w:pPr>
+      <w:r>
+        <w:rPr>
+          <w:b/>
+          <w:bCs/>
+          <w:color w:val="2E5AA8"/>
+          <w:sz w:val="25"/>
+          <w:szCs w:val="25"/>
+        </w:rPr>
+        <w:t xml:space="preserve">14.12 Open Items and Verification (version 1.7)</w:t>
+      </w:r>
+    </w:p>
+    <w:p>
+      <w:pPr>
+        <w:pStyle w:val="ListParagraph"/>
+        <w:numPr>
+          <w:ilvl w:val="0"/>
+          <w:numId w:val="1"/>
+        </w:numPr>
+        <w:spacing w:after="80" w:line="264"/>
+      </w:pPr>
+      <w:r>
+        <w:rPr>
+          <w:sz w:val="21"/>
+          <w:szCs w:val="21"/>
+        </w:rPr>
+        <w:t xml:space="preserve">The penal rate, grace days, day count and cap are </w:t>
+      </w:r>
+      <w:r>
+        <w:rPr>
+          <w:b/>
+          <w:bCs/>
+          <w:sz w:val="21"/>
+          <w:szCs w:val="21"/>
+        </w:rPr>
+        <w:t xml:space="preserve">placeholders</w:t>
+      </w:r>
+      <w:r>
+        <w:rPr>
+          <w:sz w:val="21"/>
+          <w:szCs w:val="21"/>
+        </w:rPr>
+        <w:t xml:space="preserve"> from the requirement document. Confirm them with the business before any real use; they are one product edit away.</w:t>
+      </w:r>
+    </w:p>
+    <w:p>
+      <w:pPr>
+        <w:pStyle w:val="ListParagraph"/>
+        <w:numPr>
+          <w:ilvl w:val="0"/>
+          <w:numId w:val="1"/>
+        </w:numPr>
+        <w:spacing w:after="80" w:line="264"/>
+      </w:pPr>
+      <w:r>
+        <w:rPr>
+          <w:b/>
+          <w:bCs/>
+          <w:sz w:val="21"/>
+          <w:szCs w:val="21"/>
+        </w:rPr>
+        <w:t xml:space="preserve">Deploy order:</w:t>
+      </w:r>
+      <w:r>
+        <w:rPr>
+          <w:sz w:val="21"/>
+          <w:szCs w:val="21"/>
+        </w:rPr>
+        <w:t xml:space="preserve"> lending-service first (it runs migrations V14 and V15), then lending-batch-service (migration V6 adds the demand job), then lending-admin-service, which reads the new columns directly.</w:t>
+      </w:r>
+    </w:p>
+    <w:p>
+      <w:pPr>
+        <w:pStyle w:val="ListParagraph"/>
+        <w:numPr>
+          <w:ilvl w:val="0"/>
+          <w:numId w:val="1"/>
+        </w:numPr>
+        <w:spacing w:after="80" w:line="264"/>
+      </w:pPr>
+      <w:r>
+        <w:rPr>
+          <w:sz w:val="21"/>
+          <w:szCs w:val="21"/>
+        </w:rPr>
+        <w:t xml:space="preserve">Verification: the penal calculation was run outside Maven and reproduced cases A, B and C above, a paid-in-full day, the cap, grace days and a two-step catch-up. The admin frontend passes the TypeScript check. </w:t>
+      </w:r>
+      <w:r>
+        <w:rPr>
+          <w:b/>
+          <w:bCs/>
+          <w:sz w:val="21"/>
+          <w:szCs w:val="21"/>
+        </w:rPr>
+        <w:t xml:space="preserve">The new Java code, the migrations V14 and V15 and the unit and integration tests have not been built or run with Maven</w:t>
+      </w:r>
+      <w:r>
+        <w:rPr>
+          <w:sz w:val="21"/>
+          <w:szCs w:val="21"/>
+        </w:rPr>
+        <w:t xml:space="preserve"> in the environment where they were written; run the full build and the integration tests (which need Docker) before relying on them.</w:t>
+      </w:r>
+    </w:p>
+    <w:p>
+      <w:pPr>
+        <w:pStyle w:val="ListParagraph"/>
+        <w:numPr>
+          <w:ilvl w:val="0"/>
+          <w:numId w:val="1"/>
+        </w:numPr>
+        <w:spacing w:after="80" w:line="264"/>
+      </w:pPr>
+      <w:r>
+        <w:rPr>
+          <w:sz w:val="21"/>
+          <w:szCs w:val="21"/>
+        </w:rPr>
+        <w:t xml:space="preserve">Not yet seen on the sandbox: a missed instalment taken through several end-of-day runs. Set the penal settings on a product, let an account miss an instalment for a few days, run end of day, and compare the Pay instalment screen with the penal interest list.</w:t>
       </w:r>
     </w:p>
     <w:sectPr>

</xml_diff>